<commit_message>
style: Apply {%p if %} fixes to DOCX templates to prevent blank lines
</commit_message>
<xml_diff>
--- a/template_en.example.docx
+++ b/template_en.example.docx
@@ -12,241 +12,101 @@
     </w:p>
     <w:p>
       <w:r>
-        <w:t xml:space="preserve">{% for </w:t>
+        <w:t>{%</w:t>
       </w:r>
-      <w:proofErr w:type="gramStart"/>
       <w:r>
-        <w:t>res</w:t>
+        <w:t>p</w:t>
       </w:r>
-      <w:proofErr w:type="gramEnd"/>
       <w:r>
-        <w:t xml:space="preserve"> in </w:t>
+        <w:t xml:space="preserve"> for res in results %}</w:t>
       </w:r>
-      <w:proofErr w:type="gramStart"/>
-      <w:r>
-        <w:t>results %}</w:t>
-      </w:r>
-      <w:proofErr w:type="gramEnd"/>
     </w:p>
     <w:p>
       <w:r>
-        <w:t xml:space="preserve">{% if </w:t>
+        <w:t>{%</w:t>
       </w:r>
-      <w:proofErr w:type="spellStart"/>
-      <w:proofErr w:type="gramStart"/>
       <w:r>
-        <w:t>res.rule</w:t>
+        <w:t>p</w:t>
       </w:r>
-      <w:proofErr w:type="gramEnd"/>
       <w:r>
-        <w:t>_name</w:t>
+        <w:t xml:space="preserve"> if res.rule_name == "FortiGate" %}</w:t>
       </w:r>
-      <w:proofErr w:type="spellEnd"/>
-      <w:r>
-        <w:t xml:space="preserve"> == "FortiGate</w:t>
-      </w:r>
-      <w:proofErr w:type="gramStart"/>
-      <w:r>
-        <w:t>" %}</w:t>
-      </w:r>
-      <w:proofErr w:type="gramEnd"/>
     </w:p>
     <w:p>
       <w:pPr>
         <w:pStyle w:val="Ttulo1"/>
       </w:pPr>
-      <w:proofErr w:type="gramStart"/>
       <w:r>
-        <w:t xml:space="preserve">{{ </w:t>
-      </w:r>
-      <w:proofErr w:type="spellStart"/>
-      <w:r>
-        <w:t>res</w:t>
-      </w:r>
-      <w:proofErr w:type="gramEnd"/>
-      <w:r>
-        <w:t>.rule_</w:t>
-      </w:r>
-      <w:proofErr w:type="gramStart"/>
-      <w:r>
-        <w:t>name</w:t>
-      </w:r>
-      <w:proofErr w:type="spellEnd"/>
-      <w:r>
-        <w:t xml:space="preserve"> }</w:t>
-      </w:r>
-      <w:proofErr w:type="gramEnd"/>
-      <w:r>
-        <w:t xml:space="preserve">}: </w:t>
-      </w:r>
-      <w:proofErr w:type="gramStart"/>
-      <w:r>
-        <w:t xml:space="preserve">{{ </w:t>
-      </w:r>
-      <w:proofErr w:type="spellStart"/>
-      <w:r>
-        <w:t>res</w:t>
-      </w:r>
-      <w:proofErr w:type="gramEnd"/>
-      <w:r>
-        <w:t>.</w:t>
-      </w:r>
-      <w:proofErr w:type="gramStart"/>
-      <w:r>
-        <w:t>host</w:t>
-      </w:r>
-      <w:proofErr w:type="spellEnd"/>
-      <w:r>
-        <w:t xml:space="preserve"> }</w:t>
-      </w:r>
-      <w:proofErr w:type="gramEnd"/>
-      <w:r>
-        <w:t>}</w:t>
+        <w:t>{{ res.rule_name }}: {{ res.host }}</w:t>
       </w:r>
     </w:p>
     <w:p>
       <w:r>
-        <w:t xml:space="preserve">{% if </w:t>
+        <w:t>{%</w:t>
       </w:r>
-      <w:proofErr w:type="spellStart"/>
-      <w:proofErr w:type="gramStart"/>
       <w:r>
-        <w:t>res.error</w:t>
+        <w:t>p</w:t>
       </w:r>
-      <w:proofErr w:type="spellEnd"/>
-      <w:proofErr w:type="gramEnd"/>
       <w:r>
-        <w:t xml:space="preserve"> %}</w:t>
+        <w:t xml:space="preserve"> if res.error %}</w:t>
       </w:r>
     </w:p>
     <w:p>
       <w:r>
-        <w:t xml:space="preserve">Error: </w:t>
-      </w:r>
-      <w:proofErr w:type="gramStart"/>
-      <w:r>
-        <w:t xml:space="preserve">{{ </w:t>
-      </w:r>
-      <w:proofErr w:type="spellStart"/>
-      <w:r>
-        <w:t>res</w:t>
-      </w:r>
-      <w:proofErr w:type="gramEnd"/>
-      <w:r>
-        <w:t>.</w:t>
-      </w:r>
-      <w:proofErr w:type="gramStart"/>
-      <w:r>
-        <w:t>error</w:t>
-      </w:r>
-      <w:proofErr w:type="spellEnd"/>
-      <w:r>
-        <w:t xml:space="preserve"> }</w:t>
-      </w:r>
-      <w:proofErr w:type="gramEnd"/>
-      <w:r>
-        <w:t>}</w:t>
+        <w:t>Error: {{ res.error }}</w:t>
       </w:r>
     </w:p>
     <w:p>
       <w:r>
-        <w:t>{% else %}</w:t>
+        <w:t>{%</w:t>
+      </w:r>
+      <w:r>
+        <w:t>p</w:t>
+      </w:r>
+      <w:r>
+        <w:t xml:space="preserve"> else %}</w:t>
       </w:r>
     </w:p>
     <w:p>
       <w:r>
-        <w:t xml:space="preserve">WAN1 Link Status: </w:t>
-      </w:r>
-      <w:proofErr w:type="gramStart"/>
-      <w:r>
-        <w:t>{{ res.wan</w:t>
-      </w:r>
-      <w:proofErr w:type="gramEnd"/>
-      <w:r>
-        <w:t>_</w:t>
-      </w:r>
-      <w:proofErr w:type="gramStart"/>
-      <w:r>
-        <w:t>status.WAN1 }</w:t>
-      </w:r>
-      <w:proofErr w:type="gramEnd"/>
-      <w:r>
-        <w:t>}</w:t>
+        <w:t>WAN1 Link Status: {{ res.wan_status.WAN1 }}</w:t>
       </w:r>
     </w:p>
     <w:p>
       <w:r>
-        <w:t xml:space="preserve">WAN2 Link Status: </w:t>
-      </w:r>
-      <w:proofErr w:type="gramStart"/>
-      <w:r>
-        <w:t>{{ res.wan</w:t>
-      </w:r>
-      <w:proofErr w:type="gramEnd"/>
-      <w:r>
-        <w:t>_</w:t>
-      </w:r>
-      <w:proofErr w:type="gramStart"/>
-      <w:r>
-        <w:t>status.WAN2 }</w:t>
-      </w:r>
-      <w:proofErr w:type="gramEnd"/>
-      <w:r>
-        <w:t>}</w:t>
+        <w:t>WAN2 Link Status: {{ res.wan_status.WAN2 }}</w:t>
       </w:r>
     </w:p>
     <w:p>
       <w:r>
-        <w:t>{% if res.wan_</w:t>
+        <w:t>{%</w:t>
       </w:r>
-      <w:proofErr w:type="gramStart"/>
       <w:r>
-        <w:t>status.WAN</w:t>
+        <w:t>p</w:t>
       </w:r>
-      <w:proofErr w:type="gramEnd"/>
       <w:r>
-        <w:t>3 %}</w:t>
+        <w:t xml:space="preserve"> if res.wan_status.WAN3 %}</w:t>
       </w:r>
     </w:p>
     <w:p>
       <w:r>
-        <w:t xml:space="preserve">Status do Link WAN3: </w:t>
-      </w:r>
-      <w:proofErr w:type="gramStart"/>
-      <w:r>
-        <w:t>{{ res.wan</w:t>
-      </w:r>
-      <w:proofErr w:type="gramEnd"/>
-      <w:r>
-        <w:t>_</w:t>
-      </w:r>
-      <w:proofErr w:type="gramStart"/>
-      <w:r>
-        <w:t>status.WAN3 }</w:t>
-      </w:r>
-      <w:proofErr w:type="gramEnd"/>
-      <w:r>
-        <w:t>}</w:t>
+        <w:t>Status do Link WAN3: {{ res.wan_status.WAN3 }}</w:t>
       </w:r>
     </w:p>
     <w:p>
       <w:r>
-        <w:t>{% endif %}</w:t>
+        <w:t>{%</w:t>
+      </w:r>
+      <w:r>
+        <w:t>p</w:t>
+      </w:r>
+      <w:r>
+        <w:t xml:space="preserve"> endif %}</w:t>
       </w:r>
     </w:p>
     <w:p>
       <w:r>
-        <w:t xml:space="preserve">{% if </w:t>
-      </w:r>
-      <w:proofErr w:type="spellStart"/>
-      <w:proofErr w:type="gramStart"/>
-      <w:r>
-        <w:t>res.screenshot</w:t>
-      </w:r>
-      <w:proofErr w:type="spellEnd"/>
-      <w:proofErr w:type="gramEnd"/>
-      <w:r>
-        <w:t xml:space="preserve"> %}</w:t>
+        <w:t>{% if res.screenshot %}</w:t>
       </w:r>
     </w:p>
     <w:p>
@@ -255,34 +115,19 @@
       </w:r>
     </w:p>
     <w:p>
-      <w:proofErr w:type="gramStart"/>
       <w:r>
-        <w:t xml:space="preserve">{{ </w:t>
-      </w:r>
-      <w:proofErr w:type="spellStart"/>
-      <w:r>
-        <w:t>res</w:t>
-      </w:r>
-      <w:proofErr w:type="gramEnd"/>
-      <w:r>
-        <w:t>.</w:t>
-      </w:r>
-      <w:proofErr w:type="gramStart"/>
-      <w:r>
-        <w:t>screenshot</w:t>
-      </w:r>
-      <w:proofErr w:type="spellEnd"/>
-      <w:r>
-        <w:t xml:space="preserve"> }</w:t>
-      </w:r>
-      <w:proofErr w:type="gramEnd"/>
-      <w:r>
-        <w:t>}</w:t>
+        <w:t>{{ res.screenshot }}</w:t>
       </w:r>
     </w:p>
     <w:p>
       <w:r>
-        <w:t>{% else %}</w:t>
+        <w:t>{%</w:t>
+      </w:r>
+      <w:r>
+        <w:t>p</w:t>
+      </w:r>
+      <w:r>
+        <w:t xml:space="preserve"> else %}</w:t>
       </w:r>
     </w:p>
     <w:p>
@@ -292,30 +137,46 @@
     </w:p>
     <w:p>
       <w:r>
-        <w:t>{% endif %}</w:t>
+        <w:t>{%</w:t>
+      </w:r>
+      <w:r>
+        <w:t>p</w:t>
+      </w:r>
+      <w:r>
+        <w:t xml:space="preserve"> endif %}</w:t>
       </w:r>
     </w:p>
     <w:p>
       <w:r>
-        <w:t>{% endif %}</w:t>
+        <w:t>{%</w:t>
+      </w:r>
+      <w:r>
+        <w:t>p</w:t>
+      </w:r>
+      <w:r>
+        <w:t xml:space="preserve"> endif %}</w:t>
       </w:r>
     </w:p>
     <w:p>
       <w:r>
-        <w:t>{% endif %}</w:t>
+        <w:t>{%</w:t>
+      </w:r>
+      <w:r>
+        <w:t>p</w:t>
+      </w:r>
+      <w:r>
+        <w:t xml:space="preserve"> endif %}</w:t>
       </w:r>
     </w:p>
     <w:p>
       <w:r>
-        <w:t xml:space="preserve">{% </w:t>
+        <w:t>{%</w:t>
       </w:r>
-      <w:proofErr w:type="spellStart"/>
       <w:r>
-        <w:t>endfor</w:t>
+        <w:t>p</w:t>
       </w:r>
-      <w:proofErr w:type="spellEnd"/>
       <w:r>
-        <w:t xml:space="preserve"> %}</w:t>
+        <w:t xml:space="preserve"> endfor %}</w:t>
       </w:r>
     </w:p>
     <w:sectPr>
@@ -1134,6 +995,7 @@
   <w:style w:type="character" w:default="1" w:styleId="Fontepargpadro">
     <w:name w:val="Default Paragraph Font"/>
     <w:uiPriority w:val="1"/>
+    <w:semiHidden/>
     <w:unhideWhenUsed/>
   </w:style>
   <w:style w:type="table" w:default="1" w:styleId="Tabelanormal">

</xml_diff>

<commit_message>
style: Flatten {%p if %} tags in DOCX to prevent blank lines on skipped variables
</commit_message>
<xml_diff>
--- a/template_en.example.docx
+++ b/template_en.example.docx
@@ -20,8 +20,6 @@
       <w:r>
         <w:t xml:space="preserve"> for res in results %}</w:t>
       </w:r>
-    </w:p>
-    <w:p>
       <w:r>
         <w:t>{%</w:t>
       </w:r>
@@ -50,13 +48,15 @@
       <w:r>
         <w:t xml:space="preserve"> if res.error %}</w:t>
       </w:r>
-    </w:p>
-    <w:p>
+      <w:r>
+        <w:t xml:space="preserve"> </w:t>
+      </w:r>
       <w:r>
         <w:t>Error: {{ res.error }}</w:t>
       </w:r>
-    </w:p>
-    <w:p>
+      <w:r>
+        <w:t xml:space="preserve"> </w:t>
+      </w:r>
       <w:r>
         <w:t>{%</w:t>
       </w:r>
@@ -85,15 +85,17 @@
         <w:t>p</w:t>
       </w:r>
       <w:r>
-        <w:t xml:space="preserve"> if res.wan_status.WAN3 %}</w:t>
+        <w:t xml:space="preserve"> if res.wan_status.WAN3 %}WAN3</w:t>
       </w:r>
-    </w:p>
-    <w:p>
       <w:r>
-        <w:t>Status do Link WAN3: {{ res.wan_status.WAN3 }}</w:t>
+        <w:t xml:space="preserve"> Link Status</w:t>
       </w:r>
-    </w:p>
-    <w:p>
+      <w:r>
+        <w:t>: {{ res.wan_status.WAN3 }}</w:t>
+      </w:r>
+      <w:r>
+        <w:t xml:space="preserve"> </w:t>
+      </w:r>
       <w:r>
         <w:t>{%</w:t>
       </w:r>
@@ -108,18 +110,21 @@
       <w:r>
         <w:t>{% if res.screenshot %}</w:t>
       </w:r>
-    </w:p>
-    <w:p>
+      <w:r>
+        <w:t xml:space="preserve"> </w:t>
+      </w:r>
       <w:r>
         <w:t>Evidence (Screenshot):</w:t>
       </w:r>
-    </w:p>
-    <w:p>
+      <w:r>
+        <w:t xml:space="preserve"> </w:t>
+      </w:r>
       <w:r>
         <w:t>{{ res.screenshot }}</w:t>
       </w:r>
-    </w:p>
-    <w:p>
+      <w:r>
+        <w:t xml:space="preserve"> </w:t>
+      </w:r>
       <w:r>
         <w:t>{%</w:t>
       </w:r>
@@ -129,13 +134,15 @@
       <w:r>
         <w:t xml:space="preserve"> else %}</w:t>
       </w:r>
-    </w:p>
-    <w:p>
+      <w:r>
+        <w:t xml:space="preserve"> </w:t>
+      </w:r>
       <w:r>
         <w:t>No evidence image available.</w:t>
       </w:r>
-    </w:p>
-    <w:p>
+      <w:r>
+        <w:t xml:space="preserve"> </w:t>
+      </w:r>
       <w:r>
         <w:t>{%</w:t>
       </w:r>
@@ -145,8 +152,9 @@
       <w:r>
         <w:t xml:space="preserve"> endif %}</w:t>
       </w:r>
-    </w:p>
-    <w:p>
+      <w:r>
+        <w:t xml:space="preserve"> </w:t>
+      </w:r>
       <w:r>
         <w:t>{%</w:t>
       </w:r>
@@ -154,10 +162,11 @@
         <w:t>p</w:t>
       </w:r>
       <w:r>
-        <w:t xml:space="preserve"> endif %}</w:t>
+        <w:t xml:space="preserve"> endif %</w:t>
       </w:r>
-    </w:p>
-    <w:p>
+      <w:r>
+        <w:t xml:space="preserve">} </w:t>
+      </w:r>
       <w:r>
         <w:t>{%</w:t>
       </w:r>

</xml_diff>

<commit_message>
style: Fix mixed tag syntax for screenshots in DOCX templates
</commit_message>
<xml_diff>
--- a/template_en.example.docx
+++ b/template_en.example.docx
@@ -126,13 +126,7 @@
         <w:t xml:space="preserve"> </w:t>
       </w:r>
       <w:r>
-        <w:t>{%</w:t>
-      </w:r>
-      <w:r>
-        <w:t>p</w:t>
-      </w:r>
-      <w:r>
-        <w:t xml:space="preserve"> else %}</w:t>
+        <w:t>{% else %}</w:t>
       </w:r>
       <w:r>
         <w:t xml:space="preserve"> </w:t>
@@ -144,13 +138,7 @@
         <w:t xml:space="preserve"> </w:t>
       </w:r>
       <w:r>
-        <w:t>{%</w:t>
-      </w:r>
-      <w:r>
-        <w:t>p</w:t>
-      </w:r>
-      <w:r>
-        <w:t xml:space="preserve"> endif %}</w:t>
+        <w:t>{% endif %}</w:t>
       </w:r>
       <w:r>
         <w:t xml:space="preserve"> </w:t>

</xml_diff>

<commit_message>
style: Fix template tags spacing and alignment to pass the new DOCX syntax validator
</commit_message>
<xml_diff>
--- a/template_en.example.docx
+++ b/template_en.example.docx
@@ -18,8 +18,23 @@
         <w:t>p</w:t>
       </w:r>
       <w:r>
-        <w:t xml:space="preserve"> for res in results %}</w:t>
+        <w:t xml:space="preserve"> for </w:t>
       </w:r>
+      <w:proofErr w:type="gramStart"/>
+      <w:r>
+        <w:t>res</w:t>
+      </w:r>
+      <w:proofErr w:type="gramEnd"/>
+      <w:r>
+        <w:t xml:space="preserve"> in </w:t>
+      </w:r>
+      <w:proofErr w:type="gramStart"/>
+      <w:r>
+        <w:t>results %}</w:t>
+      </w:r>
+      <w:proofErr w:type="gramEnd"/>
+    </w:p>
+    <w:p>
       <w:r>
         <w:t>{%</w:t>
       </w:r>
@@ -27,15 +42,78 @@
         <w:t>p</w:t>
       </w:r>
       <w:r>
-        <w:t xml:space="preserve"> if res.rule_name == "FortiGate" %}</w:t>
+        <w:t xml:space="preserve"> if </w:t>
       </w:r>
+      <w:proofErr w:type="spellStart"/>
+      <w:proofErr w:type="gramStart"/>
+      <w:r>
+        <w:t>res.rule</w:t>
+      </w:r>
+      <w:proofErr w:type="gramEnd"/>
+      <w:r>
+        <w:t>_name</w:t>
+      </w:r>
+      <w:proofErr w:type="spellEnd"/>
+      <w:r>
+        <w:t xml:space="preserve"> == "FortiGate</w:t>
+      </w:r>
+      <w:proofErr w:type="gramStart"/>
+      <w:r>
+        <w:t>" %}</w:t>
+      </w:r>
+      <w:proofErr w:type="gramEnd"/>
     </w:p>
     <w:p>
       <w:pPr>
         <w:pStyle w:val="Ttulo1"/>
       </w:pPr>
+      <w:proofErr w:type="gramStart"/>
       <w:r>
-        <w:t>{{ res.rule_name }}: {{ res.host }}</w:t>
+        <w:t xml:space="preserve">{{ </w:t>
+      </w:r>
+      <w:proofErr w:type="spellStart"/>
+      <w:r>
+        <w:t>res</w:t>
+      </w:r>
+      <w:proofErr w:type="gramEnd"/>
+      <w:r>
+        <w:t>.rule_</w:t>
+      </w:r>
+      <w:proofErr w:type="gramStart"/>
+      <w:r>
+        <w:t>name</w:t>
+      </w:r>
+      <w:proofErr w:type="spellEnd"/>
+      <w:r>
+        <w:t xml:space="preserve"> }</w:t>
+      </w:r>
+      <w:proofErr w:type="gramEnd"/>
+      <w:r>
+        <w:t xml:space="preserve">}: </w:t>
+      </w:r>
+      <w:proofErr w:type="gramStart"/>
+      <w:r>
+        <w:t xml:space="preserve">{{ </w:t>
+      </w:r>
+      <w:proofErr w:type="spellStart"/>
+      <w:r>
+        <w:t>res</w:t>
+      </w:r>
+      <w:proofErr w:type="gramEnd"/>
+      <w:r>
+        <w:t>.</w:t>
+      </w:r>
+      <w:proofErr w:type="gramStart"/>
+      <w:r>
+        <w:t>host</w:t>
+      </w:r>
+      <w:proofErr w:type="spellEnd"/>
+      <w:r>
+        <w:t xml:space="preserve"> }</w:t>
+      </w:r>
+      <w:proofErr w:type="gramEnd"/>
+      <w:r>
+        <w:t>}</w:t>
       </w:r>
     </w:p>
     <w:p>
@@ -46,35 +124,46 @@
         <w:t>p</w:t>
       </w:r>
       <w:r>
-        <w:t xml:space="preserve"> if res.error %}</w:t>
+        <w:t xml:space="preserve"> if </w:t>
       </w:r>
+      <w:proofErr w:type="spellStart"/>
+      <w:proofErr w:type="gramStart"/>
       <w:r>
-        <w:t xml:space="preserve"> </w:t>
+        <w:t>res.error</w:t>
       </w:r>
+      <w:proofErr w:type="spellEnd"/>
+      <w:proofErr w:type="gramEnd"/>
       <w:r>
-        <w:t>Error: {{ res.error }}</w:t>
-      </w:r>
-      <w:r>
-        <w:t xml:space="preserve"> </w:t>
-      </w:r>
-      <w:r>
-        <w:t>{%</w:t>
-      </w:r>
-      <w:r>
-        <w:t>p</w:t>
-      </w:r>
-      <w:r>
-        <w:t xml:space="preserve"> else %}</w:t>
+        <w:t xml:space="preserve"> %}</w:t>
       </w:r>
     </w:p>
     <w:p>
       <w:r>
-        <w:t>WAN1 Link Status: {{ res.wan_status.WAN1 }}</w:t>
+        <w:t xml:space="preserve">Error: </w:t>
       </w:r>
-    </w:p>
-    <w:p>
+      <w:proofErr w:type="gramStart"/>
       <w:r>
-        <w:t>WAN2 Link Status: {{ res.wan_status.WAN2 }}</w:t>
+        <w:t xml:space="preserve">{{ </w:t>
+      </w:r>
+      <w:proofErr w:type="spellStart"/>
+      <w:r>
+        <w:t>res</w:t>
+      </w:r>
+      <w:proofErr w:type="gramEnd"/>
+      <w:r>
+        <w:t>.</w:t>
+      </w:r>
+      <w:proofErr w:type="gramStart"/>
+      <w:r>
+        <w:t>error</w:t>
+      </w:r>
+      <w:proofErr w:type="spellEnd"/>
+      <w:r>
+        <w:t xml:space="preserve"> }</w:t>
+      </w:r>
+      <w:proofErr w:type="gramEnd"/>
+      <w:r>
+        <w:t>}</w:t>
       </w:r>
     </w:p>
     <w:p>
@@ -85,84 +174,54 @@
         <w:t>p</w:t>
       </w:r>
       <w:r>
-        <w:t xml:space="preserve"> if res.wan_status.WAN3 %}WAN3</w:t>
-      </w:r>
-      <w:r>
-        <w:t xml:space="preserve"> Link Status</w:t>
-      </w:r>
-      <w:r>
-        <w:t>: {{ res.wan_status.WAN3 }}</w:t>
-      </w:r>
-      <w:r>
         <w:t xml:space="preserve"> </w:t>
       </w:r>
+      <w:proofErr w:type="gramStart"/>
       <w:r>
-        <w:t>{%</w:t>
+        <w:t>else %}</w:t>
       </w:r>
+      <w:proofErr w:type="gramEnd"/>
+    </w:p>
+    <w:p>
       <w:r>
-        <w:t>p</w:t>
+        <w:t xml:space="preserve">WAN1 Link Status: </w:t>
       </w:r>
+      <w:proofErr w:type="gramStart"/>
       <w:r>
-        <w:t xml:space="preserve"> endif %}</w:t>
+        <w:t>{{ res.wan</w:t>
+      </w:r>
+      <w:proofErr w:type="gramEnd"/>
+      <w:r>
+        <w:t>_</w:t>
+      </w:r>
+      <w:proofErr w:type="gramStart"/>
+      <w:r>
+        <w:t>status.WAN1 }</w:t>
+      </w:r>
+      <w:proofErr w:type="gramEnd"/>
+      <w:r>
+        <w:t>}</w:t>
       </w:r>
     </w:p>
     <w:p>
       <w:r>
-        <w:t>{% if res.screenshot %}</w:t>
+        <w:t xml:space="preserve">WAN2 Link Status: </w:t>
       </w:r>
+      <w:proofErr w:type="gramStart"/>
       <w:r>
-        <w:t xml:space="preserve"> </w:t>
+        <w:t>{{ res.wan</w:t>
       </w:r>
+      <w:proofErr w:type="gramEnd"/>
       <w:r>
-        <w:t>Evidence (Screenshot):</w:t>
+        <w:t>_</w:t>
       </w:r>
+      <w:proofErr w:type="gramStart"/>
       <w:r>
-        <w:t xml:space="preserve"> </w:t>
+        <w:t>status.WAN2 }</w:t>
       </w:r>
+      <w:proofErr w:type="gramEnd"/>
       <w:r>
-        <w:t>{{ res.screenshot }}</w:t>
-      </w:r>
-      <w:r>
-        <w:t xml:space="preserve"> </w:t>
-      </w:r>
-      <w:r>
-        <w:t>{% else %}</w:t>
-      </w:r>
-      <w:r>
-        <w:t xml:space="preserve"> </w:t>
-      </w:r>
-      <w:r>
-        <w:t>No evidence image available.</w:t>
-      </w:r>
-      <w:r>
-        <w:t xml:space="preserve"> </w:t>
-      </w:r>
-      <w:r>
-        <w:t>{% endif %}</w:t>
-      </w:r>
-      <w:r>
-        <w:t xml:space="preserve"> </w:t>
-      </w:r>
-      <w:r>
-        <w:t>{%</w:t>
-      </w:r>
-      <w:r>
-        <w:t>p</w:t>
-      </w:r>
-      <w:r>
-        <w:t xml:space="preserve"> endif %</w:t>
-      </w:r>
-      <w:r>
-        <w:t xml:space="preserve">} </w:t>
-      </w:r>
-      <w:r>
-        <w:t>{%</w:t>
-      </w:r>
-      <w:r>
-        <w:t>p</w:t>
-      </w:r>
-      <w:r>
-        <w:t xml:space="preserve"> endif %}</w:t>
+        <w:t>}</w:t>
       </w:r>
     </w:p>
     <w:p>
@@ -173,8 +232,204 @@
         <w:t>p</w:t>
       </w:r>
       <w:r>
-        <w:t xml:space="preserve"> endfor %}</w:t>
+        <w:t xml:space="preserve"> if res.wan_</w:t>
       </w:r>
+      <w:proofErr w:type="gramStart"/>
+      <w:r>
+        <w:t>status.WAN</w:t>
+      </w:r>
+      <w:proofErr w:type="gramEnd"/>
+      <w:r>
+        <w:t>3 %}</w:t>
+      </w:r>
+    </w:p>
+    <w:p>
+      <w:r>
+        <w:t>WAN3</w:t>
+      </w:r>
+      <w:r>
+        <w:t xml:space="preserve"> Link Status</w:t>
+      </w:r>
+      <w:r>
+        <w:t xml:space="preserve">: </w:t>
+      </w:r>
+      <w:proofErr w:type="gramStart"/>
+      <w:r>
+        <w:t>{{ res.wan</w:t>
+      </w:r>
+      <w:proofErr w:type="gramEnd"/>
+      <w:r>
+        <w:t>_</w:t>
+      </w:r>
+      <w:proofErr w:type="gramStart"/>
+      <w:r>
+        <w:t>status.WAN3 }</w:t>
+      </w:r>
+      <w:proofErr w:type="gramEnd"/>
+      <w:r>
+        <w:t>}</w:t>
+      </w:r>
+    </w:p>
+    <w:p>
+      <w:r>
+        <w:t>{%</w:t>
+      </w:r>
+      <w:r>
+        <w:t>p</w:t>
+      </w:r>
+      <w:r>
+        <w:t xml:space="preserve"> </w:t>
+      </w:r>
+      <w:proofErr w:type="gramStart"/>
+      <w:r>
+        <w:t>endif %}</w:t>
+      </w:r>
+      <w:proofErr w:type="gramEnd"/>
+    </w:p>
+    <w:p>
+      <w:r>
+        <w:t>{%</w:t>
+      </w:r>
+      <w:r>
+        <w:t>p</w:t>
+      </w:r>
+      <w:r>
+        <w:t xml:space="preserve"> if </w:t>
+      </w:r>
+      <w:proofErr w:type="spellStart"/>
+      <w:proofErr w:type="gramStart"/>
+      <w:r>
+        <w:t>res.screenshot</w:t>
+      </w:r>
+      <w:proofErr w:type="spellEnd"/>
+      <w:proofErr w:type="gramEnd"/>
+      <w:r>
+        <w:t xml:space="preserve"> %}</w:t>
+      </w:r>
+    </w:p>
+    <w:p>
+      <w:r>
+        <w:t>Evidence (Screenshot):</w:t>
+      </w:r>
+    </w:p>
+    <w:p>
+      <w:proofErr w:type="gramStart"/>
+      <w:r>
+        <w:t xml:space="preserve">{{ </w:t>
+      </w:r>
+      <w:proofErr w:type="spellStart"/>
+      <w:r>
+        <w:t>res</w:t>
+      </w:r>
+      <w:proofErr w:type="gramEnd"/>
+      <w:r>
+        <w:t>.</w:t>
+      </w:r>
+      <w:proofErr w:type="gramStart"/>
+      <w:r>
+        <w:t>screenshot</w:t>
+      </w:r>
+      <w:proofErr w:type="spellEnd"/>
+      <w:r>
+        <w:t xml:space="preserve"> }</w:t>
+      </w:r>
+      <w:proofErr w:type="gramEnd"/>
+      <w:r>
+        <w:t>}</w:t>
+      </w:r>
+    </w:p>
+    <w:p>
+      <w:r>
+        <w:t>{%</w:t>
+      </w:r>
+      <w:r>
+        <w:t>p</w:t>
+      </w:r>
+      <w:r>
+        <w:t xml:space="preserve"> </w:t>
+      </w:r>
+      <w:proofErr w:type="gramStart"/>
+      <w:r>
+        <w:t>else %}</w:t>
+      </w:r>
+      <w:proofErr w:type="gramEnd"/>
+    </w:p>
+    <w:p>
+      <w:r>
+        <w:t>No evidence image available.</w:t>
+      </w:r>
+    </w:p>
+    <w:p>
+      <w:r>
+        <w:t>{%</w:t>
+      </w:r>
+      <w:r>
+        <w:t>p</w:t>
+      </w:r>
+      <w:r>
+        <w:t xml:space="preserve"> </w:t>
+      </w:r>
+      <w:proofErr w:type="gramStart"/>
+      <w:r>
+        <w:t>endif %}</w:t>
+      </w:r>
+      <w:proofErr w:type="gramEnd"/>
+    </w:p>
+    <w:p>
+      <w:r>
+        <w:t>{%</w:t>
+      </w:r>
+      <w:r>
+        <w:t>p</w:t>
+      </w:r>
+      <w:r>
+        <w:t xml:space="preserve"> </w:t>
+      </w:r>
+      <w:proofErr w:type="gramStart"/>
+      <w:r>
+        <w:t>endif %</w:t>
+      </w:r>
+      <w:r>
+        <w:t>}</w:t>
+      </w:r>
+      <w:proofErr w:type="gramEnd"/>
+    </w:p>
+    <w:p>
+      <w:r>
+        <w:t>{%</w:t>
+      </w:r>
+      <w:r>
+        <w:t>p</w:t>
+      </w:r>
+      <w:r>
+        <w:t xml:space="preserve"> </w:t>
+      </w:r>
+      <w:proofErr w:type="gramStart"/>
+      <w:r>
+        <w:t>endif %}</w:t>
+      </w:r>
+      <w:proofErr w:type="gramEnd"/>
+    </w:p>
+    <w:p>
+      <w:r>
+        <w:t>{%</w:t>
+      </w:r>
+      <w:r>
+        <w:t>p</w:t>
+      </w:r>
+      <w:r>
+        <w:t xml:space="preserve"> </w:t>
+      </w:r>
+      <w:proofErr w:type="spellStart"/>
+      <w:proofErr w:type="gramStart"/>
+      <w:r>
+        <w:t>endfor</w:t>
+      </w:r>
+      <w:proofErr w:type="spellEnd"/>
+      <w:r>
+        <w:t xml:space="preserve"> %}</w:t>
+      </w:r>
+      <w:proofErr w:type="gramEnd"/>
     </w:p>
     <w:sectPr>
       <w:pgSz w:w="12240" w:h="15840"/>

</xml_diff>

<commit_message>
style: Use inline Jinja tags to append IP addresses to WAN statuses in example templates
</commit_message>
<xml_diff>
--- a/template_en.example.docx
+++ b/template_en.example.docx
@@ -202,6 +202,49 @@
       <w:r>
         <w:t>}</w:t>
       </w:r>
+      <w:r>
+        <w:t xml:space="preserve"> </w:t>
+      </w:r>
+      <w:r>
+        <w:t>{% if res.wan_</w:t>
+      </w:r>
+      <w:proofErr w:type="gramStart"/>
+      <w:r>
+        <w:t>status.WAN</w:t>
+      </w:r>
+      <w:proofErr w:type="gramEnd"/>
+      <w:r>
+        <w:t xml:space="preserve">1_IP </w:t>
+      </w:r>
+      <w:proofErr w:type="gramStart"/>
+      <w:r>
+        <w:t>%}({{ res.wan</w:t>
+      </w:r>
+      <w:proofErr w:type="gramEnd"/>
+      <w:r>
+        <w:t>_</w:t>
+      </w:r>
+      <w:proofErr w:type="gramStart"/>
+      <w:r>
+        <w:t>status.WAN</w:t>
+      </w:r>
+      <w:proofErr w:type="gramEnd"/>
+      <w:r>
+        <w:t>1_</w:t>
+      </w:r>
+      <w:proofErr w:type="gramStart"/>
+      <w:r>
+        <w:t>IP }}){</w:t>
+      </w:r>
+      <w:proofErr w:type="gramEnd"/>
+      <w:r>
+        <w:t xml:space="preserve">% </w:t>
+      </w:r>
+      <w:proofErr w:type="gramStart"/>
+      <w:r>
+        <w:t>endif %}</w:t>
+      </w:r>
+      <w:proofErr w:type="gramEnd"/>
     </w:p>
     <w:p>
       <w:r>
@@ -223,6 +266,55 @@
       <w:r>
         <w:t>}</w:t>
       </w:r>
+      <w:r>
+        <w:t xml:space="preserve"> </w:t>
+      </w:r>
+      <w:r>
+        <w:t>{% if res.wan_</w:t>
+      </w:r>
+      <w:proofErr w:type="gramStart"/>
+      <w:r>
+        <w:t>status.WAN</w:t>
+      </w:r>
+      <w:proofErr w:type="gramEnd"/>
+      <w:r>
+        <w:t>2</w:t>
+      </w:r>
+      <w:r>
+        <w:t xml:space="preserve">_IP </w:t>
+      </w:r>
+      <w:proofErr w:type="gramStart"/>
+      <w:r>
+        <w:t>%}({{ res.wan</w:t>
+      </w:r>
+      <w:proofErr w:type="gramEnd"/>
+      <w:r>
+        <w:t>_</w:t>
+      </w:r>
+      <w:proofErr w:type="gramStart"/>
+      <w:r>
+        <w:t>status.WAN</w:t>
+      </w:r>
+      <w:proofErr w:type="gramEnd"/>
+      <w:r>
+        <w:t>2</w:t>
+      </w:r>
+      <w:r>
+        <w:t>_</w:t>
+      </w:r>
+      <w:proofErr w:type="gramStart"/>
+      <w:r>
+        <w:t>IP }}){</w:t>
+      </w:r>
+      <w:proofErr w:type="gramEnd"/>
+      <w:r>
+        <w:t xml:space="preserve">% </w:t>
+      </w:r>
+      <w:proofErr w:type="gramStart"/>
+      <w:r>
+        <w:t>endif %}</w:t>
+      </w:r>
+      <w:proofErr w:type="gramEnd"/>
     </w:p>
     <w:p>
       <w:r>
@@ -269,6 +361,55 @@
       <w:r>
         <w:t>}</w:t>
       </w:r>
+      <w:r>
+        <w:t xml:space="preserve"> </w:t>
+      </w:r>
+      <w:r>
+        <w:t>{% if res.wan_</w:t>
+      </w:r>
+      <w:proofErr w:type="gramStart"/>
+      <w:r>
+        <w:t>status.WAN</w:t>
+      </w:r>
+      <w:proofErr w:type="gramEnd"/>
+      <w:r>
+        <w:t>3</w:t>
+      </w:r>
+      <w:r>
+        <w:t xml:space="preserve">_IP </w:t>
+      </w:r>
+      <w:proofErr w:type="gramStart"/>
+      <w:r>
+        <w:t>%}({{ res.wan</w:t>
+      </w:r>
+      <w:proofErr w:type="gramEnd"/>
+      <w:r>
+        <w:t>_</w:t>
+      </w:r>
+      <w:proofErr w:type="gramStart"/>
+      <w:r>
+        <w:t>status.WAN</w:t>
+      </w:r>
+      <w:proofErr w:type="gramEnd"/>
+      <w:r>
+        <w:t>3</w:t>
+      </w:r>
+      <w:r>
+        <w:t>_</w:t>
+      </w:r>
+      <w:proofErr w:type="gramStart"/>
+      <w:r>
+        <w:t>IP }}){</w:t>
+      </w:r>
+      <w:proofErr w:type="gramEnd"/>
+      <w:r>
+        <w:t xml:space="preserve">% </w:t>
+      </w:r>
+      <w:proofErr w:type="gramStart"/>
+      <w:r>
+        <w:t>endif %}</w:t>
+      </w:r>
+      <w:proofErr w:type="gramEnd"/>
     </w:p>
     <w:p>
       <w:r>
@@ -1247,7 +1388,6 @@
   <w:style w:type="character" w:default="1" w:styleId="Fontepargpadro">
     <w:name w:val="Default Paragraph Font"/>
     <w:uiPriority w:val="1"/>
-    <w:semiHidden/>
     <w:unhideWhenUsed/>
   </w:style>
   <w:style w:type="table" w:default="1" w:styleId="Tabelanormal">

</xml_diff>

<commit_message>
feat: Update default templates with dynamic latency categorization built natively in Jinja
</commit_message>
<xml_diff>
--- a/template_en.example.docx
+++ b/template_en.example.docx
@@ -11,109 +11,117 @@
       </w:r>
     </w:p>
     <w:p>
+      <w:pPr>
+        <w:keepNext/>
+        <w:keepLines/>
+        <w:spacing w:before="480" w:after="0"/>
+        <w:outlineLvl w:val="0"/>
+        <w:rPr>
+          <w:rFonts w:ascii="Calibri" w:eastAsia="MS Gothic" w:hAnsi="Calibri" w:cs="Times New Roman"/>
+          <w:b/>
+          <w:bCs/>
+          <w:color w:val="365F91" w:themeColor="accent1" w:themeShade="BF"/>
+          <w:sz w:val="28"/>
+          <w:szCs w:val="28"/>
+        </w:rPr>
+      </w:pPr>
       <w:r>
-        <w:t>{%</w:t>
+        <w:rPr>
+          <w:rFonts w:ascii="Calibri" w:eastAsia="MS Gothic" w:hAnsi="Calibri" w:cs="Times New Roman"/>
+          <w:b/>
+          <w:bCs/>
+          <w:color w:val="365F91" w:themeColor="accent1" w:themeShade="BF"/>
+          <w:sz w:val="28"/>
+          <w:szCs w:val="28"/>
+        </w:rPr>
+        <w:t>Sum</w:t>
       </w:r>
       <w:r>
-        <w:t>p</w:t>
+        <w:rPr>
+          <w:rFonts w:ascii="Calibri" w:eastAsia="MS Gothic" w:hAnsi="Calibri" w:cs="Times New Roman"/>
+          <w:b/>
+          <w:bCs/>
+          <w:color w:val="365F91" w:themeColor="accent1" w:themeShade="BF"/>
+          <w:sz w:val="28"/>
+          <w:szCs w:val="28"/>
+        </w:rPr>
+        <w:t>mary</w:t>
       </w:r>
-      <w:r>
-        <w:t xml:space="preserve"> for </w:t>
-      </w:r>
-      <w:proofErr w:type="gramStart"/>
-      <w:r>
-        <w:t>res</w:t>
-      </w:r>
-      <w:proofErr w:type="gramEnd"/>
-      <w:r>
-        <w:t xml:space="preserve"> in </w:t>
-      </w:r>
-      <w:proofErr w:type="gramStart"/>
-      <w:r>
-        <w:t>results %}</w:t>
-      </w:r>
-      <w:proofErr w:type="gramEnd"/>
-    </w:p>
-    <w:p>
-      <w:r>
-        <w:t>{%</w:t>
-      </w:r>
-      <w:r>
-        <w:t>p</w:t>
-      </w:r>
-      <w:r>
-        <w:t xml:space="preserve"> if </w:t>
-      </w:r>
-      <w:proofErr w:type="spellStart"/>
-      <w:proofErr w:type="gramStart"/>
-      <w:r>
-        <w:t>res.rule</w:t>
-      </w:r>
-      <w:proofErr w:type="gramEnd"/>
-      <w:r>
-        <w:t>_name</w:t>
-      </w:r>
-      <w:proofErr w:type="spellEnd"/>
-      <w:r>
-        <w:t xml:space="preserve"> == "FortiGate</w:t>
-      </w:r>
-      <w:proofErr w:type="gramStart"/>
-      <w:r>
-        <w:t>" %}</w:t>
-      </w:r>
-      <w:proofErr w:type="gramEnd"/>
     </w:p>
     <w:p>
       <w:pPr>
-        <w:pStyle w:val="Ttulo1"/>
+        <w:rPr>
+          <w:rFonts w:ascii="Cambria" w:eastAsia="MS Mincho" w:hAnsi="Cambria" w:cs="Times New Roman"/>
+        </w:rPr>
       </w:pPr>
-      <w:proofErr w:type="gramStart"/>
       <w:r>
-        <w:t xml:space="preserve">{{ </w:t>
+        <w:rPr>
+          <w:rFonts w:ascii="Segoe UI Emoji" w:eastAsia="MS Mincho" w:hAnsi="Segoe UI Emoji" w:cs="Segoe UI Emoji"/>
+        </w:rPr>
+        <w:t>🟢</w:t>
       </w:r>
-      <w:proofErr w:type="spellStart"/>
       <w:r>
-        <w:t>res</w:t>
+        <w:rPr>
+          <w:rFonts w:ascii="Cambria" w:eastAsia="MS Mincho" w:hAnsi="Cambria" w:cs="Times New Roman"/>
+        </w:rPr>
+        <w:t xml:space="preserve"> Ok (Ping ≤ 50ms): {{ results | rejectattr('latency', 'equalto', '') | selectattr('latency', 'le', 50) | list | length }}</w:t>
       </w:r>
-      <w:proofErr w:type="gramEnd"/>
+    </w:p>
+    <w:p>
+      <w:pPr>
+        <w:rPr>
+          <w:rFonts w:ascii="Cambria" w:eastAsia="MS Mincho" w:hAnsi="Cambria" w:cs="Times New Roman"/>
+        </w:rPr>
+      </w:pPr>
       <w:r>
-        <w:t>.rule_</w:t>
+        <w:rPr>
+          <w:rFonts w:ascii="Segoe UI Emoji" w:eastAsia="MS Mincho" w:hAnsi="Segoe UI Emoji" w:cs="Segoe UI Emoji"/>
+        </w:rPr>
+        <w:t>🟡</w:t>
       </w:r>
-      <w:proofErr w:type="gramStart"/>
       <w:r>
-        <w:t>name</w:t>
+        <w:rPr>
+          <w:rFonts w:ascii="Cambria" w:eastAsia="MS Mincho" w:hAnsi="Cambria" w:cs="Times New Roman"/>
+        </w:rPr>
+        <w:t xml:space="preserve"> Warning (Ping 50ms ≤ 150ms): {{ results | rejectattr('latency', 'equalto', '') | selectattr('latency', 'gt', 50) | selectattr('latency', 'le', 150) | list | length }}{% set warns = results | rejectattr('latency', 'equalto', '') | selectattr('latency', 'gt', 50) | selectattr('latency', 'le', 150) | map(attribute='host') | list %}{% if warns|length &gt; 0 %} ({{ warns | join(', ') }}){% endif %}</w:t>
       </w:r>
-      <w:proofErr w:type="spellEnd"/>
+    </w:p>
+    <w:p>
+      <w:pPr>
+        <w:rPr>
+          <w:rFonts w:ascii="Cambria" w:eastAsia="MS Mincho" w:hAnsi="Cambria" w:cs="Times New Roman"/>
+        </w:rPr>
+      </w:pPr>
       <w:r>
-        <w:t xml:space="preserve"> }</w:t>
+        <w:rPr>
+          <w:rFonts w:ascii="Segoe UI Emoji" w:eastAsia="MS Mincho" w:hAnsi="Segoe UI Emoji" w:cs="Segoe UI Emoji"/>
+        </w:rPr>
+        <w:t>🔴</w:t>
       </w:r>
-      <w:proofErr w:type="gramEnd"/>
       <w:r>
-        <w:t xml:space="preserve">}: </w:t>
+        <w:rPr>
+          <w:rFonts w:ascii="Cambria" w:eastAsia="MS Mincho" w:hAnsi="Cambria" w:cs="Times New Roman"/>
+        </w:rPr>
+        <w:t xml:space="preserve"> Critical (Ping ≥ 150ms): {{ results | rejectattr('latency', 'equalto', '') | selectattr('latency', 'gt', 150) | list | length }}{% set crits = results | rejectattr('latency', 'equalto', '') | selectattr('latency', 'gt', 150) | map(attribute='host') | list %}{% if crits|length &gt; 0 %} ({{ crits | join(', ') }}){% endif %}</w:t>
       </w:r>
-      <w:proofErr w:type="gramStart"/>
+    </w:p>
+    <w:p>
+      <w:pPr>
+        <w:rPr>
+          <w:rFonts w:ascii="Cambria" w:eastAsia="MS Mincho" w:hAnsi="Cambria" w:cs="Times New Roman"/>
+        </w:rPr>
+      </w:pPr>
       <w:r>
-        <w:t xml:space="preserve">{{ </w:t>
+        <w:rPr>
+          <w:rFonts w:ascii="Segoe UI Emoji" w:eastAsia="MS Mincho" w:hAnsi="Segoe UI Emoji" w:cs="Segoe UI Emoji"/>
+        </w:rPr>
+        <w:t>❌</w:t>
       </w:r>
-      <w:proofErr w:type="spellStart"/>
       <w:r>
-        <w:t>res</w:t>
-      </w:r>
-      <w:proofErr w:type="gramEnd"/>
-      <w:r>
-        <w:t>.</w:t>
-      </w:r>
-      <w:proofErr w:type="gramStart"/>
-      <w:r>
-        <w:t>host</w:t>
-      </w:r>
-      <w:proofErr w:type="spellEnd"/>
-      <w:r>
-        <w:t xml:space="preserve"> }</w:t>
-      </w:r>
-      <w:proofErr w:type="gramEnd"/>
-      <w:r>
-        <w:t>}</w:t>
+        <w:rPr>
+          <w:rFonts w:ascii="Cambria" w:eastAsia="MS Mincho" w:hAnsi="Cambria" w:cs="Times New Roman"/>
+        </w:rPr>
+        <w:t xml:space="preserve"> Ping Timeout: {{ results | selectattr('latency', 'equalto', '') | list | length }}{% set timeouts = results | selectattr('latency', 'equalto', '') | map(attribute='host') | list %}{% if timeouts|length &gt; 0 %} ({{ timeouts | join(', ') }}){% endif %}</w:t>
       </w:r>
     </w:p>
     <w:p>
@@ -124,46 +132,7 @@
         <w:t>p</w:t>
       </w:r>
       <w:r>
-        <w:t xml:space="preserve"> if </w:t>
-      </w:r>
-      <w:proofErr w:type="spellStart"/>
-      <w:proofErr w:type="gramStart"/>
-      <w:r>
-        <w:t>res.error</w:t>
-      </w:r>
-      <w:proofErr w:type="spellEnd"/>
-      <w:proofErr w:type="gramEnd"/>
-      <w:r>
-        <w:t xml:space="preserve"> %}</w:t>
-      </w:r>
-    </w:p>
-    <w:p>
-      <w:r>
-        <w:t xml:space="preserve">Error: </w:t>
-      </w:r>
-      <w:proofErr w:type="gramStart"/>
-      <w:r>
-        <w:t xml:space="preserve">{{ </w:t>
-      </w:r>
-      <w:proofErr w:type="spellStart"/>
-      <w:r>
-        <w:t>res</w:t>
-      </w:r>
-      <w:proofErr w:type="gramEnd"/>
-      <w:r>
-        <w:t>.</w:t>
-      </w:r>
-      <w:proofErr w:type="gramStart"/>
-      <w:r>
-        <w:t>error</w:t>
-      </w:r>
-      <w:proofErr w:type="spellEnd"/>
-      <w:r>
-        <w:t xml:space="preserve"> }</w:t>
-      </w:r>
-      <w:proofErr w:type="gramEnd"/>
-      <w:r>
-        <w:t>}</w:t>
+        <w:t xml:space="preserve"> for res in results %}</w:t>
       </w:r>
     </w:p>
     <w:p>
@@ -174,309 +143,15 @@
         <w:t>p</w:t>
       </w:r>
       <w:r>
-        <w:t xml:space="preserve"> </w:t>
-      </w:r>
-      <w:proofErr w:type="gramStart"/>
-      <w:r>
-        <w:t>else %}</w:t>
-      </w:r>
-      <w:proofErr w:type="gramEnd"/>
-    </w:p>
-    <w:p>
-      <w:r>
-        <w:t xml:space="preserve">WAN1 Link Status: </w:t>
-      </w:r>
-      <w:proofErr w:type="gramStart"/>
-      <w:r>
-        <w:t>{{ res.wan</w:t>
-      </w:r>
-      <w:proofErr w:type="gramEnd"/>
-      <w:r>
-        <w:t>_</w:t>
-      </w:r>
-      <w:proofErr w:type="gramStart"/>
-      <w:r>
-        <w:t>status.WAN1 }</w:t>
-      </w:r>
-      <w:proofErr w:type="gramEnd"/>
-      <w:r>
-        <w:t>}</w:t>
-      </w:r>
-      <w:r>
-        <w:t xml:space="preserve"> </w:t>
-      </w:r>
-      <w:r>
-        <w:t>{% if res.wan_</w:t>
-      </w:r>
-      <w:proofErr w:type="gramStart"/>
-      <w:r>
-        <w:t>status.WAN</w:t>
-      </w:r>
-      <w:proofErr w:type="gramEnd"/>
-      <w:r>
-        <w:t xml:space="preserve">1_IP </w:t>
-      </w:r>
-      <w:proofErr w:type="gramStart"/>
-      <w:r>
-        <w:t>%}({{ res.wan</w:t>
-      </w:r>
-      <w:proofErr w:type="gramEnd"/>
-      <w:r>
-        <w:t>_</w:t>
-      </w:r>
-      <w:proofErr w:type="gramStart"/>
-      <w:r>
-        <w:t>status.WAN</w:t>
-      </w:r>
-      <w:proofErr w:type="gramEnd"/>
-      <w:r>
-        <w:t>1_</w:t>
-      </w:r>
-      <w:proofErr w:type="gramStart"/>
-      <w:r>
-        <w:t>IP }}){</w:t>
-      </w:r>
-      <w:proofErr w:type="gramEnd"/>
-      <w:r>
-        <w:t xml:space="preserve">% </w:t>
-      </w:r>
-      <w:proofErr w:type="gramStart"/>
-      <w:r>
-        <w:t>endif %}</w:t>
-      </w:r>
-      <w:proofErr w:type="gramEnd"/>
-    </w:p>
-    <w:p>
-      <w:r>
-        <w:t xml:space="preserve">WAN2 Link Status: </w:t>
-      </w:r>
-      <w:proofErr w:type="gramStart"/>
-      <w:r>
-        <w:t>{{ res.wan</w:t>
-      </w:r>
-      <w:proofErr w:type="gramEnd"/>
-      <w:r>
-        <w:t>_</w:t>
-      </w:r>
-      <w:proofErr w:type="gramStart"/>
-      <w:r>
-        <w:t>status.WAN2 }</w:t>
-      </w:r>
-      <w:proofErr w:type="gramEnd"/>
-      <w:r>
-        <w:t>}</w:t>
-      </w:r>
-      <w:r>
-        <w:t xml:space="preserve"> </w:t>
-      </w:r>
-      <w:r>
-        <w:t>{% if res.wan_</w:t>
-      </w:r>
-      <w:proofErr w:type="gramStart"/>
-      <w:r>
-        <w:t>status.WAN</w:t>
-      </w:r>
-      <w:proofErr w:type="gramEnd"/>
-      <w:r>
-        <w:t>2</w:t>
-      </w:r>
-      <w:r>
-        <w:t xml:space="preserve">_IP </w:t>
-      </w:r>
-      <w:proofErr w:type="gramStart"/>
-      <w:r>
-        <w:t>%}({{ res.wan</w:t>
-      </w:r>
-      <w:proofErr w:type="gramEnd"/>
-      <w:r>
-        <w:t>_</w:t>
-      </w:r>
-      <w:proofErr w:type="gramStart"/>
-      <w:r>
-        <w:t>status.WAN</w:t>
-      </w:r>
-      <w:proofErr w:type="gramEnd"/>
-      <w:r>
-        <w:t>2</w:t>
-      </w:r>
-      <w:r>
-        <w:t>_</w:t>
-      </w:r>
-      <w:proofErr w:type="gramStart"/>
-      <w:r>
-        <w:t>IP }}){</w:t>
-      </w:r>
-      <w:proofErr w:type="gramEnd"/>
-      <w:r>
-        <w:t xml:space="preserve">% </w:t>
-      </w:r>
-      <w:proofErr w:type="gramStart"/>
-      <w:r>
-        <w:t>endif %}</w:t>
-      </w:r>
-      <w:proofErr w:type="gramEnd"/>
-    </w:p>
-    <w:p>
-      <w:r>
-        <w:t>{%</w:t>
-      </w:r>
-      <w:r>
-        <w:t>p</w:t>
-      </w:r>
-      <w:r>
-        <w:t xml:space="preserve"> if res.wan_</w:t>
-      </w:r>
-      <w:proofErr w:type="gramStart"/>
-      <w:r>
-        <w:t>status.WAN</w:t>
-      </w:r>
-      <w:proofErr w:type="gramEnd"/>
-      <w:r>
-        <w:t>3 %}</w:t>
+        <w:t xml:space="preserve"> if res.rule_name == "FortiGate" %}</w:t>
       </w:r>
     </w:p>
     <w:p>
+      <w:pPr>
+        <w:pStyle w:val="Ttulo1"/>
+      </w:pPr>
       <w:r>
-        <w:t>WAN3</w:t>
-      </w:r>
-      <w:r>
-        <w:t xml:space="preserve"> Link Status</w:t>
-      </w:r>
-      <w:r>
-        <w:t xml:space="preserve">: </w:t>
-      </w:r>
-      <w:proofErr w:type="gramStart"/>
-      <w:r>
-        <w:t>{{ res.wan</w:t>
-      </w:r>
-      <w:proofErr w:type="gramEnd"/>
-      <w:r>
-        <w:t>_</w:t>
-      </w:r>
-      <w:proofErr w:type="gramStart"/>
-      <w:r>
-        <w:t>status.WAN3 }</w:t>
-      </w:r>
-      <w:proofErr w:type="gramEnd"/>
-      <w:r>
-        <w:t>}</w:t>
-      </w:r>
-      <w:r>
-        <w:t xml:space="preserve"> </w:t>
-      </w:r>
-      <w:r>
-        <w:t>{% if res.wan_</w:t>
-      </w:r>
-      <w:proofErr w:type="gramStart"/>
-      <w:r>
-        <w:t>status.WAN</w:t>
-      </w:r>
-      <w:proofErr w:type="gramEnd"/>
-      <w:r>
-        <w:t>3</w:t>
-      </w:r>
-      <w:r>
-        <w:t xml:space="preserve">_IP </w:t>
-      </w:r>
-      <w:proofErr w:type="gramStart"/>
-      <w:r>
-        <w:t>%}({{ res.wan</w:t>
-      </w:r>
-      <w:proofErr w:type="gramEnd"/>
-      <w:r>
-        <w:t>_</w:t>
-      </w:r>
-      <w:proofErr w:type="gramStart"/>
-      <w:r>
-        <w:t>status.WAN</w:t>
-      </w:r>
-      <w:proofErr w:type="gramEnd"/>
-      <w:r>
-        <w:t>3</w:t>
-      </w:r>
-      <w:r>
-        <w:t>_</w:t>
-      </w:r>
-      <w:proofErr w:type="gramStart"/>
-      <w:r>
-        <w:t>IP }}){</w:t>
-      </w:r>
-      <w:proofErr w:type="gramEnd"/>
-      <w:r>
-        <w:t xml:space="preserve">% </w:t>
-      </w:r>
-      <w:proofErr w:type="gramStart"/>
-      <w:r>
-        <w:t>endif %}</w:t>
-      </w:r>
-      <w:proofErr w:type="gramEnd"/>
-    </w:p>
-    <w:p>
-      <w:r>
-        <w:t>{%</w:t>
-      </w:r>
-      <w:r>
-        <w:t>p</w:t>
-      </w:r>
-      <w:r>
-        <w:t xml:space="preserve"> </w:t>
-      </w:r>
-      <w:proofErr w:type="gramStart"/>
-      <w:r>
-        <w:t>endif %}</w:t>
-      </w:r>
-      <w:proofErr w:type="gramEnd"/>
-    </w:p>
-    <w:p>
-      <w:r>
-        <w:t>{%</w:t>
-      </w:r>
-      <w:r>
-        <w:t>p</w:t>
-      </w:r>
-      <w:r>
-        <w:t xml:space="preserve"> if </w:t>
-      </w:r>
-      <w:proofErr w:type="spellStart"/>
-      <w:proofErr w:type="gramStart"/>
-      <w:r>
-        <w:t>res.screenshot</w:t>
-      </w:r>
-      <w:proofErr w:type="spellEnd"/>
-      <w:proofErr w:type="gramEnd"/>
-      <w:r>
-        <w:t xml:space="preserve"> %}</w:t>
-      </w:r>
-    </w:p>
-    <w:p>
-      <w:r>
-        <w:t>Evidence (Screenshot):</w:t>
-      </w:r>
-    </w:p>
-    <w:p>
-      <w:proofErr w:type="gramStart"/>
-      <w:r>
-        <w:t xml:space="preserve">{{ </w:t>
-      </w:r>
-      <w:proofErr w:type="spellStart"/>
-      <w:r>
-        <w:t>res</w:t>
-      </w:r>
-      <w:proofErr w:type="gramEnd"/>
-      <w:r>
-        <w:t>.</w:t>
-      </w:r>
-      <w:proofErr w:type="gramStart"/>
-      <w:r>
-        <w:t>screenshot</w:t>
-      </w:r>
-      <w:proofErr w:type="spellEnd"/>
-      <w:r>
-        <w:t xml:space="preserve"> }</w:t>
-      </w:r>
-      <w:proofErr w:type="gramEnd"/>
-      <w:r>
-        <w:t>}</w:t>
+        <w:t>{{ res.rule_name }}: {{ res.host }}</w:t>
       </w:r>
     </w:p>
     <w:p>
@@ -487,13 +162,223 @@
         <w:t>p</w:t>
       </w:r>
       <w:r>
-        <w:t xml:space="preserve"> </w:t>
+        <w:t xml:space="preserve"> if res.error %}</w:t>
       </w:r>
-      <w:proofErr w:type="gramStart"/>
+    </w:p>
+    <w:p>
       <w:r>
-        <w:t>else %}</w:t>
+        <w:t>Error: {{ res.error }}</w:t>
       </w:r>
-      <w:proofErr w:type="gramEnd"/>
+    </w:p>
+    <w:p>
+      <w:r>
+        <w:t>{%</w:t>
+      </w:r>
+      <w:r>
+        <w:t>p</w:t>
+      </w:r>
+      <w:r>
+        <w:t xml:space="preserve"> else %}</w:t>
+      </w:r>
+    </w:p>
+    <w:p>
+      <w:r>
+        <w:t xml:space="preserve">WAN1 Link Status: {% if res.wan_status.WAN1_IP %}{{ res.wan_status.WAN1_IP }}{% endif %} ({{ res.wan_status.WAN1 }}) {% if res.wan_status.WAN1_LATENCY %}{% set ping = res.wan_status.WAN1_LATENCY|int %}Latency: {{ ping }}ms ({% if ping &lt;= 50 %}Ok </w:t>
+      </w:r>
+      <w:r>
+        <w:rPr>
+          <w:rFonts w:ascii="Segoe UI Emoji" w:hAnsi="Segoe UI Emoji" w:cs="Segoe UI Emoji"/>
+        </w:rPr>
+        <w:t>🟢</w:t>
+      </w:r>
+      <w:r>
+        <w:t xml:space="preserve">{% elif ping &lt;= 150 %}Warning </w:t>
+      </w:r>
+      <w:r>
+        <w:rPr>
+          <w:rFonts w:ascii="Segoe UI Emoji" w:hAnsi="Segoe UI Emoji" w:cs="Segoe UI Emoji"/>
+        </w:rPr>
+        <w:t>🟡</w:t>
+      </w:r>
+      <w:r>
+        <w:t xml:space="preserve">{% else %}Critical </w:t>
+      </w:r>
+      <w:r>
+        <w:rPr>
+          <w:rFonts w:ascii="Segoe UI Emoji" w:hAnsi="Segoe UI Emoji" w:cs="Segoe UI Emoji"/>
+        </w:rPr>
+        <w:t>🔴</w:t>
+      </w:r>
+      <w:r>
+        <w:t>{% endif %}){% else %}</w:t>
+      </w:r>
+      <w:r>
+        <w:t>(</w:t>
+      </w:r>
+      <w:r>
+        <w:t xml:space="preserve">Ping Timeout </w:t>
+      </w:r>
+      <w:r>
+        <w:rPr>
+          <w:rFonts w:ascii="Segoe UI Emoji" w:hAnsi="Segoe UI Emoji" w:cs="Segoe UI Emoji"/>
+        </w:rPr>
+        <w:t>❌</w:t>
+      </w:r>
+      <w:r>
+        <w:t>){% endif %}</w:t>
+      </w:r>
+    </w:p>
+    <w:p>
+      <w:r>
+        <w:t xml:space="preserve">WAN2 Link Status: {% if res.wan_status.WAN2_IP %}{{ res.wan_status.WAN2_IP }}{% endif %} ({{ res.wan_status.WAN2 }}) {% if res.wan_status.WAN2_LATENCY %}{% set ping = res.wan_status.WAN2_LATENCY|int %}Latency: {{ ping }}ms ({% if ping &lt;= 50 %}Ok </w:t>
+      </w:r>
+      <w:r>
+        <w:rPr>
+          <w:rFonts w:ascii="Segoe UI Emoji" w:hAnsi="Segoe UI Emoji" w:cs="Segoe UI Emoji"/>
+        </w:rPr>
+        <w:t>🟢</w:t>
+      </w:r>
+      <w:r>
+        <w:t xml:space="preserve">{% </w:t>
+      </w:r>
+      <w:r>
+        <w:lastRenderedPageBreak/>
+        <w:t xml:space="preserve">elif ping &lt;= 150 %}Warning </w:t>
+      </w:r>
+      <w:r>
+        <w:rPr>
+          <w:rFonts w:ascii="Segoe UI Emoji" w:hAnsi="Segoe UI Emoji" w:cs="Segoe UI Emoji"/>
+        </w:rPr>
+        <w:t>🟡</w:t>
+      </w:r>
+      <w:r>
+        <w:t xml:space="preserve">{% else %}Critical </w:t>
+      </w:r>
+      <w:r>
+        <w:rPr>
+          <w:rFonts w:ascii="Segoe UI Emoji" w:hAnsi="Segoe UI Emoji" w:cs="Segoe UI Emoji"/>
+        </w:rPr>
+        <w:t>🔴</w:t>
+      </w:r>
+      <w:r>
+        <w:t>{% endif %}){% else %}</w:t>
+      </w:r>
+      <w:r>
+        <w:t>(</w:t>
+      </w:r>
+      <w:r>
+        <w:t xml:space="preserve">Ping Timeout </w:t>
+      </w:r>
+      <w:r>
+        <w:rPr>
+          <w:rFonts w:ascii="Segoe UI Emoji" w:hAnsi="Segoe UI Emoji" w:cs="Segoe UI Emoji"/>
+        </w:rPr>
+        <w:t>❌</w:t>
+      </w:r>
+      <w:r>
+        <w:t>){% endif %}</w:t>
+      </w:r>
+    </w:p>
+    <w:p>
+      <w:r>
+        <w:t>{%</w:t>
+      </w:r>
+      <w:r>
+        <w:t>p</w:t>
+      </w:r>
+      <w:r>
+        <w:t xml:space="preserve"> if res.wan_status.WAN3 %}</w:t>
+      </w:r>
+    </w:p>
+    <w:p>
+      <w:r>
+        <w:t xml:space="preserve">WAN3 Link Status: {% if res.wan_status.WAN3_IP %}{{ res.wan_status.WAN3_IP }}{% endif %} ({{ res.wan_status.WAN3 }}) {% if res.wan_status.WAN3_LATENCY %}{% set ping = res.wan_status.WAN3_LATENCY|int %}Latency: {{ ping }}ms ({% if ping &lt;= 50 %}Ok </w:t>
+      </w:r>
+      <w:r>
+        <w:rPr>
+          <w:rFonts w:ascii="Segoe UI Emoji" w:hAnsi="Segoe UI Emoji" w:cs="Segoe UI Emoji"/>
+        </w:rPr>
+        <w:t>🟢</w:t>
+      </w:r>
+      <w:r>
+        <w:t xml:space="preserve">{% elif ping &lt;= 150 %}Warning </w:t>
+      </w:r>
+      <w:r>
+        <w:rPr>
+          <w:rFonts w:ascii="Segoe UI Emoji" w:hAnsi="Segoe UI Emoji" w:cs="Segoe UI Emoji"/>
+        </w:rPr>
+        <w:t>🟡</w:t>
+      </w:r>
+      <w:r>
+        <w:t xml:space="preserve">{% else %}Critical </w:t>
+      </w:r>
+      <w:r>
+        <w:rPr>
+          <w:rFonts w:ascii="Segoe UI Emoji" w:hAnsi="Segoe UI Emoji" w:cs="Segoe UI Emoji"/>
+        </w:rPr>
+        <w:t>🔴</w:t>
+      </w:r>
+      <w:r>
+        <w:t>{% endif %}){% else %}</w:t>
+      </w:r>
+      <w:r>
+        <w:t>(</w:t>
+      </w:r>
+      <w:r>
+        <w:t xml:space="preserve">Ping Timeout </w:t>
+      </w:r>
+      <w:r>
+        <w:rPr>
+          <w:rFonts w:ascii="Segoe UI Emoji" w:hAnsi="Segoe UI Emoji" w:cs="Segoe UI Emoji"/>
+        </w:rPr>
+        <w:t>❌</w:t>
+      </w:r>
+      <w:r>
+        <w:t>){% endif %}</w:t>
+      </w:r>
+    </w:p>
+    <w:p>
+      <w:r>
+        <w:t>{%</w:t>
+      </w:r>
+      <w:r>
+        <w:t>p</w:t>
+      </w:r>
+      <w:r>
+        <w:t xml:space="preserve"> endif %}</w:t>
+      </w:r>
+    </w:p>
+    <w:p>
+      <w:r>
+        <w:t>{%</w:t>
+      </w:r>
+      <w:r>
+        <w:t>p</w:t>
+      </w:r>
+      <w:r>
+        <w:t xml:space="preserve"> if res.screenshot %}</w:t>
+      </w:r>
+    </w:p>
+    <w:p>
+      <w:r>
+        <w:t>Evidence (Screenshot):</w:t>
+      </w:r>
+    </w:p>
+    <w:p>
+      <w:r>
+        <w:t>{{ res.screenshot }}</w:t>
+      </w:r>
+    </w:p>
+    <w:p>
+      <w:r>
+        <w:t>{%</w:t>
+      </w:r>
+      <w:r>
+        <w:t>p</w:t>
+      </w:r>
+      <w:r>
+        <w:t xml:space="preserve"> else %}</w:t>
+      </w:r>
     </w:p>
     <w:p>
       <w:r>
@@ -508,13 +393,8 @@
         <w:t>p</w:t>
       </w:r>
       <w:r>
-        <w:t xml:space="preserve"> </w:t>
+        <w:t xml:space="preserve"> endif %}</w:t>
       </w:r>
-      <w:proofErr w:type="gramStart"/>
-      <w:r>
-        <w:t>endif %}</w:t>
-      </w:r>
-      <w:proofErr w:type="gramEnd"/>
     </w:p>
     <w:p>
       <w:r>
@@ -524,16 +404,11 @@
         <w:t>p</w:t>
       </w:r>
       <w:r>
-        <w:t xml:space="preserve"> </w:t>
-      </w:r>
-      <w:proofErr w:type="gramStart"/>
-      <w:r>
-        <w:t>endif %</w:t>
+        <w:t xml:space="preserve"> endif %</w:t>
       </w:r>
       <w:r>
         <w:t>}</w:t>
       </w:r>
-      <w:proofErr w:type="gramEnd"/>
     </w:p>
     <w:p>
       <w:r>
@@ -543,13 +418,8 @@
         <w:t>p</w:t>
       </w:r>
       <w:r>
-        <w:t xml:space="preserve"> </w:t>
+        <w:t xml:space="preserve"> endif %}</w:t>
       </w:r>
-      <w:proofErr w:type="gramStart"/>
-      <w:r>
-        <w:t>endif %}</w:t>
-      </w:r>
-      <w:proofErr w:type="gramEnd"/>
     </w:p>
     <w:p>
       <w:r>
@@ -559,18 +429,8 @@
         <w:t>p</w:t>
       </w:r>
       <w:r>
-        <w:t xml:space="preserve"> </w:t>
+        <w:t xml:space="preserve"> endfor %}</w:t>
       </w:r>
-      <w:proofErr w:type="spellStart"/>
-      <w:proofErr w:type="gramStart"/>
-      <w:r>
-        <w:t>endfor</w:t>
-      </w:r>
-      <w:proofErr w:type="spellEnd"/>
-      <w:r>
-        <w:t xml:space="preserve"> %}</w:t>
-      </w:r>
-      <w:proofErr w:type="gramEnd"/>
     </w:p>
     <w:sectPr>
       <w:pgSz w:w="12240" w:h="15840"/>

</xml_diff>

<commit_message>
feat(templates): update docx templates and config to handle generic ping devices
</commit_message>
<xml_diff>
--- a/template_en.example.docx
+++ b/template_en.example.docx
@@ -64,7 +64,93 @@
         <w:rPr>
           <w:rFonts w:ascii="Cambria" w:eastAsia="MS Mincho" w:hAnsi="Cambria" w:cs="Times New Roman"/>
         </w:rPr>
-        <w:t xml:space="preserve"> Ok (Ping ≤ 50ms): {{ results | rejectattr('latency', 'equalto', '') | selectattr('latency', 'le', 50) | list | length }}</w:t>
+        <w:t xml:space="preserve"> Ok (Ping ≤ 50ms): </w:t>
+      </w:r>
+      <w:proofErr w:type="gramStart"/>
+      <w:r>
+        <w:rPr>
+          <w:rFonts w:ascii="Cambria" w:eastAsia="MS Mincho" w:hAnsi="Cambria" w:cs="Times New Roman"/>
+        </w:rPr>
+        <w:t>{{ results</w:t>
+      </w:r>
+      <w:proofErr w:type="gramEnd"/>
+      <w:r>
+        <w:rPr>
+          <w:rFonts w:ascii="Cambria" w:eastAsia="MS Mincho" w:hAnsi="Cambria" w:cs="Times New Roman"/>
+        </w:rPr>
+        <w:t xml:space="preserve"> | </w:t>
+      </w:r>
+      <w:proofErr w:type="spellStart"/>
+      <w:proofErr w:type="gramStart"/>
+      <w:r>
+        <w:rPr>
+          <w:rFonts w:ascii="Cambria" w:eastAsia="MS Mincho" w:hAnsi="Cambria" w:cs="Times New Roman"/>
+        </w:rPr>
+        <w:t>rejectattr</w:t>
+      </w:r>
+      <w:proofErr w:type="spellEnd"/>
+      <w:r>
+        <w:rPr>
+          <w:rFonts w:ascii="Cambria" w:eastAsia="MS Mincho" w:hAnsi="Cambria" w:cs="Times New Roman"/>
+        </w:rPr>
+        <w:t>(</w:t>
+      </w:r>
+      <w:proofErr w:type="gramEnd"/>
+      <w:r>
+        <w:rPr>
+          <w:rFonts w:ascii="Cambria" w:eastAsia="MS Mincho" w:hAnsi="Cambria" w:cs="Times New Roman"/>
+        </w:rPr>
+        <w:t>'latency', '</w:t>
+      </w:r>
+      <w:proofErr w:type="spellStart"/>
+      <w:r>
+        <w:rPr>
+          <w:rFonts w:ascii="Cambria" w:eastAsia="MS Mincho" w:hAnsi="Cambria" w:cs="Times New Roman"/>
+        </w:rPr>
+        <w:t>equalto</w:t>
+      </w:r>
+      <w:proofErr w:type="spellEnd"/>
+      <w:r>
+        <w:rPr>
+          <w:rFonts w:ascii="Cambria" w:eastAsia="MS Mincho" w:hAnsi="Cambria" w:cs="Times New Roman"/>
+        </w:rPr>
+        <w:t xml:space="preserve">', '') | </w:t>
+      </w:r>
+      <w:proofErr w:type="spellStart"/>
+      <w:proofErr w:type="gramStart"/>
+      <w:r>
+        <w:rPr>
+          <w:rFonts w:ascii="Cambria" w:eastAsia="MS Mincho" w:hAnsi="Cambria" w:cs="Times New Roman"/>
+        </w:rPr>
+        <w:t>selectattr</w:t>
+      </w:r>
+      <w:proofErr w:type="spellEnd"/>
+      <w:r>
+        <w:rPr>
+          <w:rFonts w:ascii="Cambria" w:eastAsia="MS Mincho" w:hAnsi="Cambria" w:cs="Times New Roman"/>
+        </w:rPr>
+        <w:t>(</w:t>
+      </w:r>
+      <w:proofErr w:type="gramEnd"/>
+      <w:r>
+        <w:rPr>
+          <w:rFonts w:ascii="Cambria" w:eastAsia="MS Mincho" w:hAnsi="Cambria" w:cs="Times New Roman"/>
+        </w:rPr>
+        <w:t xml:space="preserve">'latency', 'le', 50) | list | </w:t>
+      </w:r>
+      <w:proofErr w:type="gramStart"/>
+      <w:r>
+        <w:rPr>
+          <w:rFonts w:ascii="Cambria" w:eastAsia="MS Mincho" w:hAnsi="Cambria" w:cs="Times New Roman"/>
+        </w:rPr>
+        <w:t>length }</w:t>
+      </w:r>
+      <w:proofErr w:type="gramEnd"/>
+      <w:r>
+        <w:rPr>
+          <w:rFonts w:ascii="Cambria" w:eastAsia="MS Mincho" w:hAnsi="Cambria" w:cs="Times New Roman"/>
+        </w:rPr>
+        <w:t>}</w:t>
       </w:r>
     </w:p>
     <w:p>
@@ -83,7 +169,293 @@
         <w:rPr>
           <w:rFonts w:ascii="Cambria" w:eastAsia="MS Mincho" w:hAnsi="Cambria" w:cs="Times New Roman"/>
         </w:rPr>
-        <w:t xml:space="preserve"> Warning (Ping 50ms ≤ 150ms): {{ results | rejectattr('latency', 'equalto', '') | selectattr('latency', 'gt', 50) | selectattr('latency', 'le', 150) | list | length }}{% set warns = results | rejectattr('latency', 'equalto', '') | selectattr('latency', 'gt', 50) | selectattr('latency', 'le', 150) | map(attribute='host') | list %}{% if warns|length &gt; 0 %} ({{ warns | join(', ') }}){% endif %}</w:t>
+        <w:t xml:space="preserve"> Warning (Ping 50ms ≤ 150ms): </w:t>
+      </w:r>
+      <w:proofErr w:type="gramStart"/>
+      <w:r>
+        <w:rPr>
+          <w:rFonts w:ascii="Cambria" w:eastAsia="MS Mincho" w:hAnsi="Cambria" w:cs="Times New Roman"/>
+        </w:rPr>
+        <w:t>{{ results</w:t>
+      </w:r>
+      <w:proofErr w:type="gramEnd"/>
+      <w:r>
+        <w:rPr>
+          <w:rFonts w:ascii="Cambria" w:eastAsia="MS Mincho" w:hAnsi="Cambria" w:cs="Times New Roman"/>
+        </w:rPr>
+        <w:t xml:space="preserve"> | </w:t>
+      </w:r>
+      <w:proofErr w:type="spellStart"/>
+      <w:proofErr w:type="gramStart"/>
+      <w:r>
+        <w:rPr>
+          <w:rFonts w:ascii="Cambria" w:eastAsia="MS Mincho" w:hAnsi="Cambria" w:cs="Times New Roman"/>
+        </w:rPr>
+        <w:t>rejectattr</w:t>
+      </w:r>
+      <w:proofErr w:type="spellEnd"/>
+      <w:r>
+        <w:rPr>
+          <w:rFonts w:ascii="Cambria" w:eastAsia="MS Mincho" w:hAnsi="Cambria" w:cs="Times New Roman"/>
+        </w:rPr>
+        <w:t>(</w:t>
+      </w:r>
+      <w:proofErr w:type="gramEnd"/>
+      <w:r>
+        <w:rPr>
+          <w:rFonts w:ascii="Cambria" w:eastAsia="MS Mincho" w:hAnsi="Cambria" w:cs="Times New Roman"/>
+        </w:rPr>
+        <w:t>'latency', '</w:t>
+      </w:r>
+      <w:proofErr w:type="spellStart"/>
+      <w:r>
+        <w:rPr>
+          <w:rFonts w:ascii="Cambria" w:eastAsia="MS Mincho" w:hAnsi="Cambria" w:cs="Times New Roman"/>
+        </w:rPr>
+        <w:t>equalto</w:t>
+      </w:r>
+      <w:proofErr w:type="spellEnd"/>
+      <w:r>
+        <w:rPr>
+          <w:rFonts w:ascii="Cambria" w:eastAsia="MS Mincho" w:hAnsi="Cambria" w:cs="Times New Roman"/>
+        </w:rPr>
+        <w:t xml:space="preserve">', '') | </w:t>
+      </w:r>
+      <w:proofErr w:type="spellStart"/>
+      <w:proofErr w:type="gramStart"/>
+      <w:r>
+        <w:rPr>
+          <w:rFonts w:ascii="Cambria" w:eastAsia="MS Mincho" w:hAnsi="Cambria" w:cs="Times New Roman"/>
+        </w:rPr>
+        <w:t>selectattr</w:t>
+      </w:r>
+      <w:proofErr w:type="spellEnd"/>
+      <w:r>
+        <w:rPr>
+          <w:rFonts w:ascii="Cambria" w:eastAsia="MS Mincho" w:hAnsi="Cambria" w:cs="Times New Roman"/>
+        </w:rPr>
+        <w:t>(</w:t>
+      </w:r>
+      <w:proofErr w:type="gramEnd"/>
+      <w:r>
+        <w:rPr>
+          <w:rFonts w:ascii="Cambria" w:eastAsia="MS Mincho" w:hAnsi="Cambria" w:cs="Times New Roman"/>
+        </w:rPr>
+        <w:t>'latency', '</w:t>
+      </w:r>
+      <w:proofErr w:type="spellStart"/>
+      <w:r>
+        <w:rPr>
+          <w:rFonts w:ascii="Cambria" w:eastAsia="MS Mincho" w:hAnsi="Cambria" w:cs="Times New Roman"/>
+        </w:rPr>
+        <w:t>gt</w:t>
+      </w:r>
+      <w:proofErr w:type="spellEnd"/>
+      <w:r>
+        <w:rPr>
+          <w:rFonts w:ascii="Cambria" w:eastAsia="MS Mincho" w:hAnsi="Cambria" w:cs="Times New Roman"/>
+        </w:rPr>
+        <w:t xml:space="preserve">', 50) | </w:t>
+      </w:r>
+      <w:proofErr w:type="spellStart"/>
+      <w:proofErr w:type="gramStart"/>
+      <w:r>
+        <w:rPr>
+          <w:rFonts w:ascii="Cambria" w:eastAsia="MS Mincho" w:hAnsi="Cambria" w:cs="Times New Roman"/>
+        </w:rPr>
+        <w:t>selectattr</w:t>
+      </w:r>
+      <w:proofErr w:type="spellEnd"/>
+      <w:r>
+        <w:rPr>
+          <w:rFonts w:ascii="Cambria" w:eastAsia="MS Mincho" w:hAnsi="Cambria" w:cs="Times New Roman"/>
+        </w:rPr>
+        <w:t>(</w:t>
+      </w:r>
+      <w:proofErr w:type="gramEnd"/>
+      <w:r>
+        <w:rPr>
+          <w:rFonts w:ascii="Cambria" w:eastAsia="MS Mincho" w:hAnsi="Cambria" w:cs="Times New Roman"/>
+        </w:rPr>
+        <w:t xml:space="preserve">'latency', 'le', 150) | list | </w:t>
+      </w:r>
+      <w:proofErr w:type="gramStart"/>
+      <w:r>
+        <w:rPr>
+          <w:rFonts w:ascii="Cambria" w:eastAsia="MS Mincho" w:hAnsi="Cambria" w:cs="Times New Roman"/>
+        </w:rPr>
+        <w:t>length }}{</w:t>
+      </w:r>
+      <w:proofErr w:type="gramEnd"/>
+      <w:r>
+        <w:rPr>
+          <w:rFonts w:ascii="Cambria" w:eastAsia="MS Mincho" w:hAnsi="Cambria" w:cs="Times New Roman"/>
+        </w:rPr>
+        <w:t xml:space="preserve">% set warns = results | </w:t>
+      </w:r>
+      <w:proofErr w:type="spellStart"/>
+      <w:proofErr w:type="gramStart"/>
+      <w:r>
+        <w:rPr>
+          <w:rFonts w:ascii="Cambria" w:eastAsia="MS Mincho" w:hAnsi="Cambria" w:cs="Times New Roman"/>
+        </w:rPr>
+        <w:t>rejectattr</w:t>
+      </w:r>
+      <w:proofErr w:type="spellEnd"/>
+      <w:r>
+        <w:rPr>
+          <w:rFonts w:ascii="Cambria" w:eastAsia="MS Mincho" w:hAnsi="Cambria" w:cs="Times New Roman"/>
+        </w:rPr>
+        <w:t>(</w:t>
+      </w:r>
+      <w:proofErr w:type="gramEnd"/>
+      <w:r>
+        <w:rPr>
+          <w:rFonts w:ascii="Cambria" w:eastAsia="MS Mincho" w:hAnsi="Cambria" w:cs="Times New Roman"/>
+        </w:rPr>
+        <w:t>'latency', '</w:t>
+      </w:r>
+      <w:proofErr w:type="spellStart"/>
+      <w:r>
+        <w:rPr>
+          <w:rFonts w:ascii="Cambria" w:eastAsia="MS Mincho" w:hAnsi="Cambria" w:cs="Times New Roman"/>
+        </w:rPr>
+        <w:t>equalto</w:t>
+      </w:r>
+      <w:proofErr w:type="spellEnd"/>
+      <w:r>
+        <w:rPr>
+          <w:rFonts w:ascii="Cambria" w:eastAsia="MS Mincho" w:hAnsi="Cambria" w:cs="Times New Roman"/>
+        </w:rPr>
+        <w:t xml:space="preserve">', '') | </w:t>
+      </w:r>
+      <w:proofErr w:type="spellStart"/>
+      <w:proofErr w:type="gramStart"/>
+      <w:r>
+        <w:rPr>
+          <w:rFonts w:ascii="Cambria" w:eastAsia="MS Mincho" w:hAnsi="Cambria" w:cs="Times New Roman"/>
+        </w:rPr>
+        <w:t>selectattr</w:t>
+      </w:r>
+      <w:proofErr w:type="spellEnd"/>
+      <w:r>
+        <w:rPr>
+          <w:rFonts w:ascii="Cambria" w:eastAsia="MS Mincho" w:hAnsi="Cambria" w:cs="Times New Roman"/>
+        </w:rPr>
+        <w:t>(</w:t>
+      </w:r>
+      <w:proofErr w:type="gramEnd"/>
+      <w:r>
+        <w:rPr>
+          <w:rFonts w:ascii="Cambria" w:eastAsia="MS Mincho" w:hAnsi="Cambria" w:cs="Times New Roman"/>
+        </w:rPr>
+        <w:t>'latency', '</w:t>
+      </w:r>
+      <w:proofErr w:type="spellStart"/>
+      <w:r>
+        <w:rPr>
+          <w:rFonts w:ascii="Cambria" w:eastAsia="MS Mincho" w:hAnsi="Cambria" w:cs="Times New Roman"/>
+        </w:rPr>
+        <w:t>gt</w:t>
+      </w:r>
+      <w:proofErr w:type="spellEnd"/>
+      <w:r>
+        <w:rPr>
+          <w:rFonts w:ascii="Cambria" w:eastAsia="MS Mincho" w:hAnsi="Cambria" w:cs="Times New Roman"/>
+        </w:rPr>
+        <w:t xml:space="preserve">', 50) | </w:t>
+      </w:r>
+      <w:proofErr w:type="spellStart"/>
+      <w:proofErr w:type="gramStart"/>
+      <w:r>
+        <w:rPr>
+          <w:rFonts w:ascii="Cambria" w:eastAsia="MS Mincho" w:hAnsi="Cambria" w:cs="Times New Roman"/>
+        </w:rPr>
+        <w:t>selectattr</w:t>
+      </w:r>
+      <w:proofErr w:type="spellEnd"/>
+      <w:r>
+        <w:rPr>
+          <w:rFonts w:ascii="Cambria" w:eastAsia="MS Mincho" w:hAnsi="Cambria" w:cs="Times New Roman"/>
+        </w:rPr>
+        <w:t>(</w:t>
+      </w:r>
+      <w:proofErr w:type="gramEnd"/>
+      <w:r>
+        <w:rPr>
+          <w:rFonts w:ascii="Cambria" w:eastAsia="MS Mincho" w:hAnsi="Cambria" w:cs="Times New Roman"/>
+        </w:rPr>
+        <w:t xml:space="preserve">'latency', 'le', 150) | map(attribute='host') | list </w:t>
+      </w:r>
+      <w:proofErr w:type="gramStart"/>
+      <w:r>
+        <w:rPr>
+          <w:rFonts w:ascii="Cambria" w:eastAsia="MS Mincho" w:hAnsi="Cambria" w:cs="Times New Roman"/>
+        </w:rPr>
+        <w:t>%}{</w:t>
+      </w:r>
+      <w:proofErr w:type="gramEnd"/>
+      <w:r>
+        <w:rPr>
+          <w:rFonts w:ascii="Cambria" w:eastAsia="MS Mincho" w:hAnsi="Cambria" w:cs="Times New Roman"/>
+        </w:rPr>
+        <w:t xml:space="preserve">% if </w:t>
+      </w:r>
+      <w:proofErr w:type="spellStart"/>
+      <w:r>
+        <w:rPr>
+          <w:rFonts w:ascii="Cambria" w:eastAsia="MS Mincho" w:hAnsi="Cambria" w:cs="Times New Roman"/>
+        </w:rPr>
+        <w:t>warns|length</w:t>
+      </w:r>
+      <w:proofErr w:type="spellEnd"/>
+      <w:r>
+        <w:rPr>
+          <w:rFonts w:ascii="Cambria" w:eastAsia="MS Mincho" w:hAnsi="Cambria" w:cs="Times New Roman"/>
+        </w:rPr>
+        <w:t xml:space="preserve"> &gt; 0 %} (</w:t>
+      </w:r>
+      <w:proofErr w:type="gramStart"/>
+      <w:r>
+        <w:rPr>
+          <w:rFonts w:ascii="Cambria" w:eastAsia="MS Mincho" w:hAnsi="Cambria" w:cs="Times New Roman"/>
+        </w:rPr>
+        <w:t>{{ warns</w:t>
+      </w:r>
+      <w:proofErr w:type="gramEnd"/>
+      <w:r>
+        <w:rPr>
+          <w:rFonts w:ascii="Cambria" w:eastAsia="MS Mincho" w:hAnsi="Cambria" w:cs="Times New Roman"/>
+        </w:rPr>
+        <w:t xml:space="preserve"> | </w:t>
+      </w:r>
+      <w:proofErr w:type="gramStart"/>
+      <w:r>
+        <w:rPr>
+          <w:rFonts w:ascii="Cambria" w:eastAsia="MS Mincho" w:hAnsi="Cambria" w:cs="Times New Roman"/>
+        </w:rPr>
+        <w:t>join(</w:t>
+      </w:r>
+      <w:proofErr w:type="gramEnd"/>
+      <w:r>
+        <w:rPr>
+          <w:rFonts w:ascii="Cambria" w:eastAsia="MS Mincho" w:hAnsi="Cambria" w:cs="Times New Roman"/>
+        </w:rPr>
+        <w:t>', '</w:t>
+      </w:r>
+      <w:proofErr w:type="gramStart"/>
+      <w:r>
+        <w:rPr>
+          <w:rFonts w:ascii="Cambria" w:eastAsia="MS Mincho" w:hAnsi="Cambria" w:cs="Times New Roman"/>
+        </w:rPr>
+        <w:t>) }}){</w:t>
+      </w:r>
+      <w:proofErr w:type="gramEnd"/>
+      <w:r>
+        <w:rPr>
+          <w:rFonts w:ascii="Cambria" w:eastAsia="MS Mincho" w:hAnsi="Cambria" w:cs="Times New Roman"/>
+        </w:rPr>
+        <w:t>% endif %}</w:t>
       </w:r>
     </w:p>
     <w:p>
@@ -102,7 +474,249 @@
         <w:rPr>
           <w:rFonts w:ascii="Cambria" w:eastAsia="MS Mincho" w:hAnsi="Cambria" w:cs="Times New Roman"/>
         </w:rPr>
-        <w:t xml:space="preserve"> Critical (Ping ≥ 150ms): {{ results | rejectattr('latency', 'equalto', '') | selectattr('latency', 'gt', 150) | list | length }}{% set crits = results | rejectattr('latency', 'equalto', '') | selectattr('latency', 'gt', 150) | map(attribute='host') | list %}{% if crits|length &gt; 0 %} ({{ crits | join(', ') }}){% endif %}</w:t>
+        <w:t xml:space="preserve"> Critical (Ping ≥ 150ms): </w:t>
+      </w:r>
+      <w:proofErr w:type="gramStart"/>
+      <w:r>
+        <w:rPr>
+          <w:rFonts w:ascii="Cambria" w:eastAsia="MS Mincho" w:hAnsi="Cambria" w:cs="Times New Roman"/>
+        </w:rPr>
+        <w:t>{{ results</w:t>
+      </w:r>
+      <w:proofErr w:type="gramEnd"/>
+      <w:r>
+        <w:rPr>
+          <w:rFonts w:ascii="Cambria" w:eastAsia="MS Mincho" w:hAnsi="Cambria" w:cs="Times New Roman"/>
+        </w:rPr>
+        <w:t xml:space="preserve"> | </w:t>
+      </w:r>
+      <w:proofErr w:type="spellStart"/>
+      <w:proofErr w:type="gramStart"/>
+      <w:r>
+        <w:rPr>
+          <w:rFonts w:ascii="Cambria" w:eastAsia="MS Mincho" w:hAnsi="Cambria" w:cs="Times New Roman"/>
+        </w:rPr>
+        <w:t>rejectattr</w:t>
+      </w:r>
+      <w:proofErr w:type="spellEnd"/>
+      <w:r>
+        <w:rPr>
+          <w:rFonts w:ascii="Cambria" w:eastAsia="MS Mincho" w:hAnsi="Cambria" w:cs="Times New Roman"/>
+        </w:rPr>
+        <w:t>(</w:t>
+      </w:r>
+      <w:proofErr w:type="gramEnd"/>
+      <w:r>
+        <w:rPr>
+          <w:rFonts w:ascii="Cambria" w:eastAsia="MS Mincho" w:hAnsi="Cambria" w:cs="Times New Roman"/>
+        </w:rPr>
+        <w:t>'latency', '</w:t>
+      </w:r>
+      <w:proofErr w:type="spellStart"/>
+      <w:r>
+        <w:rPr>
+          <w:rFonts w:ascii="Cambria" w:eastAsia="MS Mincho" w:hAnsi="Cambria" w:cs="Times New Roman"/>
+        </w:rPr>
+        <w:t>equalto</w:t>
+      </w:r>
+      <w:proofErr w:type="spellEnd"/>
+      <w:r>
+        <w:rPr>
+          <w:rFonts w:ascii="Cambria" w:eastAsia="MS Mincho" w:hAnsi="Cambria" w:cs="Times New Roman"/>
+        </w:rPr>
+        <w:t xml:space="preserve">', '') | </w:t>
+      </w:r>
+      <w:proofErr w:type="spellStart"/>
+      <w:proofErr w:type="gramStart"/>
+      <w:r>
+        <w:rPr>
+          <w:rFonts w:ascii="Cambria" w:eastAsia="MS Mincho" w:hAnsi="Cambria" w:cs="Times New Roman"/>
+        </w:rPr>
+        <w:t>selectattr</w:t>
+      </w:r>
+      <w:proofErr w:type="spellEnd"/>
+      <w:r>
+        <w:rPr>
+          <w:rFonts w:ascii="Cambria" w:eastAsia="MS Mincho" w:hAnsi="Cambria" w:cs="Times New Roman"/>
+        </w:rPr>
+        <w:t>(</w:t>
+      </w:r>
+      <w:proofErr w:type="gramEnd"/>
+      <w:r>
+        <w:rPr>
+          <w:rFonts w:ascii="Cambria" w:eastAsia="MS Mincho" w:hAnsi="Cambria" w:cs="Times New Roman"/>
+        </w:rPr>
+        <w:t>'latency', '</w:t>
+      </w:r>
+      <w:proofErr w:type="spellStart"/>
+      <w:r>
+        <w:rPr>
+          <w:rFonts w:ascii="Cambria" w:eastAsia="MS Mincho" w:hAnsi="Cambria" w:cs="Times New Roman"/>
+        </w:rPr>
+        <w:t>gt</w:t>
+      </w:r>
+      <w:proofErr w:type="spellEnd"/>
+      <w:r>
+        <w:rPr>
+          <w:rFonts w:ascii="Cambria" w:eastAsia="MS Mincho" w:hAnsi="Cambria" w:cs="Times New Roman"/>
+        </w:rPr>
+        <w:t xml:space="preserve">', 150) | list | </w:t>
+      </w:r>
+      <w:proofErr w:type="gramStart"/>
+      <w:r>
+        <w:rPr>
+          <w:rFonts w:ascii="Cambria" w:eastAsia="MS Mincho" w:hAnsi="Cambria" w:cs="Times New Roman"/>
+        </w:rPr>
+        <w:t>length }}{</w:t>
+      </w:r>
+      <w:proofErr w:type="gramEnd"/>
+      <w:r>
+        <w:rPr>
+          <w:rFonts w:ascii="Cambria" w:eastAsia="MS Mincho" w:hAnsi="Cambria" w:cs="Times New Roman"/>
+        </w:rPr>
+        <w:t xml:space="preserve">% set crits = results | </w:t>
+      </w:r>
+      <w:proofErr w:type="spellStart"/>
+      <w:proofErr w:type="gramStart"/>
+      <w:r>
+        <w:rPr>
+          <w:rFonts w:ascii="Cambria" w:eastAsia="MS Mincho" w:hAnsi="Cambria" w:cs="Times New Roman"/>
+        </w:rPr>
+        <w:t>rejectattr</w:t>
+      </w:r>
+      <w:proofErr w:type="spellEnd"/>
+      <w:r>
+        <w:rPr>
+          <w:rFonts w:ascii="Cambria" w:eastAsia="MS Mincho" w:hAnsi="Cambria" w:cs="Times New Roman"/>
+        </w:rPr>
+        <w:t>(</w:t>
+      </w:r>
+      <w:proofErr w:type="gramEnd"/>
+      <w:r>
+        <w:rPr>
+          <w:rFonts w:ascii="Cambria" w:eastAsia="MS Mincho" w:hAnsi="Cambria" w:cs="Times New Roman"/>
+        </w:rPr>
+        <w:t>'latency', '</w:t>
+      </w:r>
+      <w:proofErr w:type="spellStart"/>
+      <w:r>
+        <w:rPr>
+          <w:rFonts w:ascii="Cambria" w:eastAsia="MS Mincho" w:hAnsi="Cambria" w:cs="Times New Roman"/>
+        </w:rPr>
+        <w:t>equalto</w:t>
+      </w:r>
+      <w:proofErr w:type="spellEnd"/>
+      <w:r>
+        <w:rPr>
+          <w:rFonts w:ascii="Cambria" w:eastAsia="MS Mincho" w:hAnsi="Cambria" w:cs="Times New Roman"/>
+        </w:rPr>
+        <w:t xml:space="preserve">', '') | </w:t>
+      </w:r>
+      <w:proofErr w:type="spellStart"/>
+      <w:proofErr w:type="gramStart"/>
+      <w:r>
+        <w:rPr>
+          <w:rFonts w:ascii="Cambria" w:eastAsia="MS Mincho" w:hAnsi="Cambria" w:cs="Times New Roman"/>
+        </w:rPr>
+        <w:t>selectattr</w:t>
+      </w:r>
+      <w:proofErr w:type="spellEnd"/>
+      <w:r>
+        <w:rPr>
+          <w:rFonts w:ascii="Cambria" w:eastAsia="MS Mincho" w:hAnsi="Cambria" w:cs="Times New Roman"/>
+        </w:rPr>
+        <w:t>(</w:t>
+      </w:r>
+      <w:proofErr w:type="gramEnd"/>
+      <w:r>
+        <w:rPr>
+          <w:rFonts w:ascii="Cambria" w:eastAsia="MS Mincho" w:hAnsi="Cambria" w:cs="Times New Roman"/>
+        </w:rPr>
+        <w:t>'latency', '</w:t>
+      </w:r>
+      <w:proofErr w:type="spellStart"/>
+      <w:r>
+        <w:rPr>
+          <w:rFonts w:ascii="Cambria" w:eastAsia="MS Mincho" w:hAnsi="Cambria" w:cs="Times New Roman"/>
+        </w:rPr>
+        <w:t>gt</w:t>
+      </w:r>
+      <w:proofErr w:type="spellEnd"/>
+      <w:r>
+        <w:rPr>
+          <w:rFonts w:ascii="Cambria" w:eastAsia="MS Mincho" w:hAnsi="Cambria" w:cs="Times New Roman"/>
+        </w:rPr>
+        <w:t xml:space="preserve">', 150) | map(attribute='host') | list </w:t>
+      </w:r>
+      <w:proofErr w:type="gramStart"/>
+      <w:r>
+        <w:rPr>
+          <w:rFonts w:ascii="Cambria" w:eastAsia="MS Mincho" w:hAnsi="Cambria" w:cs="Times New Roman"/>
+        </w:rPr>
+        <w:t>%}{</w:t>
+      </w:r>
+      <w:proofErr w:type="gramEnd"/>
+      <w:r>
+        <w:rPr>
+          <w:rFonts w:ascii="Cambria" w:eastAsia="MS Mincho" w:hAnsi="Cambria" w:cs="Times New Roman"/>
+        </w:rPr>
+        <w:t xml:space="preserve">% if </w:t>
+      </w:r>
+      <w:proofErr w:type="spellStart"/>
+      <w:r>
+        <w:rPr>
+          <w:rFonts w:ascii="Cambria" w:eastAsia="MS Mincho" w:hAnsi="Cambria" w:cs="Times New Roman"/>
+        </w:rPr>
+        <w:t>crits|length</w:t>
+      </w:r>
+      <w:proofErr w:type="spellEnd"/>
+      <w:r>
+        <w:rPr>
+          <w:rFonts w:ascii="Cambria" w:eastAsia="MS Mincho" w:hAnsi="Cambria" w:cs="Times New Roman"/>
+        </w:rPr>
+        <w:t xml:space="preserve"> &gt; 0 %} (</w:t>
+      </w:r>
+      <w:proofErr w:type="gramStart"/>
+      <w:r>
+        <w:rPr>
+          <w:rFonts w:ascii="Cambria" w:eastAsia="MS Mincho" w:hAnsi="Cambria" w:cs="Times New Roman"/>
+        </w:rPr>
+        <w:t>{{ crits</w:t>
+      </w:r>
+      <w:proofErr w:type="gramEnd"/>
+      <w:r>
+        <w:rPr>
+          <w:rFonts w:ascii="Cambria" w:eastAsia="MS Mincho" w:hAnsi="Cambria" w:cs="Times New Roman"/>
+        </w:rPr>
+        <w:t xml:space="preserve"> | </w:t>
+      </w:r>
+      <w:proofErr w:type="gramStart"/>
+      <w:r>
+        <w:rPr>
+          <w:rFonts w:ascii="Cambria" w:eastAsia="MS Mincho" w:hAnsi="Cambria" w:cs="Times New Roman"/>
+        </w:rPr>
+        <w:t>join(</w:t>
+      </w:r>
+      <w:proofErr w:type="gramEnd"/>
+      <w:r>
+        <w:rPr>
+          <w:rFonts w:ascii="Cambria" w:eastAsia="MS Mincho" w:hAnsi="Cambria" w:cs="Times New Roman"/>
+        </w:rPr>
+        <w:t>', '</w:t>
+      </w:r>
+      <w:proofErr w:type="gramStart"/>
+      <w:r>
+        <w:rPr>
+          <w:rFonts w:ascii="Cambria" w:eastAsia="MS Mincho" w:hAnsi="Cambria" w:cs="Times New Roman"/>
+        </w:rPr>
+        <w:t>) }}){</w:t>
+      </w:r>
+      <w:proofErr w:type="gramEnd"/>
+      <w:r>
+        <w:rPr>
+          <w:rFonts w:ascii="Cambria" w:eastAsia="MS Mincho" w:hAnsi="Cambria" w:cs="Times New Roman"/>
+        </w:rPr>
+        <w:t>% endif %}</w:t>
       </w:r>
     </w:p>
     <w:p>
@@ -121,7 +735,177 @@
         <w:rPr>
           <w:rFonts w:ascii="Cambria" w:eastAsia="MS Mincho" w:hAnsi="Cambria" w:cs="Times New Roman"/>
         </w:rPr>
-        <w:t xml:space="preserve"> Ping Timeout: {{ results | selectattr('latency', 'equalto', '') | list | length }}{% set timeouts = results | selectattr('latency', 'equalto', '') | map(attribute='host') | list %}{% if timeouts|length &gt; 0 %} ({{ timeouts | join(', ') }}){% endif %}</w:t>
+        <w:t xml:space="preserve"> Ping Timeout: </w:t>
+      </w:r>
+      <w:proofErr w:type="gramStart"/>
+      <w:r>
+        <w:rPr>
+          <w:rFonts w:ascii="Cambria" w:eastAsia="MS Mincho" w:hAnsi="Cambria" w:cs="Times New Roman"/>
+        </w:rPr>
+        <w:t>{{ results</w:t>
+      </w:r>
+      <w:proofErr w:type="gramEnd"/>
+      <w:r>
+        <w:rPr>
+          <w:rFonts w:ascii="Cambria" w:eastAsia="MS Mincho" w:hAnsi="Cambria" w:cs="Times New Roman"/>
+        </w:rPr>
+        <w:t xml:space="preserve"> | </w:t>
+      </w:r>
+      <w:proofErr w:type="spellStart"/>
+      <w:proofErr w:type="gramStart"/>
+      <w:r>
+        <w:rPr>
+          <w:rFonts w:ascii="Cambria" w:eastAsia="MS Mincho" w:hAnsi="Cambria" w:cs="Times New Roman"/>
+        </w:rPr>
+        <w:t>selectattr</w:t>
+      </w:r>
+      <w:proofErr w:type="spellEnd"/>
+      <w:r>
+        <w:rPr>
+          <w:rFonts w:ascii="Cambria" w:eastAsia="MS Mincho" w:hAnsi="Cambria" w:cs="Times New Roman"/>
+        </w:rPr>
+        <w:t>(</w:t>
+      </w:r>
+      <w:proofErr w:type="gramEnd"/>
+      <w:r>
+        <w:rPr>
+          <w:rFonts w:ascii="Cambria" w:eastAsia="MS Mincho" w:hAnsi="Cambria" w:cs="Times New Roman"/>
+        </w:rPr>
+        <w:t>'latency', '</w:t>
+      </w:r>
+      <w:proofErr w:type="spellStart"/>
+      <w:r>
+        <w:rPr>
+          <w:rFonts w:ascii="Cambria" w:eastAsia="MS Mincho" w:hAnsi="Cambria" w:cs="Times New Roman"/>
+        </w:rPr>
+        <w:t>equalto</w:t>
+      </w:r>
+      <w:proofErr w:type="spellEnd"/>
+      <w:r>
+        <w:rPr>
+          <w:rFonts w:ascii="Cambria" w:eastAsia="MS Mincho" w:hAnsi="Cambria" w:cs="Times New Roman"/>
+        </w:rPr>
+        <w:t xml:space="preserve">', '') | list | </w:t>
+      </w:r>
+      <w:proofErr w:type="gramStart"/>
+      <w:r>
+        <w:rPr>
+          <w:rFonts w:ascii="Cambria" w:eastAsia="MS Mincho" w:hAnsi="Cambria" w:cs="Times New Roman"/>
+        </w:rPr>
+        <w:t>length }}{</w:t>
+      </w:r>
+      <w:proofErr w:type="gramEnd"/>
+      <w:r>
+        <w:rPr>
+          <w:rFonts w:ascii="Cambria" w:eastAsia="MS Mincho" w:hAnsi="Cambria" w:cs="Times New Roman"/>
+        </w:rPr>
+        <w:t xml:space="preserve">% set timeouts = results | </w:t>
+      </w:r>
+      <w:proofErr w:type="spellStart"/>
+      <w:proofErr w:type="gramStart"/>
+      <w:r>
+        <w:rPr>
+          <w:rFonts w:ascii="Cambria" w:eastAsia="MS Mincho" w:hAnsi="Cambria" w:cs="Times New Roman"/>
+        </w:rPr>
+        <w:t>selectattr</w:t>
+      </w:r>
+      <w:proofErr w:type="spellEnd"/>
+      <w:r>
+        <w:rPr>
+          <w:rFonts w:ascii="Cambria" w:eastAsia="MS Mincho" w:hAnsi="Cambria" w:cs="Times New Roman"/>
+        </w:rPr>
+        <w:t>(</w:t>
+      </w:r>
+      <w:proofErr w:type="gramEnd"/>
+      <w:r>
+        <w:rPr>
+          <w:rFonts w:ascii="Cambria" w:eastAsia="MS Mincho" w:hAnsi="Cambria" w:cs="Times New Roman"/>
+        </w:rPr>
+        <w:t>'latency', '</w:t>
+      </w:r>
+      <w:proofErr w:type="spellStart"/>
+      <w:r>
+        <w:rPr>
+          <w:rFonts w:ascii="Cambria" w:eastAsia="MS Mincho" w:hAnsi="Cambria" w:cs="Times New Roman"/>
+        </w:rPr>
+        <w:t>equalto</w:t>
+      </w:r>
+      <w:proofErr w:type="spellEnd"/>
+      <w:r>
+        <w:rPr>
+          <w:rFonts w:ascii="Cambria" w:eastAsia="MS Mincho" w:hAnsi="Cambria" w:cs="Times New Roman"/>
+        </w:rPr>
+        <w:t xml:space="preserve">', '') | map(attribute='host') | list </w:t>
+      </w:r>
+      <w:proofErr w:type="gramStart"/>
+      <w:r>
+        <w:rPr>
+          <w:rFonts w:ascii="Cambria" w:eastAsia="MS Mincho" w:hAnsi="Cambria" w:cs="Times New Roman"/>
+        </w:rPr>
+        <w:t>%}{</w:t>
+      </w:r>
+      <w:proofErr w:type="gramEnd"/>
+      <w:r>
+        <w:rPr>
+          <w:rFonts w:ascii="Cambria" w:eastAsia="MS Mincho" w:hAnsi="Cambria" w:cs="Times New Roman"/>
+        </w:rPr>
+        <w:t xml:space="preserve">% if </w:t>
+      </w:r>
+      <w:proofErr w:type="spellStart"/>
+      <w:r>
+        <w:rPr>
+          <w:rFonts w:ascii="Cambria" w:eastAsia="MS Mincho" w:hAnsi="Cambria" w:cs="Times New Roman"/>
+        </w:rPr>
+        <w:t>timeouts|length</w:t>
+      </w:r>
+      <w:proofErr w:type="spellEnd"/>
+      <w:r>
+        <w:rPr>
+          <w:rFonts w:ascii="Cambria" w:eastAsia="MS Mincho" w:hAnsi="Cambria" w:cs="Times New Roman"/>
+        </w:rPr>
+        <w:t xml:space="preserve"> &gt; 0 %} (</w:t>
+      </w:r>
+      <w:proofErr w:type="gramStart"/>
+      <w:r>
+        <w:rPr>
+          <w:rFonts w:ascii="Cambria" w:eastAsia="MS Mincho" w:hAnsi="Cambria" w:cs="Times New Roman"/>
+        </w:rPr>
+        <w:t>{{ timeouts</w:t>
+      </w:r>
+      <w:proofErr w:type="gramEnd"/>
+      <w:r>
+        <w:rPr>
+          <w:rFonts w:ascii="Cambria" w:eastAsia="MS Mincho" w:hAnsi="Cambria" w:cs="Times New Roman"/>
+        </w:rPr>
+        <w:t xml:space="preserve"> | </w:t>
+      </w:r>
+      <w:proofErr w:type="gramStart"/>
+      <w:r>
+        <w:rPr>
+          <w:rFonts w:ascii="Cambria" w:eastAsia="MS Mincho" w:hAnsi="Cambria" w:cs="Times New Roman"/>
+        </w:rPr>
+        <w:t>join(</w:t>
+      </w:r>
+      <w:proofErr w:type="gramEnd"/>
+      <w:r>
+        <w:rPr>
+          <w:rFonts w:ascii="Cambria" w:eastAsia="MS Mincho" w:hAnsi="Cambria" w:cs="Times New Roman"/>
+        </w:rPr>
+        <w:t>', '</w:t>
+      </w:r>
+      <w:proofErr w:type="gramStart"/>
+      <w:r>
+        <w:rPr>
+          <w:rFonts w:ascii="Cambria" w:eastAsia="MS Mincho" w:hAnsi="Cambria" w:cs="Times New Roman"/>
+        </w:rPr>
+        <w:t>) }}){</w:t>
+      </w:r>
+      <w:proofErr w:type="gramEnd"/>
+      <w:r>
+        <w:rPr>
+          <w:rFonts w:ascii="Cambria" w:eastAsia="MS Mincho" w:hAnsi="Cambria" w:cs="Times New Roman"/>
+        </w:rPr>
+        <w:t>% endif %}</w:t>
       </w:r>
     </w:p>
     <w:p>
@@ -132,59 +916,169 @@
         <w:t>p</w:t>
       </w:r>
       <w:r>
-        <w:t xml:space="preserve"> for res in results %}</w:t>
-      </w:r>
-    </w:p>
-    <w:p>
-      <w:r>
-        <w:t>{%</w:t>
-      </w:r>
-      <w:r>
-        <w:t>p</w:t>
-      </w:r>
-      <w:r>
-        <w:t xml:space="preserve"> if res.rule_name == "FortiGate" %}</w:t>
-      </w:r>
+        <w:t xml:space="preserve"> for </w:t>
+      </w:r>
+      <w:proofErr w:type="gramStart"/>
+      <w:r>
+        <w:t>res</w:t>
+      </w:r>
+      <w:proofErr w:type="gramEnd"/>
+      <w:r>
+        <w:t xml:space="preserve"> in </w:t>
+      </w:r>
+      <w:proofErr w:type="gramStart"/>
+      <w:r>
+        <w:t>results %}</w:t>
+      </w:r>
+      <w:proofErr w:type="gramEnd"/>
     </w:p>
     <w:p>
       <w:pPr>
         <w:pStyle w:val="Ttulo1"/>
       </w:pPr>
-      <w:r>
-        <w:t>{{ res.rule_name }}: {{ res.host }}</w:t>
+      <w:proofErr w:type="gramStart"/>
+      <w:r>
+        <w:t xml:space="preserve">{{ </w:t>
+      </w:r>
+      <w:proofErr w:type="spellStart"/>
+      <w:r>
+        <w:t>res</w:t>
+      </w:r>
+      <w:proofErr w:type="gramEnd"/>
+      <w:r>
+        <w:t>.rule_</w:t>
+      </w:r>
+      <w:proofErr w:type="gramStart"/>
+      <w:r>
+        <w:t>name</w:t>
+      </w:r>
+      <w:proofErr w:type="spellEnd"/>
+      <w:r>
+        <w:t xml:space="preserve"> }</w:t>
+      </w:r>
+      <w:proofErr w:type="gramEnd"/>
+      <w:r>
+        <w:t xml:space="preserve">}: </w:t>
+      </w:r>
+      <w:proofErr w:type="gramStart"/>
+      <w:r>
+        <w:t xml:space="preserve">{{ </w:t>
+      </w:r>
+      <w:proofErr w:type="spellStart"/>
+      <w:r>
+        <w:t>res</w:t>
+      </w:r>
+      <w:proofErr w:type="gramEnd"/>
+      <w:r>
+        <w:t>.</w:t>
+      </w:r>
+      <w:proofErr w:type="gramStart"/>
+      <w:r>
+        <w:t>host</w:t>
+      </w:r>
+      <w:proofErr w:type="spellEnd"/>
+      <w:r>
+        <w:t xml:space="preserve"> }</w:t>
+      </w:r>
+      <w:proofErr w:type="gramEnd"/>
+      <w:r>
+        <w:t>}</w:t>
       </w:r>
     </w:p>
     <w:p>
       <w:r>
-        <w:t>{%</w:t>
-      </w:r>
-      <w:r>
-        <w:t>p</w:t>
-      </w:r>
-      <w:r>
-        <w:t xml:space="preserve"> if res.error %}</w:t>
-      </w:r>
+        <w:t xml:space="preserve">{%p if </w:t>
+      </w:r>
+      <w:proofErr w:type="spellStart"/>
+      <w:proofErr w:type="gramStart"/>
+      <w:r>
+        <w:t>res.rule</w:t>
+      </w:r>
+      <w:proofErr w:type="gramEnd"/>
+      <w:r>
+        <w:t>_name</w:t>
+      </w:r>
+      <w:proofErr w:type="spellEnd"/>
+      <w:r>
+        <w:t xml:space="preserve"> in ['Switch', 'Access Point'</w:t>
+      </w:r>
+      <w:proofErr w:type="gramStart"/>
+      <w:r>
+        <w:t>] %}</w:t>
+      </w:r>
+      <w:proofErr w:type="gramEnd"/>
     </w:p>
     <w:p>
       <w:r>
-        <w:t>Error: {{ res.error }}</w:t>
-      </w:r>
-    </w:p>
-    <w:p>
-      <w:r>
-        <w:t>{%</w:t>
-      </w:r>
-      <w:r>
-        <w:t>p</w:t>
-      </w:r>
-      <w:r>
-        <w:t xml:space="preserve"> else %}</w:t>
-      </w:r>
-    </w:p>
-    <w:p>
-      <w:r>
-        <w:t xml:space="preserve">WAN1 Link Status: {% if res.wan_status.WAN1_IP %}{{ res.wan_status.WAN1_IP }}{% endif %} ({{ res.wan_status.WAN1 }}) {% if res.wan_status.WAN1_LATENCY %}{% set ping = res.wan_status.WAN1_LATENCY|int %}Latency: {{ ping }}ms ({% if ping &lt;= 50 %}Ok </w:t>
-      </w:r>
+        <w:t xml:space="preserve">{% if </w:t>
+      </w:r>
+      <w:proofErr w:type="spellStart"/>
+      <w:proofErr w:type="gramStart"/>
+      <w:r>
+        <w:t>res.latency</w:t>
+      </w:r>
+      <w:proofErr w:type="spellEnd"/>
+      <w:proofErr w:type="gramEnd"/>
+      <w:r>
+        <w:t xml:space="preserve"> </w:t>
+      </w:r>
+      <w:proofErr w:type="gramStart"/>
+      <w:r>
+        <w:t>%}{</w:t>
+      </w:r>
+      <w:proofErr w:type="gramEnd"/>
+      <w:r>
+        <w:t xml:space="preserve">% set ping = </w:t>
+      </w:r>
+      <w:proofErr w:type="spellStart"/>
+      <w:proofErr w:type="gramStart"/>
+      <w:r>
+        <w:t>res.latency</w:t>
+      </w:r>
+      <w:proofErr w:type="gramEnd"/>
+      <w:r>
+        <w:t>|int</w:t>
+      </w:r>
+      <w:proofErr w:type="spellEnd"/>
+      <w:r>
+        <w:t xml:space="preserve"> </w:t>
+      </w:r>
+      <w:proofErr w:type="gramStart"/>
+      <w:r>
+        <w:t>%}Lat</w:t>
+      </w:r>
+      <w:r>
+        <w:t>ency</w:t>
+      </w:r>
+      <w:proofErr w:type="gramEnd"/>
+      <w:r>
+        <w:t xml:space="preserve">: </w:t>
+      </w:r>
+      <w:proofErr w:type="gramStart"/>
+      <w:r>
+        <w:t>{{ ping</w:t>
+      </w:r>
+      <w:proofErr w:type="gramEnd"/>
+      <w:r>
+        <w:t xml:space="preserve"> }}</w:t>
+      </w:r>
+      <w:proofErr w:type="spellStart"/>
+      <w:r>
+        <w:t>ms</w:t>
+      </w:r>
+      <w:proofErr w:type="spellEnd"/>
+      <w:r>
+        <w:t xml:space="preserve"> ({% if ping &lt;= 50 </w:t>
+      </w:r>
+      <w:proofErr w:type="gramStart"/>
+      <w:r>
+        <w:t>%}Ok</w:t>
+      </w:r>
+      <w:proofErr w:type="gramEnd"/>
+      <w:r>
+        <w:t xml:space="preserve"> </w:t>
+      </w:r>
+      <w:proofErr w:type="gramStart"/>
       <w:r>
         <w:rPr>
           <w:rFonts w:ascii="Segoe UI Emoji" w:hAnsi="Segoe UI Emoji" w:cs="Segoe UI Emoji"/>
@@ -192,8 +1086,29 @@
         <w:t>🟢</w:t>
       </w:r>
       <w:r>
-        <w:t xml:space="preserve">{% elif ping &lt;= 150 %}Warning </w:t>
-      </w:r>
+        <w:t>{</w:t>
+      </w:r>
+      <w:proofErr w:type="gramEnd"/>
+      <w:r>
+        <w:t xml:space="preserve">% </w:t>
+      </w:r>
+      <w:proofErr w:type="spellStart"/>
+      <w:r>
+        <w:t>elif</w:t>
+      </w:r>
+      <w:proofErr w:type="spellEnd"/>
+      <w:r>
+        <w:t xml:space="preserve"> ping &lt;= 150 </w:t>
+      </w:r>
+      <w:proofErr w:type="gramStart"/>
+      <w:r>
+        <w:t>%}Warning</w:t>
+      </w:r>
+      <w:proofErr w:type="gramEnd"/>
+      <w:r>
+        <w:t xml:space="preserve"> </w:t>
+      </w:r>
+      <w:proofErr w:type="gramStart"/>
       <w:r>
         <w:rPr>
           <w:rFonts w:ascii="Segoe UI Emoji" w:hAnsi="Segoe UI Emoji" w:cs="Segoe UI Emoji"/>
@@ -201,8 +1116,21 @@
         <w:t>🟡</w:t>
       </w:r>
       <w:r>
-        <w:t xml:space="preserve">{% else %}Critical </w:t>
-      </w:r>
+        <w:t>{</w:t>
+      </w:r>
+      <w:proofErr w:type="gramEnd"/>
+      <w:r>
+        <w:t xml:space="preserve">% else </w:t>
+      </w:r>
+      <w:proofErr w:type="gramStart"/>
+      <w:r>
+        <w:t>%}Critical</w:t>
+      </w:r>
+      <w:proofErr w:type="gramEnd"/>
+      <w:r>
+        <w:t xml:space="preserve"> </w:t>
+      </w:r>
+      <w:proofErr w:type="gramStart"/>
       <w:r>
         <w:rPr>
           <w:rFonts w:ascii="Segoe UI Emoji" w:hAnsi="Segoe UI Emoji" w:cs="Segoe UI Emoji"/>
@@ -210,14 +1138,29 @@
         <w:t>🔴</w:t>
       </w:r>
       <w:r>
-        <w:t>{% endif %}){% else %}</w:t>
-      </w:r>
-      <w:r>
-        <w:t>(</w:t>
-      </w:r>
+        <w:t>{</w:t>
+      </w:r>
+      <w:proofErr w:type="gramEnd"/>
+      <w:r>
+        <w:t>% endif %</w:t>
+      </w:r>
+      <w:proofErr w:type="gramStart"/>
+      <w:r>
+        <w:t>}){</w:t>
+      </w:r>
+      <w:proofErr w:type="gramEnd"/>
+      <w:r>
+        <w:t xml:space="preserve">% else </w:t>
+      </w:r>
+      <w:proofErr w:type="gramStart"/>
+      <w:r>
+        <w:t>%}(</w:t>
+      </w:r>
+      <w:proofErr w:type="gramEnd"/>
       <w:r>
         <w:t xml:space="preserve">Ping Timeout </w:t>
       </w:r>
+      <w:proofErr w:type="gramStart"/>
       <w:r>
         <w:rPr>
           <w:rFonts w:ascii="Segoe UI Emoji" w:hAnsi="Segoe UI Emoji" w:cs="Segoe UI Emoji"/>
@@ -225,13 +1168,225 @@
         <w:t>❌</w:t>
       </w:r>
       <w:r>
-        <w:t>){% endif %}</w:t>
+        <w:t>){</w:t>
+      </w:r>
+      <w:proofErr w:type="gramEnd"/>
+      <w:r>
+        <w:t>% endif %}</w:t>
       </w:r>
     </w:p>
     <w:p>
       <w:r>
-        <w:t xml:space="preserve">WAN2 Link Status: {% if res.wan_status.WAN2_IP %}{{ res.wan_status.WAN2_IP }}{% endif %} ({{ res.wan_status.WAN2 }}) {% if res.wan_status.WAN2_LATENCY %}{% set ping = res.wan_status.WAN2_LATENCY|int %}Latency: {{ ping }}ms ({% if ping &lt;= 50 %}Ok </w:t>
-      </w:r>
+        <w:t>{%</w:t>
+      </w:r>
+      <w:r>
+        <w:t>p</w:t>
+      </w:r>
+      <w:r>
+        <w:t xml:space="preserve"> </w:t>
+      </w:r>
+      <w:proofErr w:type="spellStart"/>
+      <w:r>
+        <w:t>elif</w:t>
+      </w:r>
+      <w:proofErr w:type="spellEnd"/>
+      <w:r>
+        <w:t xml:space="preserve"> </w:t>
+      </w:r>
+      <w:proofErr w:type="spellStart"/>
+      <w:proofErr w:type="gramStart"/>
+      <w:r>
+        <w:t>res.rule</w:t>
+      </w:r>
+      <w:proofErr w:type="gramEnd"/>
+      <w:r>
+        <w:t>_name</w:t>
+      </w:r>
+      <w:proofErr w:type="spellEnd"/>
+      <w:r>
+        <w:t xml:space="preserve"> == "FortiGate</w:t>
+      </w:r>
+      <w:proofErr w:type="gramStart"/>
+      <w:r>
+        <w:t>" %}</w:t>
+      </w:r>
+      <w:proofErr w:type="gramEnd"/>
+    </w:p>
+    <w:p>
+      <w:r>
+        <w:t>{%</w:t>
+      </w:r>
+      <w:r>
+        <w:t>p</w:t>
+      </w:r>
+      <w:r>
+        <w:t xml:space="preserve"> if </w:t>
+      </w:r>
+      <w:proofErr w:type="spellStart"/>
+      <w:proofErr w:type="gramStart"/>
+      <w:r>
+        <w:t>res.error</w:t>
+      </w:r>
+      <w:proofErr w:type="spellEnd"/>
+      <w:proofErr w:type="gramEnd"/>
+      <w:r>
+        <w:t xml:space="preserve"> %}</w:t>
+      </w:r>
+    </w:p>
+    <w:p>
+      <w:r>
+        <w:t xml:space="preserve">Error: </w:t>
+      </w:r>
+      <w:proofErr w:type="gramStart"/>
+      <w:r>
+        <w:t xml:space="preserve">{{ </w:t>
+      </w:r>
+      <w:proofErr w:type="spellStart"/>
+      <w:r>
+        <w:t>res</w:t>
+      </w:r>
+      <w:proofErr w:type="gramEnd"/>
+      <w:r>
+        <w:t>.</w:t>
+      </w:r>
+      <w:proofErr w:type="gramStart"/>
+      <w:r>
+        <w:t>error</w:t>
+      </w:r>
+      <w:proofErr w:type="spellEnd"/>
+      <w:r>
+        <w:t xml:space="preserve"> }</w:t>
+      </w:r>
+      <w:proofErr w:type="gramEnd"/>
+      <w:r>
+        <w:t>}</w:t>
+      </w:r>
+    </w:p>
+    <w:p>
+      <w:r>
+        <w:t>{%</w:t>
+      </w:r>
+      <w:r>
+        <w:t>p</w:t>
+      </w:r>
+      <w:r>
+        <w:t xml:space="preserve"> </w:t>
+      </w:r>
+      <w:proofErr w:type="gramStart"/>
+      <w:r>
+        <w:t>else %}</w:t>
+      </w:r>
+      <w:proofErr w:type="gramEnd"/>
+    </w:p>
+    <w:p>
+      <w:r>
+        <w:t>WAN1 Link Status: {% if res.wan_</w:t>
+      </w:r>
+      <w:proofErr w:type="gramStart"/>
+      <w:r>
+        <w:t>status.WAN</w:t>
+      </w:r>
+      <w:proofErr w:type="gramEnd"/>
+      <w:r>
+        <w:t xml:space="preserve">1_IP </w:t>
+      </w:r>
+      <w:proofErr w:type="gramStart"/>
+      <w:r>
+        <w:t>%}{{ res.wan</w:t>
+      </w:r>
+      <w:proofErr w:type="gramEnd"/>
+      <w:r>
+        <w:t>_</w:t>
+      </w:r>
+      <w:proofErr w:type="gramStart"/>
+      <w:r>
+        <w:t>status.WAN</w:t>
+      </w:r>
+      <w:proofErr w:type="gramEnd"/>
+      <w:r>
+        <w:t>1_</w:t>
+      </w:r>
+      <w:proofErr w:type="gramStart"/>
+      <w:r>
+        <w:t>IP }}{</w:t>
+      </w:r>
+      <w:proofErr w:type="gramEnd"/>
+      <w:r>
+        <w:t>% endif %} (</w:t>
+      </w:r>
+      <w:proofErr w:type="gramStart"/>
+      <w:r>
+        <w:t>{{ res.wan</w:t>
+      </w:r>
+      <w:proofErr w:type="gramEnd"/>
+      <w:r>
+        <w:t>_</w:t>
+      </w:r>
+      <w:proofErr w:type="gramStart"/>
+      <w:r>
+        <w:t>status.WAN1 }</w:t>
+      </w:r>
+      <w:proofErr w:type="gramEnd"/>
+      <w:r>
+        <w:t>}) {% if res.wan_</w:t>
+      </w:r>
+      <w:proofErr w:type="gramStart"/>
+      <w:r>
+        <w:t>status.WAN</w:t>
+      </w:r>
+      <w:proofErr w:type="gramEnd"/>
+      <w:r>
+        <w:t xml:space="preserve">1_LATENCY </w:t>
+      </w:r>
+      <w:proofErr w:type="gramStart"/>
+      <w:r>
+        <w:t>%}{</w:t>
+      </w:r>
+      <w:proofErr w:type="gramEnd"/>
+      <w:r>
+        <w:t>% set ping = res.wan_</w:t>
+      </w:r>
+      <w:proofErr w:type="gramStart"/>
+      <w:r>
+        <w:t>status.WAN</w:t>
+      </w:r>
+      <w:proofErr w:type="gramEnd"/>
+      <w:r>
+        <w:t xml:space="preserve">1_LATENCY|int </w:t>
+      </w:r>
+      <w:proofErr w:type="gramStart"/>
+      <w:r>
+        <w:t>%}Latency</w:t>
+      </w:r>
+      <w:proofErr w:type="gramEnd"/>
+      <w:r>
+        <w:t xml:space="preserve">: </w:t>
+      </w:r>
+      <w:proofErr w:type="gramStart"/>
+      <w:r>
+        <w:t>{{ ping</w:t>
+      </w:r>
+      <w:proofErr w:type="gramEnd"/>
+      <w:r>
+        <w:t xml:space="preserve"> }}</w:t>
+      </w:r>
+      <w:proofErr w:type="spellStart"/>
+      <w:r>
+        <w:t>ms</w:t>
+      </w:r>
+      <w:proofErr w:type="spellEnd"/>
+      <w:r>
+        <w:t xml:space="preserve"> ({% if ping &lt;= 50 </w:t>
+      </w:r>
+      <w:proofErr w:type="gramStart"/>
+      <w:r>
+        <w:t>%}Ok</w:t>
+      </w:r>
+      <w:proofErr w:type="gramEnd"/>
+      <w:r>
+        <w:t xml:space="preserve"> </w:t>
+      </w:r>
+      <w:proofErr w:type="gramStart"/>
       <w:r>
         <w:rPr>
           <w:rFonts w:ascii="Segoe UI Emoji" w:hAnsi="Segoe UI Emoji" w:cs="Segoe UI Emoji"/>
@@ -239,12 +1394,30 @@
         <w:t>🟢</w:t>
       </w:r>
       <w:r>
-        <w:t xml:space="preserve">{% </w:t>
-      </w:r>
+        <w:t>{</w:t>
+      </w:r>
+      <w:proofErr w:type="gramEnd"/>
+      <w:r>
+        <w:t xml:space="preserve">% </w:t>
+      </w:r>
+      <w:proofErr w:type="spellStart"/>
       <w:r>
         <w:lastRenderedPageBreak/>
-        <w:t xml:space="preserve">elif ping &lt;= 150 %}Warning </w:t>
-      </w:r>
+        <w:t>elif</w:t>
+      </w:r>
+      <w:proofErr w:type="spellEnd"/>
+      <w:r>
+        <w:t xml:space="preserve"> ping &lt;= 150 </w:t>
+      </w:r>
+      <w:proofErr w:type="gramStart"/>
+      <w:r>
+        <w:t>%}Warning</w:t>
+      </w:r>
+      <w:proofErr w:type="gramEnd"/>
+      <w:r>
+        <w:t xml:space="preserve"> </w:t>
+      </w:r>
+      <w:proofErr w:type="gramStart"/>
       <w:r>
         <w:rPr>
           <w:rFonts w:ascii="Segoe UI Emoji" w:hAnsi="Segoe UI Emoji" w:cs="Segoe UI Emoji"/>
@@ -252,8 +1425,21 @@
         <w:t>🟡</w:t>
       </w:r>
       <w:r>
-        <w:t xml:space="preserve">{% else %}Critical </w:t>
-      </w:r>
+        <w:t>{</w:t>
+      </w:r>
+      <w:proofErr w:type="gramEnd"/>
+      <w:r>
+        <w:t xml:space="preserve">% else </w:t>
+      </w:r>
+      <w:proofErr w:type="gramStart"/>
+      <w:r>
+        <w:t>%}Critical</w:t>
+      </w:r>
+      <w:proofErr w:type="gramEnd"/>
+      <w:r>
+        <w:t xml:space="preserve"> </w:t>
+      </w:r>
+      <w:proofErr w:type="gramStart"/>
       <w:r>
         <w:rPr>
           <w:rFonts w:ascii="Segoe UI Emoji" w:hAnsi="Segoe UI Emoji" w:cs="Segoe UI Emoji"/>
@@ -261,14 +1447,32 @@
         <w:t>🔴</w:t>
       </w:r>
       <w:r>
-        <w:t>{% endif %}){% else %}</w:t>
+        <w:t>{</w:t>
+      </w:r>
+      <w:proofErr w:type="gramEnd"/>
+      <w:r>
+        <w:t>% endif %</w:t>
+      </w:r>
+      <w:proofErr w:type="gramStart"/>
+      <w:r>
+        <w:t>}){</w:t>
+      </w:r>
+      <w:proofErr w:type="gramEnd"/>
+      <w:r>
+        <w:t xml:space="preserve">% else </w:t>
+      </w:r>
+      <w:proofErr w:type="gramStart"/>
+      <w:r>
+        <w:t>%}</w:t>
       </w:r>
       <w:r>
         <w:t>(</w:t>
       </w:r>
+      <w:proofErr w:type="gramEnd"/>
       <w:r>
         <w:t xml:space="preserve">Ping Timeout </w:t>
       </w:r>
+      <w:proofErr w:type="gramStart"/>
       <w:r>
         <w:rPr>
           <w:rFonts w:ascii="Segoe UI Emoji" w:hAnsi="Segoe UI Emoji" w:cs="Segoe UI Emoji"/>
@@ -276,24 +1480,122 @@
         <w:t>❌</w:t>
       </w:r>
       <w:r>
-        <w:t>){% endif %}</w:t>
+        <w:t>){</w:t>
+      </w:r>
+      <w:proofErr w:type="gramEnd"/>
+      <w:r>
+        <w:t>% endif %}</w:t>
       </w:r>
     </w:p>
     <w:p>
       <w:r>
-        <w:t>{%</w:t>
-      </w:r>
-      <w:r>
-        <w:t>p</w:t>
-      </w:r>
-      <w:r>
-        <w:t xml:space="preserve"> if res.wan_status.WAN3 %}</w:t>
-      </w:r>
-    </w:p>
-    <w:p>
-      <w:r>
-        <w:t xml:space="preserve">WAN3 Link Status: {% if res.wan_status.WAN3_IP %}{{ res.wan_status.WAN3_IP }}{% endif %} ({{ res.wan_status.WAN3 }}) {% if res.wan_status.WAN3_LATENCY %}{% set ping = res.wan_status.WAN3_LATENCY|int %}Latency: {{ ping }}ms ({% if ping &lt;= 50 %}Ok </w:t>
-      </w:r>
+        <w:t>WAN2 Link Status: {% if res.wan_</w:t>
+      </w:r>
+      <w:proofErr w:type="gramStart"/>
+      <w:r>
+        <w:t>status.WAN</w:t>
+      </w:r>
+      <w:proofErr w:type="gramEnd"/>
+      <w:r>
+        <w:t xml:space="preserve">2_IP </w:t>
+      </w:r>
+      <w:proofErr w:type="gramStart"/>
+      <w:r>
+        <w:t>%}{{ res.wan</w:t>
+      </w:r>
+      <w:proofErr w:type="gramEnd"/>
+      <w:r>
+        <w:t>_</w:t>
+      </w:r>
+      <w:proofErr w:type="gramStart"/>
+      <w:r>
+        <w:t>status.WAN</w:t>
+      </w:r>
+      <w:proofErr w:type="gramEnd"/>
+      <w:r>
+        <w:t>2_</w:t>
+      </w:r>
+      <w:proofErr w:type="gramStart"/>
+      <w:r>
+        <w:t>IP }}{</w:t>
+      </w:r>
+      <w:proofErr w:type="gramEnd"/>
+      <w:r>
+        <w:t>% endif %} (</w:t>
+      </w:r>
+      <w:proofErr w:type="gramStart"/>
+      <w:r>
+        <w:t>{{ res.wan</w:t>
+      </w:r>
+      <w:proofErr w:type="gramEnd"/>
+      <w:r>
+        <w:t>_</w:t>
+      </w:r>
+      <w:proofErr w:type="gramStart"/>
+      <w:r>
+        <w:t>status.WAN2 }</w:t>
+      </w:r>
+      <w:proofErr w:type="gramEnd"/>
+      <w:r>
+        <w:t>}) {% if res.wan_</w:t>
+      </w:r>
+      <w:proofErr w:type="gramStart"/>
+      <w:r>
+        <w:t>status.WAN</w:t>
+      </w:r>
+      <w:proofErr w:type="gramEnd"/>
+      <w:r>
+        <w:t xml:space="preserve">2_LATENCY </w:t>
+      </w:r>
+      <w:proofErr w:type="gramStart"/>
+      <w:r>
+        <w:t>%}{</w:t>
+      </w:r>
+      <w:proofErr w:type="gramEnd"/>
+      <w:r>
+        <w:t>% set ping = res.wan_</w:t>
+      </w:r>
+      <w:proofErr w:type="gramStart"/>
+      <w:r>
+        <w:t>status.WAN</w:t>
+      </w:r>
+      <w:proofErr w:type="gramEnd"/>
+      <w:r>
+        <w:t xml:space="preserve">2_LATENCY|int </w:t>
+      </w:r>
+      <w:proofErr w:type="gramStart"/>
+      <w:r>
+        <w:t>%}Latency</w:t>
+      </w:r>
+      <w:proofErr w:type="gramEnd"/>
+      <w:r>
+        <w:t xml:space="preserve">: </w:t>
+      </w:r>
+      <w:proofErr w:type="gramStart"/>
+      <w:r>
+        <w:t>{{ ping</w:t>
+      </w:r>
+      <w:proofErr w:type="gramEnd"/>
+      <w:r>
+        <w:t xml:space="preserve"> }}</w:t>
+      </w:r>
+      <w:proofErr w:type="spellStart"/>
+      <w:r>
+        <w:t>ms</w:t>
+      </w:r>
+      <w:proofErr w:type="spellEnd"/>
+      <w:r>
+        <w:t xml:space="preserve"> ({% if ping &lt;= 50 </w:t>
+      </w:r>
+      <w:proofErr w:type="gramStart"/>
+      <w:r>
+        <w:t>%}Ok</w:t>
+      </w:r>
+      <w:proofErr w:type="gramEnd"/>
+      <w:r>
+        <w:t xml:space="preserve"> </w:t>
+      </w:r>
+      <w:proofErr w:type="gramStart"/>
       <w:r>
         <w:rPr>
           <w:rFonts w:ascii="Segoe UI Emoji" w:hAnsi="Segoe UI Emoji" w:cs="Segoe UI Emoji"/>
@@ -301,8 +1603,29 @@
         <w:t>🟢</w:t>
       </w:r>
       <w:r>
-        <w:t xml:space="preserve">{% elif ping &lt;= 150 %}Warning </w:t>
-      </w:r>
+        <w:t>{</w:t>
+      </w:r>
+      <w:proofErr w:type="gramEnd"/>
+      <w:r>
+        <w:t xml:space="preserve">% </w:t>
+      </w:r>
+      <w:proofErr w:type="spellStart"/>
+      <w:r>
+        <w:t>elif</w:t>
+      </w:r>
+      <w:proofErr w:type="spellEnd"/>
+      <w:r>
+        <w:t xml:space="preserve"> ping &lt;= 150 </w:t>
+      </w:r>
+      <w:proofErr w:type="gramStart"/>
+      <w:r>
+        <w:t>%}Warning</w:t>
+      </w:r>
+      <w:proofErr w:type="gramEnd"/>
+      <w:r>
+        <w:t xml:space="preserve"> </w:t>
+      </w:r>
+      <w:proofErr w:type="gramStart"/>
       <w:r>
         <w:rPr>
           <w:rFonts w:ascii="Segoe UI Emoji" w:hAnsi="Segoe UI Emoji" w:cs="Segoe UI Emoji"/>
@@ -310,8 +1633,21 @@
         <w:t>🟡</w:t>
       </w:r>
       <w:r>
-        <w:t xml:space="preserve">{% else %}Critical </w:t>
-      </w:r>
+        <w:t>{</w:t>
+      </w:r>
+      <w:proofErr w:type="gramEnd"/>
+      <w:r>
+        <w:t xml:space="preserve">% else </w:t>
+      </w:r>
+      <w:proofErr w:type="gramStart"/>
+      <w:r>
+        <w:t>%}Critical</w:t>
+      </w:r>
+      <w:proofErr w:type="gramEnd"/>
+      <w:r>
+        <w:t xml:space="preserve"> </w:t>
+      </w:r>
+      <w:proofErr w:type="gramStart"/>
       <w:r>
         <w:rPr>
           <w:rFonts w:ascii="Segoe UI Emoji" w:hAnsi="Segoe UI Emoji" w:cs="Segoe UI Emoji"/>
@@ -319,14 +1655,32 @@
         <w:t>🔴</w:t>
       </w:r>
       <w:r>
-        <w:t>{% endif %}){% else %}</w:t>
+        <w:t>{</w:t>
+      </w:r>
+      <w:proofErr w:type="gramEnd"/>
+      <w:r>
+        <w:t>% endif %</w:t>
+      </w:r>
+      <w:proofErr w:type="gramStart"/>
+      <w:r>
+        <w:t>}){</w:t>
+      </w:r>
+      <w:proofErr w:type="gramEnd"/>
+      <w:r>
+        <w:t xml:space="preserve">% else </w:t>
+      </w:r>
+      <w:proofErr w:type="gramStart"/>
+      <w:r>
+        <w:t>%}</w:t>
       </w:r>
       <w:r>
         <w:t>(</w:t>
       </w:r>
+      <w:proofErr w:type="gramEnd"/>
       <w:r>
         <w:t xml:space="preserve">Ping Timeout </w:t>
       </w:r>
+      <w:proofErr w:type="gramStart"/>
       <w:r>
         <w:rPr>
           <w:rFonts w:ascii="Segoe UI Emoji" w:hAnsi="Segoe UI Emoji" w:cs="Segoe UI Emoji"/>
@@ -334,7 +1688,11 @@
         <w:t>❌</w:t>
       </w:r>
       <w:r>
-        <w:t>){% endif %}</w:t>
+        <w:t>){</w:t>
+      </w:r>
+      <w:proofErr w:type="gramEnd"/>
+      <w:r>
+        <w:t>% endif %}</w:t>
       </w:r>
     </w:p>
     <w:p>
@@ -345,44 +1703,291 @@
         <w:t>p</w:t>
       </w:r>
       <w:r>
-        <w:t xml:space="preserve"> endif %}</w:t>
+        <w:t xml:space="preserve"> if res.wan_</w:t>
+      </w:r>
+      <w:proofErr w:type="gramStart"/>
+      <w:r>
+        <w:t>status.WAN</w:t>
+      </w:r>
+      <w:proofErr w:type="gramEnd"/>
+      <w:r>
+        <w:t>3 %}</w:t>
       </w:r>
     </w:p>
     <w:p>
       <w:r>
-        <w:t>{%</w:t>
-      </w:r>
-      <w:r>
-        <w:t>p</w:t>
-      </w:r>
-      <w:r>
-        <w:t xml:space="preserve"> if res.screenshot %}</w:t>
+        <w:t>WAN3 Link Status: {% if res.wan_</w:t>
+      </w:r>
+      <w:proofErr w:type="gramStart"/>
+      <w:r>
+        <w:t>status.WAN</w:t>
+      </w:r>
+      <w:proofErr w:type="gramEnd"/>
+      <w:r>
+        <w:t xml:space="preserve">3_IP </w:t>
+      </w:r>
+      <w:proofErr w:type="gramStart"/>
+      <w:r>
+        <w:t>%}{{ res.wan</w:t>
+      </w:r>
+      <w:proofErr w:type="gramEnd"/>
+      <w:r>
+        <w:t>_</w:t>
+      </w:r>
+      <w:proofErr w:type="gramStart"/>
+      <w:r>
+        <w:t>status.WAN</w:t>
+      </w:r>
+      <w:proofErr w:type="gramEnd"/>
+      <w:r>
+        <w:t>3_</w:t>
+      </w:r>
+      <w:proofErr w:type="gramStart"/>
+      <w:r>
+        <w:t>IP }}{</w:t>
+      </w:r>
+      <w:proofErr w:type="gramEnd"/>
+      <w:r>
+        <w:t>% endif %} (</w:t>
+      </w:r>
+      <w:proofErr w:type="gramStart"/>
+      <w:r>
+        <w:t>{{ res.wan</w:t>
+      </w:r>
+      <w:proofErr w:type="gramEnd"/>
+      <w:r>
+        <w:t>_</w:t>
+      </w:r>
+      <w:proofErr w:type="gramStart"/>
+      <w:r>
+        <w:t>status.WAN3 }</w:t>
+      </w:r>
+      <w:proofErr w:type="gramEnd"/>
+      <w:r>
+        <w:t>}) {% if res.wan_</w:t>
+      </w:r>
+      <w:proofErr w:type="gramStart"/>
+      <w:r>
+        <w:t>status.WAN</w:t>
+      </w:r>
+      <w:proofErr w:type="gramEnd"/>
+      <w:r>
+        <w:t xml:space="preserve">3_LATENCY </w:t>
+      </w:r>
+      <w:proofErr w:type="gramStart"/>
+      <w:r>
+        <w:t>%}{</w:t>
+      </w:r>
+      <w:proofErr w:type="gramEnd"/>
+      <w:r>
+        <w:t>% set ping = res.wan_</w:t>
+      </w:r>
+      <w:proofErr w:type="gramStart"/>
+      <w:r>
+        <w:t>status.WAN</w:t>
+      </w:r>
+      <w:proofErr w:type="gramEnd"/>
+      <w:r>
+        <w:t xml:space="preserve">3_LATENCY|int </w:t>
+      </w:r>
+      <w:proofErr w:type="gramStart"/>
+      <w:r>
+        <w:t>%}Latency</w:t>
+      </w:r>
+      <w:proofErr w:type="gramEnd"/>
+      <w:r>
+        <w:t xml:space="preserve">: </w:t>
+      </w:r>
+      <w:proofErr w:type="gramStart"/>
+      <w:r>
+        <w:t>{{ ping</w:t>
+      </w:r>
+      <w:proofErr w:type="gramEnd"/>
+      <w:r>
+        <w:t xml:space="preserve"> }}</w:t>
+      </w:r>
+      <w:proofErr w:type="spellStart"/>
+      <w:r>
+        <w:t>ms</w:t>
+      </w:r>
+      <w:proofErr w:type="spellEnd"/>
+      <w:r>
+        <w:t xml:space="preserve"> ({% if ping &lt;= 50 </w:t>
+      </w:r>
+      <w:proofErr w:type="gramStart"/>
+      <w:r>
+        <w:t>%}Ok</w:t>
+      </w:r>
+      <w:proofErr w:type="gramEnd"/>
+      <w:r>
+        <w:t xml:space="preserve"> </w:t>
+      </w:r>
+      <w:proofErr w:type="gramStart"/>
+      <w:r>
+        <w:rPr>
+          <w:rFonts w:ascii="Segoe UI Emoji" w:hAnsi="Segoe UI Emoji" w:cs="Segoe UI Emoji"/>
+        </w:rPr>
+        <w:t>🟢</w:t>
+      </w:r>
+      <w:r>
+        <w:t>{</w:t>
+      </w:r>
+      <w:proofErr w:type="gramEnd"/>
+      <w:r>
+        <w:t xml:space="preserve">% </w:t>
+      </w:r>
+      <w:proofErr w:type="spellStart"/>
+      <w:r>
+        <w:t>elif</w:t>
+      </w:r>
+      <w:proofErr w:type="spellEnd"/>
+      <w:r>
+        <w:t xml:space="preserve"> ping &lt;= 150 </w:t>
+      </w:r>
+      <w:proofErr w:type="gramStart"/>
+      <w:r>
+        <w:t>%}Warning</w:t>
+      </w:r>
+      <w:proofErr w:type="gramEnd"/>
+      <w:r>
+        <w:t xml:space="preserve"> </w:t>
+      </w:r>
+      <w:proofErr w:type="gramStart"/>
+      <w:r>
+        <w:rPr>
+          <w:rFonts w:ascii="Segoe UI Emoji" w:hAnsi="Segoe UI Emoji" w:cs="Segoe UI Emoji"/>
+        </w:rPr>
+        <w:t>🟡</w:t>
+      </w:r>
+      <w:r>
+        <w:t>{</w:t>
+      </w:r>
+      <w:proofErr w:type="gramEnd"/>
+      <w:r>
+        <w:t xml:space="preserve">% else </w:t>
+      </w:r>
+      <w:proofErr w:type="gramStart"/>
+      <w:r>
+        <w:t>%}Critical</w:t>
+      </w:r>
+      <w:proofErr w:type="gramEnd"/>
+      <w:r>
+        <w:t xml:space="preserve"> </w:t>
+      </w:r>
+      <w:proofErr w:type="gramStart"/>
+      <w:r>
+        <w:rPr>
+          <w:rFonts w:ascii="Segoe UI Emoji" w:hAnsi="Segoe UI Emoji" w:cs="Segoe UI Emoji"/>
+        </w:rPr>
+        <w:t>🔴</w:t>
+      </w:r>
+      <w:r>
+        <w:t>{</w:t>
+      </w:r>
+      <w:proofErr w:type="gramEnd"/>
+      <w:r>
+        <w:t>% endif %</w:t>
+      </w:r>
+      <w:proofErr w:type="gramStart"/>
+      <w:r>
+        <w:t>}){</w:t>
+      </w:r>
+      <w:proofErr w:type="gramEnd"/>
+      <w:r>
+        <w:t xml:space="preserve">% else </w:t>
+      </w:r>
+      <w:proofErr w:type="gramStart"/>
+      <w:r>
+        <w:t>%}</w:t>
+      </w:r>
+      <w:r>
+        <w:t>(</w:t>
+      </w:r>
+      <w:proofErr w:type="gramEnd"/>
+      <w:r>
+        <w:t xml:space="preserve">Ping Timeout </w:t>
+      </w:r>
+      <w:proofErr w:type="gramStart"/>
+      <w:r>
+        <w:rPr>
+          <w:rFonts w:ascii="Segoe UI Emoji" w:hAnsi="Segoe UI Emoji" w:cs="Segoe UI Emoji"/>
+        </w:rPr>
+        <w:t>❌</w:t>
+      </w:r>
+      <w:r>
+        <w:t>){</w:t>
+      </w:r>
+      <w:proofErr w:type="gramEnd"/>
+      <w:r>
+        <w:t>% endif %}</w:t>
       </w:r>
     </w:p>
     <w:p>
       <w:r>
-        <w:t>Evidence (Screenshot):</w:t>
-      </w:r>
+        <w:t>{%</w:t>
+      </w:r>
+      <w:r>
+        <w:t>p</w:t>
+      </w:r>
+      <w:r>
+        <w:t xml:space="preserve"> </w:t>
+      </w:r>
+      <w:proofErr w:type="gramStart"/>
+      <w:r>
+        <w:t>endif %}</w:t>
+      </w:r>
+      <w:proofErr w:type="gramEnd"/>
     </w:p>
     <w:p>
       <w:r>
-        <w:t>{{ res.screenshot }}</w:t>
+        <w:t>{%</w:t>
+      </w:r>
+      <w:r>
+        <w:t>p</w:t>
+      </w:r>
+      <w:r>
+        <w:t xml:space="preserve"> if </w:t>
+      </w:r>
+      <w:proofErr w:type="spellStart"/>
+      <w:proofErr w:type="gramStart"/>
+      <w:r>
+        <w:t>res.screenshot</w:t>
+      </w:r>
+      <w:proofErr w:type="spellEnd"/>
+      <w:proofErr w:type="gramEnd"/>
+      <w:r>
+        <w:t xml:space="preserve"> %}</w:t>
       </w:r>
     </w:p>
     <w:p>
       <w:r>
-        <w:t>{%</w:t>
-      </w:r>
-      <w:r>
-        <w:t>p</w:t>
-      </w:r>
-      <w:r>
-        <w:t xml:space="preserve"> else %}</w:t>
+        <w:t>Evidence (Screenshot):</w:t>
       </w:r>
     </w:p>
     <w:p>
-      <w:r>
-        <w:t>No evidence image available.</w:t>
+      <w:proofErr w:type="gramStart"/>
+      <w:r>
+        <w:t xml:space="preserve">{{ </w:t>
+      </w:r>
+      <w:proofErr w:type="spellStart"/>
+      <w:r>
+        <w:t>res</w:t>
+      </w:r>
+      <w:proofErr w:type="gramEnd"/>
+      <w:r>
+        <w:t>.</w:t>
+      </w:r>
+      <w:proofErr w:type="gramStart"/>
+      <w:r>
+        <w:t>screenshot</w:t>
+      </w:r>
+      <w:proofErr w:type="spellEnd"/>
+      <w:r>
+        <w:t xml:space="preserve"> }</w:t>
+      </w:r>
+      <w:proofErr w:type="gramEnd"/>
+      <w:r>
+        <w:t>}</w:t>
       </w:r>
     </w:p>
     <w:p>
@@ -393,21 +1998,17 @@
         <w:t>p</w:t>
       </w:r>
       <w:r>
-        <w:t xml:space="preserve"> endif %}</w:t>
-      </w:r>
+        <w:t xml:space="preserve"> </w:t>
+      </w:r>
+      <w:proofErr w:type="gramStart"/>
+      <w:r>
+        <w:t>else %}</w:t>
+      </w:r>
+      <w:proofErr w:type="gramEnd"/>
     </w:p>
     <w:p>
       <w:r>
-        <w:t>{%</w:t>
-      </w:r>
-      <w:r>
-        <w:t>p</w:t>
-      </w:r>
-      <w:r>
-        <w:t xml:space="preserve"> endif %</w:t>
-      </w:r>
-      <w:r>
-        <w:t>}</w:t>
+        <w:t>No evidence image available.</w:t>
       </w:r>
     </w:p>
     <w:p>
@@ -418,8 +2019,13 @@
         <w:t>p</w:t>
       </w:r>
       <w:r>
-        <w:t xml:space="preserve"> endif %}</w:t>
-      </w:r>
+        <w:t xml:space="preserve"> </w:t>
+      </w:r>
+      <w:proofErr w:type="gramStart"/>
+      <w:r>
+        <w:t>endif %}</w:t>
+      </w:r>
+      <w:proofErr w:type="gramEnd"/>
     </w:p>
     <w:p>
       <w:r>
@@ -429,8 +2035,53 @@
         <w:t>p</w:t>
       </w:r>
       <w:r>
-        <w:t xml:space="preserve"> endfor %}</w:t>
-      </w:r>
+        <w:t xml:space="preserve"> </w:t>
+      </w:r>
+      <w:proofErr w:type="gramStart"/>
+      <w:r>
+        <w:t>endif %</w:t>
+      </w:r>
+      <w:r>
+        <w:t>}</w:t>
+      </w:r>
+      <w:proofErr w:type="gramEnd"/>
+    </w:p>
+    <w:p>
+      <w:r>
+        <w:t>{%</w:t>
+      </w:r>
+      <w:r>
+        <w:t>p</w:t>
+      </w:r>
+      <w:r>
+        <w:t xml:space="preserve"> </w:t>
+      </w:r>
+      <w:proofErr w:type="gramStart"/>
+      <w:r>
+        <w:t>endif %}</w:t>
+      </w:r>
+      <w:proofErr w:type="gramEnd"/>
+    </w:p>
+    <w:p>
+      <w:r>
+        <w:t>{%</w:t>
+      </w:r>
+      <w:r>
+        <w:t>p</w:t>
+      </w:r>
+      <w:r>
+        <w:t xml:space="preserve"> </w:t>
+      </w:r>
+      <w:proofErr w:type="spellStart"/>
+      <w:proofErr w:type="gramStart"/>
+      <w:r>
+        <w:t>endfor</w:t>
+      </w:r>
+      <w:proofErr w:type="spellEnd"/>
+      <w:r>
+        <w:t xml:space="preserve"> %}</w:t>
+      </w:r>
+      <w:proofErr w:type="gramEnd"/>
     </w:p>
     <w:sectPr>
       <w:pgSz w:w="12240" w:h="15840"/>

</xml_diff>

<commit_message>
style(templates): add logic to handle generic ping devices in docx templates
</commit_message>
<xml_diff>
--- a/template_en.example.docx
+++ b/template_en.example.docx
@@ -1946,7 +1946,36 @@
         <w:t>p</w:t>
       </w:r>
       <w:r>
-        <w:t xml:space="preserve"> if </w:t>
+        <w:t xml:space="preserve"> </w:t>
+      </w:r>
+      <w:proofErr w:type="gramStart"/>
+      <w:r>
+        <w:t>endif %</w:t>
+      </w:r>
+      <w:r>
+        <w:t>}</w:t>
+      </w:r>
+      <w:proofErr w:type="gramEnd"/>
+    </w:p>
+    <w:p>
+      <w:r>
+        <w:t>{%</w:t>
+      </w:r>
+      <w:r>
+        <w:t>p</w:t>
+      </w:r>
+      <w:r>
+        <w:t xml:space="preserve"> </w:t>
+      </w:r>
+      <w:proofErr w:type="gramStart"/>
+      <w:r>
+        <w:t>endif %}</w:t>
+      </w:r>
+      <w:proofErr w:type="gramEnd"/>
+    </w:p>
+    <w:p>
+      <w:r>
+        <w:t xml:space="preserve">{%p if </w:t>
       </w:r>
       <w:proofErr w:type="spellStart"/>
       <w:proofErr w:type="gramStart"/>
@@ -1992,13 +2021,7 @@
     </w:p>
     <w:p>
       <w:r>
-        <w:t>{%</w:t>
-      </w:r>
-      <w:r>
-        <w:t>p</w:t>
-      </w:r>
-      <w:r>
-        <w:t xml:space="preserve"> </w:t>
+        <w:t xml:space="preserve">{%p </w:t>
       </w:r>
       <w:proofErr w:type="gramStart"/>
       <w:r>
@@ -2013,48 +2036,7 @@
     </w:p>
     <w:p>
       <w:r>
-        <w:t>{%</w:t>
-      </w:r>
-      <w:r>
-        <w:t>p</w:t>
-      </w:r>
-      <w:r>
-        <w:t xml:space="preserve"> </w:t>
-      </w:r>
-      <w:proofErr w:type="gramStart"/>
-      <w:r>
-        <w:t>endif %}</w:t>
-      </w:r>
-      <w:proofErr w:type="gramEnd"/>
-    </w:p>
-    <w:p>
-      <w:r>
-        <w:t>{%</w:t>
-      </w:r>
-      <w:r>
-        <w:t>p</w:t>
-      </w:r>
-      <w:r>
-        <w:t xml:space="preserve"> </w:t>
-      </w:r>
-      <w:proofErr w:type="gramStart"/>
-      <w:r>
-        <w:t>endif %</w:t>
-      </w:r>
-      <w:r>
-        <w:t>}</w:t>
-      </w:r>
-      <w:proofErr w:type="gramEnd"/>
-    </w:p>
-    <w:p>
-      <w:r>
-        <w:t>{%</w:t>
-      </w:r>
-      <w:r>
-        <w:t>p</w:t>
-      </w:r>
-      <w:r>
-        <w:t xml:space="preserve"> </w:t>
+        <w:t xml:space="preserve">{%p </w:t>
       </w:r>
       <w:proofErr w:type="gramStart"/>
       <w:r>
@@ -2899,6 +2881,7 @@
   <w:style w:type="character" w:default="1" w:styleId="Fontepargpadro">
     <w:name w:val="Default Paragraph Font"/>
     <w:uiPriority w:val="1"/>
+    <w:semiHidden/>
     <w:unhideWhenUsed/>
   </w:style>
   <w:style w:type="table" w:default="1" w:styleId="Tabelanormal">

</xml_diff>

<commit_message>
chore(templates): update docx templates for dynamic interface naming
</commit_message>
<xml_diff>
--- a/template_en.example.docx
+++ b/template_en.example.docx
@@ -1707,24 +1707,39 @@
       </w:r>
       <w:proofErr w:type="gramStart"/>
       <w:r>
-        <w:t>status.WAN</w:t>
+        <w:t>status.</w:t>
+      </w:r>
+      <w:r>
+        <w:t>INTERNAL</w:t>
       </w:r>
       <w:proofErr w:type="gramEnd"/>
       <w:r>
-        <w:t>3 %}</w:t>
+        <w:t>5</w:t>
+      </w:r>
+      <w:r>
+        <w:t xml:space="preserve"> %}</w:t>
       </w:r>
     </w:p>
     <w:p>
       <w:r>
-        <w:t>WAN3 Link Status: {% if res.wan_</w:t>
+        <w:t>INTERNAL5</w:t>
+      </w:r>
+      <w:r>
+        <w:t xml:space="preserve"> Link Status: {% if res.wan_</w:t>
       </w:r>
       <w:proofErr w:type="gramStart"/>
       <w:r>
-        <w:t>status.WAN</w:t>
+        <w:t>status.</w:t>
+      </w:r>
+      <w:r>
+        <w:t>INTERNAL</w:t>
       </w:r>
       <w:proofErr w:type="gramEnd"/>
       <w:r>
-        <w:t xml:space="preserve">3_IP </w:t>
+        <w:t>5</w:t>
+      </w:r>
+      <w:r>
+        <w:t xml:space="preserve">_IP </w:t>
       </w:r>
       <w:proofErr w:type="gramStart"/>
       <w:r>
@@ -1736,11 +1751,17 @@
       </w:r>
       <w:proofErr w:type="gramStart"/>
       <w:r>
-        <w:t>status.WAN</w:t>
+        <w:t>status.</w:t>
+      </w:r>
+      <w:r>
+        <w:t>INTERNAL</w:t>
       </w:r>
       <w:proofErr w:type="gramEnd"/>
       <w:r>
-        <w:t>3_</w:t>
+        <w:t>5</w:t>
+      </w:r>
+      <w:r>
+        <w:t>_</w:t>
       </w:r>
       <w:proofErr w:type="gramStart"/>
       <w:r>
@@ -1760,7 +1781,13 @@
       </w:r>
       <w:proofErr w:type="gramStart"/>
       <w:r>
-        <w:t>status.WAN3 }</w:t>
+        <w:t>status.</w:t>
+      </w:r>
+      <w:r>
+        <w:t>INTERNAL5</w:t>
+      </w:r>
+      <w:r>
+        <w:t xml:space="preserve"> }</w:t>
       </w:r>
       <w:proofErr w:type="gramEnd"/>
       <w:r>
@@ -1768,11 +1795,17 @@
       </w:r>
       <w:proofErr w:type="gramStart"/>
       <w:r>
-        <w:t>status.WAN</w:t>
+        <w:t>status.</w:t>
+      </w:r>
+      <w:r>
+        <w:t>INTERNAL</w:t>
       </w:r>
       <w:proofErr w:type="gramEnd"/>
       <w:r>
-        <w:t xml:space="preserve">3_LATENCY </w:t>
+        <w:t>5</w:t>
+      </w:r>
+      <w:r>
+        <w:t xml:space="preserve">_LATENCY </w:t>
       </w:r>
       <w:proofErr w:type="gramStart"/>
       <w:r>
@@ -1784,11 +1817,17 @@
       </w:r>
       <w:proofErr w:type="gramStart"/>
       <w:r>
-        <w:t>status.WAN</w:t>
+        <w:t>status.</w:t>
+      </w:r>
+      <w:r>
+        <w:t>INTERNAL</w:t>
       </w:r>
       <w:proofErr w:type="gramEnd"/>
       <w:r>
-        <w:t xml:space="preserve">3_LATENCY|int </w:t>
+        <w:t>5</w:t>
+      </w:r>
+      <w:r>
+        <w:t xml:space="preserve">_LATENCY|int </w:t>
       </w:r>
       <w:proofErr w:type="gramStart"/>
       <w:r>

</xml_diff>

<commit_message>
chore(templates): simplify wan status tracking with dynamic jinja loop and ISP mapping
</commit_message>
<xml_diff>
--- a/template_en.example.docx
+++ b/template_en.example.docx
@@ -1280,87 +1280,323 @@
     </w:p>
     <w:p>
       <w:r>
-        <w:t>WAN1 Link Status: {% if res.wan_</w:t>
+        <w:t xml:space="preserve">{%p for </w:t>
+      </w:r>
+      <w:proofErr w:type="spellStart"/>
+      <w:r>
+        <w:t>intf_</w:t>
+      </w:r>
+      <w:r>
+        <w:t>key</w:t>
+      </w:r>
+      <w:proofErr w:type="spellEnd"/>
+      <w:r>
+        <w:t xml:space="preserve">, </w:t>
+      </w:r>
+      <w:proofErr w:type="spellStart"/>
+      <w:r>
+        <w:t>intf_data</w:t>
+      </w:r>
+      <w:proofErr w:type="spellEnd"/>
+      <w:r>
+        <w:t xml:space="preserve"> in </w:t>
+      </w:r>
+      <w:proofErr w:type="spellStart"/>
+      <w:r>
+        <w:t>res.wan_</w:t>
       </w:r>
       <w:proofErr w:type="gramStart"/>
       <w:r>
-        <w:t>status.WAN</w:t>
-      </w:r>
+        <w:t>status.items</w:t>
+      </w:r>
+      <w:proofErr w:type="spellEnd"/>
       <w:proofErr w:type="gramEnd"/>
       <w:r>
-        <w:t xml:space="preserve">1_IP </w:t>
+        <w:t>(</w:t>
       </w:r>
       <w:proofErr w:type="gramStart"/>
       <w:r>
-        <w:t>%}{{ res.wan</w:t>
+        <w:t>) %}</w:t>
       </w:r>
       <w:proofErr w:type="gramEnd"/>
+    </w:p>
+    <w:p>
+      <w:r>
+        <w:t xml:space="preserve">{% set </w:t>
+      </w:r>
+      <w:proofErr w:type="spellStart"/>
+      <w:r>
+        <w:t>isp_map</w:t>
+      </w:r>
+      <w:proofErr w:type="spellEnd"/>
+      <w:r>
+        <w:t xml:space="preserve"> </w:t>
+      </w:r>
+      <w:proofErr w:type="gramStart"/>
+      <w:r>
+        <w:t>= {'</w:t>
+      </w:r>
+      <w:proofErr w:type="gramEnd"/>
+      <w:r>
+        <w:t>WAN1': '</w:t>
+      </w:r>
+      <w:r>
+        <w:t>ISP1</w:t>
+      </w:r>
+      <w:r>
+        <w:t>', 'WAN2': '</w:t>
+      </w:r>
+      <w:proofErr w:type="gramStart"/>
+      <w:r>
+        <w:t>ISP2</w:t>
+      </w:r>
+      <w:r>
+        <w:t>'}</w:t>
+      </w:r>
+      <w:proofErr w:type="gramEnd"/>
+      <w:r>
+        <w:t xml:space="preserve"> %}</w:t>
+      </w:r>
+    </w:p>
+    <w:p>
+      <w:r>
+        <w:t xml:space="preserve">{% set </w:t>
+      </w:r>
+      <w:proofErr w:type="spellStart"/>
+      <w:r>
+        <w:t>isp_name</w:t>
+      </w:r>
+      <w:proofErr w:type="spellEnd"/>
+      <w:r>
+        <w:t xml:space="preserve"> = </w:t>
+      </w:r>
+      <w:proofErr w:type="spellStart"/>
+      <w:proofErr w:type="gramStart"/>
+      <w:r>
+        <w:t>isp_map.get</w:t>
+      </w:r>
+      <w:proofErr w:type="spellEnd"/>
+      <w:r>
+        <w:t>(</w:t>
+      </w:r>
+      <w:proofErr w:type="spellStart"/>
+      <w:proofErr w:type="gramEnd"/>
+      <w:r>
+        <w:t>intf_key</w:t>
+      </w:r>
+      <w:proofErr w:type="spellEnd"/>
+      <w:r>
+        <w:t xml:space="preserve">, </w:t>
+      </w:r>
+      <w:proofErr w:type="spellStart"/>
+      <w:r>
+        <w:t>intf_key</w:t>
+      </w:r>
+      <w:proofErr w:type="spellEnd"/>
+      <w:proofErr w:type="gramStart"/>
+      <w:r>
+        <w:t>) %}</w:t>
+      </w:r>
+      <w:proofErr w:type="gramEnd"/>
+    </w:p>
+    <w:p>
+      <w:proofErr w:type="gramStart"/>
+      <w:r>
+        <w:lastRenderedPageBreak/>
+        <w:t xml:space="preserve">{{ </w:t>
+      </w:r>
+      <w:proofErr w:type="spellStart"/>
+      <w:r>
+        <w:t>isp</w:t>
+      </w:r>
+      <w:proofErr w:type="gramEnd"/>
       <w:r>
         <w:t>_</w:t>
       </w:r>
       <w:proofErr w:type="gramStart"/>
       <w:r>
-        <w:t>status.WAN</w:t>
+        <w:t>name</w:t>
+      </w:r>
+      <w:proofErr w:type="spellEnd"/>
+      <w:r>
+        <w:t xml:space="preserve"> }</w:t>
       </w:r>
       <w:proofErr w:type="gramEnd"/>
       <w:r>
-        <w:t>1_</w:t>
+        <w:t>}</w:t>
+      </w:r>
+      <w:r>
+        <w:t xml:space="preserve"> </w:t>
+      </w:r>
+      <w:r>
+        <w:t>(</w:t>
       </w:r>
       <w:proofErr w:type="gramStart"/>
       <w:r>
-        <w:t>IP }}{</w:t>
+        <w:t>{{ i</w:t>
+      </w:r>
+      <w:proofErr w:type="spellStart"/>
+      <w:r>
+        <w:t>ntf</w:t>
       </w:r>
       <w:proofErr w:type="gramEnd"/>
       <w:r>
-        <w:t>% endif %} (</w:t>
+        <w:t>_</w:t>
       </w:r>
       <w:proofErr w:type="gramStart"/>
       <w:r>
-        <w:t>{{ res.wan</w:t>
+        <w:t>key</w:t>
+      </w:r>
+      <w:proofErr w:type="spellEnd"/>
+      <w:r>
+        <w:t xml:space="preserve"> }</w:t>
       </w:r>
       <w:proofErr w:type="gramEnd"/>
       <w:r>
+        <w:t>}</w:t>
+      </w:r>
+      <w:r>
+        <w:t>)</w:t>
+      </w:r>
+      <w:r>
+        <w:t xml:space="preserve"> Link </w:t>
+      </w:r>
+      <w:proofErr w:type="gramStart"/>
+      <w:r>
+        <w:t>Status: {</w:t>
+      </w:r>
+      <w:proofErr w:type="gramEnd"/>
+      <w:r>
+        <w:t xml:space="preserve">% if </w:t>
+      </w:r>
+      <w:proofErr w:type="spellStart"/>
+      <w:r>
+        <w:t>intf_</w:t>
+      </w:r>
+      <w:proofErr w:type="gramStart"/>
+      <w:r>
+        <w:t>data.ip</w:t>
+      </w:r>
+      <w:proofErr w:type="spellEnd"/>
+      <w:proofErr w:type="gramEnd"/>
+      <w:r>
+        <w:t xml:space="preserve"> </w:t>
+      </w:r>
+      <w:proofErr w:type="gramStart"/>
+      <w:r>
+        <w:t xml:space="preserve">%}{{ </w:t>
+      </w:r>
+      <w:proofErr w:type="spellStart"/>
+      <w:r>
+        <w:t>intf</w:t>
+      </w:r>
+      <w:proofErr w:type="gramEnd"/>
+      <w:r>
         <w:t>_</w:t>
       </w:r>
       <w:proofErr w:type="gramStart"/>
       <w:r>
-        <w:t>status.WAN1 }</w:t>
-      </w:r>
+        <w:t>data.ip</w:t>
+      </w:r>
+      <w:proofErr w:type="spellEnd"/>
       <w:proofErr w:type="gramEnd"/>
       <w:r>
-        <w:t>}) {% if res.wan_</w:t>
+        <w:t xml:space="preserve"> </w:t>
       </w:r>
       <w:proofErr w:type="gramStart"/>
       <w:r>
-        <w:t>status.WAN</w:t>
+        <w:t>}}{</w:t>
       </w:r>
       <w:proofErr w:type="gramEnd"/>
       <w:r>
-        <w:t xml:space="preserve">1_LATENCY </w:t>
+        <w:t xml:space="preserve">% </w:t>
       </w:r>
       <w:proofErr w:type="gramStart"/>
       <w:r>
+        <w:t>endif %}</w:t>
+      </w:r>
+      <w:proofErr w:type="gramEnd"/>
+      <w:r>
+        <w:t xml:space="preserve"> (</w:t>
+      </w:r>
+      <w:proofErr w:type="gramStart"/>
+      <w:r>
+        <w:t xml:space="preserve">{{ </w:t>
+      </w:r>
+      <w:proofErr w:type="spellStart"/>
+      <w:r>
+        <w:t>intf</w:t>
+      </w:r>
+      <w:proofErr w:type="gramEnd"/>
+      <w:r>
+        <w:t>_</w:t>
+      </w:r>
+      <w:proofErr w:type="gramStart"/>
+      <w:r>
+        <w:t>data.status</w:t>
+      </w:r>
+      <w:proofErr w:type="spellEnd"/>
+      <w:proofErr w:type="gramEnd"/>
+      <w:r>
+        <w:t xml:space="preserve"> }})</w:t>
+      </w:r>
+    </w:p>
+    <w:p>
+      <w:r>
+        <w:t xml:space="preserve">{% if </w:t>
+      </w:r>
+      <w:proofErr w:type="spellStart"/>
+      <w:r>
+        <w:t>intf_</w:t>
+      </w:r>
+      <w:proofErr w:type="gramStart"/>
+      <w:r>
+        <w:t>data.latency</w:t>
+      </w:r>
+      <w:proofErr w:type="spellEnd"/>
+      <w:proofErr w:type="gramEnd"/>
+      <w:r>
+        <w:t xml:space="preserve"> </w:t>
+      </w:r>
+      <w:proofErr w:type="gramStart"/>
+      <w:r>
         <w:t>%}{</w:t>
       </w:r>
       <w:proofErr w:type="gramEnd"/>
       <w:r>
-        <w:t>% set ping = res.wan_</w:t>
+        <w:t xml:space="preserve">% set ping = </w:t>
+      </w:r>
+      <w:proofErr w:type="spellStart"/>
+      <w:r>
+        <w:t>intf_</w:t>
       </w:r>
       <w:proofErr w:type="gramStart"/>
       <w:r>
-        <w:t>status.WAN</w:t>
+        <w:t>data.latency</w:t>
       </w:r>
       <w:proofErr w:type="gramEnd"/>
       <w:r>
-        <w:t xml:space="preserve">1_LATENCY|int </w:t>
+        <w:t>|int</w:t>
+      </w:r>
+      <w:proofErr w:type="spellEnd"/>
+      <w:r>
+        <w:t xml:space="preserve"> </w:t>
       </w:r>
       <w:proofErr w:type="gramStart"/>
       <w:r>
-        <w:t>%}Latency</w:t>
+        <w:t>%}Gateway</w:t>
       </w:r>
       <w:proofErr w:type="gramEnd"/>
       <w:r>
-        <w:t xml:space="preserve">: </w:t>
+        <w:t xml:space="preserve"> Latency (</w:t>
+      </w:r>
+      <w:proofErr w:type="gramStart"/>
+      <w:r>
+        <w:t>{{ intf_data.gw</w:t>
+      </w:r>
+      <w:proofErr w:type="gramEnd"/>
+      <w:r>
+        <w:t xml:space="preserve"> }}): </w:t>
       </w:r>
       <w:proofErr w:type="gramStart"/>
       <w:r>
@@ -1390,6 +1626,7 @@
       <w:r>
         <w:rPr>
           <w:rFonts w:ascii="Segoe UI Emoji" w:hAnsi="Segoe UI Emoji" w:cs="Segoe UI Emoji"/>
+          <w:lang w:val="pt-BR"/>
         </w:rPr>
         <w:t>🟢</w:t>
       </w:r>
@@ -1402,7 +1639,6 @@
       </w:r>
       <w:proofErr w:type="spellStart"/>
       <w:r>
-        <w:lastRenderedPageBreak/>
         <w:t>elif</w:t>
       </w:r>
       <w:proofErr w:type="spellEnd"/>
@@ -1421,6 +1657,7 @@
       <w:r>
         <w:rPr>
           <w:rFonts w:ascii="Segoe UI Emoji" w:hAnsi="Segoe UI Emoji" w:cs="Segoe UI Emoji"/>
+          <w:lang w:val="pt-BR"/>
         </w:rPr>
         <w:t>🟡</w:t>
       </w:r>
@@ -1443,6 +1680,7 @@
       <w:r>
         <w:rPr>
           <w:rFonts w:ascii="Segoe UI Emoji" w:hAnsi="Segoe UI Emoji" w:cs="Segoe UI Emoji"/>
+          <w:lang w:val="pt-BR"/>
         </w:rPr>
         <w:t>🔴</w:t>
       </w:r>
@@ -1463,10 +1701,7 @@
       </w:r>
       <w:proofErr w:type="gramStart"/>
       <w:r>
-        <w:t>%}</w:t>
-      </w:r>
-      <w:r>
-        <w:t>(</w:t>
+        <w:t>%}(</w:t>
       </w:r>
       <w:proofErr w:type="gramEnd"/>
       <w:r>
@@ -1489,210 +1724,40 @@
     </w:p>
     <w:p>
       <w:r>
-        <w:t>WAN2 Link Status: {% if res.wan_</w:t>
-      </w:r>
-      <w:proofErr w:type="gramStart"/>
-      <w:r>
-        <w:t>status.WAN</w:t>
-      </w:r>
-      <w:proofErr w:type="gramEnd"/>
-      <w:r>
-        <w:t xml:space="preserve">2_IP </w:t>
-      </w:r>
-      <w:proofErr w:type="gramStart"/>
-      <w:r>
-        <w:t>%}{{ res.wan</w:t>
-      </w:r>
-      <w:proofErr w:type="gramEnd"/>
-      <w:r>
-        <w:t>_</w:t>
-      </w:r>
-      <w:proofErr w:type="gramStart"/>
-      <w:r>
-        <w:t>status.WAN</w:t>
-      </w:r>
-      <w:proofErr w:type="gramEnd"/>
-      <w:r>
-        <w:t>2_</w:t>
-      </w:r>
-      <w:proofErr w:type="gramStart"/>
-      <w:r>
-        <w:t>IP }}{</w:t>
-      </w:r>
-      <w:proofErr w:type="gramEnd"/>
-      <w:r>
-        <w:t>% endif %} (</w:t>
-      </w:r>
-      <w:proofErr w:type="gramStart"/>
-      <w:r>
-        <w:t>{{ res.wan</w:t>
-      </w:r>
-      <w:proofErr w:type="gramEnd"/>
-      <w:r>
-        <w:t>_</w:t>
-      </w:r>
-      <w:proofErr w:type="gramStart"/>
-      <w:r>
-        <w:t>status.WAN2 }</w:t>
-      </w:r>
-      <w:proofErr w:type="gramEnd"/>
-      <w:r>
-        <w:t>}) {% if res.wan_</w:t>
-      </w:r>
-      <w:proofErr w:type="gramStart"/>
-      <w:r>
-        <w:t>status.WAN</w:t>
-      </w:r>
-      <w:proofErr w:type="gramEnd"/>
-      <w:r>
-        <w:t xml:space="preserve">2_LATENCY </w:t>
-      </w:r>
-      <w:proofErr w:type="gramStart"/>
-      <w:r>
-        <w:t>%}{</w:t>
-      </w:r>
-      <w:proofErr w:type="gramEnd"/>
-      <w:r>
-        <w:t>% set ping = res.wan_</w:t>
-      </w:r>
-      <w:proofErr w:type="gramStart"/>
-      <w:r>
-        <w:t>status.WAN</w:t>
-      </w:r>
-      <w:proofErr w:type="gramEnd"/>
-      <w:r>
-        <w:t xml:space="preserve">2_LATENCY|int </w:t>
-      </w:r>
-      <w:proofErr w:type="gramStart"/>
-      <w:r>
-        <w:t>%}Latency</w:t>
-      </w:r>
-      <w:proofErr w:type="gramEnd"/>
-      <w:r>
-        <w:t xml:space="preserve">: </w:t>
-      </w:r>
-      <w:proofErr w:type="gramStart"/>
-      <w:r>
-        <w:t>{{ ping</w:t>
-      </w:r>
-      <w:proofErr w:type="gramEnd"/>
-      <w:r>
-        <w:t xml:space="preserve"> }}</w:t>
+        <w:t xml:space="preserve">{%p </w:t>
       </w:r>
       <w:proofErr w:type="spellStart"/>
       <w:r>
-        <w:t>ms</w:t>
+        <w:t>endfor</w:t>
       </w:r>
       <w:proofErr w:type="spellEnd"/>
       <w:r>
-        <w:t xml:space="preserve"> ({% if ping &lt;= 50 </w:t>
-      </w:r>
-      <w:proofErr w:type="gramStart"/>
-      <w:r>
-        <w:t>%}Ok</w:t>
-      </w:r>
-      <w:proofErr w:type="gramEnd"/>
+        <w:t xml:space="preserve"> %}</w:t>
+      </w:r>
       <w:r>
         <w:t xml:space="preserve"> </w:t>
       </w:r>
-      <w:proofErr w:type="gramStart"/>
-      <w:r>
-        <w:rPr>
-          <w:rFonts w:ascii="Segoe UI Emoji" w:hAnsi="Segoe UI Emoji" w:cs="Segoe UI Emoji"/>
-        </w:rPr>
-        <w:t>🟢</w:t>
-      </w:r>
-      <w:r>
-        <w:t>{</w:t>
-      </w:r>
-      <w:proofErr w:type="gramEnd"/>
-      <w:r>
-        <w:t xml:space="preserve">% </w:t>
+      <w:r>
+        <w:t xml:space="preserve">{# CLOSES: for </w:t>
       </w:r>
       <w:proofErr w:type="spellStart"/>
       <w:r>
-        <w:t>elif</w:t>
+        <w:t>intf_key</w:t>
       </w:r>
       <w:proofErr w:type="spellEnd"/>
       <w:r>
-        <w:t xml:space="preserve"> ping &lt;= 150 </w:t>
-      </w:r>
-      <w:proofErr w:type="gramStart"/>
-      <w:r>
-        <w:t>%}Warning</w:t>
-      </w:r>
-      <w:proofErr w:type="gramEnd"/>
+        <w:t xml:space="preserve">, </w:t>
+      </w:r>
+      <w:proofErr w:type="spellStart"/>
+      <w:r>
+        <w:t>intf_data</w:t>
+      </w:r>
+      <w:proofErr w:type="spellEnd"/>
+      <w:r>
+        <w:t xml:space="preserve"> #}</w:t>
+      </w:r>
       <w:r>
         <w:t xml:space="preserve"> </w:t>
-      </w:r>
-      <w:proofErr w:type="gramStart"/>
-      <w:r>
-        <w:rPr>
-          <w:rFonts w:ascii="Segoe UI Emoji" w:hAnsi="Segoe UI Emoji" w:cs="Segoe UI Emoji"/>
-        </w:rPr>
-        <w:t>🟡</w:t>
-      </w:r>
-      <w:r>
-        <w:t>{</w:t>
-      </w:r>
-      <w:proofErr w:type="gramEnd"/>
-      <w:r>
-        <w:t xml:space="preserve">% else </w:t>
-      </w:r>
-      <w:proofErr w:type="gramStart"/>
-      <w:r>
-        <w:t>%}Critical</w:t>
-      </w:r>
-      <w:proofErr w:type="gramEnd"/>
-      <w:r>
-        <w:t xml:space="preserve"> </w:t>
-      </w:r>
-      <w:proofErr w:type="gramStart"/>
-      <w:r>
-        <w:rPr>
-          <w:rFonts w:ascii="Segoe UI Emoji" w:hAnsi="Segoe UI Emoji" w:cs="Segoe UI Emoji"/>
-        </w:rPr>
-        <w:t>🔴</w:t>
-      </w:r>
-      <w:r>
-        <w:t>{</w:t>
-      </w:r>
-      <w:proofErr w:type="gramEnd"/>
-      <w:r>
-        <w:t>% endif %</w:t>
-      </w:r>
-      <w:proofErr w:type="gramStart"/>
-      <w:r>
-        <w:t>}){</w:t>
-      </w:r>
-      <w:proofErr w:type="gramEnd"/>
-      <w:r>
-        <w:t xml:space="preserve">% else </w:t>
-      </w:r>
-      <w:proofErr w:type="gramStart"/>
-      <w:r>
-        <w:t>%}</w:t>
-      </w:r>
-      <w:r>
-        <w:t>(</w:t>
-      </w:r>
-      <w:proofErr w:type="gramEnd"/>
-      <w:r>
-        <w:t xml:space="preserve">Ping Timeout </w:t>
-      </w:r>
-      <w:proofErr w:type="gramStart"/>
-      <w:r>
-        <w:rPr>
-          <w:rFonts w:ascii="Segoe UI Emoji" w:hAnsi="Segoe UI Emoji" w:cs="Segoe UI Emoji"/>
-        </w:rPr>
-        <w:t>❌</w:t>
-      </w:r>
-      <w:r>
-        <w:t>){</w:t>
-      </w:r>
-      <w:proofErr w:type="gramEnd"/>
-      <w:r>
-        <w:t>% endif %}</w:t>
       </w:r>
     </w:p>
     <w:p>
@@ -1703,312 +1768,76 @@
         <w:t>p</w:t>
       </w:r>
       <w:r>
-        <w:t xml:space="preserve"> if res.wan_</w:t>
+        <w:t xml:space="preserve"> </w:t>
       </w:r>
       <w:proofErr w:type="gramStart"/>
       <w:r>
-        <w:t>status.</w:t>
-      </w:r>
-      <w:r>
-        <w:t>INTERNAL</w:t>
+        <w:t>endif %</w:t>
+      </w:r>
+      <w:r>
+        <w:t>}</w:t>
+      </w:r>
+      <w:r>
+        <w:t xml:space="preserve"> </w:t>
+      </w:r>
+      <w:r>
+        <w:t>{#</w:t>
       </w:r>
       <w:proofErr w:type="gramEnd"/>
       <w:r>
-        <w:t>5</w:t>
-      </w:r>
-      <w:r>
-        <w:t xml:space="preserve"> %}</w:t>
+        <w:t xml:space="preserve"> CLOSES: if </w:t>
+      </w:r>
+      <w:proofErr w:type="spellStart"/>
+      <w:proofErr w:type="gramStart"/>
+      <w:r>
+        <w:t>res.error</w:t>
+      </w:r>
+      <w:proofErr w:type="spellEnd"/>
+      <w:proofErr w:type="gramEnd"/>
+      <w:r>
+        <w:t xml:space="preserve"> #}</w:t>
       </w:r>
     </w:p>
     <w:p>
       <w:r>
-        <w:t>INTERNAL5</w:t>
-      </w:r>
-      <w:r>
-        <w:t xml:space="preserve"> Link Status: {% if res.wan_</w:t>
+        <w:t>{%</w:t>
+      </w:r>
+      <w:r>
+        <w:t>p</w:t>
+      </w:r>
+      <w:r>
+        <w:t xml:space="preserve"> </w:t>
       </w:r>
       <w:proofErr w:type="gramStart"/>
       <w:r>
-        <w:t>status.</w:t>
-      </w:r>
-      <w:r>
-        <w:t>INTERNAL</w:t>
+        <w:t>endif %}</w:t>
+      </w:r>
+      <w:r>
+        <w:t xml:space="preserve"> </w:t>
+      </w:r>
+      <w:r>
+        <w:t>{#</w:t>
       </w:r>
       <w:proofErr w:type="gramEnd"/>
       <w:r>
-        <w:t>5</w:t>
-      </w:r>
-      <w:r>
-        <w:t xml:space="preserve">_IP </w:t>
-      </w:r>
+        <w:t xml:space="preserve"> CLOSES: if </w:t>
+      </w:r>
+      <w:proofErr w:type="spellStart"/>
       <w:proofErr w:type="gramStart"/>
       <w:r>
-        <w:t>%}{{ res.wan</w:t>
+        <w:t>res.rule</w:t>
       </w:r>
       <w:proofErr w:type="gramEnd"/>
       <w:r>
-        <w:t>_</w:t>
+        <w:t>_name</w:t>
+      </w:r>
+      <w:proofErr w:type="spellEnd"/>
+      <w:r>
+        <w:t xml:space="preserve"> in ['Switch', 'Access Point</w:t>
       </w:r>
       <w:proofErr w:type="gramStart"/>
       <w:r>
-        <w:t>status.</w:t>
-      </w:r>
-      <w:r>
-        <w:t>INTERNAL</w:t>
-      </w:r>
-      <w:proofErr w:type="gramEnd"/>
-      <w:r>
-        <w:t>5</w:t>
-      </w:r>
-      <w:r>
-        <w:t>_</w:t>
-      </w:r>
-      <w:proofErr w:type="gramStart"/>
-      <w:r>
-        <w:t>IP }}{</w:t>
-      </w:r>
-      <w:proofErr w:type="gramEnd"/>
-      <w:r>
-        <w:t>% endif %} (</w:t>
-      </w:r>
-      <w:proofErr w:type="gramStart"/>
-      <w:r>
-        <w:t>{{ res.wan</w:t>
-      </w:r>
-      <w:proofErr w:type="gramEnd"/>
-      <w:r>
-        <w:t>_</w:t>
-      </w:r>
-      <w:proofErr w:type="gramStart"/>
-      <w:r>
-        <w:t>status.</w:t>
-      </w:r>
-      <w:r>
-        <w:t>INTERNAL5</w:t>
-      </w:r>
-      <w:r>
-        <w:t xml:space="preserve"> }</w:t>
-      </w:r>
-      <w:proofErr w:type="gramEnd"/>
-      <w:r>
-        <w:t>}) {% if res.wan_</w:t>
-      </w:r>
-      <w:proofErr w:type="gramStart"/>
-      <w:r>
-        <w:t>status.</w:t>
-      </w:r>
-      <w:r>
-        <w:t>INTERNAL</w:t>
-      </w:r>
-      <w:proofErr w:type="gramEnd"/>
-      <w:r>
-        <w:t>5</w:t>
-      </w:r>
-      <w:r>
-        <w:t xml:space="preserve">_LATENCY </w:t>
-      </w:r>
-      <w:proofErr w:type="gramStart"/>
-      <w:r>
-        <w:t>%}{</w:t>
-      </w:r>
-      <w:proofErr w:type="gramEnd"/>
-      <w:r>
-        <w:t>% set ping = res.wan_</w:t>
-      </w:r>
-      <w:proofErr w:type="gramStart"/>
-      <w:r>
-        <w:t>status.</w:t>
-      </w:r>
-      <w:r>
-        <w:t>INTERNAL</w:t>
-      </w:r>
-      <w:proofErr w:type="gramEnd"/>
-      <w:r>
-        <w:t>5</w:t>
-      </w:r>
-      <w:r>
-        <w:t xml:space="preserve">_LATENCY|int </w:t>
-      </w:r>
-      <w:proofErr w:type="gramStart"/>
-      <w:r>
-        <w:t>%}Latency</w:t>
-      </w:r>
-      <w:proofErr w:type="gramEnd"/>
-      <w:r>
-        <w:t xml:space="preserve">: </w:t>
-      </w:r>
-      <w:proofErr w:type="gramStart"/>
-      <w:r>
-        <w:t>{{ ping</w:t>
-      </w:r>
-      <w:proofErr w:type="gramEnd"/>
-      <w:r>
-        <w:t xml:space="preserve"> }}</w:t>
-      </w:r>
-      <w:proofErr w:type="spellStart"/>
-      <w:r>
-        <w:t>ms</w:t>
-      </w:r>
-      <w:proofErr w:type="spellEnd"/>
-      <w:r>
-        <w:t xml:space="preserve"> ({% if ping &lt;= 50 </w:t>
-      </w:r>
-      <w:proofErr w:type="gramStart"/>
-      <w:r>
-        <w:t>%}Ok</w:t>
-      </w:r>
-      <w:proofErr w:type="gramEnd"/>
-      <w:r>
-        <w:t xml:space="preserve"> </w:t>
-      </w:r>
-      <w:proofErr w:type="gramStart"/>
-      <w:r>
-        <w:rPr>
-          <w:rFonts w:ascii="Segoe UI Emoji" w:hAnsi="Segoe UI Emoji" w:cs="Segoe UI Emoji"/>
-        </w:rPr>
-        <w:t>🟢</w:t>
-      </w:r>
-      <w:r>
-        <w:t>{</w:t>
-      </w:r>
-      <w:proofErr w:type="gramEnd"/>
-      <w:r>
-        <w:t xml:space="preserve">% </w:t>
-      </w:r>
-      <w:proofErr w:type="spellStart"/>
-      <w:r>
-        <w:t>elif</w:t>
-      </w:r>
-      <w:proofErr w:type="spellEnd"/>
-      <w:r>
-        <w:t xml:space="preserve"> ping &lt;= 150 </w:t>
-      </w:r>
-      <w:proofErr w:type="gramStart"/>
-      <w:r>
-        <w:t>%}Warning</w:t>
-      </w:r>
-      <w:proofErr w:type="gramEnd"/>
-      <w:r>
-        <w:t xml:space="preserve"> </w:t>
-      </w:r>
-      <w:proofErr w:type="gramStart"/>
-      <w:r>
-        <w:rPr>
-          <w:rFonts w:ascii="Segoe UI Emoji" w:hAnsi="Segoe UI Emoji" w:cs="Segoe UI Emoji"/>
-        </w:rPr>
-        <w:t>🟡</w:t>
-      </w:r>
-      <w:r>
-        <w:t>{</w:t>
-      </w:r>
-      <w:proofErr w:type="gramEnd"/>
-      <w:r>
-        <w:t xml:space="preserve">% else </w:t>
-      </w:r>
-      <w:proofErr w:type="gramStart"/>
-      <w:r>
-        <w:t>%}Critical</w:t>
-      </w:r>
-      <w:proofErr w:type="gramEnd"/>
-      <w:r>
-        <w:t xml:space="preserve"> </w:t>
-      </w:r>
-      <w:proofErr w:type="gramStart"/>
-      <w:r>
-        <w:rPr>
-          <w:rFonts w:ascii="Segoe UI Emoji" w:hAnsi="Segoe UI Emoji" w:cs="Segoe UI Emoji"/>
-        </w:rPr>
-        <w:t>🔴</w:t>
-      </w:r>
-      <w:r>
-        <w:t>{</w:t>
-      </w:r>
-      <w:proofErr w:type="gramEnd"/>
-      <w:r>
-        <w:t>% endif %</w:t>
-      </w:r>
-      <w:proofErr w:type="gramStart"/>
-      <w:r>
-        <w:t>}){</w:t>
-      </w:r>
-      <w:proofErr w:type="gramEnd"/>
-      <w:r>
-        <w:t xml:space="preserve">% else </w:t>
-      </w:r>
-      <w:proofErr w:type="gramStart"/>
-      <w:r>
-        <w:t>%}</w:t>
-      </w:r>
-      <w:r>
-        <w:t>(</w:t>
-      </w:r>
-      <w:proofErr w:type="gramEnd"/>
-      <w:r>
-        <w:t xml:space="preserve">Ping Timeout </w:t>
-      </w:r>
-      <w:proofErr w:type="gramStart"/>
-      <w:r>
-        <w:rPr>
-          <w:rFonts w:ascii="Segoe UI Emoji" w:hAnsi="Segoe UI Emoji" w:cs="Segoe UI Emoji"/>
-        </w:rPr>
-        <w:t>❌</w:t>
-      </w:r>
-      <w:r>
-        <w:t>){</w:t>
-      </w:r>
-      <w:proofErr w:type="gramEnd"/>
-      <w:r>
-        <w:t>% endif %}</w:t>
-      </w:r>
-    </w:p>
-    <w:p>
-      <w:r>
-        <w:t>{%</w:t>
-      </w:r>
-      <w:r>
-        <w:t>p</w:t>
-      </w:r>
-      <w:r>
-        <w:t xml:space="preserve"> </w:t>
-      </w:r>
-      <w:proofErr w:type="gramStart"/>
-      <w:r>
-        <w:t>endif %}</w:t>
-      </w:r>
-      <w:proofErr w:type="gramEnd"/>
-    </w:p>
-    <w:p>
-      <w:r>
-        <w:t>{%</w:t>
-      </w:r>
-      <w:r>
-        <w:t>p</w:t>
-      </w:r>
-      <w:r>
-        <w:t xml:space="preserve"> </w:t>
-      </w:r>
-      <w:proofErr w:type="gramStart"/>
-      <w:r>
-        <w:t>endif %</w:t>
-      </w:r>
-      <w:r>
-        <w:t>}</w:t>
-      </w:r>
-      <w:proofErr w:type="gramEnd"/>
-    </w:p>
-    <w:p>
-      <w:r>
-        <w:t>{%</w:t>
-      </w:r>
-      <w:r>
-        <w:t>p</w:t>
-      </w:r>
-      <w:r>
-        <w:t xml:space="preserve"> </w:t>
-      </w:r>
-      <w:proofErr w:type="gramStart"/>
-      <w:r>
-        <w:t>endif %}</w:t>
+        <w:t>'] #}</w:t>
       </w:r>
       <w:proofErr w:type="gramEnd"/>
     </w:p>
@@ -2920,7 +2749,6 @@
   <w:style w:type="character" w:default="1" w:styleId="Fontepargpadro">
     <w:name w:val="Default Paragraph Font"/>
     <w:uiPriority w:val="1"/>
-    <w:semiHidden/>
     <w:unhideWhenUsed/>
   </w:style>
   <w:style w:type="table" w:default="1" w:styleId="Tabelanormal">

</xml_diff>

<commit_message>
Fix: correctly detect 0.0.0.0 as logical down, flag host in ping timeout summary, and provide ping_interface boolean for DOCX logic
</commit_message>
<xml_diff>
--- a/template_en.example.docx
+++ b/template_en.example.docx
@@ -64,93 +64,7 @@
         <w:rPr>
           <w:rFonts w:ascii="Cambria" w:eastAsia="MS Mincho" w:hAnsi="Cambria" w:cs="Times New Roman"/>
         </w:rPr>
-        <w:t xml:space="preserve"> Ok (Ping ≤ 50ms): </w:t>
-      </w:r>
-      <w:proofErr w:type="gramStart"/>
-      <w:r>
-        <w:rPr>
-          <w:rFonts w:ascii="Cambria" w:eastAsia="MS Mincho" w:hAnsi="Cambria" w:cs="Times New Roman"/>
-        </w:rPr>
-        <w:t>{{ results</w:t>
-      </w:r>
-      <w:proofErr w:type="gramEnd"/>
-      <w:r>
-        <w:rPr>
-          <w:rFonts w:ascii="Cambria" w:eastAsia="MS Mincho" w:hAnsi="Cambria" w:cs="Times New Roman"/>
-        </w:rPr>
-        <w:t xml:space="preserve"> | </w:t>
-      </w:r>
-      <w:proofErr w:type="spellStart"/>
-      <w:proofErr w:type="gramStart"/>
-      <w:r>
-        <w:rPr>
-          <w:rFonts w:ascii="Cambria" w:eastAsia="MS Mincho" w:hAnsi="Cambria" w:cs="Times New Roman"/>
-        </w:rPr>
-        <w:t>rejectattr</w:t>
-      </w:r>
-      <w:proofErr w:type="spellEnd"/>
-      <w:r>
-        <w:rPr>
-          <w:rFonts w:ascii="Cambria" w:eastAsia="MS Mincho" w:hAnsi="Cambria" w:cs="Times New Roman"/>
-        </w:rPr>
-        <w:t>(</w:t>
-      </w:r>
-      <w:proofErr w:type="gramEnd"/>
-      <w:r>
-        <w:rPr>
-          <w:rFonts w:ascii="Cambria" w:eastAsia="MS Mincho" w:hAnsi="Cambria" w:cs="Times New Roman"/>
-        </w:rPr>
-        <w:t>'latency', '</w:t>
-      </w:r>
-      <w:proofErr w:type="spellStart"/>
-      <w:r>
-        <w:rPr>
-          <w:rFonts w:ascii="Cambria" w:eastAsia="MS Mincho" w:hAnsi="Cambria" w:cs="Times New Roman"/>
-        </w:rPr>
-        <w:t>equalto</w:t>
-      </w:r>
-      <w:proofErr w:type="spellEnd"/>
-      <w:r>
-        <w:rPr>
-          <w:rFonts w:ascii="Cambria" w:eastAsia="MS Mincho" w:hAnsi="Cambria" w:cs="Times New Roman"/>
-        </w:rPr>
-        <w:t xml:space="preserve">', '') | </w:t>
-      </w:r>
-      <w:proofErr w:type="spellStart"/>
-      <w:proofErr w:type="gramStart"/>
-      <w:r>
-        <w:rPr>
-          <w:rFonts w:ascii="Cambria" w:eastAsia="MS Mincho" w:hAnsi="Cambria" w:cs="Times New Roman"/>
-        </w:rPr>
-        <w:t>selectattr</w:t>
-      </w:r>
-      <w:proofErr w:type="spellEnd"/>
-      <w:r>
-        <w:rPr>
-          <w:rFonts w:ascii="Cambria" w:eastAsia="MS Mincho" w:hAnsi="Cambria" w:cs="Times New Roman"/>
-        </w:rPr>
-        <w:t>(</w:t>
-      </w:r>
-      <w:proofErr w:type="gramEnd"/>
-      <w:r>
-        <w:rPr>
-          <w:rFonts w:ascii="Cambria" w:eastAsia="MS Mincho" w:hAnsi="Cambria" w:cs="Times New Roman"/>
-        </w:rPr>
-        <w:t xml:space="preserve">'latency', 'le', 50) | list | </w:t>
-      </w:r>
-      <w:proofErr w:type="gramStart"/>
-      <w:r>
-        <w:rPr>
-          <w:rFonts w:ascii="Cambria" w:eastAsia="MS Mincho" w:hAnsi="Cambria" w:cs="Times New Roman"/>
-        </w:rPr>
-        <w:t>length }</w:t>
-      </w:r>
-      <w:proofErr w:type="gramEnd"/>
-      <w:r>
-        <w:rPr>
-          <w:rFonts w:ascii="Cambria" w:eastAsia="MS Mincho" w:hAnsi="Cambria" w:cs="Times New Roman"/>
-        </w:rPr>
-        <w:t>}</w:t>
+        <w:t xml:space="preserve"> Ok (Ping ≤ 50ms): {{ results | rejectattr('latency', 'equalto', '') | selectattr('latency', 'le', 50) | list | length }}</w:t>
       </w:r>
     </w:p>
     <w:p>
@@ -169,293 +83,7 @@
         <w:rPr>
           <w:rFonts w:ascii="Cambria" w:eastAsia="MS Mincho" w:hAnsi="Cambria" w:cs="Times New Roman"/>
         </w:rPr>
-        <w:t xml:space="preserve"> Warning (Ping 50ms ≤ 150ms): </w:t>
-      </w:r>
-      <w:proofErr w:type="gramStart"/>
-      <w:r>
-        <w:rPr>
-          <w:rFonts w:ascii="Cambria" w:eastAsia="MS Mincho" w:hAnsi="Cambria" w:cs="Times New Roman"/>
-        </w:rPr>
-        <w:t>{{ results</w:t>
-      </w:r>
-      <w:proofErr w:type="gramEnd"/>
-      <w:r>
-        <w:rPr>
-          <w:rFonts w:ascii="Cambria" w:eastAsia="MS Mincho" w:hAnsi="Cambria" w:cs="Times New Roman"/>
-        </w:rPr>
-        <w:t xml:space="preserve"> | </w:t>
-      </w:r>
-      <w:proofErr w:type="spellStart"/>
-      <w:proofErr w:type="gramStart"/>
-      <w:r>
-        <w:rPr>
-          <w:rFonts w:ascii="Cambria" w:eastAsia="MS Mincho" w:hAnsi="Cambria" w:cs="Times New Roman"/>
-        </w:rPr>
-        <w:t>rejectattr</w:t>
-      </w:r>
-      <w:proofErr w:type="spellEnd"/>
-      <w:r>
-        <w:rPr>
-          <w:rFonts w:ascii="Cambria" w:eastAsia="MS Mincho" w:hAnsi="Cambria" w:cs="Times New Roman"/>
-        </w:rPr>
-        <w:t>(</w:t>
-      </w:r>
-      <w:proofErr w:type="gramEnd"/>
-      <w:r>
-        <w:rPr>
-          <w:rFonts w:ascii="Cambria" w:eastAsia="MS Mincho" w:hAnsi="Cambria" w:cs="Times New Roman"/>
-        </w:rPr>
-        <w:t>'latency', '</w:t>
-      </w:r>
-      <w:proofErr w:type="spellStart"/>
-      <w:r>
-        <w:rPr>
-          <w:rFonts w:ascii="Cambria" w:eastAsia="MS Mincho" w:hAnsi="Cambria" w:cs="Times New Roman"/>
-        </w:rPr>
-        <w:t>equalto</w:t>
-      </w:r>
-      <w:proofErr w:type="spellEnd"/>
-      <w:r>
-        <w:rPr>
-          <w:rFonts w:ascii="Cambria" w:eastAsia="MS Mincho" w:hAnsi="Cambria" w:cs="Times New Roman"/>
-        </w:rPr>
-        <w:t xml:space="preserve">', '') | </w:t>
-      </w:r>
-      <w:proofErr w:type="spellStart"/>
-      <w:proofErr w:type="gramStart"/>
-      <w:r>
-        <w:rPr>
-          <w:rFonts w:ascii="Cambria" w:eastAsia="MS Mincho" w:hAnsi="Cambria" w:cs="Times New Roman"/>
-        </w:rPr>
-        <w:t>selectattr</w:t>
-      </w:r>
-      <w:proofErr w:type="spellEnd"/>
-      <w:r>
-        <w:rPr>
-          <w:rFonts w:ascii="Cambria" w:eastAsia="MS Mincho" w:hAnsi="Cambria" w:cs="Times New Roman"/>
-        </w:rPr>
-        <w:t>(</w:t>
-      </w:r>
-      <w:proofErr w:type="gramEnd"/>
-      <w:r>
-        <w:rPr>
-          <w:rFonts w:ascii="Cambria" w:eastAsia="MS Mincho" w:hAnsi="Cambria" w:cs="Times New Roman"/>
-        </w:rPr>
-        <w:t>'latency', '</w:t>
-      </w:r>
-      <w:proofErr w:type="spellStart"/>
-      <w:r>
-        <w:rPr>
-          <w:rFonts w:ascii="Cambria" w:eastAsia="MS Mincho" w:hAnsi="Cambria" w:cs="Times New Roman"/>
-        </w:rPr>
-        <w:t>gt</w:t>
-      </w:r>
-      <w:proofErr w:type="spellEnd"/>
-      <w:r>
-        <w:rPr>
-          <w:rFonts w:ascii="Cambria" w:eastAsia="MS Mincho" w:hAnsi="Cambria" w:cs="Times New Roman"/>
-        </w:rPr>
-        <w:t xml:space="preserve">', 50) | </w:t>
-      </w:r>
-      <w:proofErr w:type="spellStart"/>
-      <w:proofErr w:type="gramStart"/>
-      <w:r>
-        <w:rPr>
-          <w:rFonts w:ascii="Cambria" w:eastAsia="MS Mincho" w:hAnsi="Cambria" w:cs="Times New Roman"/>
-        </w:rPr>
-        <w:t>selectattr</w:t>
-      </w:r>
-      <w:proofErr w:type="spellEnd"/>
-      <w:r>
-        <w:rPr>
-          <w:rFonts w:ascii="Cambria" w:eastAsia="MS Mincho" w:hAnsi="Cambria" w:cs="Times New Roman"/>
-        </w:rPr>
-        <w:t>(</w:t>
-      </w:r>
-      <w:proofErr w:type="gramEnd"/>
-      <w:r>
-        <w:rPr>
-          <w:rFonts w:ascii="Cambria" w:eastAsia="MS Mincho" w:hAnsi="Cambria" w:cs="Times New Roman"/>
-        </w:rPr>
-        <w:t xml:space="preserve">'latency', 'le', 150) | list | </w:t>
-      </w:r>
-      <w:proofErr w:type="gramStart"/>
-      <w:r>
-        <w:rPr>
-          <w:rFonts w:ascii="Cambria" w:eastAsia="MS Mincho" w:hAnsi="Cambria" w:cs="Times New Roman"/>
-        </w:rPr>
-        <w:t>length }}{</w:t>
-      </w:r>
-      <w:proofErr w:type="gramEnd"/>
-      <w:r>
-        <w:rPr>
-          <w:rFonts w:ascii="Cambria" w:eastAsia="MS Mincho" w:hAnsi="Cambria" w:cs="Times New Roman"/>
-        </w:rPr>
-        <w:t xml:space="preserve">% set warns = results | </w:t>
-      </w:r>
-      <w:proofErr w:type="spellStart"/>
-      <w:proofErr w:type="gramStart"/>
-      <w:r>
-        <w:rPr>
-          <w:rFonts w:ascii="Cambria" w:eastAsia="MS Mincho" w:hAnsi="Cambria" w:cs="Times New Roman"/>
-        </w:rPr>
-        <w:t>rejectattr</w:t>
-      </w:r>
-      <w:proofErr w:type="spellEnd"/>
-      <w:r>
-        <w:rPr>
-          <w:rFonts w:ascii="Cambria" w:eastAsia="MS Mincho" w:hAnsi="Cambria" w:cs="Times New Roman"/>
-        </w:rPr>
-        <w:t>(</w:t>
-      </w:r>
-      <w:proofErr w:type="gramEnd"/>
-      <w:r>
-        <w:rPr>
-          <w:rFonts w:ascii="Cambria" w:eastAsia="MS Mincho" w:hAnsi="Cambria" w:cs="Times New Roman"/>
-        </w:rPr>
-        <w:t>'latency', '</w:t>
-      </w:r>
-      <w:proofErr w:type="spellStart"/>
-      <w:r>
-        <w:rPr>
-          <w:rFonts w:ascii="Cambria" w:eastAsia="MS Mincho" w:hAnsi="Cambria" w:cs="Times New Roman"/>
-        </w:rPr>
-        <w:t>equalto</w:t>
-      </w:r>
-      <w:proofErr w:type="spellEnd"/>
-      <w:r>
-        <w:rPr>
-          <w:rFonts w:ascii="Cambria" w:eastAsia="MS Mincho" w:hAnsi="Cambria" w:cs="Times New Roman"/>
-        </w:rPr>
-        <w:t xml:space="preserve">', '') | </w:t>
-      </w:r>
-      <w:proofErr w:type="spellStart"/>
-      <w:proofErr w:type="gramStart"/>
-      <w:r>
-        <w:rPr>
-          <w:rFonts w:ascii="Cambria" w:eastAsia="MS Mincho" w:hAnsi="Cambria" w:cs="Times New Roman"/>
-        </w:rPr>
-        <w:t>selectattr</w:t>
-      </w:r>
-      <w:proofErr w:type="spellEnd"/>
-      <w:r>
-        <w:rPr>
-          <w:rFonts w:ascii="Cambria" w:eastAsia="MS Mincho" w:hAnsi="Cambria" w:cs="Times New Roman"/>
-        </w:rPr>
-        <w:t>(</w:t>
-      </w:r>
-      <w:proofErr w:type="gramEnd"/>
-      <w:r>
-        <w:rPr>
-          <w:rFonts w:ascii="Cambria" w:eastAsia="MS Mincho" w:hAnsi="Cambria" w:cs="Times New Roman"/>
-        </w:rPr>
-        <w:t>'latency', '</w:t>
-      </w:r>
-      <w:proofErr w:type="spellStart"/>
-      <w:r>
-        <w:rPr>
-          <w:rFonts w:ascii="Cambria" w:eastAsia="MS Mincho" w:hAnsi="Cambria" w:cs="Times New Roman"/>
-        </w:rPr>
-        <w:t>gt</w:t>
-      </w:r>
-      <w:proofErr w:type="spellEnd"/>
-      <w:r>
-        <w:rPr>
-          <w:rFonts w:ascii="Cambria" w:eastAsia="MS Mincho" w:hAnsi="Cambria" w:cs="Times New Roman"/>
-        </w:rPr>
-        <w:t xml:space="preserve">', 50) | </w:t>
-      </w:r>
-      <w:proofErr w:type="spellStart"/>
-      <w:proofErr w:type="gramStart"/>
-      <w:r>
-        <w:rPr>
-          <w:rFonts w:ascii="Cambria" w:eastAsia="MS Mincho" w:hAnsi="Cambria" w:cs="Times New Roman"/>
-        </w:rPr>
-        <w:t>selectattr</w:t>
-      </w:r>
-      <w:proofErr w:type="spellEnd"/>
-      <w:r>
-        <w:rPr>
-          <w:rFonts w:ascii="Cambria" w:eastAsia="MS Mincho" w:hAnsi="Cambria" w:cs="Times New Roman"/>
-        </w:rPr>
-        <w:t>(</w:t>
-      </w:r>
-      <w:proofErr w:type="gramEnd"/>
-      <w:r>
-        <w:rPr>
-          <w:rFonts w:ascii="Cambria" w:eastAsia="MS Mincho" w:hAnsi="Cambria" w:cs="Times New Roman"/>
-        </w:rPr>
-        <w:t xml:space="preserve">'latency', 'le', 150) | map(attribute='host') | list </w:t>
-      </w:r>
-      <w:proofErr w:type="gramStart"/>
-      <w:r>
-        <w:rPr>
-          <w:rFonts w:ascii="Cambria" w:eastAsia="MS Mincho" w:hAnsi="Cambria" w:cs="Times New Roman"/>
-        </w:rPr>
-        <w:t>%}{</w:t>
-      </w:r>
-      <w:proofErr w:type="gramEnd"/>
-      <w:r>
-        <w:rPr>
-          <w:rFonts w:ascii="Cambria" w:eastAsia="MS Mincho" w:hAnsi="Cambria" w:cs="Times New Roman"/>
-        </w:rPr>
-        <w:t xml:space="preserve">% if </w:t>
-      </w:r>
-      <w:proofErr w:type="spellStart"/>
-      <w:r>
-        <w:rPr>
-          <w:rFonts w:ascii="Cambria" w:eastAsia="MS Mincho" w:hAnsi="Cambria" w:cs="Times New Roman"/>
-        </w:rPr>
-        <w:t>warns|length</w:t>
-      </w:r>
-      <w:proofErr w:type="spellEnd"/>
-      <w:r>
-        <w:rPr>
-          <w:rFonts w:ascii="Cambria" w:eastAsia="MS Mincho" w:hAnsi="Cambria" w:cs="Times New Roman"/>
-        </w:rPr>
-        <w:t xml:space="preserve"> &gt; 0 %} (</w:t>
-      </w:r>
-      <w:proofErr w:type="gramStart"/>
-      <w:r>
-        <w:rPr>
-          <w:rFonts w:ascii="Cambria" w:eastAsia="MS Mincho" w:hAnsi="Cambria" w:cs="Times New Roman"/>
-        </w:rPr>
-        <w:t>{{ warns</w:t>
-      </w:r>
-      <w:proofErr w:type="gramEnd"/>
-      <w:r>
-        <w:rPr>
-          <w:rFonts w:ascii="Cambria" w:eastAsia="MS Mincho" w:hAnsi="Cambria" w:cs="Times New Roman"/>
-        </w:rPr>
-        <w:t xml:space="preserve"> | </w:t>
-      </w:r>
-      <w:proofErr w:type="gramStart"/>
-      <w:r>
-        <w:rPr>
-          <w:rFonts w:ascii="Cambria" w:eastAsia="MS Mincho" w:hAnsi="Cambria" w:cs="Times New Roman"/>
-        </w:rPr>
-        <w:t>join(</w:t>
-      </w:r>
-      <w:proofErr w:type="gramEnd"/>
-      <w:r>
-        <w:rPr>
-          <w:rFonts w:ascii="Cambria" w:eastAsia="MS Mincho" w:hAnsi="Cambria" w:cs="Times New Roman"/>
-        </w:rPr>
-        <w:t>', '</w:t>
-      </w:r>
-      <w:proofErr w:type="gramStart"/>
-      <w:r>
-        <w:rPr>
-          <w:rFonts w:ascii="Cambria" w:eastAsia="MS Mincho" w:hAnsi="Cambria" w:cs="Times New Roman"/>
-        </w:rPr>
-        <w:t>) }}){</w:t>
-      </w:r>
-      <w:proofErr w:type="gramEnd"/>
-      <w:r>
-        <w:rPr>
-          <w:rFonts w:ascii="Cambria" w:eastAsia="MS Mincho" w:hAnsi="Cambria" w:cs="Times New Roman"/>
-        </w:rPr>
-        <w:t>% endif %}</w:t>
+        <w:t xml:space="preserve"> Warning (Ping 50ms ≤ 150ms): {{ results | rejectattr('latency', 'equalto', '') | selectattr('latency', 'gt', 50) | selectattr('latency', 'le', 150) | list | length }}{% set warns = results | rejectattr('latency', 'equalto', '') | selectattr('latency', 'gt', 50) | selectattr('latency', 'le', 150) | map(attribute='host') | list %}{% if warns|length &gt; 0 %} ({{ warns | join(', ') }}){% endif %}</w:t>
       </w:r>
     </w:p>
     <w:p>
@@ -474,249 +102,7 @@
         <w:rPr>
           <w:rFonts w:ascii="Cambria" w:eastAsia="MS Mincho" w:hAnsi="Cambria" w:cs="Times New Roman"/>
         </w:rPr>
-        <w:t xml:space="preserve"> Critical (Ping ≥ 150ms): </w:t>
-      </w:r>
-      <w:proofErr w:type="gramStart"/>
-      <w:r>
-        <w:rPr>
-          <w:rFonts w:ascii="Cambria" w:eastAsia="MS Mincho" w:hAnsi="Cambria" w:cs="Times New Roman"/>
-        </w:rPr>
-        <w:t>{{ results</w:t>
-      </w:r>
-      <w:proofErr w:type="gramEnd"/>
-      <w:r>
-        <w:rPr>
-          <w:rFonts w:ascii="Cambria" w:eastAsia="MS Mincho" w:hAnsi="Cambria" w:cs="Times New Roman"/>
-        </w:rPr>
-        <w:t xml:space="preserve"> | </w:t>
-      </w:r>
-      <w:proofErr w:type="spellStart"/>
-      <w:proofErr w:type="gramStart"/>
-      <w:r>
-        <w:rPr>
-          <w:rFonts w:ascii="Cambria" w:eastAsia="MS Mincho" w:hAnsi="Cambria" w:cs="Times New Roman"/>
-        </w:rPr>
-        <w:t>rejectattr</w:t>
-      </w:r>
-      <w:proofErr w:type="spellEnd"/>
-      <w:r>
-        <w:rPr>
-          <w:rFonts w:ascii="Cambria" w:eastAsia="MS Mincho" w:hAnsi="Cambria" w:cs="Times New Roman"/>
-        </w:rPr>
-        <w:t>(</w:t>
-      </w:r>
-      <w:proofErr w:type="gramEnd"/>
-      <w:r>
-        <w:rPr>
-          <w:rFonts w:ascii="Cambria" w:eastAsia="MS Mincho" w:hAnsi="Cambria" w:cs="Times New Roman"/>
-        </w:rPr>
-        <w:t>'latency', '</w:t>
-      </w:r>
-      <w:proofErr w:type="spellStart"/>
-      <w:r>
-        <w:rPr>
-          <w:rFonts w:ascii="Cambria" w:eastAsia="MS Mincho" w:hAnsi="Cambria" w:cs="Times New Roman"/>
-        </w:rPr>
-        <w:t>equalto</w:t>
-      </w:r>
-      <w:proofErr w:type="spellEnd"/>
-      <w:r>
-        <w:rPr>
-          <w:rFonts w:ascii="Cambria" w:eastAsia="MS Mincho" w:hAnsi="Cambria" w:cs="Times New Roman"/>
-        </w:rPr>
-        <w:t xml:space="preserve">', '') | </w:t>
-      </w:r>
-      <w:proofErr w:type="spellStart"/>
-      <w:proofErr w:type="gramStart"/>
-      <w:r>
-        <w:rPr>
-          <w:rFonts w:ascii="Cambria" w:eastAsia="MS Mincho" w:hAnsi="Cambria" w:cs="Times New Roman"/>
-        </w:rPr>
-        <w:t>selectattr</w:t>
-      </w:r>
-      <w:proofErr w:type="spellEnd"/>
-      <w:r>
-        <w:rPr>
-          <w:rFonts w:ascii="Cambria" w:eastAsia="MS Mincho" w:hAnsi="Cambria" w:cs="Times New Roman"/>
-        </w:rPr>
-        <w:t>(</w:t>
-      </w:r>
-      <w:proofErr w:type="gramEnd"/>
-      <w:r>
-        <w:rPr>
-          <w:rFonts w:ascii="Cambria" w:eastAsia="MS Mincho" w:hAnsi="Cambria" w:cs="Times New Roman"/>
-        </w:rPr>
-        <w:t>'latency', '</w:t>
-      </w:r>
-      <w:proofErr w:type="spellStart"/>
-      <w:r>
-        <w:rPr>
-          <w:rFonts w:ascii="Cambria" w:eastAsia="MS Mincho" w:hAnsi="Cambria" w:cs="Times New Roman"/>
-        </w:rPr>
-        <w:t>gt</w:t>
-      </w:r>
-      <w:proofErr w:type="spellEnd"/>
-      <w:r>
-        <w:rPr>
-          <w:rFonts w:ascii="Cambria" w:eastAsia="MS Mincho" w:hAnsi="Cambria" w:cs="Times New Roman"/>
-        </w:rPr>
-        <w:t xml:space="preserve">', 150) | list | </w:t>
-      </w:r>
-      <w:proofErr w:type="gramStart"/>
-      <w:r>
-        <w:rPr>
-          <w:rFonts w:ascii="Cambria" w:eastAsia="MS Mincho" w:hAnsi="Cambria" w:cs="Times New Roman"/>
-        </w:rPr>
-        <w:t>length }}{</w:t>
-      </w:r>
-      <w:proofErr w:type="gramEnd"/>
-      <w:r>
-        <w:rPr>
-          <w:rFonts w:ascii="Cambria" w:eastAsia="MS Mincho" w:hAnsi="Cambria" w:cs="Times New Roman"/>
-        </w:rPr>
-        <w:t xml:space="preserve">% set crits = results | </w:t>
-      </w:r>
-      <w:proofErr w:type="spellStart"/>
-      <w:proofErr w:type="gramStart"/>
-      <w:r>
-        <w:rPr>
-          <w:rFonts w:ascii="Cambria" w:eastAsia="MS Mincho" w:hAnsi="Cambria" w:cs="Times New Roman"/>
-        </w:rPr>
-        <w:t>rejectattr</w:t>
-      </w:r>
-      <w:proofErr w:type="spellEnd"/>
-      <w:r>
-        <w:rPr>
-          <w:rFonts w:ascii="Cambria" w:eastAsia="MS Mincho" w:hAnsi="Cambria" w:cs="Times New Roman"/>
-        </w:rPr>
-        <w:t>(</w:t>
-      </w:r>
-      <w:proofErr w:type="gramEnd"/>
-      <w:r>
-        <w:rPr>
-          <w:rFonts w:ascii="Cambria" w:eastAsia="MS Mincho" w:hAnsi="Cambria" w:cs="Times New Roman"/>
-        </w:rPr>
-        <w:t>'latency', '</w:t>
-      </w:r>
-      <w:proofErr w:type="spellStart"/>
-      <w:r>
-        <w:rPr>
-          <w:rFonts w:ascii="Cambria" w:eastAsia="MS Mincho" w:hAnsi="Cambria" w:cs="Times New Roman"/>
-        </w:rPr>
-        <w:t>equalto</w:t>
-      </w:r>
-      <w:proofErr w:type="spellEnd"/>
-      <w:r>
-        <w:rPr>
-          <w:rFonts w:ascii="Cambria" w:eastAsia="MS Mincho" w:hAnsi="Cambria" w:cs="Times New Roman"/>
-        </w:rPr>
-        <w:t xml:space="preserve">', '') | </w:t>
-      </w:r>
-      <w:proofErr w:type="spellStart"/>
-      <w:proofErr w:type="gramStart"/>
-      <w:r>
-        <w:rPr>
-          <w:rFonts w:ascii="Cambria" w:eastAsia="MS Mincho" w:hAnsi="Cambria" w:cs="Times New Roman"/>
-        </w:rPr>
-        <w:t>selectattr</w:t>
-      </w:r>
-      <w:proofErr w:type="spellEnd"/>
-      <w:r>
-        <w:rPr>
-          <w:rFonts w:ascii="Cambria" w:eastAsia="MS Mincho" w:hAnsi="Cambria" w:cs="Times New Roman"/>
-        </w:rPr>
-        <w:t>(</w:t>
-      </w:r>
-      <w:proofErr w:type="gramEnd"/>
-      <w:r>
-        <w:rPr>
-          <w:rFonts w:ascii="Cambria" w:eastAsia="MS Mincho" w:hAnsi="Cambria" w:cs="Times New Roman"/>
-        </w:rPr>
-        <w:t>'latency', '</w:t>
-      </w:r>
-      <w:proofErr w:type="spellStart"/>
-      <w:r>
-        <w:rPr>
-          <w:rFonts w:ascii="Cambria" w:eastAsia="MS Mincho" w:hAnsi="Cambria" w:cs="Times New Roman"/>
-        </w:rPr>
-        <w:t>gt</w:t>
-      </w:r>
-      <w:proofErr w:type="spellEnd"/>
-      <w:r>
-        <w:rPr>
-          <w:rFonts w:ascii="Cambria" w:eastAsia="MS Mincho" w:hAnsi="Cambria" w:cs="Times New Roman"/>
-        </w:rPr>
-        <w:t xml:space="preserve">', 150) | map(attribute='host') | list </w:t>
-      </w:r>
-      <w:proofErr w:type="gramStart"/>
-      <w:r>
-        <w:rPr>
-          <w:rFonts w:ascii="Cambria" w:eastAsia="MS Mincho" w:hAnsi="Cambria" w:cs="Times New Roman"/>
-        </w:rPr>
-        <w:t>%}{</w:t>
-      </w:r>
-      <w:proofErr w:type="gramEnd"/>
-      <w:r>
-        <w:rPr>
-          <w:rFonts w:ascii="Cambria" w:eastAsia="MS Mincho" w:hAnsi="Cambria" w:cs="Times New Roman"/>
-        </w:rPr>
-        <w:t xml:space="preserve">% if </w:t>
-      </w:r>
-      <w:proofErr w:type="spellStart"/>
-      <w:r>
-        <w:rPr>
-          <w:rFonts w:ascii="Cambria" w:eastAsia="MS Mincho" w:hAnsi="Cambria" w:cs="Times New Roman"/>
-        </w:rPr>
-        <w:t>crits|length</w:t>
-      </w:r>
-      <w:proofErr w:type="spellEnd"/>
-      <w:r>
-        <w:rPr>
-          <w:rFonts w:ascii="Cambria" w:eastAsia="MS Mincho" w:hAnsi="Cambria" w:cs="Times New Roman"/>
-        </w:rPr>
-        <w:t xml:space="preserve"> &gt; 0 %} (</w:t>
-      </w:r>
-      <w:proofErr w:type="gramStart"/>
-      <w:r>
-        <w:rPr>
-          <w:rFonts w:ascii="Cambria" w:eastAsia="MS Mincho" w:hAnsi="Cambria" w:cs="Times New Roman"/>
-        </w:rPr>
-        <w:t>{{ crits</w:t>
-      </w:r>
-      <w:proofErr w:type="gramEnd"/>
-      <w:r>
-        <w:rPr>
-          <w:rFonts w:ascii="Cambria" w:eastAsia="MS Mincho" w:hAnsi="Cambria" w:cs="Times New Roman"/>
-        </w:rPr>
-        <w:t xml:space="preserve"> | </w:t>
-      </w:r>
-      <w:proofErr w:type="gramStart"/>
-      <w:r>
-        <w:rPr>
-          <w:rFonts w:ascii="Cambria" w:eastAsia="MS Mincho" w:hAnsi="Cambria" w:cs="Times New Roman"/>
-        </w:rPr>
-        <w:t>join(</w:t>
-      </w:r>
-      <w:proofErr w:type="gramEnd"/>
-      <w:r>
-        <w:rPr>
-          <w:rFonts w:ascii="Cambria" w:eastAsia="MS Mincho" w:hAnsi="Cambria" w:cs="Times New Roman"/>
-        </w:rPr>
-        <w:t>', '</w:t>
-      </w:r>
-      <w:proofErr w:type="gramStart"/>
-      <w:r>
-        <w:rPr>
-          <w:rFonts w:ascii="Cambria" w:eastAsia="MS Mincho" w:hAnsi="Cambria" w:cs="Times New Roman"/>
-        </w:rPr>
-        <w:t>) }}){</w:t>
-      </w:r>
-      <w:proofErr w:type="gramEnd"/>
-      <w:r>
-        <w:rPr>
-          <w:rFonts w:ascii="Cambria" w:eastAsia="MS Mincho" w:hAnsi="Cambria" w:cs="Times New Roman"/>
-        </w:rPr>
-        <w:t>% endif %}</w:t>
+        <w:t xml:space="preserve"> Critical (Ping ≥ 150ms): {{ results | rejectattr('latency', 'equalto', '') | selectattr('latency', 'gt', 150) | list | length }}{% set crits = results | rejectattr('latency', 'equalto', '') | selectattr('latency', 'gt', 150) | map(attribute='host') | list %}{% if crits|length &gt; 0 %} ({{ crits | join(', ') }}){% endif %}</w:t>
       </w:r>
     </w:p>
     <w:p>
@@ -735,177 +121,7 @@
         <w:rPr>
           <w:rFonts w:ascii="Cambria" w:eastAsia="MS Mincho" w:hAnsi="Cambria" w:cs="Times New Roman"/>
         </w:rPr>
-        <w:t xml:space="preserve"> Ping Timeout: </w:t>
-      </w:r>
-      <w:proofErr w:type="gramStart"/>
-      <w:r>
-        <w:rPr>
-          <w:rFonts w:ascii="Cambria" w:eastAsia="MS Mincho" w:hAnsi="Cambria" w:cs="Times New Roman"/>
-        </w:rPr>
-        <w:t>{{ results</w:t>
-      </w:r>
-      <w:proofErr w:type="gramEnd"/>
-      <w:r>
-        <w:rPr>
-          <w:rFonts w:ascii="Cambria" w:eastAsia="MS Mincho" w:hAnsi="Cambria" w:cs="Times New Roman"/>
-        </w:rPr>
-        <w:t xml:space="preserve"> | </w:t>
-      </w:r>
-      <w:proofErr w:type="spellStart"/>
-      <w:proofErr w:type="gramStart"/>
-      <w:r>
-        <w:rPr>
-          <w:rFonts w:ascii="Cambria" w:eastAsia="MS Mincho" w:hAnsi="Cambria" w:cs="Times New Roman"/>
-        </w:rPr>
-        <w:t>selectattr</w:t>
-      </w:r>
-      <w:proofErr w:type="spellEnd"/>
-      <w:r>
-        <w:rPr>
-          <w:rFonts w:ascii="Cambria" w:eastAsia="MS Mincho" w:hAnsi="Cambria" w:cs="Times New Roman"/>
-        </w:rPr>
-        <w:t>(</w:t>
-      </w:r>
-      <w:proofErr w:type="gramEnd"/>
-      <w:r>
-        <w:rPr>
-          <w:rFonts w:ascii="Cambria" w:eastAsia="MS Mincho" w:hAnsi="Cambria" w:cs="Times New Roman"/>
-        </w:rPr>
-        <w:t>'latency', '</w:t>
-      </w:r>
-      <w:proofErr w:type="spellStart"/>
-      <w:r>
-        <w:rPr>
-          <w:rFonts w:ascii="Cambria" w:eastAsia="MS Mincho" w:hAnsi="Cambria" w:cs="Times New Roman"/>
-        </w:rPr>
-        <w:t>equalto</w:t>
-      </w:r>
-      <w:proofErr w:type="spellEnd"/>
-      <w:r>
-        <w:rPr>
-          <w:rFonts w:ascii="Cambria" w:eastAsia="MS Mincho" w:hAnsi="Cambria" w:cs="Times New Roman"/>
-        </w:rPr>
-        <w:t xml:space="preserve">', '') | list | </w:t>
-      </w:r>
-      <w:proofErr w:type="gramStart"/>
-      <w:r>
-        <w:rPr>
-          <w:rFonts w:ascii="Cambria" w:eastAsia="MS Mincho" w:hAnsi="Cambria" w:cs="Times New Roman"/>
-        </w:rPr>
-        <w:t>length }}{</w:t>
-      </w:r>
-      <w:proofErr w:type="gramEnd"/>
-      <w:r>
-        <w:rPr>
-          <w:rFonts w:ascii="Cambria" w:eastAsia="MS Mincho" w:hAnsi="Cambria" w:cs="Times New Roman"/>
-        </w:rPr>
-        <w:t xml:space="preserve">% set timeouts = results | </w:t>
-      </w:r>
-      <w:proofErr w:type="spellStart"/>
-      <w:proofErr w:type="gramStart"/>
-      <w:r>
-        <w:rPr>
-          <w:rFonts w:ascii="Cambria" w:eastAsia="MS Mincho" w:hAnsi="Cambria" w:cs="Times New Roman"/>
-        </w:rPr>
-        <w:t>selectattr</w:t>
-      </w:r>
-      <w:proofErr w:type="spellEnd"/>
-      <w:r>
-        <w:rPr>
-          <w:rFonts w:ascii="Cambria" w:eastAsia="MS Mincho" w:hAnsi="Cambria" w:cs="Times New Roman"/>
-        </w:rPr>
-        <w:t>(</w:t>
-      </w:r>
-      <w:proofErr w:type="gramEnd"/>
-      <w:r>
-        <w:rPr>
-          <w:rFonts w:ascii="Cambria" w:eastAsia="MS Mincho" w:hAnsi="Cambria" w:cs="Times New Roman"/>
-        </w:rPr>
-        <w:t>'latency', '</w:t>
-      </w:r>
-      <w:proofErr w:type="spellStart"/>
-      <w:r>
-        <w:rPr>
-          <w:rFonts w:ascii="Cambria" w:eastAsia="MS Mincho" w:hAnsi="Cambria" w:cs="Times New Roman"/>
-        </w:rPr>
-        <w:t>equalto</w:t>
-      </w:r>
-      <w:proofErr w:type="spellEnd"/>
-      <w:r>
-        <w:rPr>
-          <w:rFonts w:ascii="Cambria" w:eastAsia="MS Mincho" w:hAnsi="Cambria" w:cs="Times New Roman"/>
-        </w:rPr>
-        <w:t xml:space="preserve">', '') | map(attribute='host') | list </w:t>
-      </w:r>
-      <w:proofErr w:type="gramStart"/>
-      <w:r>
-        <w:rPr>
-          <w:rFonts w:ascii="Cambria" w:eastAsia="MS Mincho" w:hAnsi="Cambria" w:cs="Times New Roman"/>
-        </w:rPr>
-        <w:t>%}{</w:t>
-      </w:r>
-      <w:proofErr w:type="gramEnd"/>
-      <w:r>
-        <w:rPr>
-          <w:rFonts w:ascii="Cambria" w:eastAsia="MS Mincho" w:hAnsi="Cambria" w:cs="Times New Roman"/>
-        </w:rPr>
-        <w:t xml:space="preserve">% if </w:t>
-      </w:r>
-      <w:proofErr w:type="spellStart"/>
-      <w:r>
-        <w:rPr>
-          <w:rFonts w:ascii="Cambria" w:eastAsia="MS Mincho" w:hAnsi="Cambria" w:cs="Times New Roman"/>
-        </w:rPr>
-        <w:t>timeouts|length</w:t>
-      </w:r>
-      <w:proofErr w:type="spellEnd"/>
-      <w:r>
-        <w:rPr>
-          <w:rFonts w:ascii="Cambria" w:eastAsia="MS Mincho" w:hAnsi="Cambria" w:cs="Times New Roman"/>
-        </w:rPr>
-        <w:t xml:space="preserve"> &gt; 0 %} (</w:t>
-      </w:r>
-      <w:proofErr w:type="gramStart"/>
-      <w:r>
-        <w:rPr>
-          <w:rFonts w:ascii="Cambria" w:eastAsia="MS Mincho" w:hAnsi="Cambria" w:cs="Times New Roman"/>
-        </w:rPr>
-        <w:t>{{ timeouts</w:t>
-      </w:r>
-      <w:proofErr w:type="gramEnd"/>
-      <w:r>
-        <w:rPr>
-          <w:rFonts w:ascii="Cambria" w:eastAsia="MS Mincho" w:hAnsi="Cambria" w:cs="Times New Roman"/>
-        </w:rPr>
-        <w:t xml:space="preserve"> | </w:t>
-      </w:r>
-      <w:proofErr w:type="gramStart"/>
-      <w:r>
-        <w:rPr>
-          <w:rFonts w:ascii="Cambria" w:eastAsia="MS Mincho" w:hAnsi="Cambria" w:cs="Times New Roman"/>
-        </w:rPr>
-        <w:t>join(</w:t>
-      </w:r>
-      <w:proofErr w:type="gramEnd"/>
-      <w:r>
-        <w:rPr>
-          <w:rFonts w:ascii="Cambria" w:eastAsia="MS Mincho" w:hAnsi="Cambria" w:cs="Times New Roman"/>
-        </w:rPr>
-        <w:t>', '</w:t>
-      </w:r>
-      <w:proofErr w:type="gramStart"/>
-      <w:r>
-        <w:rPr>
-          <w:rFonts w:ascii="Cambria" w:eastAsia="MS Mincho" w:hAnsi="Cambria" w:cs="Times New Roman"/>
-        </w:rPr>
-        <w:t>) }}){</w:t>
-      </w:r>
-      <w:proofErr w:type="gramEnd"/>
-      <w:r>
-        <w:rPr>
-          <w:rFonts w:ascii="Cambria" w:eastAsia="MS Mincho" w:hAnsi="Cambria" w:cs="Times New Roman"/>
-        </w:rPr>
-        <w:t>% endif %}</w:t>
+        <w:t xml:space="preserve"> Ping Timeout: {{ results | selectattr('latency', 'equalto', '') | list | length }}{% set timeouts = results | selectattr('latency', 'equalto', '') | map(attribute='host') | list %}{% if timeouts|length &gt; 0 %} ({{ timeouts | join(', ') }}){% endif %}</w:t>
       </w:r>
     </w:p>
     <w:p>
@@ -916,169 +132,50 @@
         <w:t>p</w:t>
       </w:r>
       <w:r>
-        <w:t xml:space="preserve"> for </w:t>
+        <w:t xml:space="preserve"> for res in results %}</w:t>
       </w:r>
-      <w:proofErr w:type="gramStart"/>
-      <w:r>
-        <w:t>res</w:t>
-      </w:r>
-      <w:proofErr w:type="gramEnd"/>
-      <w:r>
-        <w:t xml:space="preserve"> in </w:t>
-      </w:r>
-      <w:proofErr w:type="gramStart"/>
-      <w:r>
-        <w:t>results %}</w:t>
-      </w:r>
-      <w:proofErr w:type="gramEnd"/>
     </w:p>
     <w:p>
       <w:pPr>
         <w:pStyle w:val="Ttulo1"/>
       </w:pPr>
-      <w:proofErr w:type="gramStart"/>
       <w:r>
-        <w:t xml:space="preserve">{{ </w:t>
-      </w:r>
-      <w:proofErr w:type="spellStart"/>
-      <w:r>
-        <w:t>res</w:t>
-      </w:r>
-      <w:proofErr w:type="gramEnd"/>
-      <w:r>
-        <w:t>.rule_</w:t>
-      </w:r>
-      <w:proofErr w:type="gramStart"/>
-      <w:r>
-        <w:t>name</w:t>
-      </w:r>
-      <w:proofErr w:type="spellEnd"/>
-      <w:r>
-        <w:t xml:space="preserve"> }</w:t>
-      </w:r>
-      <w:proofErr w:type="gramEnd"/>
-      <w:r>
-        <w:t xml:space="preserve">}: </w:t>
-      </w:r>
-      <w:proofErr w:type="gramStart"/>
-      <w:r>
-        <w:t xml:space="preserve">{{ </w:t>
-      </w:r>
-      <w:proofErr w:type="spellStart"/>
-      <w:r>
-        <w:t>res</w:t>
-      </w:r>
-      <w:proofErr w:type="gramEnd"/>
-      <w:r>
-        <w:t>.</w:t>
-      </w:r>
-      <w:proofErr w:type="gramStart"/>
-      <w:r>
-        <w:t>host</w:t>
-      </w:r>
-      <w:proofErr w:type="spellEnd"/>
-      <w:r>
-        <w:t xml:space="preserve"> }</w:t>
-      </w:r>
-      <w:proofErr w:type="gramEnd"/>
-      <w:r>
-        <w:t>}</w:t>
+        <w:t>{{ res.rule_name }}: {{ res.host }}</w:t>
       </w:r>
     </w:p>
     <w:p>
       <w:r>
-        <w:t xml:space="preserve">{%p if </w:t>
+        <w:t>{%p if res.rule_name in ['Switch', 'Access Point'] %}</w:t>
       </w:r>
-      <w:proofErr w:type="spellStart"/>
-      <w:proofErr w:type="gramStart"/>
-      <w:r>
-        <w:t>res.rule</w:t>
-      </w:r>
-      <w:proofErr w:type="gramEnd"/>
-      <w:r>
-        <w:t>_name</w:t>
-      </w:r>
-      <w:proofErr w:type="spellEnd"/>
-      <w:r>
-        <w:t xml:space="preserve"> in ['Switch', 'Access Point'</w:t>
-      </w:r>
-      <w:proofErr w:type="gramStart"/>
-      <w:r>
-        <w:t>] %}</w:t>
-      </w:r>
-      <w:proofErr w:type="gramEnd"/>
     </w:p>
     <w:p>
       <w:r>
-        <w:t xml:space="preserve">{% if </w:t>
+        <w:t>{%</w:t>
       </w:r>
-      <w:proofErr w:type="spellStart"/>
-      <w:proofErr w:type="gramStart"/>
+      <w:r>
+        <w:t>p</w:t>
+      </w:r>
+      <w:r>
+        <w:t xml:space="preserve"> if </w:t>
+      </w:r>
       <w:r>
         <w:t>res.latency</w:t>
       </w:r>
-      <w:proofErr w:type="spellEnd"/>
-      <w:proofErr w:type="gramEnd"/>
       <w:r>
-        <w:t xml:space="preserve"> </w:t>
+        <w:t xml:space="preserve"> %}{% set ping = </w:t>
       </w:r>
-      <w:proofErr w:type="gramStart"/>
-      <w:r>
-        <w:t>%}{</w:t>
-      </w:r>
-      <w:proofErr w:type="gramEnd"/>
-      <w:r>
-        <w:t xml:space="preserve">% set ping = </w:t>
-      </w:r>
-      <w:proofErr w:type="spellStart"/>
-      <w:proofErr w:type="gramStart"/>
       <w:r>
         <w:t>res.latency</w:t>
       </w:r>
-      <w:proofErr w:type="gramEnd"/>
       <w:r>
-        <w:t>|int</w:t>
-      </w:r>
-      <w:proofErr w:type="spellEnd"/>
-      <w:r>
-        <w:t xml:space="preserve"> </w:t>
-      </w:r>
-      <w:proofErr w:type="gramStart"/>
-      <w:r>
-        <w:t>%}Lat</w:t>
+        <w:t>|int %}Lat</w:t>
       </w:r>
       <w:r>
         <w:t>ency</w:t>
       </w:r>
-      <w:proofErr w:type="gramEnd"/>
       <w:r>
-        <w:t xml:space="preserve">: </w:t>
+        <w:t xml:space="preserve">: {{ ping }}ms ({% if ping &lt;= 50 %}Ok </w:t>
       </w:r>
-      <w:proofErr w:type="gramStart"/>
-      <w:r>
-        <w:t>{{ ping</w:t>
-      </w:r>
-      <w:proofErr w:type="gramEnd"/>
-      <w:r>
-        <w:t xml:space="preserve"> }}</w:t>
-      </w:r>
-      <w:proofErr w:type="spellStart"/>
-      <w:r>
-        <w:t>ms</w:t>
-      </w:r>
-      <w:proofErr w:type="spellEnd"/>
-      <w:r>
-        <w:t xml:space="preserve"> ({% if ping &lt;= 50 </w:t>
-      </w:r>
-      <w:proofErr w:type="gramStart"/>
-      <w:r>
-        <w:t>%}Ok</w:t>
-      </w:r>
-      <w:proofErr w:type="gramEnd"/>
-      <w:r>
-        <w:t xml:space="preserve"> </w:t>
-      </w:r>
-      <w:proofErr w:type="gramStart"/>
       <w:r>
         <w:rPr>
           <w:rFonts w:ascii="Segoe UI Emoji" w:hAnsi="Segoe UI Emoji" w:cs="Segoe UI Emoji"/>
@@ -1086,29 +183,8 @@
         <w:t>🟢</w:t>
       </w:r>
       <w:r>
-        <w:t>{</w:t>
+        <w:t xml:space="preserve">{% elif ping &lt;= 150 %}Warning </w:t>
       </w:r>
-      <w:proofErr w:type="gramEnd"/>
-      <w:r>
-        <w:t xml:space="preserve">% </w:t>
-      </w:r>
-      <w:proofErr w:type="spellStart"/>
-      <w:r>
-        <w:t>elif</w:t>
-      </w:r>
-      <w:proofErr w:type="spellEnd"/>
-      <w:r>
-        <w:t xml:space="preserve"> ping &lt;= 150 </w:t>
-      </w:r>
-      <w:proofErr w:type="gramStart"/>
-      <w:r>
-        <w:t>%}Warning</w:t>
-      </w:r>
-      <w:proofErr w:type="gramEnd"/>
-      <w:r>
-        <w:t xml:space="preserve"> </w:t>
-      </w:r>
-      <w:proofErr w:type="gramStart"/>
       <w:r>
         <w:rPr>
           <w:rFonts w:ascii="Segoe UI Emoji" w:hAnsi="Segoe UI Emoji" w:cs="Segoe UI Emoji"/>
@@ -1116,21 +192,8 @@
         <w:t>🟡</w:t>
       </w:r>
       <w:r>
-        <w:t>{</w:t>
+        <w:t xml:space="preserve">{% else %}Critical </w:t>
       </w:r>
-      <w:proofErr w:type="gramEnd"/>
-      <w:r>
-        <w:t xml:space="preserve">% else </w:t>
-      </w:r>
-      <w:proofErr w:type="gramStart"/>
-      <w:r>
-        <w:t>%}Critical</w:t>
-      </w:r>
-      <w:proofErr w:type="gramEnd"/>
-      <w:r>
-        <w:t xml:space="preserve"> </w:t>
-      </w:r>
-      <w:proofErr w:type="gramStart"/>
       <w:r>
         <w:rPr>
           <w:rFonts w:ascii="Segoe UI Emoji" w:hAnsi="Segoe UI Emoji" w:cs="Segoe UI Emoji"/>
@@ -1138,29 +201,8 @@
         <w:t>🔴</w:t>
       </w:r>
       <w:r>
-        <w:t>{</w:t>
+        <w:t xml:space="preserve">{% endif %}){% else %}(Ping Timeout </w:t>
       </w:r>
-      <w:proofErr w:type="gramEnd"/>
-      <w:r>
-        <w:t>% endif %</w:t>
-      </w:r>
-      <w:proofErr w:type="gramStart"/>
-      <w:r>
-        <w:t>}){</w:t>
-      </w:r>
-      <w:proofErr w:type="gramEnd"/>
-      <w:r>
-        <w:t xml:space="preserve">% else </w:t>
-      </w:r>
-      <w:proofErr w:type="gramStart"/>
-      <w:r>
-        <w:t>%}(</w:t>
-      </w:r>
-      <w:proofErr w:type="gramEnd"/>
-      <w:r>
-        <w:t xml:space="preserve">Ping Timeout </w:t>
-      </w:r>
-      <w:proofErr w:type="gramStart"/>
       <w:r>
         <w:rPr>
           <w:rFonts w:ascii="Segoe UI Emoji" w:hAnsi="Segoe UI Emoji" w:cs="Segoe UI Emoji"/>
@@ -1168,11 +210,13 @@
         <w:t>❌</w:t>
       </w:r>
       <w:r>
-        <w:t>){</w:t>
+        <w:t>){%</w:t>
       </w:r>
-      <w:proofErr w:type="gramEnd"/>
       <w:r>
-        <w:t>% endif %}</w:t>
+        <w:t>p</w:t>
+      </w:r>
+      <w:r>
+        <w:t xml:space="preserve"> endif %}</w:t>
       </w:r>
     </w:p>
     <w:p>
@@ -1185,81 +229,11 @@
       <w:r>
         <w:t xml:space="preserve"> </w:t>
       </w:r>
-      <w:proofErr w:type="spellStart"/>
       <w:r>
         <w:t>elif</w:t>
       </w:r>
-      <w:proofErr w:type="spellEnd"/>
       <w:r>
-        <w:t xml:space="preserve"> </w:t>
-      </w:r>
-      <w:proofErr w:type="spellStart"/>
-      <w:proofErr w:type="gramStart"/>
-      <w:r>
-        <w:t>res.rule</w:t>
-      </w:r>
-      <w:proofErr w:type="gramEnd"/>
-      <w:r>
-        <w:t>_name</w:t>
-      </w:r>
-      <w:proofErr w:type="spellEnd"/>
-      <w:r>
-        <w:t xml:space="preserve"> == "FortiGate</w:t>
-      </w:r>
-      <w:proofErr w:type="gramStart"/>
-      <w:r>
-        <w:t>" %}</w:t>
-      </w:r>
-      <w:proofErr w:type="gramEnd"/>
-    </w:p>
-    <w:p>
-      <w:r>
-        <w:t>{%</w:t>
-      </w:r>
-      <w:r>
-        <w:t>p</w:t>
-      </w:r>
-      <w:r>
-        <w:t xml:space="preserve"> if </w:t>
-      </w:r>
-      <w:proofErr w:type="spellStart"/>
-      <w:proofErr w:type="gramStart"/>
-      <w:r>
-        <w:t>res.error</w:t>
-      </w:r>
-      <w:proofErr w:type="spellEnd"/>
-      <w:proofErr w:type="gramEnd"/>
-      <w:r>
-        <w:t xml:space="preserve"> %}</w:t>
-      </w:r>
-    </w:p>
-    <w:p>
-      <w:r>
-        <w:t xml:space="preserve">Error: </w:t>
-      </w:r>
-      <w:proofErr w:type="gramStart"/>
-      <w:r>
-        <w:t xml:space="preserve">{{ </w:t>
-      </w:r>
-      <w:proofErr w:type="spellStart"/>
-      <w:r>
-        <w:t>res</w:t>
-      </w:r>
-      <w:proofErr w:type="gramEnd"/>
-      <w:r>
-        <w:t>.</w:t>
-      </w:r>
-      <w:proofErr w:type="gramStart"/>
-      <w:r>
-        <w:t>error</w:t>
-      </w:r>
-      <w:proofErr w:type="spellEnd"/>
-      <w:r>
-        <w:t xml:space="preserve"> }</w:t>
-      </w:r>
-      <w:proofErr w:type="gramEnd"/>
-      <w:r>
-        <w:t>}</w:t>
+        <w:t xml:space="preserve"> res.rule_name == "FortiGate" %}</w:t>
       </w:r>
     </w:p>
     <w:p>
@@ -1270,75 +244,39 @@
         <w:t>p</w:t>
       </w:r>
       <w:r>
-        <w:t xml:space="preserve"> </w:t>
+        <w:t xml:space="preserve"> if res.error %}</w:t>
       </w:r>
-      <w:proofErr w:type="gramStart"/>
-      <w:r>
-        <w:t>else %}</w:t>
-      </w:r>
-      <w:proofErr w:type="gramEnd"/>
     </w:p>
     <w:p>
       <w:r>
-        <w:t xml:space="preserve">{%p for </w:t>
+        <w:t>Error: {{ res.error }}</w:t>
       </w:r>
-      <w:proofErr w:type="spellStart"/>
+    </w:p>
+    <w:p>
       <w:r>
-        <w:t>intf_</w:t>
+        <w:t>{%</w:t>
+      </w:r>
+      <w:r>
+        <w:t>p</w:t>
+      </w:r>
+      <w:r>
+        <w:t xml:space="preserve"> else %}</w:t>
+      </w:r>
+    </w:p>
+    <w:p>
+      <w:r>
+        <w:t>{%p for intf_</w:t>
       </w:r>
       <w:r>
         <w:t>key</w:t>
       </w:r>
-      <w:proofErr w:type="spellEnd"/>
       <w:r>
-        <w:t xml:space="preserve">, </w:t>
+        <w:t>, intf_data in res.wan_status.items() %}</w:t>
       </w:r>
-      <w:proofErr w:type="spellStart"/>
-      <w:r>
-        <w:t>intf_data</w:t>
-      </w:r>
-      <w:proofErr w:type="spellEnd"/>
-      <w:r>
-        <w:t xml:space="preserve"> in </w:t>
-      </w:r>
-      <w:proofErr w:type="spellStart"/>
-      <w:r>
-        <w:t>res.wan_</w:t>
-      </w:r>
-      <w:proofErr w:type="gramStart"/>
-      <w:r>
-        <w:t>status.items</w:t>
-      </w:r>
-      <w:proofErr w:type="spellEnd"/>
-      <w:proofErr w:type="gramEnd"/>
-      <w:r>
-        <w:t>(</w:t>
-      </w:r>
-      <w:proofErr w:type="gramStart"/>
-      <w:r>
-        <w:t>) %}</w:t>
-      </w:r>
-      <w:proofErr w:type="gramEnd"/>
     </w:p>
     <w:p>
       <w:r>
-        <w:t xml:space="preserve">{% set </w:t>
-      </w:r>
-      <w:proofErr w:type="spellStart"/>
-      <w:r>
-        <w:t>isp_map</w:t>
-      </w:r>
-      <w:proofErr w:type="spellEnd"/>
-      <w:r>
-        <w:t xml:space="preserve"> </w:t>
-      </w:r>
-      <w:proofErr w:type="gramStart"/>
-      <w:r>
-        <w:t>= {'</w:t>
-      </w:r>
-      <w:proofErr w:type="gramEnd"/>
-      <w:r>
-        <w:t>WAN1': '</w:t>
+        <w:t>{% set isp_map = {'WAN1': '</w:t>
       </w:r>
       <w:r>
         <w:t>ISP1</w:t>
@@ -1346,283 +284,70 @@
       <w:r>
         <w:t>', 'WAN2': '</w:t>
       </w:r>
-      <w:proofErr w:type="gramStart"/>
       <w:r>
         <w:t>ISP2</w:t>
       </w:r>
       <w:r>
-        <w:t>'}</w:t>
-      </w:r>
-      <w:proofErr w:type="gramEnd"/>
-      <w:r>
-        <w:t xml:space="preserve"> %}</w:t>
+        <w:t>'} %}</w:t>
       </w:r>
     </w:p>
     <w:p>
       <w:r>
-        <w:t xml:space="preserve">{% set </w:t>
+        <w:t>{% set isp_name = isp_map.get(intf_key, intf_key) %}</w:t>
       </w:r>
-      <w:proofErr w:type="spellStart"/>
-      <w:r>
-        <w:t>isp_name</w:t>
-      </w:r>
-      <w:proofErr w:type="spellEnd"/>
-      <w:r>
-        <w:t xml:space="preserve"> = </w:t>
-      </w:r>
-      <w:proofErr w:type="spellStart"/>
-      <w:proofErr w:type="gramStart"/>
-      <w:r>
-        <w:t>isp_map.get</w:t>
-      </w:r>
-      <w:proofErr w:type="spellEnd"/>
-      <w:r>
-        <w:t>(</w:t>
-      </w:r>
-      <w:proofErr w:type="spellStart"/>
-      <w:proofErr w:type="gramEnd"/>
-      <w:r>
-        <w:t>intf_key</w:t>
-      </w:r>
-      <w:proofErr w:type="spellEnd"/>
-      <w:r>
-        <w:t xml:space="preserve">, </w:t>
-      </w:r>
-      <w:proofErr w:type="spellStart"/>
-      <w:r>
-        <w:t>intf_key</w:t>
-      </w:r>
-      <w:proofErr w:type="spellEnd"/>
-      <w:proofErr w:type="gramStart"/>
-      <w:r>
-        <w:t>) %}</w:t>
-      </w:r>
-      <w:proofErr w:type="gramEnd"/>
     </w:p>
     <w:p>
-      <w:proofErr w:type="gramStart"/>
       <w:r>
         <w:lastRenderedPageBreak/>
-        <w:t xml:space="preserve">{{ </w:t>
-      </w:r>
-      <w:proofErr w:type="spellStart"/>
-      <w:r>
-        <w:t>isp</w:t>
-      </w:r>
-      <w:proofErr w:type="gramEnd"/>
-      <w:r>
-        <w:t>_</w:t>
-      </w:r>
-      <w:proofErr w:type="gramStart"/>
-      <w:r>
-        <w:t>name</w:t>
-      </w:r>
-      <w:proofErr w:type="spellEnd"/>
-      <w:r>
-        <w:t xml:space="preserve"> }</w:t>
-      </w:r>
-      <w:proofErr w:type="gramEnd"/>
-      <w:r>
-        <w:t>}</w:t>
-      </w:r>
-      <w:r>
-        <w:t xml:space="preserve"> </w:t>
+        <w:t xml:space="preserve">{{ isp_name }} </w:t>
       </w:r>
       <w:r>
         <w:t>(</w:t>
       </w:r>
-      <w:proofErr w:type="gramStart"/>
       <w:r>
-        <w:t>{{ i</w:t>
+        <w:t>{{ intf_</w:t>
       </w:r>
-      <w:proofErr w:type="spellStart"/>
-      <w:r>
-        <w:t>ntf</w:t>
-      </w:r>
-      <w:proofErr w:type="gramEnd"/>
-      <w:r>
-        <w:t>_</w:t>
-      </w:r>
-      <w:proofErr w:type="gramStart"/>
       <w:r>
         <w:t>key</w:t>
       </w:r>
-      <w:proofErr w:type="spellEnd"/>
       <w:r>
-        <w:t xml:space="preserve"> }</w:t>
-      </w:r>
-      <w:proofErr w:type="gramEnd"/>
-      <w:r>
-        <w:t>}</w:t>
+        <w:t xml:space="preserve"> }}</w:t>
       </w:r>
       <w:r>
         <w:t>)</w:t>
       </w:r>
       <w:r>
-        <w:t xml:space="preserve"> Link </w:t>
-      </w:r>
-      <w:proofErr w:type="gramStart"/>
-      <w:r>
-        <w:t>Status: {</w:t>
-      </w:r>
-      <w:proofErr w:type="gramEnd"/>
-      <w:r>
-        <w:t xml:space="preserve">% if </w:t>
-      </w:r>
-      <w:proofErr w:type="spellStart"/>
-      <w:r>
-        <w:t>intf_</w:t>
-      </w:r>
-      <w:proofErr w:type="gramStart"/>
-      <w:r>
-        <w:t>data.ip</w:t>
-      </w:r>
-      <w:proofErr w:type="spellEnd"/>
-      <w:proofErr w:type="gramEnd"/>
-      <w:r>
-        <w:t xml:space="preserve"> </w:t>
-      </w:r>
-      <w:proofErr w:type="gramStart"/>
-      <w:r>
-        <w:t xml:space="preserve">%}{{ </w:t>
-      </w:r>
-      <w:proofErr w:type="spellStart"/>
-      <w:r>
-        <w:t>intf</w:t>
-      </w:r>
-      <w:proofErr w:type="gramEnd"/>
-      <w:r>
-        <w:t>_</w:t>
-      </w:r>
-      <w:proofErr w:type="gramStart"/>
-      <w:r>
-        <w:t>data.ip</w:t>
-      </w:r>
-      <w:proofErr w:type="spellEnd"/>
-      <w:proofErr w:type="gramEnd"/>
-      <w:r>
-        <w:t xml:space="preserve"> </w:t>
-      </w:r>
-      <w:proofErr w:type="gramStart"/>
-      <w:r>
-        <w:t>}}{</w:t>
-      </w:r>
-      <w:proofErr w:type="gramEnd"/>
-      <w:r>
-        <w:t xml:space="preserve">% </w:t>
-      </w:r>
-      <w:proofErr w:type="gramStart"/>
-      <w:r>
-        <w:t>endif %}</w:t>
-      </w:r>
-      <w:proofErr w:type="gramEnd"/>
-      <w:r>
-        <w:t xml:space="preserve"> (</w:t>
-      </w:r>
-      <w:proofErr w:type="gramStart"/>
-      <w:r>
-        <w:t xml:space="preserve">{{ </w:t>
-      </w:r>
-      <w:proofErr w:type="spellStart"/>
-      <w:r>
-        <w:t>intf</w:t>
-      </w:r>
-      <w:proofErr w:type="gramEnd"/>
-      <w:r>
-        <w:t>_</w:t>
-      </w:r>
-      <w:proofErr w:type="gramStart"/>
-      <w:r>
-        <w:t>data.status</w:t>
-      </w:r>
-      <w:proofErr w:type="spellEnd"/>
-      <w:proofErr w:type="gramEnd"/>
-      <w:r>
-        <w:t xml:space="preserve"> }})</w:t>
+        <w:t xml:space="preserve"> Link Status: {% if intf_data.ip %}{{ intf_data.ip }}{% endif %} ({{ intf_data.status }})</w:t>
       </w:r>
     </w:p>
     <w:p>
       <w:r>
-        <w:t xml:space="preserve">{% if </w:t>
+        <w:t>{%</w:t>
       </w:r>
-      <w:proofErr w:type="spellStart"/>
       <w:r>
-        <w:t>intf_</w:t>
+        <w:t>p</w:t>
       </w:r>
-      <w:proofErr w:type="gramStart"/>
       <w:r>
-        <w:t>data.latency</w:t>
+        <w:t xml:space="preserve"> if intf_data.</w:t>
       </w:r>
-      <w:proofErr w:type="spellEnd"/>
-      <w:proofErr w:type="gramEnd"/>
       <w:r>
-        <w:t xml:space="preserve"> </w:t>
+        <w:t>ping</w:t>
       </w:r>
-      <w:proofErr w:type="gramStart"/>
       <w:r>
-        <w:t>%}{</w:t>
+        <w:t>_interface</w:t>
       </w:r>
-      <w:proofErr w:type="gramEnd"/>
       <w:r>
-        <w:t xml:space="preserve">% set ping = </w:t>
+        <w:t xml:space="preserve"> %}</w:t>
       </w:r>
-      <w:proofErr w:type="spellStart"/>
       <w:r>
-        <w:t>intf_</w:t>
+        <w:t>{%</w:t>
       </w:r>
-      <w:proofErr w:type="gramStart"/>
       <w:r>
-        <w:t>data.latency</w:t>
+        <w:t>p</w:t>
       </w:r>
-      <w:proofErr w:type="gramEnd"/>
       <w:r>
-        <w:t>|int</w:t>
+        <w:t xml:space="preserve"> if intf_data.latency %}{% set ping = intf_data.latency|int %}Gateway Latency ({{ intf_data.gw }}): {{ ping }}ms ({% if ping &lt;= 50 %}Ok </w:t>
       </w:r>
-      <w:proofErr w:type="spellEnd"/>
-      <w:r>
-        <w:t xml:space="preserve"> </w:t>
-      </w:r>
-      <w:proofErr w:type="gramStart"/>
-      <w:r>
-        <w:t>%}Gateway</w:t>
-      </w:r>
-      <w:proofErr w:type="gramEnd"/>
-      <w:r>
-        <w:t xml:space="preserve"> Latency (</w:t>
-      </w:r>
-      <w:proofErr w:type="gramStart"/>
-      <w:r>
-        <w:t>{{ intf_data.gw</w:t>
-      </w:r>
-      <w:proofErr w:type="gramEnd"/>
-      <w:r>
-        <w:t xml:space="preserve"> }}): </w:t>
-      </w:r>
-      <w:proofErr w:type="gramStart"/>
-      <w:r>
-        <w:t>{{ ping</w:t>
-      </w:r>
-      <w:proofErr w:type="gramEnd"/>
-      <w:r>
-        <w:t xml:space="preserve"> }}</w:t>
-      </w:r>
-      <w:proofErr w:type="spellStart"/>
-      <w:r>
-        <w:t>ms</w:t>
-      </w:r>
-      <w:proofErr w:type="spellEnd"/>
-      <w:r>
-        <w:t xml:space="preserve"> ({% if ping &lt;= 50 </w:t>
-      </w:r>
-      <w:proofErr w:type="gramStart"/>
-      <w:r>
-        <w:t>%}Ok</w:t>
-      </w:r>
-      <w:proofErr w:type="gramEnd"/>
-      <w:r>
-        <w:t xml:space="preserve"> </w:t>
-      </w:r>
-      <w:proofErr w:type="gramStart"/>
       <w:r>
         <w:rPr>
           <w:rFonts w:ascii="Segoe UI Emoji" w:hAnsi="Segoe UI Emoji" w:cs="Segoe UI Emoji"/>
@@ -1631,29 +356,8 @@
         <w:t>🟢</w:t>
       </w:r>
       <w:r>
-        <w:t>{</w:t>
+        <w:t xml:space="preserve">{% elif ping &lt;= 150 %}Warning </w:t>
       </w:r>
-      <w:proofErr w:type="gramEnd"/>
-      <w:r>
-        <w:t xml:space="preserve">% </w:t>
-      </w:r>
-      <w:proofErr w:type="spellStart"/>
-      <w:r>
-        <w:t>elif</w:t>
-      </w:r>
-      <w:proofErr w:type="spellEnd"/>
-      <w:r>
-        <w:t xml:space="preserve"> ping &lt;= 150 </w:t>
-      </w:r>
-      <w:proofErr w:type="gramStart"/>
-      <w:r>
-        <w:t>%}Warning</w:t>
-      </w:r>
-      <w:proofErr w:type="gramEnd"/>
-      <w:r>
-        <w:t xml:space="preserve"> </w:t>
-      </w:r>
-      <w:proofErr w:type="gramStart"/>
       <w:r>
         <w:rPr>
           <w:rFonts w:ascii="Segoe UI Emoji" w:hAnsi="Segoe UI Emoji" w:cs="Segoe UI Emoji"/>
@@ -1662,21 +366,8 @@
         <w:t>🟡</w:t>
       </w:r>
       <w:r>
-        <w:t>{</w:t>
+        <w:t xml:space="preserve">{% else %}Critical </w:t>
       </w:r>
-      <w:proofErr w:type="gramEnd"/>
-      <w:r>
-        <w:t xml:space="preserve">% else </w:t>
-      </w:r>
-      <w:proofErr w:type="gramStart"/>
-      <w:r>
-        <w:t>%}Critical</w:t>
-      </w:r>
-      <w:proofErr w:type="gramEnd"/>
-      <w:r>
-        <w:t xml:space="preserve"> </w:t>
-      </w:r>
-      <w:proofErr w:type="gramStart"/>
       <w:r>
         <w:rPr>
           <w:rFonts w:ascii="Segoe UI Emoji" w:hAnsi="Segoe UI Emoji" w:cs="Segoe UI Emoji"/>
@@ -1685,29 +376,8 @@
         <w:t>🔴</w:t>
       </w:r>
       <w:r>
-        <w:t>{</w:t>
+        <w:t xml:space="preserve">{% endif %}){% else %}(Ping Timeout </w:t>
       </w:r>
-      <w:proofErr w:type="gramEnd"/>
-      <w:r>
-        <w:t>% endif %</w:t>
-      </w:r>
-      <w:proofErr w:type="gramStart"/>
-      <w:r>
-        <w:t>}){</w:t>
-      </w:r>
-      <w:proofErr w:type="gramEnd"/>
-      <w:r>
-        <w:t xml:space="preserve">% else </w:t>
-      </w:r>
-      <w:proofErr w:type="gramStart"/>
-      <w:r>
-        <w:t>%}(</w:t>
-      </w:r>
-      <w:proofErr w:type="gramEnd"/>
-      <w:r>
-        <w:t xml:space="preserve">Ping Timeout </w:t>
-      </w:r>
-      <w:proofErr w:type="gramStart"/>
       <w:r>
         <w:rPr>
           <w:rFonts w:ascii="Segoe UI Emoji" w:hAnsi="Segoe UI Emoji" w:cs="Segoe UI Emoji"/>
@@ -1715,46 +385,33 @@
         <w:t>❌</w:t>
       </w:r>
       <w:r>
-        <w:t>){</w:t>
+        <w:t>){%</w:t>
       </w:r>
-      <w:proofErr w:type="gramEnd"/>
       <w:r>
-        <w:t>% endif %}</w:t>
+        <w:t>p</w:t>
+      </w:r>
+      <w:r>
+        <w:t xml:space="preserve"> endif %}</w:t>
+      </w:r>
+      <w:r>
+        <w:t>{%</w:t>
+      </w:r>
+      <w:r>
+        <w:t>p</w:t>
+      </w:r>
+      <w:r>
+        <w:t xml:space="preserve"> endif %}</w:t>
       </w:r>
     </w:p>
     <w:p>
       <w:r>
-        <w:t xml:space="preserve">{%p </w:t>
-      </w:r>
-      <w:proofErr w:type="spellStart"/>
-      <w:r>
-        <w:t>endfor</w:t>
-      </w:r>
-      <w:proofErr w:type="spellEnd"/>
-      <w:r>
-        <w:t xml:space="preserve"> %}</w:t>
+        <w:t>{%p endfor %}</w:t>
       </w:r>
       <w:r>
         <w:t xml:space="preserve"> </w:t>
       </w:r>
       <w:r>
-        <w:t xml:space="preserve">{# CLOSES: for </w:t>
-      </w:r>
-      <w:proofErr w:type="spellStart"/>
-      <w:r>
-        <w:t>intf_key</w:t>
-      </w:r>
-      <w:proofErr w:type="spellEnd"/>
-      <w:r>
-        <w:t xml:space="preserve">, </w:t>
-      </w:r>
-      <w:proofErr w:type="spellStart"/>
-      <w:r>
-        <w:t>intf_data</w:t>
-      </w:r>
-      <w:proofErr w:type="spellEnd"/>
-      <w:r>
-        <w:t xml:space="preserve"> #}</w:t>
+        <w:t>{# CLOSES: for intf_key, intf_data #}</w:t>
       </w:r>
       <w:r>
         <w:t xml:space="preserve"> </w:t>
@@ -1768,11 +425,7 @@
         <w:t>p</w:t>
       </w:r>
       <w:r>
-        <w:t xml:space="preserve"> </w:t>
-      </w:r>
-      <w:proofErr w:type="gramStart"/>
-      <w:r>
-        <w:t>endif %</w:t>
+        <w:t xml:space="preserve"> endif %</w:t>
       </w:r>
       <w:r>
         <w:t>}</w:t>
@@ -1781,21 +434,7 @@
         <w:t xml:space="preserve"> </w:t>
       </w:r>
       <w:r>
-        <w:t>{#</w:t>
-      </w:r>
-      <w:proofErr w:type="gramEnd"/>
-      <w:r>
-        <w:t xml:space="preserve"> CLOSES: if </w:t>
-      </w:r>
-      <w:proofErr w:type="spellStart"/>
-      <w:proofErr w:type="gramStart"/>
-      <w:r>
-        <w:t>res.error</w:t>
-      </w:r>
-      <w:proofErr w:type="spellEnd"/>
-      <w:proofErr w:type="gramEnd"/>
-      <w:r>
-        <w:t xml:space="preserve"> #}</w:t>
+        <w:t>{# CLOSES: if res.error #}</w:t>
       </w:r>
     </w:p>
     <w:p>
@@ -1806,54 +445,18 @@
         <w:t>p</w:t>
       </w:r>
       <w:r>
-        <w:t xml:space="preserve"> </w:t>
-      </w:r>
-      <w:proofErr w:type="gramStart"/>
-      <w:r>
-        <w:t>endif %}</w:t>
+        <w:t xml:space="preserve"> endif %}</w:t>
       </w:r>
       <w:r>
         <w:t xml:space="preserve"> </w:t>
       </w:r>
       <w:r>
-        <w:t>{#</w:t>
+        <w:t>{# CLOSES: if res.rule_name in ['Switch', 'Access Point'] #}</w:t>
       </w:r>
-      <w:proofErr w:type="gramEnd"/>
-      <w:r>
-        <w:t xml:space="preserve"> CLOSES: if </w:t>
-      </w:r>
-      <w:proofErr w:type="spellStart"/>
-      <w:proofErr w:type="gramStart"/>
-      <w:r>
-        <w:t>res.rule</w:t>
-      </w:r>
-      <w:proofErr w:type="gramEnd"/>
-      <w:r>
-        <w:t>_name</w:t>
-      </w:r>
-      <w:proofErr w:type="spellEnd"/>
-      <w:r>
-        <w:t xml:space="preserve"> in ['Switch', 'Access Point</w:t>
-      </w:r>
-      <w:proofErr w:type="gramStart"/>
-      <w:r>
-        <w:t>'] #}</w:t>
-      </w:r>
-      <w:proofErr w:type="gramEnd"/>
     </w:p>
     <w:p>
       <w:r>
-        <w:t xml:space="preserve">{%p if </w:t>
-      </w:r>
-      <w:proofErr w:type="spellStart"/>
-      <w:proofErr w:type="gramStart"/>
-      <w:r>
-        <w:t>res.screenshot</w:t>
-      </w:r>
-      <w:proofErr w:type="spellEnd"/>
-      <w:proofErr w:type="gramEnd"/>
-      <w:r>
-        <w:t xml:space="preserve"> %}</w:t>
+        <w:t>{%p if res.screenshot %}</w:t>
       </w:r>
     </w:p>
     <w:p>
@@ -1862,40 +465,14 @@
       </w:r>
     </w:p>
     <w:p>
-      <w:proofErr w:type="gramStart"/>
       <w:r>
-        <w:t xml:space="preserve">{{ </w:t>
-      </w:r>
-      <w:proofErr w:type="spellStart"/>
-      <w:r>
-        <w:t>res</w:t>
-      </w:r>
-      <w:proofErr w:type="gramEnd"/>
-      <w:r>
-        <w:t>.</w:t>
-      </w:r>
-      <w:proofErr w:type="gramStart"/>
-      <w:r>
-        <w:t>screenshot</w:t>
-      </w:r>
-      <w:proofErr w:type="spellEnd"/>
-      <w:r>
-        <w:t xml:space="preserve"> }</w:t>
-      </w:r>
-      <w:proofErr w:type="gramEnd"/>
-      <w:r>
-        <w:t>}</w:t>
+        <w:t>{{ res.screenshot }}</w:t>
       </w:r>
     </w:p>
     <w:p>
       <w:r>
-        <w:t xml:space="preserve">{%p </w:t>
+        <w:t>{%p else %}</w:t>
       </w:r>
-      <w:proofErr w:type="gramStart"/>
-      <w:r>
-        <w:t>else %}</w:t>
-      </w:r>
-      <w:proofErr w:type="gramEnd"/>
     </w:p>
     <w:p>
       <w:r>
@@ -1904,13 +481,8 @@
     </w:p>
     <w:p>
       <w:r>
-        <w:t xml:space="preserve">{%p </w:t>
+        <w:t>{%p endif %}</w:t>
       </w:r>
-      <w:proofErr w:type="gramStart"/>
-      <w:r>
-        <w:t>endif %}</w:t>
-      </w:r>
-      <w:proofErr w:type="gramEnd"/>
     </w:p>
     <w:p>
       <w:r>
@@ -1920,18 +492,8 @@
         <w:t>p</w:t>
       </w:r>
       <w:r>
-        <w:t xml:space="preserve"> </w:t>
+        <w:t xml:space="preserve"> endfor %}</w:t>
       </w:r>
-      <w:proofErr w:type="spellStart"/>
-      <w:proofErr w:type="gramStart"/>
-      <w:r>
-        <w:t>endfor</w:t>
-      </w:r>
-      <w:proofErr w:type="spellEnd"/>
-      <w:r>
-        <w:t xml:space="preserve"> %}</w:t>
-      </w:r>
-      <w:proofErr w:type="gramEnd"/>
     </w:p>
     <w:sectPr>
       <w:pgSz w:w="12240" w:h="15840"/>
@@ -2749,6 +1311,7 @@
   <w:style w:type="character" w:default="1" w:styleId="Fontepargpadro">
     <w:name w:val="Default Paragraph Font"/>
     <w:uiPriority w:val="1"/>
+    <w:semiHidden/>
     <w:unhideWhenUsed/>
   </w:style>
   <w:style w:type="table" w:default="1" w:styleId="Tabelanormal">

</xml_diff>

<commit_message>
Fix: correct docxtpl paragraph tag formatting to resolve Jinja rendering issues
</commit_message>
<xml_diff>
--- a/template_en.example.docx
+++ b/template_en.example.docx
@@ -64,7 +64,93 @@
         <w:rPr>
           <w:rFonts w:ascii="Cambria" w:eastAsia="MS Mincho" w:hAnsi="Cambria" w:cs="Times New Roman"/>
         </w:rPr>
-        <w:t xml:space="preserve"> Ok (Ping ≤ 50ms): {{ results | rejectattr('latency', 'equalto', '') | selectattr('latency', 'le', 50) | list | length }}</w:t>
+        <w:t xml:space="preserve"> Ok (Ping ≤ 50ms): </w:t>
+      </w:r>
+      <w:proofErr w:type="gramStart"/>
+      <w:r>
+        <w:rPr>
+          <w:rFonts w:ascii="Cambria" w:eastAsia="MS Mincho" w:hAnsi="Cambria" w:cs="Times New Roman"/>
+        </w:rPr>
+        <w:t>{{ results</w:t>
+      </w:r>
+      <w:proofErr w:type="gramEnd"/>
+      <w:r>
+        <w:rPr>
+          <w:rFonts w:ascii="Cambria" w:eastAsia="MS Mincho" w:hAnsi="Cambria" w:cs="Times New Roman"/>
+        </w:rPr>
+        <w:t xml:space="preserve"> | </w:t>
+      </w:r>
+      <w:proofErr w:type="spellStart"/>
+      <w:proofErr w:type="gramStart"/>
+      <w:r>
+        <w:rPr>
+          <w:rFonts w:ascii="Cambria" w:eastAsia="MS Mincho" w:hAnsi="Cambria" w:cs="Times New Roman"/>
+        </w:rPr>
+        <w:t>rejectattr</w:t>
+      </w:r>
+      <w:proofErr w:type="spellEnd"/>
+      <w:r>
+        <w:rPr>
+          <w:rFonts w:ascii="Cambria" w:eastAsia="MS Mincho" w:hAnsi="Cambria" w:cs="Times New Roman"/>
+        </w:rPr>
+        <w:t>(</w:t>
+      </w:r>
+      <w:proofErr w:type="gramEnd"/>
+      <w:r>
+        <w:rPr>
+          <w:rFonts w:ascii="Cambria" w:eastAsia="MS Mincho" w:hAnsi="Cambria" w:cs="Times New Roman"/>
+        </w:rPr>
+        <w:t>'latency', '</w:t>
+      </w:r>
+      <w:proofErr w:type="spellStart"/>
+      <w:r>
+        <w:rPr>
+          <w:rFonts w:ascii="Cambria" w:eastAsia="MS Mincho" w:hAnsi="Cambria" w:cs="Times New Roman"/>
+        </w:rPr>
+        <w:t>equalto</w:t>
+      </w:r>
+      <w:proofErr w:type="spellEnd"/>
+      <w:r>
+        <w:rPr>
+          <w:rFonts w:ascii="Cambria" w:eastAsia="MS Mincho" w:hAnsi="Cambria" w:cs="Times New Roman"/>
+        </w:rPr>
+        <w:t xml:space="preserve">', '') | </w:t>
+      </w:r>
+      <w:proofErr w:type="spellStart"/>
+      <w:proofErr w:type="gramStart"/>
+      <w:r>
+        <w:rPr>
+          <w:rFonts w:ascii="Cambria" w:eastAsia="MS Mincho" w:hAnsi="Cambria" w:cs="Times New Roman"/>
+        </w:rPr>
+        <w:t>selectattr</w:t>
+      </w:r>
+      <w:proofErr w:type="spellEnd"/>
+      <w:r>
+        <w:rPr>
+          <w:rFonts w:ascii="Cambria" w:eastAsia="MS Mincho" w:hAnsi="Cambria" w:cs="Times New Roman"/>
+        </w:rPr>
+        <w:t>(</w:t>
+      </w:r>
+      <w:proofErr w:type="gramEnd"/>
+      <w:r>
+        <w:rPr>
+          <w:rFonts w:ascii="Cambria" w:eastAsia="MS Mincho" w:hAnsi="Cambria" w:cs="Times New Roman"/>
+        </w:rPr>
+        <w:t xml:space="preserve">'latency', 'le', 50) | list | </w:t>
+      </w:r>
+      <w:proofErr w:type="gramStart"/>
+      <w:r>
+        <w:rPr>
+          <w:rFonts w:ascii="Cambria" w:eastAsia="MS Mincho" w:hAnsi="Cambria" w:cs="Times New Roman"/>
+        </w:rPr>
+        <w:t>length }</w:t>
+      </w:r>
+      <w:proofErr w:type="gramEnd"/>
+      <w:r>
+        <w:rPr>
+          <w:rFonts w:ascii="Cambria" w:eastAsia="MS Mincho" w:hAnsi="Cambria" w:cs="Times New Roman"/>
+        </w:rPr>
+        <w:t>}</w:t>
       </w:r>
     </w:p>
     <w:p>
@@ -83,7 +169,293 @@
         <w:rPr>
           <w:rFonts w:ascii="Cambria" w:eastAsia="MS Mincho" w:hAnsi="Cambria" w:cs="Times New Roman"/>
         </w:rPr>
-        <w:t xml:space="preserve"> Warning (Ping 50ms ≤ 150ms): {{ results | rejectattr('latency', 'equalto', '') | selectattr('latency', 'gt', 50) | selectattr('latency', 'le', 150) | list | length }}{% set warns = results | rejectattr('latency', 'equalto', '') | selectattr('latency', 'gt', 50) | selectattr('latency', 'le', 150) | map(attribute='host') | list %}{% if warns|length &gt; 0 %} ({{ warns | join(', ') }}){% endif %}</w:t>
+        <w:t xml:space="preserve"> Warning (Ping 50ms ≤ 150ms): </w:t>
+      </w:r>
+      <w:proofErr w:type="gramStart"/>
+      <w:r>
+        <w:rPr>
+          <w:rFonts w:ascii="Cambria" w:eastAsia="MS Mincho" w:hAnsi="Cambria" w:cs="Times New Roman"/>
+        </w:rPr>
+        <w:t>{{ results</w:t>
+      </w:r>
+      <w:proofErr w:type="gramEnd"/>
+      <w:r>
+        <w:rPr>
+          <w:rFonts w:ascii="Cambria" w:eastAsia="MS Mincho" w:hAnsi="Cambria" w:cs="Times New Roman"/>
+        </w:rPr>
+        <w:t xml:space="preserve"> | </w:t>
+      </w:r>
+      <w:proofErr w:type="spellStart"/>
+      <w:proofErr w:type="gramStart"/>
+      <w:r>
+        <w:rPr>
+          <w:rFonts w:ascii="Cambria" w:eastAsia="MS Mincho" w:hAnsi="Cambria" w:cs="Times New Roman"/>
+        </w:rPr>
+        <w:t>rejectattr</w:t>
+      </w:r>
+      <w:proofErr w:type="spellEnd"/>
+      <w:r>
+        <w:rPr>
+          <w:rFonts w:ascii="Cambria" w:eastAsia="MS Mincho" w:hAnsi="Cambria" w:cs="Times New Roman"/>
+        </w:rPr>
+        <w:t>(</w:t>
+      </w:r>
+      <w:proofErr w:type="gramEnd"/>
+      <w:r>
+        <w:rPr>
+          <w:rFonts w:ascii="Cambria" w:eastAsia="MS Mincho" w:hAnsi="Cambria" w:cs="Times New Roman"/>
+        </w:rPr>
+        <w:t>'latency', '</w:t>
+      </w:r>
+      <w:proofErr w:type="spellStart"/>
+      <w:r>
+        <w:rPr>
+          <w:rFonts w:ascii="Cambria" w:eastAsia="MS Mincho" w:hAnsi="Cambria" w:cs="Times New Roman"/>
+        </w:rPr>
+        <w:t>equalto</w:t>
+      </w:r>
+      <w:proofErr w:type="spellEnd"/>
+      <w:r>
+        <w:rPr>
+          <w:rFonts w:ascii="Cambria" w:eastAsia="MS Mincho" w:hAnsi="Cambria" w:cs="Times New Roman"/>
+        </w:rPr>
+        <w:t xml:space="preserve">', '') | </w:t>
+      </w:r>
+      <w:proofErr w:type="spellStart"/>
+      <w:proofErr w:type="gramStart"/>
+      <w:r>
+        <w:rPr>
+          <w:rFonts w:ascii="Cambria" w:eastAsia="MS Mincho" w:hAnsi="Cambria" w:cs="Times New Roman"/>
+        </w:rPr>
+        <w:t>selectattr</w:t>
+      </w:r>
+      <w:proofErr w:type="spellEnd"/>
+      <w:r>
+        <w:rPr>
+          <w:rFonts w:ascii="Cambria" w:eastAsia="MS Mincho" w:hAnsi="Cambria" w:cs="Times New Roman"/>
+        </w:rPr>
+        <w:t>(</w:t>
+      </w:r>
+      <w:proofErr w:type="gramEnd"/>
+      <w:r>
+        <w:rPr>
+          <w:rFonts w:ascii="Cambria" w:eastAsia="MS Mincho" w:hAnsi="Cambria" w:cs="Times New Roman"/>
+        </w:rPr>
+        <w:t>'latency', '</w:t>
+      </w:r>
+      <w:proofErr w:type="spellStart"/>
+      <w:r>
+        <w:rPr>
+          <w:rFonts w:ascii="Cambria" w:eastAsia="MS Mincho" w:hAnsi="Cambria" w:cs="Times New Roman"/>
+        </w:rPr>
+        <w:t>gt</w:t>
+      </w:r>
+      <w:proofErr w:type="spellEnd"/>
+      <w:r>
+        <w:rPr>
+          <w:rFonts w:ascii="Cambria" w:eastAsia="MS Mincho" w:hAnsi="Cambria" w:cs="Times New Roman"/>
+        </w:rPr>
+        <w:t xml:space="preserve">', 50) | </w:t>
+      </w:r>
+      <w:proofErr w:type="spellStart"/>
+      <w:proofErr w:type="gramStart"/>
+      <w:r>
+        <w:rPr>
+          <w:rFonts w:ascii="Cambria" w:eastAsia="MS Mincho" w:hAnsi="Cambria" w:cs="Times New Roman"/>
+        </w:rPr>
+        <w:t>selectattr</w:t>
+      </w:r>
+      <w:proofErr w:type="spellEnd"/>
+      <w:r>
+        <w:rPr>
+          <w:rFonts w:ascii="Cambria" w:eastAsia="MS Mincho" w:hAnsi="Cambria" w:cs="Times New Roman"/>
+        </w:rPr>
+        <w:t>(</w:t>
+      </w:r>
+      <w:proofErr w:type="gramEnd"/>
+      <w:r>
+        <w:rPr>
+          <w:rFonts w:ascii="Cambria" w:eastAsia="MS Mincho" w:hAnsi="Cambria" w:cs="Times New Roman"/>
+        </w:rPr>
+        <w:t xml:space="preserve">'latency', 'le', 150) | list | </w:t>
+      </w:r>
+      <w:proofErr w:type="gramStart"/>
+      <w:r>
+        <w:rPr>
+          <w:rFonts w:ascii="Cambria" w:eastAsia="MS Mincho" w:hAnsi="Cambria" w:cs="Times New Roman"/>
+        </w:rPr>
+        <w:t>length }}{</w:t>
+      </w:r>
+      <w:proofErr w:type="gramEnd"/>
+      <w:r>
+        <w:rPr>
+          <w:rFonts w:ascii="Cambria" w:eastAsia="MS Mincho" w:hAnsi="Cambria" w:cs="Times New Roman"/>
+        </w:rPr>
+        <w:t xml:space="preserve">% set warns = results | </w:t>
+      </w:r>
+      <w:proofErr w:type="spellStart"/>
+      <w:proofErr w:type="gramStart"/>
+      <w:r>
+        <w:rPr>
+          <w:rFonts w:ascii="Cambria" w:eastAsia="MS Mincho" w:hAnsi="Cambria" w:cs="Times New Roman"/>
+        </w:rPr>
+        <w:t>rejectattr</w:t>
+      </w:r>
+      <w:proofErr w:type="spellEnd"/>
+      <w:r>
+        <w:rPr>
+          <w:rFonts w:ascii="Cambria" w:eastAsia="MS Mincho" w:hAnsi="Cambria" w:cs="Times New Roman"/>
+        </w:rPr>
+        <w:t>(</w:t>
+      </w:r>
+      <w:proofErr w:type="gramEnd"/>
+      <w:r>
+        <w:rPr>
+          <w:rFonts w:ascii="Cambria" w:eastAsia="MS Mincho" w:hAnsi="Cambria" w:cs="Times New Roman"/>
+        </w:rPr>
+        <w:t>'latency', '</w:t>
+      </w:r>
+      <w:proofErr w:type="spellStart"/>
+      <w:r>
+        <w:rPr>
+          <w:rFonts w:ascii="Cambria" w:eastAsia="MS Mincho" w:hAnsi="Cambria" w:cs="Times New Roman"/>
+        </w:rPr>
+        <w:t>equalto</w:t>
+      </w:r>
+      <w:proofErr w:type="spellEnd"/>
+      <w:r>
+        <w:rPr>
+          <w:rFonts w:ascii="Cambria" w:eastAsia="MS Mincho" w:hAnsi="Cambria" w:cs="Times New Roman"/>
+        </w:rPr>
+        <w:t xml:space="preserve">', '') | </w:t>
+      </w:r>
+      <w:proofErr w:type="spellStart"/>
+      <w:proofErr w:type="gramStart"/>
+      <w:r>
+        <w:rPr>
+          <w:rFonts w:ascii="Cambria" w:eastAsia="MS Mincho" w:hAnsi="Cambria" w:cs="Times New Roman"/>
+        </w:rPr>
+        <w:t>selectattr</w:t>
+      </w:r>
+      <w:proofErr w:type="spellEnd"/>
+      <w:r>
+        <w:rPr>
+          <w:rFonts w:ascii="Cambria" w:eastAsia="MS Mincho" w:hAnsi="Cambria" w:cs="Times New Roman"/>
+        </w:rPr>
+        <w:t>(</w:t>
+      </w:r>
+      <w:proofErr w:type="gramEnd"/>
+      <w:r>
+        <w:rPr>
+          <w:rFonts w:ascii="Cambria" w:eastAsia="MS Mincho" w:hAnsi="Cambria" w:cs="Times New Roman"/>
+        </w:rPr>
+        <w:t>'latency', '</w:t>
+      </w:r>
+      <w:proofErr w:type="spellStart"/>
+      <w:r>
+        <w:rPr>
+          <w:rFonts w:ascii="Cambria" w:eastAsia="MS Mincho" w:hAnsi="Cambria" w:cs="Times New Roman"/>
+        </w:rPr>
+        <w:t>gt</w:t>
+      </w:r>
+      <w:proofErr w:type="spellEnd"/>
+      <w:r>
+        <w:rPr>
+          <w:rFonts w:ascii="Cambria" w:eastAsia="MS Mincho" w:hAnsi="Cambria" w:cs="Times New Roman"/>
+        </w:rPr>
+        <w:t xml:space="preserve">', 50) | </w:t>
+      </w:r>
+      <w:proofErr w:type="spellStart"/>
+      <w:proofErr w:type="gramStart"/>
+      <w:r>
+        <w:rPr>
+          <w:rFonts w:ascii="Cambria" w:eastAsia="MS Mincho" w:hAnsi="Cambria" w:cs="Times New Roman"/>
+        </w:rPr>
+        <w:t>selectattr</w:t>
+      </w:r>
+      <w:proofErr w:type="spellEnd"/>
+      <w:r>
+        <w:rPr>
+          <w:rFonts w:ascii="Cambria" w:eastAsia="MS Mincho" w:hAnsi="Cambria" w:cs="Times New Roman"/>
+        </w:rPr>
+        <w:t>(</w:t>
+      </w:r>
+      <w:proofErr w:type="gramEnd"/>
+      <w:r>
+        <w:rPr>
+          <w:rFonts w:ascii="Cambria" w:eastAsia="MS Mincho" w:hAnsi="Cambria" w:cs="Times New Roman"/>
+        </w:rPr>
+        <w:t xml:space="preserve">'latency', 'le', 150) | map(attribute='host') | list </w:t>
+      </w:r>
+      <w:proofErr w:type="gramStart"/>
+      <w:r>
+        <w:rPr>
+          <w:rFonts w:ascii="Cambria" w:eastAsia="MS Mincho" w:hAnsi="Cambria" w:cs="Times New Roman"/>
+        </w:rPr>
+        <w:t>%}{</w:t>
+      </w:r>
+      <w:proofErr w:type="gramEnd"/>
+      <w:r>
+        <w:rPr>
+          <w:rFonts w:ascii="Cambria" w:eastAsia="MS Mincho" w:hAnsi="Cambria" w:cs="Times New Roman"/>
+        </w:rPr>
+        <w:t xml:space="preserve">% if </w:t>
+      </w:r>
+      <w:proofErr w:type="spellStart"/>
+      <w:r>
+        <w:rPr>
+          <w:rFonts w:ascii="Cambria" w:eastAsia="MS Mincho" w:hAnsi="Cambria" w:cs="Times New Roman"/>
+        </w:rPr>
+        <w:t>warns|length</w:t>
+      </w:r>
+      <w:proofErr w:type="spellEnd"/>
+      <w:r>
+        <w:rPr>
+          <w:rFonts w:ascii="Cambria" w:eastAsia="MS Mincho" w:hAnsi="Cambria" w:cs="Times New Roman"/>
+        </w:rPr>
+        <w:t xml:space="preserve"> &gt; 0 %} (</w:t>
+      </w:r>
+      <w:proofErr w:type="gramStart"/>
+      <w:r>
+        <w:rPr>
+          <w:rFonts w:ascii="Cambria" w:eastAsia="MS Mincho" w:hAnsi="Cambria" w:cs="Times New Roman"/>
+        </w:rPr>
+        <w:t>{{ warns</w:t>
+      </w:r>
+      <w:proofErr w:type="gramEnd"/>
+      <w:r>
+        <w:rPr>
+          <w:rFonts w:ascii="Cambria" w:eastAsia="MS Mincho" w:hAnsi="Cambria" w:cs="Times New Roman"/>
+        </w:rPr>
+        <w:t xml:space="preserve"> | </w:t>
+      </w:r>
+      <w:proofErr w:type="gramStart"/>
+      <w:r>
+        <w:rPr>
+          <w:rFonts w:ascii="Cambria" w:eastAsia="MS Mincho" w:hAnsi="Cambria" w:cs="Times New Roman"/>
+        </w:rPr>
+        <w:t>join(</w:t>
+      </w:r>
+      <w:proofErr w:type="gramEnd"/>
+      <w:r>
+        <w:rPr>
+          <w:rFonts w:ascii="Cambria" w:eastAsia="MS Mincho" w:hAnsi="Cambria" w:cs="Times New Roman"/>
+        </w:rPr>
+        <w:t>', '</w:t>
+      </w:r>
+      <w:proofErr w:type="gramStart"/>
+      <w:r>
+        <w:rPr>
+          <w:rFonts w:ascii="Cambria" w:eastAsia="MS Mincho" w:hAnsi="Cambria" w:cs="Times New Roman"/>
+        </w:rPr>
+        <w:t>) }}){</w:t>
+      </w:r>
+      <w:proofErr w:type="gramEnd"/>
+      <w:r>
+        <w:rPr>
+          <w:rFonts w:ascii="Cambria" w:eastAsia="MS Mincho" w:hAnsi="Cambria" w:cs="Times New Roman"/>
+        </w:rPr>
+        <w:t>% endif %}</w:t>
       </w:r>
     </w:p>
     <w:p>
@@ -102,7 +474,249 @@
         <w:rPr>
           <w:rFonts w:ascii="Cambria" w:eastAsia="MS Mincho" w:hAnsi="Cambria" w:cs="Times New Roman"/>
         </w:rPr>
-        <w:t xml:space="preserve"> Critical (Ping ≥ 150ms): {{ results | rejectattr('latency', 'equalto', '') | selectattr('latency', 'gt', 150) | list | length }}{% set crits = results | rejectattr('latency', 'equalto', '') | selectattr('latency', 'gt', 150) | map(attribute='host') | list %}{% if crits|length &gt; 0 %} ({{ crits | join(', ') }}){% endif %}</w:t>
+        <w:t xml:space="preserve"> Critical (Ping ≥ 150ms): </w:t>
+      </w:r>
+      <w:proofErr w:type="gramStart"/>
+      <w:r>
+        <w:rPr>
+          <w:rFonts w:ascii="Cambria" w:eastAsia="MS Mincho" w:hAnsi="Cambria" w:cs="Times New Roman"/>
+        </w:rPr>
+        <w:t>{{ results</w:t>
+      </w:r>
+      <w:proofErr w:type="gramEnd"/>
+      <w:r>
+        <w:rPr>
+          <w:rFonts w:ascii="Cambria" w:eastAsia="MS Mincho" w:hAnsi="Cambria" w:cs="Times New Roman"/>
+        </w:rPr>
+        <w:t xml:space="preserve"> | </w:t>
+      </w:r>
+      <w:proofErr w:type="spellStart"/>
+      <w:proofErr w:type="gramStart"/>
+      <w:r>
+        <w:rPr>
+          <w:rFonts w:ascii="Cambria" w:eastAsia="MS Mincho" w:hAnsi="Cambria" w:cs="Times New Roman"/>
+        </w:rPr>
+        <w:t>rejectattr</w:t>
+      </w:r>
+      <w:proofErr w:type="spellEnd"/>
+      <w:r>
+        <w:rPr>
+          <w:rFonts w:ascii="Cambria" w:eastAsia="MS Mincho" w:hAnsi="Cambria" w:cs="Times New Roman"/>
+        </w:rPr>
+        <w:t>(</w:t>
+      </w:r>
+      <w:proofErr w:type="gramEnd"/>
+      <w:r>
+        <w:rPr>
+          <w:rFonts w:ascii="Cambria" w:eastAsia="MS Mincho" w:hAnsi="Cambria" w:cs="Times New Roman"/>
+        </w:rPr>
+        <w:t>'latency', '</w:t>
+      </w:r>
+      <w:proofErr w:type="spellStart"/>
+      <w:r>
+        <w:rPr>
+          <w:rFonts w:ascii="Cambria" w:eastAsia="MS Mincho" w:hAnsi="Cambria" w:cs="Times New Roman"/>
+        </w:rPr>
+        <w:t>equalto</w:t>
+      </w:r>
+      <w:proofErr w:type="spellEnd"/>
+      <w:r>
+        <w:rPr>
+          <w:rFonts w:ascii="Cambria" w:eastAsia="MS Mincho" w:hAnsi="Cambria" w:cs="Times New Roman"/>
+        </w:rPr>
+        <w:t xml:space="preserve">', '') | </w:t>
+      </w:r>
+      <w:proofErr w:type="spellStart"/>
+      <w:proofErr w:type="gramStart"/>
+      <w:r>
+        <w:rPr>
+          <w:rFonts w:ascii="Cambria" w:eastAsia="MS Mincho" w:hAnsi="Cambria" w:cs="Times New Roman"/>
+        </w:rPr>
+        <w:t>selectattr</w:t>
+      </w:r>
+      <w:proofErr w:type="spellEnd"/>
+      <w:r>
+        <w:rPr>
+          <w:rFonts w:ascii="Cambria" w:eastAsia="MS Mincho" w:hAnsi="Cambria" w:cs="Times New Roman"/>
+        </w:rPr>
+        <w:t>(</w:t>
+      </w:r>
+      <w:proofErr w:type="gramEnd"/>
+      <w:r>
+        <w:rPr>
+          <w:rFonts w:ascii="Cambria" w:eastAsia="MS Mincho" w:hAnsi="Cambria" w:cs="Times New Roman"/>
+        </w:rPr>
+        <w:t>'latency', '</w:t>
+      </w:r>
+      <w:proofErr w:type="spellStart"/>
+      <w:r>
+        <w:rPr>
+          <w:rFonts w:ascii="Cambria" w:eastAsia="MS Mincho" w:hAnsi="Cambria" w:cs="Times New Roman"/>
+        </w:rPr>
+        <w:t>gt</w:t>
+      </w:r>
+      <w:proofErr w:type="spellEnd"/>
+      <w:r>
+        <w:rPr>
+          <w:rFonts w:ascii="Cambria" w:eastAsia="MS Mincho" w:hAnsi="Cambria" w:cs="Times New Roman"/>
+        </w:rPr>
+        <w:t xml:space="preserve">', 150) | list | </w:t>
+      </w:r>
+      <w:proofErr w:type="gramStart"/>
+      <w:r>
+        <w:rPr>
+          <w:rFonts w:ascii="Cambria" w:eastAsia="MS Mincho" w:hAnsi="Cambria" w:cs="Times New Roman"/>
+        </w:rPr>
+        <w:t>length }}{</w:t>
+      </w:r>
+      <w:proofErr w:type="gramEnd"/>
+      <w:r>
+        <w:rPr>
+          <w:rFonts w:ascii="Cambria" w:eastAsia="MS Mincho" w:hAnsi="Cambria" w:cs="Times New Roman"/>
+        </w:rPr>
+        <w:t xml:space="preserve">% set crits = results | </w:t>
+      </w:r>
+      <w:proofErr w:type="spellStart"/>
+      <w:proofErr w:type="gramStart"/>
+      <w:r>
+        <w:rPr>
+          <w:rFonts w:ascii="Cambria" w:eastAsia="MS Mincho" w:hAnsi="Cambria" w:cs="Times New Roman"/>
+        </w:rPr>
+        <w:t>rejectattr</w:t>
+      </w:r>
+      <w:proofErr w:type="spellEnd"/>
+      <w:r>
+        <w:rPr>
+          <w:rFonts w:ascii="Cambria" w:eastAsia="MS Mincho" w:hAnsi="Cambria" w:cs="Times New Roman"/>
+        </w:rPr>
+        <w:t>(</w:t>
+      </w:r>
+      <w:proofErr w:type="gramEnd"/>
+      <w:r>
+        <w:rPr>
+          <w:rFonts w:ascii="Cambria" w:eastAsia="MS Mincho" w:hAnsi="Cambria" w:cs="Times New Roman"/>
+        </w:rPr>
+        <w:t>'latency', '</w:t>
+      </w:r>
+      <w:proofErr w:type="spellStart"/>
+      <w:r>
+        <w:rPr>
+          <w:rFonts w:ascii="Cambria" w:eastAsia="MS Mincho" w:hAnsi="Cambria" w:cs="Times New Roman"/>
+        </w:rPr>
+        <w:t>equalto</w:t>
+      </w:r>
+      <w:proofErr w:type="spellEnd"/>
+      <w:r>
+        <w:rPr>
+          <w:rFonts w:ascii="Cambria" w:eastAsia="MS Mincho" w:hAnsi="Cambria" w:cs="Times New Roman"/>
+        </w:rPr>
+        <w:t xml:space="preserve">', '') | </w:t>
+      </w:r>
+      <w:proofErr w:type="spellStart"/>
+      <w:proofErr w:type="gramStart"/>
+      <w:r>
+        <w:rPr>
+          <w:rFonts w:ascii="Cambria" w:eastAsia="MS Mincho" w:hAnsi="Cambria" w:cs="Times New Roman"/>
+        </w:rPr>
+        <w:t>selectattr</w:t>
+      </w:r>
+      <w:proofErr w:type="spellEnd"/>
+      <w:r>
+        <w:rPr>
+          <w:rFonts w:ascii="Cambria" w:eastAsia="MS Mincho" w:hAnsi="Cambria" w:cs="Times New Roman"/>
+        </w:rPr>
+        <w:t>(</w:t>
+      </w:r>
+      <w:proofErr w:type="gramEnd"/>
+      <w:r>
+        <w:rPr>
+          <w:rFonts w:ascii="Cambria" w:eastAsia="MS Mincho" w:hAnsi="Cambria" w:cs="Times New Roman"/>
+        </w:rPr>
+        <w:t>'latency', '</w:t>
+      </w:r>
+      <w:proofErr w:type="spellStart"/>
+      <w:r>
+        <w:rPr>
+          <w:rFonts w:ascii="Cambria" w:eastAsia="MS Mincho" w:hAnsi="Cambria" w:cs="Times New Roman"/>
+        </w:rPr>
+        <w:t>gt</w:t>
+      </w:r>
+      <w:proofErr w:type="spellEnd"/>
+      <w:r>
+        <w:rPr>
+          <w:rFonts w:ascii="Cambria" w:eastAsia="MS Mincho" w:hAnsi="Cambria" w:cs="Times New Roman"/>
+        </w:rPr>
+        <w:t xml:space="preserve">', 150) | map(attribute='host') | list </w:t>
+      </w:r>
+      <w:proofErr w:type="gramStart"/>
+      <w:r>
+        <w:rPr>
+          <w:rFonts w:ascii="Cambria" w:eastAsia="MS Mincho" w:hAnsi="Cambria" w:cs="Times New Roman"/>
+        </w:rPr>
+        <w:t>%}{</w:t>
+      </w:r>
+      <w:proofErr w:type="gramEnd"/>
+      <w:r>
+        <w:rPr>
+          <w:rFonts w:ascii="Cambria" w:eastAsia="MS Mincho" w:hAnsi="Cambria" w:cs="Times New Roman"/>
+        </w:rPr>
+        <w:t xml:space="preserve">% if </w:t>
+      </w:r>
+      <w:proofErr w:type="spellStart"/>
+      <w:r>
+        <w:rPr>
+          <w:rFonts w:ascii="Cambria" w:eastAsia="MS Mincho" w:hAnsi="Cambria" w:cs="Times New Roman"/>
+        </w:rPr>
+        <w:t>crits|length</w:t>
+      </w:r>
+      <w:proofErr w:type="spellEnd"/>
+      <w:r>
+        <w:rPr>
+          <w:rFonts w:ascii="Cambria" w:eastAsia="MS Mincho" w:hAnsi="Cambria" w:cs="Times New Roman"/>
+        </w:rPr>
+        <w:t xml:space="preserve"> &gt; 0 %} (</w:t>
+      </w:r>
+      <w:proofErr w:type="gramStart"/>
+      <w:r>
+        <w:rPr>
+          <w:rFonts w:ascii="Cambria" w:eastAsia="MS Mincho" w:hAnsi="Cambria" w:cs="Times New Roman"/>
+        </w:rPr>
+        <w:t>{{ crits</w:t>
+      </w:r>
+      <w:proofErr w:type="gramEnd"/>
+      <w:r>
+        <w:rPr>
+          <w:rFonts w:ascii="Cambria" w:eastAsia="MS Mincho" w:hAnsi="Cambria" w:cs="Times New Roman"/>
+        </w:rPr>
+        <w:t xml:space="preserve"> | </w:t>
+      </w:r>
+      <w:proofErr w:type="gramStart"/>
+      <w:r>
+        <w:rPr>
+          <w:rFonts w:ascii="Cambria" w:eastAsia="MS Mincho" w:hAnsi="Cambria" w:cs="Times New Roman"/>
+        </w:rPr>
+        <w:t>join(</w:t>
+      </w:r>
+      <w:proofErr w:type="gramEnd"/>
+      <w:r>
+        <w:rPr>
+          <w:rFonts w:ascii="Cambria" w:eastAsia="MS Mincho" w:hAnsi="Cambria" w:cs="Times New Roman"/>
+        </w:rPr>
+        <w:t>', '</w:t>
+      </w:r>
+      <w:proofErr w:type="gramStart"/>
+      <w:r>
+        <w:rPr>
+          <w:rFonts w:ascii="Cambria" w:eastAsia="MS Mincho" w:hAnsi="Cambria" w:cs="Times New Roman"/>
+        </w:rPr>
+        <w:t>) }}){</w:t>
+      </w:r>
+      <w:proofErr w:type="gramEnd"/>
+      <w:r>
+        <w:rPr>
+          <w:rFonts w:ascii="Cambria" w:eastAsia="MS Mincho" w:hAnsi="Cambria" w:cs="Times New Roman"/>
+        </w:rPr>
+        <w:t>% endif %}</w:t>
       </w:r>
     </w:p>
     <w:p>
@@ -121,7 +735,177 @@
         <w:rPr>
           <w:rFonts w:ascii="Cambria" w:eastAsia="MS Mincho" w:hAnsi="Cambria" w:cs="Times New Roman"/>
         </w:rPr>
-        <w:t xml:space="preserve"> Ping Timeout: {{ results | selectattr('latency', 'equalto', '') | list | length }}{% set timeouts = results | selectattr('latency', 'equalto', '') | map(attribute='host') | list %}{% if timeouts|length &gt; 0 %} ({{ timeouts | join(', ') }}){% endif %}</w:t>
+        <w:t xml:space="preserve"> Ping Timeout: </w:t>
+      </w:r>
+      <w:proofErr w:type="gramStart"/>
+      <w:r>
+        <w:rPr>
+          <w:rFonts w:ascii="Cambria" w:eastAsia="MS Mincho" w:hAnsi="Cambria" w:cs="Times New Roman"/>
+        </w:rPr>
+        <w:t>{{ results</w:t>
+      </w:r>
+      <w:proofErr w:type="gramEnd"/>
+      <w:r>
+        <w:rPr>
+          <w:rFonts w:ascii="Cambria" w:eastAsia="MS Mincho" w:hAnsi="Cambria" w:cs="Times New Roman"/>
+        </w:rPr>
+        <w:t xml:space="preserve"> | </w:t>
+      </w:r>
+      <w:proofErr w:type="spellStart"/>
+      <w:proofErr w:type="gramStart"/>
+      <w:r>
+        <w:rPr>
+          <w:rFonts w:ascii="Cambria" w:eastAsia="MS Mincho" w:hAnsi="Cambria" w:cs="Times New Roman"/>
+        </w:rPr>
+        <w:t>selectattr</w:t>
+      </w:r>
+      <w:proofErr w:type="spellEnd"/>
+      <w:r>
+        <w:rPr>
+          <w:rFonts w:ascii="Cambria" w:eastAsia="MS Mincho" w:hAnsi="Cambria" w:cs="Times New Roman"/>
+        </w:rPr>
+        <w:t>(</w:t>
+      </w:r>
+      <w:proofErr w:type="gramEnd"/>
+      <w:r>
+        <w:rPr>
+          <w:rFonts w:ascii="Cambria" w:eastAsia="MS Mincho" w:hAnsi="Cambria" w:cs="Times New Roman"/>
+        </w:rPr>
+        <w:t>'latency', '</w:t>
+      </w:r>
+      <w:proofErr w:type="spellStart"/>
+      <w:r>
+        <w:rPr>
+          <w:rFonts w:ascii="Cambria" w:eastAsia="MS Mincho" w:hAnsi="Cambria" w:cs="Times New Roman"/>
+        </w:rPr>
+        <w:t>equalto</w:t>
+      </w:r>
+      <w:proofErr w:type="spellEnd"/>
+      <w:r>
+        <w:rPr>
+          <w:rFonts w:ascii="Cambria" w:eastAsia="MS Mincho" w:hAnsi="Cambria" w:cs="Times New Roman"/>
+        </w:rPr>
+        <w:t xml:space="preserve">', '') | list | </w:t>
+      </w:r>
+      <w:proofErr w:type="gramStart"/>
+      <w:r>
+        <w:rPr>
+          <w:rFonts w:ascii="Cambria" w:eastAsia="MS Mincho" w:hAnsi="Cambria" w:cs="Times New Roman"/>
+        </w:rPr>
+        <w:t>length }}{</w:t>
+      </w:r>
+      <w:proofErr w:type="gramEnd"/>
+      <w:r>
+        <w:rPr>
+          <w:rFonts w:ascii="Cambria" w:eastAsia="MS Mincho" w:hAnsi="Cambria" w:cs="Times New Roman"/>
+        </w:rPr>
+        <w:t xml:space="preserve">% set timeouts = results | </w:t>
+      </w:r>
+      <w:proofErr w:type="spellStart"/>
+      <w:proofErr w:type="gramStart"/>
+      <w:r>
+        <w:rPr>
+          <w:rFonts w:ascii="Cambria" w:eastAsia="MS Mincho" w:hAnsi="Cambria" w:cs="Times New Roman"/>
+        </w:rPr>
+        <w:t>selectattr</w:t>
+      </w:r>
+      <w:proofErr w:type="spellEnd"/>
+      <w:r>
+        <w:rPr>
+          <w:rFonts w:ascii="Cambria" w:eastAsia="MS Mincho" w:hAnsi="Cambria" w:cs="Times New Roman"/>
+        </w:rPr>
+        <w:t>(</w:t>
+      </w:r>
+      <w:proofErr w:type="gramEnd"/>
+      <w:r>
+        <w:rPr>
+          <w:rFonts w:ascii="Cambria" w:eastAsia="MS Mincho" w:hAnsi="Cambria" w:cs="Times New Roman"/>
+        </w:rPr>
+        <w:t>'latency', '</w:t>
+      </w:r>
+      <w:proofErr w:type="spellStart"/>
+      <w:r>
+        <w:rPr>
+          <w:rFonts w:ascii="Cambria" w:eastAsia="MS Mincho" w:hAnsi="Cambria" w:cs="Times New Roman"/>
+        </w:rPr>
+        <w:t>equalto</w:t>
+      </w:r>
+      <w:proofErr w:type="spellEnd"/>
+      <w:r>
+        <w:rPr>
+          <w:rFonts w:ascii="Cambria" w:eastAsia="MS Mincho" w:hAnsi="Cambria" w:cs="Times New Roman"/>
+        </w:rPr>
+        <w:t xml:space="preserve">', '') | map(attribute='host') | list </w:t>
+      </w:r>
+      <w:proofErr w:type="gramStart"/>
+      <w:r>
+        <w:rPr>
+          <w:rFonts w:ascii="Cambria" w:eastAsia="MS Mincho" w:hAnsi="Cambria" w:cs="Times New Roman"/>
+        </w:rPr>
+        <w:t>%}{</w:t>
+      </w:r>
+      <w:proofErr w:type="gramEnd"/>
+      <w:r>
+        <w:rPr>
+          <w:rFonts w:ascii="Cambria" w:eastAsia="MS Mincho" w:hAnsi="Cambria" w:cs="Times New Roman"/>
+        </w:rPr>
+        <w:t xml:space="preserve">% if </w:t>
+      </w:r>
+      <w:proofErr w:type="spellStart"/>
+      <w:r>
+        <w:rPr>
+          <w:rFonts w:ascii="Cambria" w:eastAsia="MS Mincho" w:hAnsi="Cambria" w:cs="Times New Roman"/>
+        </w:rPr>
+        <w:t>timeouts|length</w:t>
+      </w:r>
+      <w:proofErr w:type="spellEnd"/>
+      <w:r>
+        <w:rPr>
+          <w:rFonts w:ascii="Cambria" w:eastAsia="MS Mincho" w:hAnsi="Cambria" w:cs="Times New Roman"/>
+        </w:rPr>
+        <w:t xml:space="preserve"> &gt; 0 %} (</w:t>
+      </w:r>
+      <w:proofErr w:type="gramStart"/>
+      <w:r>
+        <w:rPr>
+          <w:rFonts w:ascii="Cambria" w:eastAsia="MS Mincho" w:hAnsi="Cambria" w:cs="Times New Roman"/>
+        </w:rPr>
+        <w:t>{{ timeouts</w:t>
+      </w:r>
+      <w:proofErr w:type="gramEnd"/>
+      <w:r>
+        <w:rPr>
+          <w:rFonts w:ascii="Cambria" w:eastAsia="MS Mincho" w:hAnsi="Cambria" w:cs="Times New Roman"/>
+        </w:rPr>
+        <w:t xml:space="preserve"> | </w:t>
+      </w:r>
+      <w:proofErr w:type="gramStart"/>
+      <w:r>
+        <w:rPr>
+          <w:rFonts w:ascii="Cambria" w:eastAsia="MS Mincho" w:hAnsi="Cambria" w:cs="Times New Roman"/>
+        </w:rPr>
+        <w:t>join(</w:t>
+      </w:r>
+      <w:proofErr w:type="gramEnd"/>
+      <w:r>
+        <w:rPr>
+          <w:rFonts w:ascii="Cambria" w:eastAsia="MS Mincho" w:hAnsi="Cambria" w:cs="Times New Roman"/>
+        </w:rPr>
+        <w:t>', '</w:t>
+      </w:r>
+      <w:proofErr w:type="gramStart"/>
+      <w:r>
+        <w:rPr>
+          <w:rFonts w:ascii="Cambria" w:eastAsia="MS Mincho" w:hAnsi="Cambria" w:cs="Times New Roman"/>
+        </w:rPr>
+        <w:t>) }}){</w:t>
+      </w:r>
+      <w:proofErr w:type="gramEnd"/>
+      <w:r>
+        <w:rPr>
+          <w:rFonts w:ascii="Cambria" w:eastAsia="MS Mincho" w:hAnsi="Cambria" w:cs="Times New Roman"/>
+        </w:rPr>
+        <w:t>% endif %}</w:t>
       </w:r>
     </w:p>
     <w:p>
@@ -132,21 +916,97 @@
         <w:t>p</w:t>
       </w:r>
       <w:r>
-        <w:t xml:space="preserve"> for res in results %}</w:t>
-      </w:r>
+        <w:t xml:space="preserve"> for </w:t>
+      </w:r>
+      <w:proofErr w:type="gramStart"/>
+      <w:r>
+        <w:t>res</w:t>
+      </w:r>
+      <w:proofErr w:type="gramEnd"/>
+      <w:r>
+        <w:t xml:space="preserve"> in </w:t>
+      </w:r>
+      <w:proofErr w:type="gramStart"/>
+      <w:r>
+        <w:t>results %}</w:t>
+      </w:r>
+      <w:proofErr w:type="gramEnd"/>
     </w:p>
     <w:p>
       <w:pPr>
         <w:pStyle w:val="Ttulo1"/>
       </w:pPr>
-      <w:r>
-        <w:t>{{ res.rule_name }}: {{ res.host }}</w:t>
+      <w:proofErr w:type="gramStart"/>
+      <w:r>
+        <w:t xml:space="preserve">{{ </w:t>
+      </w:r>
+      <w:proofErr w:type="spellStart"/>
+      <w:r>
+        <w:t>res</w:t>
+      </w:r>
+      <w:proofErr w:type="gramEnd"/>
+      <w:r>
+        <w:t>.rule_</w:t>
+      </w:r>
+      <w:proofErr w:type="gramStart"/>
+      <w:r>
+        <w:t>name</w:t>
+      </w:r>
+      <w:proofErr w:type="spellEnd"/>
+      <w:r>
+        <w:t xml:space="preserve"> }</w:t>
+      </w:r>
+      <w:proofErr w:type="gramEnd"/>
+      <w:r>
+        <w:t xml:space="preserve">}: </w:t>
+      </w:r>
+      <w:proofErr w:type="gramStart"/>
+      <w:r>
+        <w:t xml:space="preserve">{{ </w:t>
+      </w:r>
+      <w:proofErr w:type="spellStart"/>
+      <w:r>
+        <w:t>res</w:t>
+      </w:r>
+      <w:proofErr w:type="gramEnd"/>
+      <w:r>
+        <w:t>.</w:t>
+      </w:r>
+      <w:proofErr w:type="gramStart"/>
+      <w:r>
+        <w:t>host</w:t>
+      </w:r>
+      <w:proofErr w:type="spellEnd"/>
+      <w:r>
+        <w:t xml:space="preserve"> }</w:t>
+      </w:r>
+      <w:proofErr w:type="gramEnd"/>
+      <w:r>
+        <w:t>}</w:t>
       </w:r>
     </w:p>
     <w:p>
       <w:r>
-        <w:t>{%p if res.rule_name in ['Switch', 'Access Point'] %}</w:t>
-      </w:r>
+        <w:t xml:space="preserve">{%p if </w:t>
+      </w:r>
+      <w:proofErr w:type="spellStart"/>
+      <w:proofErr w:type="gramStart"/>
+      <w:r>
+        <w:t>res.rule</w:t>
+      </w:r>
+      <w:proofErr w:type="gramEnd"/>
+      <w:r>
+        <w:t>_name</w:t>
+      </w:r>
+      <w:proofErr w:type="spellEnd"/>
+      <w:r>
+        <w:t xml:space="preserve"> in ['Switch', 'Access Point'</w:t>
+      </w:r>
+      <w:proofErr w:type="gramStart"/>
+      <w:r>
+        <w:t>] %}</w:t>
+      </w:r>
+      <w:proofErr w:type="gramEnd"/>
     </w:p>
     <w:p>
       <w:r>
@@ -158,24 +1018,70 @@
       <w:r>
         <w:t xml:space="preserve"> if </w:t>
       </w:r>
+      <w:proofErr w:type="spellStart"/>
+      <w:proofErr w:type="gramStart"/>
       <w:r>
         <w:t>res.latency</w:t>
       </w:r>
-      <w:r>
-        <w:t xml:space="preserve"> %}{% set ping = </w:t>
-      </w:r>
+      <w:proofErr w:type="spellEnd"/>
+      <w:proofErr w:type="gramEnd"/>
+      <w:r>
+        <w:t xml:space="preserve"> %}</w:t>
+      </w:r>
+    </w:p>
+    <w:p>
+      <w:r>
+        <w:t xml:space="preserve">{% set ping = </w:t>
+      </w:r>
+      <w:proofErr w:type="spellStart"/>
+      <w:proofErr w:type="gramStart"/>
       <w:r>
         <w:t>res.latency</w:t>
       </w:r>
-      <w:r>
-        <w:t>|int %}Lat</w:t>
+      <w:proofErr w:type="gramEnd"/>
+      <w:r>
+        <w:t>|int</w:t>
+      </w:r>
+      <w:proofErr w:type="spellEnd"/>
+      <w:r>
+        <w:t xml:space="preserve"> </w:t>
+      </w:r>
+      <w:proofErr w:type="gramStart"/>
+      <w:r>
+        <w:t>%}Lat</w:t>
       </w:r>
       <w:r>
         <w:t>ency</w:t>
       </w:r>
-      <w:r>
-        <w:t xml:space="preserve">: {{ ping }}ms ({% if ping &lt;= 50 %}Ok </w:t>
-      </w:r>
+      <w:proofErr w:type="gramEnd"/>
+      <w:r>
+        <w:t xml:space="preserve">: </w:t>
+      </w:r>
+      <w:proofErr w:type="gramStart"/>
+      <w:r>
+        <w:t>{{ ping</w:t>
+      </w:r>
+      <w:proofErr w:type="gramEnd"/>
+      <w:r>
+        <w:t xml:space="preserve"> }}</w:t>
+      </w:r>
+      <w:proofErr w:type="spellStart"/>
+      <w:r>
+        <w:t>ms</w:t>
+      </w:r>
+      <w:proofErr w:type="spellEnd"/>
+      <w:r>
+        <w:t xml:space="preserve"> ({% if ping &lt;= 50 </w:t>
+      </w:r>
+      <w:proofErr w:type="gramStart"/>
+      <w:r>
+        <w:t>%}Ok</w:t>
+      </w:r>
+      <w:proofErr w:type="gramEnd"/>
+      <w:r>
+        <w:t xml:space="preserve"> </w:t>
+      </w:r>
+      <w:proofErr w:type="gramStart"/>
       <w:r>
         <w:rPr>
           <w:rFonts w:ascii="Segoe UI Emoji" w:hAnsi="Segoe UI Emoji" w:cs="Segoe UI Emoji"/>
@@ -183,8 +1089,29 @@
         <w:t>🟢</w:t>
       </w:r>
       <w:r>
-        <w:t xml:space="preserve">{% elif ping &lt;= 150 %}Warning </w:t>
-      </w:r>
+        <w:t>{</w:t>
+      </w:r>
+      <w:proofErr w:type="gramEnd"/>
+      <w:r>
+        <w:t xml:space="preserve">% </w:t>
+      </w:r>
+      <w:proofErr w:type="spellStart"/>
+      <w:r>
+        <w:t>elif</w:t>
+      </w:r>
+      <w:proofErr w:type="spellEnd"/>
+      <w:r>
+        <w:t xml:space="preserve"> ping &lt;= 150 </w:t>
+      </w:r>
+      <w:proofErr w:type="gramStart"/>
+      <w:r>
+        <w:t>%}Warning</w:t>
+      </w:r>
+      <w:proofErr w:type="gramEnd"/>
+      <w:r>
+        <w:t xml:space="preserve"> </w:t>
+      </w:r>
+      <w:proofErr w:type="gramStart"/>
       <w:r>
         <w:rPr>
           <w:rFonts w:ascii="Segoe UI Emoji" w:hAnsi="Segoe UI Emoji" w:cs="Segoe UI Emoji"/>
@@ -192,8 +1119,21 @@
         <w:t>🟡</w:t>
       </w:r>
       <w:r>
-        <w:t xml:space="preserve">{% else %}Critical </w:t>
-      </w:r>
+        <w:t>{</w:t>
+      </w:r>
+      <w:proofErr w:type="gramEnd"/>
+      <w:r>
+        <w:t xml:space="preserve">% else </w:t>
+      </w:r>
+      <w:proofErr w:type="gramStart"/>
+      <w:r>
+        <w:t>%}Critical</w:t>
+      </w:r>
+      <w:proofErr w:type="gramEnd"/>
+      <w:r>
+        <w:t xml:space="preserve"> </w:t>
+      </w:r>
+      <w:proofErr w:type="gramStart"/>
       <w:r>
         <w:rPr>
           <w:rFonts w:ascii="Segoe UI Emoji" w:hAnsi="Segoe UI Emoji" w:cs="Segoe UI Emoji"/>
@@ -201,7 +1141,32 @@
         <w:t>🔴</w:t>
       </w:r>
       <w:r>
-        <w:t xml:space="preserve">{% endif %}){% else %}(Ping Timeout </w:t>
+        <w:t>{</w:t>
+      </w:r>
+      <w:proofErr w:type="gramEnd"/>
+      <w:r>
+        <w:t>% endif %})</w:t>
+      </w:r>
+    </w:p>
+    <w:p>
+      <w:r>
+        <w:t>{%</w:t>
+      </w:r>
+      <w:r>
+        <w:t>p</w:t>
+      </w:r>
+      <w:r>
+        <w:t xml:space="preserve"> </w:t>
+      </w:r>
+      <w:proofErr w:type="gramStart"/>
+      <w:r>
+        <w:t>else %}</w:t>
+      </w:r>
+      <w:proofErr w:type="gramEnd"/>
+    </w:p>
+    <w:p>
+      <w:r>
+        <w:t xml:space="preserve">(Ping Timeout </w:t>
       </w:r>
       <w:r>
         <w:rPr>
@@ -210,13 +1175,7 @@
         <w:t>❌</w:t>
       </w:r>
       <w:r>
-        <w:t>){%</w:t>
-      </w:r>
-      <w:r>
-        <w:t>p</w:t>
-      </w:r>
-      <w:r>
-        <w:t xml:space="preserve"> endif %}</w:t>
+        <w:t>)</w:t>
       </w:r>
     </w:p>
     <w:p>
@@ -229,12 +1188,11 @@
       <w:r>
         <w:t xml:space="preserve"> </w:t>
       </w:r>
-      <w:r>
-        <w:t>elif</w:t>
-      </w:r>
-      <w:r>
-        <w:t xml:space="preserve"> res.rule_name == "FortiGate" %}</w:t>
-      </w:r>
+      <w:proofErr w:type="gramStart"/>
+      <w:r>
+        <w:t>endif %}</w:t>
+      </w:r>
+      <w:proofErr w:type="gramEnd"/>
     </w:p>
     <w:p>
       <w:r>
@@ -244,83 +1202,362 @@
         <w:t>p</w:t>
       </w:r>
       <w:r>
-        <w:t xml:space="preserve"> if res.error %}</w:t>
-      </w:r>
+        <w:t xml:space="preserve"> </w:t>
+      </w:r>
+      <w:proofErr w:type="spellStart"/>
+      <w:r>
+        <w:t>elif</w:t>
+      </w:r>
+      <w:proofErr w:type="spellEnd"/>
+      <w:r>
+        <w:t xml:space="preserve"> </w:t>
+      </w:r>
+      <w:proofErr w:type="spellStart"/>
+      <w:proofErr w:type="gramStart"/>
+      <w:r>
+        <w:t>res.rule</w:t>
+      </w:r>
+      <w:proofErr w:type="gramEnd"/>
+      <w:r>
+        <w:t>_name</w:t>
+      </w:r>
+      <w:proofErr w:type="spellEnd"/>
+      <w:r>
+        <w:t xml:space="preserve"> == "FortiGate</w:t>
+      </w:r>
+      <w:proofErr w:type="gramStart"/>
+      <w:r>
+        <w:t>" %}</w:t>
+      </w:r>
+      <w:proofErr w:type="gramEnd"/>
     </w:p>
     <w:p>
       <w:r>
-        <w:t>Error: {{ res.error }}</w:t>
+        <w:t>{%</w:t>
+      </w:r>
+      <w:r>
+        <w:t>p</w:t>
+      </w:r>
+      <w:r>
+        <w:t xml:space="preserve"> if </w:t>
+      </w:r>
+      <w:proofErr w:type="spellStart"/>
+      <w:proofErr w:type="gramStart"/>
+      <w:r>
+        <w:t>res.error</w:t>
+      </w:r>
+      <w:proofErr w:type="spellEnd"/>
+      <w:proofErr w:type="gramEnd"/>
+      <w:r>
+        <w:t xml:space="preserve"> %}</w:t>
       </w:r>
     </w:p>
     <w:p>
       <w:r>
-        <w:t>{%</w:t>
-      </w:r>
-      <w:r>
-        <w:t>p</w:t>
-      </w:r>
-      <w:r>
-        <w:t xml:space="preserve"> else %}</w:t>
+        <w:t xml:space="preserve">Error: </w:t>
+      </w:r>
+      <w:proofErr w:type="gramStart"/>
+      <w:r>
+        <w:t xml:space="preserve">{{ </w:t>
+      </w:r>
+      <w:proofErr w:type="spellStart"/>
+      <w:r>
+        <w:t>res</w:t>
+      </w:r>
+      <w:proofErr w:type="gramEnd"/>
+      <w:r>
+        <w:t>.</w:t>
+      </w:r>
+      <w:proofErr w:type="gramStart"/>
+      <w:r>
+        <w:t>error</w:t>
+      </w:r>
+      <w:proofErr w:type="spellEnd"/>
+      <w:r>
+        <w:t xml:space="preserve"> }</w:t>
+      </w:r>
+      <w:proofErr w:type="gramEnd"/>
+      <w:r>
+        <w:t>}</w:t>
       </w:r>
     </w:p>
     <w:p>
       <w:r>
-        <w:t>{%p for intf_</w:t>
-      </w:r>
-      <w:r>
-        <w:t>key</w:t>
-      </w:r>
-      <w:r>
-        <w:t>, intf_data in res.wan_status.items() %}</w:t>
-      </w:r>
+        <w:lastRenderedPageBreak/>
+        <w:t>{%</w:t>
+      </w:r>
+      <w:r>
+        <w:t>p</w:t>
+      </w:r>
+      <w:r>
+        <w:t xml:space="preserve"> </w:t>
+      </w:r>
+      <w:proofErr w:type="gramStart"/>
+      <w:r>
+        <w:t>else %}</w:t>
+      </w:r>
+      <w:proofErr w:type="gramEnd"/>
     </w:p>
     <w:p>
       <w:r>
-        <w:t>{% set isp_map = {'WAN1': '</w:t>
-      </w:r>
-      <w:r>
-        <w:t>ISP1</w:t>
-      </w:r>
-      <w:r>
-        <w:t>', 'WAN2': '</w:t>
-      </w:r>
-      <w:r>
-        <w:t>ISP2</w:t>
-      </w:r>
-      <w:r>
-        <w:t>'} %}</w:t>
-      </w:r>
+        <w:t xml:space="preserve">{%p for </w:t>
+      </w:r>
+      <w:proofErr w:type="spellStart"/>
+      <w:r>
+        <w:t>intf_</w:t>
+      </w:r>
+      <w:r>
+        <w:t>key</w:t>
+      </w:r>
+      <w:proofErr w:type="spellEnd"/>
+      <w:r>
+        <w:t xml:space="preserve">, </w:t>
+      </w:r>
+      <w:proofErr w:type="spellStart"/>
+      <w:r>
+        <w:t>intf_data</w:t>
+      </w:r>
+      <w:proofErr w:type="spellEnd"/>
+      <w:r>
+        <w:t xml:space="preserve"> in </w:t>
+      </w:r>
+      <w:proofErr w:type="spellStart"/>
+      <w:r>
+        <w:t>res.wan_</w:t>
+      </w:r>
+      <w:proofErr w:type="gramStart"/>
+      <w:r>
+        <w:t>status.items</w:t>
+      </w:r>
+      <w:proofErr w:type="spellEnd"/>
+      <w:proofErr w:type="gramEnd"/>
+      <w:r>
+        <w:t>(</w:t>
+      </w:r>
+      <w:proofErr w:type="gramStart"/>
+      <w:r>
+        <w:t>) %}</w:t>
+      </w:r>
+      <w:proofErr w:type="gramEnd"/>
     </w:p>
     <w:p>
       <w:r>
-        <w:t>{% set isp_name = isp_map.get(intf_key, intf_key) %}</w:t>
+        <w:t xml:space="preserve">{% set </w:t>
+      </w:r>
+      <w:proofErr w:type="spellStart"/>
+      <w:r>
+        <w:t>isp_map</w:t>
+      </w:r>
+      <w:proofErr w:type="spellEnd"/>
+      <w:r>
+        <w:t xml:space="preserve"> </w:t>
+      </w:r>
+      <w:proofErr w:type="gramStart"/>
+      <w:r>
+        <w:t>= {'</w:t>
+      </w:r>
+      <w:proofErr w:type="gramEnd"/>
+      <w:r>
+        <w:t>WAN1': '</w:t>
+      </w:r>
+      <w:r>
+        <w:t>ISP1</w:t>
+      </w:r>
+      <w:r>
+        <w:t>', 'WAN2': '</w:t>
+      </w:r>
+      <w:proofErr w:type="gramStart"/>
+      <w:r>
+        <w:t>ISP2</w:t>
+      </w:r>
+      <w:r>
+        <w:t>'}</w:t>
+      </w:r>
+      <w:proofErr w:type="gramEnd"/>
+      <w:r>
+        <w:t xml:space="preserve"> %}</w:t>
       </w:r>
     </w:p>
     <w:p>
       <w:r>
-        <w:lastRenderedPageBreak/>
-        <w:t xml:space="preserve">{{ isp_name }} </w:t>
-      </w:r>
+        <w:t xml:space="preserve">{% set </w:t>
+      </w:r>
+      <w:proofErr w:type="spellStart"/>
+      <w:r>
+        <w:t>isp_name</w:t>
+      </w:r>
+      <w:proofErr w:type="spellEnd"/>
+      <w:r>
+        <w:t xml:space="preserve"> = </w:t>
+      </w:r>
+      <w:proofErr w:type="spellStart"/>
+      <w:proofErr w:type="gramStart"/>
+      <w:r>
+        <w:t>isp_map.get</w:t>
+      </w:r>
+      <w:proofErr w:type="spellEnd"/>
       <w:r>
         <w:t>(</w:t>
       </w:r>
-      <w:r>
-        <w:t>{{ intf_</w:t>
-      </w:r>
-      <w:r>
-        <w:t>key</w:t>
-      </w:r>
-      <w:r>
-        <w:t xml:space="preserve"> }}</w:t>
-      </w:r>
-      <w:r>
-        <w:t>)</w:t>
-      </w:r>
-      <w:r>
-        <w:t xml:space="preserve"> Link Status: {% if intf_data.ip %}{{ intf_data.ip }}{% endif %} ({{ intf_data.status }})</w:t>
-      </w:r>
+      <w:proofErr w:type="spellStart"/>
+      <w:proofErr w:type="gramEnd"/>
+      <w:r>
+        <w:t>intf_key</w:t>
+      </w:r>
+      <w:proofErr w:type="spellEnd"/>
+      <w:r>
+        <w:t xml:space="preserve">, </w:t>
+      </w:r>
+      <w:proofErr w:type="spellStart"/>
+      <w:r>
+        <w:t>intf_key</w:t>
+      </w:r>
+      <w:proofErr w:type="spellEnd"/>
+      <w:proofErr w:type="gramStart"/>
+      <w:r>
+        <w:t>) %}</w:t>
+      </w:r>
+      <w:proofErr w:type="gramEnd"/>
     </w:p>
     <w:p>
+      <w:proofErr w:type="gramStart"/>
+      <w:r>
+        <w:t xml:space="preserve">{{ </w:t>
+      </w:r>
+      <w:proofErr w:type="spellStart"/>
+      <w:r>
+        <w:t>isp</w:t>
+      </w:r>
+      <w:proofErr w:type="gramEnd"/>
+      <w:r>
+        <w:t>_</w:t>
+      </w:r>
+      <w:proofErr w:type="gramStart"/>
+      <w:r>
+        <w:t>name</w:t>
+      </w:r>
+      <w:proofErr w:type="spellEnd"/>
+      <w:r>
+        <w:t xml:space="preserve"> }</w:t>
+      </w:r>
+      <w:proofErr w:type="gramEnd"/>
+      <w:r>
+        <w:t xml:space="preserve">} </w:t>
+      </w:r>
+      <w:r>
+        <w:t>(</w:t>
+      </w:r>
+      <w:proofErr w:type="gramStart"/>
+      <w:r>
+        <w:t xml:space="preserve">{{ </w:t>
+      </w:r>
+      <w:proofErr w:type="spellStart"/>
+      <w:r>
+        <w:t>intf</w:t>
+      </w:r>
+      <w:proofErr w:type="gramEnd"/>
+      <w:r>
+        <w:t>_</w:t>
+      </w:r>
+      <w:proofErr w:type="gramStart"/>
+      <w:r>
+        <w:t>key</w:t>
+      </w:r>
+      <w:proofErr w:type="spellEnd"/>
+      <w:r>
+        <w:t xml:space="preserve"> }</w:t>
+      </w:r>
+      <w:proofErr w:type="gramEnd"/>
+      <w:r>
+        <w:t>}</w:t>
+      </w:r>
+      <w:r>
+        <w:t>)</w:t>
+      </w:r>
+      <w:r>
+        <w:t xml:space="preserve"> Link </w:t>
+      </w:r>
+      <w:proofErr w:type="gramStart"/>
+      <w:r>
+        <w:t>Status: {</w:t>
+      </w:r>
+      <w:proofErr w:type="gramEnd"/>
+      <w:r>
+        <w:t xml:space="preserve">% if </w:t>
+      </w:r>
+      <w:proofErr w:type="spellStart"/>
+      <w:r>
+        <w:t>intf_</w:t>
+      </w:r>
+      <w:proofErr w:type="gramStart"/>
+      <w:r>
+        <w:t>data.ip</w:t>
+      </w:r>
+      <w:proofErr w:type="spellEnd"/>
+      <w:proofErr w:type="gramEnd"/>
+      <w:r>
+        <w:t xml:space="preserve"> </w:t>
+      </w:r>
+      <w:proofErr w:type="gramStart"/>
+      <w:r>
+        <w:t xml:space="preserve">%}{{ </w:t>
+      </w:r>
+      <w:proofErr w:type="spellStart"/>
+      <w:r>
+        <w:t>intf</w:t>
+      </w:r>
+      <w:proofErr w:type="gramEnd"/>
+      <w:r>
+        <w:t>_</w:t>
+      </w:r>
+      <w:proofErr w:type="gramStart"/>
+      <w:r>
+        <w:t>data.ip</w:t>
+      </w:r>
+      <w:proofErr w:type="spellEnd"/>
+      <w:proofErr w:type="gramEnd"/>
+      <w:r>
+        <w:t xml:space="preserve"> </w:t>
+      </w:r>
+      <w:proofErr w:type="gramStart"/>
+      <w:r>
+        <w:t>}}{</w:t>
+      </w:r>
+      <w:proofErr w:type="gramEnd"/>
+      <w:r>
+        <w:t xml:space="preserve">% </w:t>
+      </w:r>
+      <w:proofErr w:type="gramStart"/>
+      <w:r>
+        <w:t>endif %}</w:t>
+      </w:r>
+      <w:proofErr w:type="gramEnd"/>
+      <w:r>
+        <w:t xml:space="preserve"> (</w:t>
+      </w:r>
+      <w:proofErr w:type="gramStart"/>
+      <w:r>
+        <w:t xml:space="preserve">{{ </w:t>
+      </w:r>
+      <w:proofErr w:type="spellStart"/>
+      <w:r>
+        <w:t>intf</w:t>
+      </w:r>
+      <w:proofErr w:type="gramEnd"/>
+      <w:r>
+        <w:t>_</w:t>
+      </w:r>
+      <w:proofErr w:type="gramStart"/>
+      <w:r>
+        <w:t>data.status</w:t>
+      </w:r>
+      <w:proofErr w:type="spellEnd"/>
+      <w:proofErr w:type="gramEnd"/>
+      <w:r>
+        <w:t xml:space="preserve"> }})</w:t>
+      </w:r>
+    </w:p>
+    <w:p>
       <w:r>
         <w:t>{%</w:t>
       </w:r>
@@ -328,26 +1565,115 @@
         <w:t>p</w:t>
       </w:r>
       <w:r>
-        <w:t xml:space="preserve"> if intf_data.</w:t>
+        <w:t xml:space="preserve"> if </w:t>
+      </w:r>
+      <w:proofErr w:type="spellStart"/>
+      <w:r>
+        <w:t>intf_</w:t>
+      </w:r>
+      <w:proofErr w:type="gramStart"/>
+      <w:r>
+        <w:t>data.</w:t>
       </w:r>
       <w:r>
         <w:t>ping</w:t>
       </w:r>
-      <w:r>
-        <w:t>_interface</w:t>
-      </w:r>
+      <w:proofErr w:type="gramEnd"/>
+      <w:r>
+        <w:t>_</w:t>
+      </w:r>
+      <w:proofErr w:type="gramStart"/>
+      <w:r>
+        <w:t>interface</w:t>
+      </w:r>
+      <w:proofErr w:type="spellEnd"/>
       <w:r>
         <w:t xml:space="preserve"> %}</w:t>
       </w:r>
-      <w:r>
-        <w:t>{%</w:t>
-      </w:r>
-      <w:r>
-        <w:t>p</w:t>
-      </w:r>
-      <w:r>
-        <w:t xml:space="preserve"> if intf_data.latency %}{% set ping = intf_data.latency|int %}Gateway Latency ({{ intf_data.gw }}): {{ ping }}ms ({% if ping &lt;= 50 %}Ok </w:t>
-      </w:r>
+      <w:proofErr w:type="gramEnd"/>
+    </w:p>
+    <w:p>
+      <w:r>
+        <w:t xml:space="preserve">{% if </w:t>
+      </w:r>
+      <w:proofErr w:type="spellStart"/>
+      <w:r>
+        <w:t>intf_</w:t>
+      </w:r>
+      <w:proofErr w:type="gramStart"/>
+      <w:r>
+        <w:t>data.latency</w:t>
+      </w:r>
+      <w:proofErr w:type="spellEnd"/>
+      <w:proofErr w:type="gramEnd"/>
+      <w:r>
+        <w:t xml:space="preserve"> </w:t>
+      </w:r>
+      <w:proofErr w:type="gramStart"/>
+      <w:r>
+        <w:t>%}{</w:t>
+      </w:r>
+      <w:proofErr w:type="gramEnd"/>
+      <w:r>
+        <w:t xml:space="preserve">% set ping = </w:t>
+      </w:r>
+      <w:proofErr w:type="spellStart"/>
+      <w:r>
+        <w:t>intf_</w:t>
+      </w:r>
+      <w:proofErr w:type="gramStart"/>
+      <w:r>
+        <w:t>data.latency</w:t>
+      </w:r>
+      <w:proofErr w:type="gramEnd"/>
+      <w:r>
+        <w:t>|int</w:t>
+      </w:r>
+      <w:proofErr w:type="spellEnd"/>
+      <w:r>
+        <w:t xml:space="preserve"> </w:t>
+      </w:r>
+      <w:proofErr w:type="gramStart"/>
+      <w:r>
+        <w:t>%}Gateway</w:t>
+      </w:r>
+      <w:proofErr w:type="gramEnd"/>
+      <w:r>
+        <w:t xml:space="preserve"> Latency (</w:t>
+      </w:r>
+      <w:proofErr w:type="gramStart"/>
+      <w:r>
+        <w:t>{{ intf_data.gw</w:t>
+      </w:r>
+      <w:proofErr w:type="gramEnd"/>
+      <w:r>
+        <w:t xml:space="preserve"> }}): </w:t>
+      </w:r>
+      <w:proofErr w:type="gramStart"/>
+      <w:r>
+        <w:t>{{ ping</w:t>
+      </w:r>
+      <w:proofErr w:type="gramEnd"/>
+      <w:r>
+        <w:t xml:space="preserve"> }}</w:t>
+      </w:r>
+      <w:proofErr w:type="spellStart"/>
+      <w:r>
+        <w:t>ms</w:t>
+      </w:r>
+      <w:proofErr w:type="spellEnd"/>
+      <w:r>
+        <w:t xml:space="preserve"> ({% if ping &lt;= 50 </w:t>
+      </w:r>
+      <w:proofErr w:type="gramStart"/>
+      <w:r>
+        <w:t>%}Ok</w:t>
+      </w:r>
+      <w:proofErr w:type="gramEnd"/>
+      <w:r>
+        <w:t xml:space="preserve"> </w:t>
+      </w:r>
+      <w:proofErr w:type="gramStart"/>
       <w:r>
         <w:rPr>
           <w:rFonts w:ascii="Segoe UI Emoji" w:hAnsi="Segoe UI Emoji" w:cs="Segoe UI Emoji"/>
@@ -356,8 +1682,29 @@
         <w:t>🟢</w:t>
       </w:r>
       <w:r>
-        <w:t xml:space="preserve">{% elif ping &lt;= 150 %}Warning </w:t>
-      </w:r>
+        <w:t>{</w:t>
+      </w:r>
+      <w:proofErr w:type="gramEnd"/>
+      <w:r>
+        <w:t xml:space="preserve">% </w:t>
+      </w:r>
+      <w:proofErr w:type="spellStart"/>
+      <w:r>
+        <w:t>elif</w:t>
+      </w:r>
+      <w:proofErr w:type="spellEnd"/>
+      <w:r>
+        <w:t xml:space="preserve"> ping &lt;= 150 </w:t>
+      </w:r>
+      <w:proofErr w:type="gramStart"/>
+      <w:r>
+        <w:t>%}Warning</w:t>
+      </w:r>
+      <w:proofErr w:type="gramEnd"/>
+      <w:r>
+        <w:t xml:space="preserve"> </w:t>
+      </w:r>
+      <w:proofErr w:type="gramStart"/>
       <w:r>
         <w:rPr>
           <w:rFonts w:ascii="Segoe UI Emoji" w:hAnsi="Segoe UI Emoji" w:cs="Segoe UI Emoji"/>
@@ -366,8 +1713,21 @@
         <w:t>🟡</w:t>
       </w:r>
       <w:r>
-        <w:t xml:space="preserve">{% else %}Critical </w:t>
-      </w:r>
+        <w:t>{</w:t>
+      </w:r>
+      <w:proofErr w:type="gramEnd"/>
+      <w:r>
+        <w:t xml:space="preserve">% else </w:t>
+      </w:r>
+      <w:proofErr w:type="gramStart"/>
+      <w:r>
+        <w:t>%}Critical</w:t>
+      </w:r>
+      <w:proofErr w:type="gramEnd"/>
+      <w:r>
+        <w:t xml:space="preserve"> </w:t>
+      </w:r>
+      <w:proofErr w:type="gramStart"/>
       <w:r>
         <w:rPr>
           <w:rFonts w:ascii="Segoe UI Emoji" w:hAnsi="Segoe UI Emoji" w:cs="Segoe UI Emoji"/>
@@ -376,8 +1736,29 @@
         <w:t>🔴</w:t>
       </w:r>
       <w:r>
-        <w:t xml:space="preserve">{% endif %}){% else %}(Ping Timeout </w:t>
-      </w:r>
+        <w:t>{</w:t>
+      </w:r>
+      <w:proofErr w:type="gramEnd"/>
+      <w:r>
+        <w:t>% endif %</w:t>
+      </w:r>
+      <w:proofErr w:type="gramStart"/>
+      <w:r>
+        <w:t>}){</w:t>
+      </w:r>
+      <w:proofErr w:type="gramEnd"/>
+      <w:r>
+        <w:t xml:space="preserve">% else </w:t>
+      </w:r>
+      <w:proofErr w:type="gramStart"/>
+      <w:r>
+        <w:t>%}(</w:t>
+      </w:r>
+      <w:proofErr w:type="gramEnd"/>
+      <w:r>
+        <w:t xml:space="preserve">Ping Timeout </w:t>
+      </w:r>
+      <w:proofErr w:type="gramStart"/>
       <w:r>
         <w:rPr>
           <w:rFonts w:ascii="Segoe UI Emoji" w:hAnsi="Segoe UI Emoji" w:cs="Segoe UI Emoji"/>
@@ -385,56 +1766,65 @@
         <w:t>❌</w:t>
       </w:r>
       <w:r>
-        <w:t>){%</w:t>
-      </w:r>
-      <w:r>
-        <w:t>p</w:t>
-      </w:r>
-      <w:r>
-        <w:t xml:space="preserve"> endif %}</w:t>
-      </w:r>
-      <w:r>
-        <w:t>{%</w:t>
-      </w:r>
-      <w:r>
-        <w:t>p</w:t>
-      </w:r>
-      <w:r>
-        <w:t xml:space="preserve"> endif %}</w:t>
+        <w:t>){</w:t>
+      </w:r>
+      <w:proofErr w:type="gramEnd"/>
+      <w:r>
+        <w:t>% endif %}</w:t>
       </w:r>
     </w:p>
     <w:p>
       <w:r>
-        <w:t>{%p endfor %}</w:t>
+        <w:t>{%</w:t>
+      </w:r>
+      <w:r>
+        <w:t>p</w:t>
       </w:r>
       <w:r>
         <w:t xml:space="preserve"> </w:t>
       </w:r>
-      <w:r>
-        <w:t>{# CLOSES: for intf_key, intf_data #}</w:t>
-      </w:r>
-      <w:r>
-        <w:t xml:space="preserve"> </w:t>
-      </w:r>
+      <w:proofErr w:type="gramStart"/>
+      <w:r>
+        <w:t>endif %}</w:t>
+      </w:r>
+      <w:proofErr w:type="gramEnd"/>
     </w:p>
     <w:p>
       <w:r>
-        <w:t>{%</w:t>
-      </w:r>
-      <w:r>
-        <w:t>p</w:t>
-      </w:r>
-      <w:r>
-        <w:t xml:space="preserve"> endif %</w:t>
-      </w:r>
-      <w:r>
-        <w:t>}</w:t>
+        <w:t xml:space="preserve">{%p </w:t>
+      </w:r>
+      <w:proofErr w:type="spellStart"/>
+      <w:r>
+        <w:t>endfor</w:t>
+      </w:r>
+      <w:proofErr w:type="spellEnd"/>
+      <w:r>
+        <w:t xml:space="preserve"> %}</w:t>
       </w:r>
       <w:r>
         <w:t xml:space="preserve"> </w:t>
       </w:r>
       <w:r>
-        <w:t>{# CLOSES: if res.error #}</w:t>
+        <w:t xml:space="preserve">{# CLOSES: for </w:t>
+      </w:r>
+      <w:proofErr w:type="spellStart"/>
+      <w:r>
+        <w:t>intf_key</w:t>
+      </w:r>
+      <w:proofErr w:type="spellEnd"/>
+      <w:r>
+        <w:t xml:space="preserve">, </w:t>
+      </w:r>
+      <w:proofErr w:type="spellStart"/>
+      <w:r>
+        <w:t>intf_data</w:t>
+      </w:r>
+      <w:proofErr w:type="spellEnd"/>
+      <w:r>
+        <w:t xml:space="preserve"> #}</w:t>
+      </w:r>
+      <w:r>
+        <w:t xml:space="preserve"> </w:t>
       </w:r>
     </w:p>
     <w:p>
@@ -445,55 +1835,170 @@
         <w:t>p</w:t>
       </w:r>
       <w:r>
-        <w:t xml:space="preserve"> endif %}</w:t>
-      </w:r>
-      <w:r>
         <w:t xml:space="preserve"> </w:t>
       </w:r>
-      <w:r>
-        <w:t>{# CLOSES: if res.rule_name in ['Switch', 'Access Point'] #}</w:t>
+      <w:proofErr w:type="gramStart"/>
+      <w:r>
+        <w:t>endif %</w:t>
+      </w:r>
+      <w:r>
+        <w:t>}</w:t>
+      </w:r>
+      <w:r>
+        <w:t xml:space="preserve"> </w:t>
+      </w:r>
+      <w:r>
+        <w:t>{#</w:t>
+      </w:r>
+      <w:proofErr w:type="gramEnd"/>
+      <w:r>
+        <w:t xml:space="preserve"> CLOSES: if </w:t>
+      </w:r>
+      <w:proofErr w:type="spellStart"/>
+      <w:proofErr w:type="gramStart"/>
+      <w:r>
+        <w:t>res.error</w:t>
+      </w:r>
+      <w:proofErr w:type="spellEnd"/>
+      <w:proofErr w:type="gramEnd"/>
+      <w:r>
+        <w:t xml:space="preserve"> #}</w:t>
       </w:r>
     </w:p>
     <w:p>
       <w:r>
-        <w:t>{%p if res.screenshot %}</w:t>
-      </w:r>
+        <w:t>{%</w:t>
+      </w:r>
+      <w:r>
+        <w:t>p</w:t>
+      </w:r>
+      <w:r>
+        <w:t xml:space="preserve"> </w:t>
+      </w:r>
+      <w:proofErr w:type="gramStart"/>
+      <w:r>
+        <w:t>endif %}</w:t>
+      </w:r>
+      <w:r>
+        <w:t xml:space="preserve"> </w:t>
+      </w:r>
+      <w:r>
+        <w:t>{#</w:t>
+      </w:r>
+      <w:proofErr w:type="gramEnd"/>
+      <w:r>
+        <w:t xml:space="preserve"> CLOSES: if </w:t>
+      </w:r>
+      <w:proofErr w:type="spellStart"/>
+      <w:proofErr w:type="gramStart"/>
+      <w:r>
+        <w:t>res.rule</w:t>
+      </w:r>
+      <w:proofErr w:type="gramEnd"/>
+      <w:r>
+        <w:t>_name</w:t>
+      </w:r>
+      <w:proofErr w:type="spellEnd"/>
+      <w:r>
+        <w:t xml:space="preserve"> in ['Switch', 'Access Point</w:t>
+      </w:r>
+      <w:proofErr w:type="gramStart"/>
+      <w:r>
+        <w:t>'] #}</w:t>
+      </w:r>
+      <w:proofErr w:type="gramEnd"/>
     </w:p>
     <w:p>
       <w:r>
-        <w:t>Evidence (Screenshot):</w:t>
+        <w:t xml:space="preserve">{%p if </w:t>
+      </w:r>
+      <w:proofErr w:type="spellStart"/>
+      <w:proofErr w:type="gramStart"/>
+      <w:r>
+        <w:t>res.screenshot</w:t>
+      </w:r>
+      <w:proofErr w:type="spellEnd"/>
+      <w:proofErr w:type="gramEnd"/>
+      <w:r>
+        <w:t xml:space="preserve"> %}</w:t>
       </w:r>
     </w:p>
     <w:p>
       <w:r>
-        <w:t>{{ res.screenshot }}</w:t>
+        <w:t>Evidence (Screenshot):</w:t>
       </w:r>
     </w:p>
     <w:p>
-      <w:r>
-        <w:t>{%p else %}</w:t>
+      <w:proofErr w:type="gramStart"/>
+      <w:r>
+        <w:t xml:space="preserve">{{ </w:t>
+      </w:r>
+      <w:proofErr w:type="spellStart"/>
+      <w:r>
+        <w:t>res</w:t>
+      </w:r>
+      <w:proofErr w:type="gramEnd"/>
+      <w:r>
+        <w:t>.</w:t>
+      </w:r>
+      <w:proofErr w:type="gramStart"/>
+      <w:r>
+        <w:t>screenshot</w:t>
+      </w:r>
+      <w:proofErr w:type="spellEnd"/>
+      <w:r>
+        <w:t xml:space="preserve"> }</w:t>
+      </w:r>
+      <w:proofErr w:type="gramEnd"/>
+      <w:r>
+        <w:t>}</w:t>
       </w:r>
     </w:p>
     <w:p>
       <w:r>
-        <w:t>No evidence image available.</w:t>
-      </w:r>
+        <w:t xml:space="preserve">{%p </w:t>
+      </w:r>
+      <w:proofErr w:type="gramStart"/>
+      <w:r>
+        <w:t>else %}</w:t>
+      </w:r>
+      <w:proofErr w:type="gramEnd"/>
     </w:p>
     <w:p>
       <w:r>
-        <w:t>{%p endif %}</w:t>
+        <w:t>No evidence image available.</w:t>
       </w:r>
     </w:p>
     <w:p>
       <w:r>
+        <w:t xml:space="preserve">{%p </w:t>
+      </w:r>
+      <w:proofErr w:type="gramStart"/>
+      <w:r>
+        <w:t>endif %}</w:t>
+      </w:r>
+      <w:proofErr w:type="gramEnd"/>
+    </w:p>
+    <w:p>
+      <w:r>
         <w:t>{%</w:t>
       </w:r>
       <w:r>
         <w:t>p</w:t>
       </w:r>
       <w:r>
-        <w:t xml:space="preserve"> endfor %}</w:t>
-      </w:r>
+        <w:t xml:space="preserve"> </w:t>
+      </w:r>
+      <w:proofErr w:type="spellStart"/>
+      <w:proofErr w:type="gramStart"/>
+      <w:r>
+        <w:t>endfor</w:t>
+      </w:r>
+      <w:proofErr w:type="spellEnd"/>
+      <w:r>
+        <w:t xml:space="preserve"> %}</w:t>
+      </w:r>
+      <w:proofErr w:type="gramEnd"/>
     </w:p>
     <w:sectPr>
       <w:pgSz w:w="12240" w:h="15840"/>

</xml_diff>

<commit_message>
Feat: update templates to hide DOWN interfaces without IPs and improve spacing
</commit_message>
<xml_diff>
--- a/template_en.example.docx
+++ b/template_en.example.docx
@@ -64,93 +64,7 @@
         <w:rPr>
           <w:rFonts w:ascii="Cambria" w:eastAsia="MS Mincho" w:hAnsi="Cambria" w:cs="Times New Roman"/>
         </w:rPr>
-        <w:t xml:space="preserve"> Ok (Ping ≤ 50ms): </w:t>
-      </w:r>
-      <w:proofErr w:type="gramStart"/>
-      <w:r>
-        <w:rPr>
-          <w:rFonts w:ascii="Cambria" w:eastAsia="MS Mincho" w:hAnsi="Cambria" w:cs="Times New Roman"/>
-        </w:rPr>
-        <w:t>{{ results</w:t>
-      </w:r>
-      <w:proofErr w:type="gramEnd"/>
-      <w:r>
-        <w:rPr>
-          <w:rFonts w:ascii="Cambria" w:eastAsia="MS Mincho" w:hAnsi="Cambria" w:cs="Times New Roman"/>
-        </w:rPr>
-        <w:t xml:space="preserve"> | </w:t>
-      </w:r>
-      <w:proofErr w:type="spellStart"/>
-      <w:proofErr w:type="gramStart"/>
-      <w:r>
-        <w:rPr>
-          <w:rFonts w:ascii="Cambria" w:eastAsia="MS Mincho" w:hAnsi="Cambria" w:cs="Times New Roman"/>
-        </w:rPr>
-        <w:t>rejectattr</w:t>
-      </w:r>
-      <w:proofErr w:type="spellEnd"/>
-      <w:r>
-        <w:rPr>
-          <w:rFonts w:ascii="Cambria" w:eastAsia="MS Mincho" w:hAnsi="Cambria" w:cs="Times New Roman"/>
-        </w:rPr>
-        <w:t>(</w:t>
-      </w:r>
-      <w:proofErr w:type="gramEnd"/>
-      <w:r>
-        <w:rPr>
-          <w:rFonts w:ascii="Cambria" w:eastAsia="MS Mincho" w:hAnsi="Cambria" w:cs="Times New Roman"/>
-        </w:rPr>
-        <w:t>'latency', '</w:t>
-      </w:r>
-      <w:proofErr w:type="spellStart"/>
-      <w:r>
-        <w:rPr>
-          <w:rFonts w:ascii="Cambria" w:eastAsia="MS Mincho" w:hAnsi="Cambria" w:cs="Times New Roman"/>
-        </w:rPr>
-        <w:t>equalto</w:t>
-      </w:r>
-      <w:proofErr w:type="spellEnd"/>
-      <w:r>
-        <w:rPr>
-          <w:rFonts w:ascii="Cambria" w:eastAsia="MS Mincho" w:hAnsi="Cambria" w:cs="Times New Roman"/>
-        </w:rPr>
-        <w:t xml:space="preserve">', '') | </w:t>
-      </w:r>
-      <w:proofErr w:type="spellStart"/>
-      <w:proofErr w:type="gramStart"/>
-      <w:r>
-        <w:rPr>
-          <w:rFonts w:ascii="Cambria" w:eastAsia="MS Mincho" w:hAnsi="Cambria" w:cs="Times New Roman"/>
-        </w:rPr>
-        <w:t>selectattr</w:t>
-      </w:r>
-      <w:proofErr w:type="spellEnd"/>
-      <w:r>
-        <w:rPr>
-          <w:rFonts w:ascii="Cambria" w:eastAsia="MS Mincho" w:hAnsi="Cambria" w:cs="Times New Roman"/>
-        </w:rPr>
-        <w:t>(</w:t>
-      </w:r>
-      <w:proofErr w:type="gramEnd"/>
-      <w:r>
-        <w:rPr>
-          <w:rFonts w:ascii="Cambria" w:eastAsia="MS Mincho" w:hAnsi="Cambria" w:cs="Times New Roman"/>
-        </w:rPr>
-        <w:t xml:space="preserve">'latency', 'le', 50) | list | </w:t>
-      </w:r>
-      <w:proofErr w:type="gramStart"/>
-      <w:r>
-        <w:rPr>
-          <w:rFonts w:ascii="Cambria" w:eastAsia="MS Mincho" w:hAnsi="Cambria" w:cs="Times New Roman"/>
-        </w:rPr>
-        <w:t>length }</w:t>
-      </w:r>
-      <w:proofErr w:type="gramEnd"/>
-      <w:r>
-        <w:rPr>
-          <w:rFonts w:ascii="Cambria" w:eastAsia="MS Mincho" w:hAnsi="Cambria" w:cs="Times New Roman"/>
-        </w:rPr>
-        <w:t>}</w:t>
+        <w:t xml:space="preserve"> Ok (Ping ≤ 50ms): {{ results | rejectattr('latency', 'equalto', '') | selectattr('latency', 'le', 50) | list | length }}</w:t>
       </w:r>
     </w:p>
     <w:p>
@@ -169,293 +83,7 @@
         <w:rPr>
           <w:rFonts w:ascii="Cambria" w:eastAsia="MS Mincho" w:hAnsi="Cambria" w:cs="Times New Roman"/>
         </w:rPr>
-        <w:t xml:space="preserve"> Warning (Ping 50ms ≤ 150ms): </w:t>
-      </w:r>
-      <w:proofErr w:type="gramStart"/>
-      <w:r>
-        <w:rPr>
-          <w:rFonts w:ascii="Cambria" w:eastAsia="MS Mincho" w:hAnsi="Cambria" w:cs="Times New Roman"/>
-        </w:rPr>
-        <w:t>{{ results</w:t>
-      </w:r>
-      <w:proofErr w:type="gramEnd"/>
-      <w:r>
-        <w:rPr>
-          <w:rFonts w:ascii="Cambria" w:eastAsia="MS Mincho" w:hAnsi="Cambria" w:cs="Times New Roman"/>
-        </w:rPr>
-        <w:t xml:space="preserve"> | </w:t>
-      </w:r>
-      <w:proofErr w:type="spellStart"/>
-      <w:proofErr w:type="gramStart"/>
-      <w:r>
-        <w:rPr>
-          <w:rFonts w:ascii="Cambria" w:eastAsia="MS Mincho" w:hAnsi="Cambria" w:cs="Times New Roman"/>
-        </w:rPr>
-        <w:t>rejectattr</w:t>
-      </w:r>
-      <w:proofErr w:type="spellEnd"/>
-      <w:r>
-        <w:rPr>
-          <w:rFonts w:ascii="Cambria" w:eastAsia="MS Mincho" w:hAnsi="Cambria" w:cs="Times New Roman"/>
-        </w:rPr>
-        <w:t>(</w:t>
-      </w:r>
-      <w:proofErr w:type="gramEnd"/>
-      <w:r>
-        <w:rPr>
-          <w:rFonts w:ascii="Cambria" w:eastAsia="MS Mincho" w:hAnsi="Cambria" w:cs="Times New Roman"/>
-        </w:rPr>
-        <w:t>'latency', '</w:t>
-      </w:r>
-      <w:proofErr w:type="spellStart"/>
-      <w:r>
-        <w:rPr>
-          <w:rFonts w:ascii="Cambria" w:eastAsia="MS Mincho" w:hAnsi="Cambria" w:cs="Times New Roman"/>
-        </w:rPr>
-        <w:t>equalto</w:t>
-      </w:r>
-      <w:proofErr w:type="spellEnd"/>
-      <w:r>
-        <w:rPr>
-          <w:rFonts w:ascii="Cambria" w:eastAsia="MS Mincho" w:hAnsi="Cambria" w:cs="Times New Roman"/>
-        </w:rPr>
-        <w:t xml:space="preserve">', '') | </w:t>
-      </w:r>
-      <w:proofErr w:type="spellStart"/>
-      <w:proofErr w:type="gramStart"/>
-      <w:r>
-        <w:rPr>
-          <w:rFonts w:ascii="Cambria" w:eastAsia="MS Mincho" w:hAnsi="Cambria" w:cs="Times New Roman"/>
-        </w:rPr>
-        <w:t>selectattr</w:t>
-      </w:r>
-      <w:proofErr w:type="spellEnd"/>
-      <w:r>
-        <w:rPr>
-          <w:rFonts w:ascii="Cambria" w:eastAsia="MS Mincho" w:hAnsi="Cambria" w:cs="Times New Roman"/>
-        </w:rPr>
-        <w:t>(</w:t>
-      </w:r>
-      <w:proofErr w:type="gramEnd"/>
-      <w:r>
-        <w:rPr>
-          <w:rFonts w:ascii="Cambria" w:eastAsia="MS Mincho" w:hAnsi="Cambria" w:cs="Times New Roman"/>
-        </w:rPr>
-        <w:t>'latency', '</w:t>
-      </w:r>
-      <w:proofErr w:type="spellStart"/>
-      <w:r>
-        <w:rPr>
-          <w:rFonts w:ascii="Cambria" w:eastAsia="MS Mincho" w:hAnsi="Cambria" w:cs="Times New Roman"/>
-        </w:rPr>
-        <w:t>gt</w:t>
-      </w:r>
-      <w:proofErr w:type="spellEnd"/>
-      <w:r>
-        <w:rPr>
-          <w:rFonts w:ascii="Cambria" w:eastAsia="MS Mincho" w:hAnsi="Cambria" w:cs="Times New Roman"/>
-        </w:rPr>
-        <w:t xml:space="preserve">', 50) | </w:t>
-      </w:r>
-      <w:proofErr w:type="spellStart"/>
-      <w:proofErr w:type="gramStart"/>
-      <w:r>
-        <w:rPr>
-          <w:rFonts w:ascii="Cambria" w:eastAsia="MS Mincho" w:hAnsi="Cambria" w:cs="Times New Roman"/>
-        </w:rPr>
-        <w:t>selectattr</w:t>
-      </w:r>
-      <w:proofErr w:type="spellEnd"/>
-      <w:r>
-        <w:rPr>
-          <w:rFonts w:ascii="Cambria" w:eastAsia="MS Mincho" w:hAnsi="Cambria" w:cs="Times New Roman"/>
-        </w:rPr>
-        <w:t>(</w:t>
-      </w:r>
-      <w:proofErr w:type="gramEnd"/>
-      <w:r>
-        <w:rPr>
-          <w:rFonts w:ascii="Cambria" w:eastAsia="MS Mincho" w:hAnsi="Cambria" w:cs="Times New Roman"/>
-        </w:rPr>
-        <w:t xml:space="preserve">'latency', 'le', 150) | list | </w:t>
-      </w:r>
-      <w:proofErr w:type="gramStart"/>
-      <w:r>
-        <w:rPr>
-          <w:rFonts w:ascii="Cambria" w:eastAsia="MS Mincho" w:hAnsi="Cambria" w:cs="Times New Roman"/>
-        </w:rPr>
-        <w:t>length }}{</w:t>
-      </w:r>
-      <w:proofErr w:type="gramEnd"/>
-      <w:r>
-        <w:rPr>
-          <w:rFonts w:ascii="Cambria" w:eastAsia="MS Mincho" w:hAnsi="Cambria" w:cs="Times New Roman"/>
-        </w:rPr>
-        <w:t xml:space="preserve">% set warns = results | </w:t>
-      </w:r>
-      <w:proofErr w:type="spellStart"/>
-      <w:proofErr w:type="gramStart"/>
-      <w:r>
-        <w:rPr>
-          <w:rFonts w:ascii="Cambria" w:eastAsia="MS Mincho" w:hAnsi="Cambria" w:cs="Times New Roman"/>
-        </w:rPr>
-        <w:t>rejectattr</w:t>
-      </w:r>
-      <w:proofErr w:type="spellEnd"/>
-      <w:r>
-        <w:rPr>
-          <w:rFonts w:ascii="Cambria" w:eastAsia="MS Mincho" w:hAnsi="Cambria" w:cs="Times New Roman"/>
-        </w:rPr>
-        <w:t>(</w:t>
-      </w:r>
-      <w:proofErr w:type="gramEnd"/>
-      <w:r>
-        <w:rPr>
-          <w:rFonts w:ascii="Cambria" w:eastAsia="MS Mincho" w:hAnsi="Cambria" w:cs="Times New Roman"/>
-        </w:rPr>
-        <w:t>'latency', '</w:t>
-      </w:r>
-      <w:proofErr w:type="spellStart"/>
-      <w:r>
-        <w:rPr>
-          <w:rFonts w:ascii="Cambria" w:eastAsia="MS Mincho" w:hAnsi="Cambria" w:cs="Times New Roman"/>
-        </w:rPr>
-        <w:t>equalto</w:t>
-      </w:r>
-      <w:proofErr w:type="spellEnd"/>
-      <w:r>
-        <w:rPr>
-          <w:rFonts w:ascii="Cambria" w:eastAsia="MS Mincho" w:hAnsi="Cambria" w:cs="Times New Roman"/>
-        </w:rPr>
-        <w:t xml:space="preserve">', '') | </w:t>
-      </w:r>
-      <w:proofErr w:type="spellStart"/>
-      <w:proofErr w:type="gramStart"/>
-      <w:r>
-        <w:rPr>
-          <w:rFonts w:ascii="Cambria" w:eastAsia="MS Mincho" w:hAnsi="Cambria" w:cs="Times New Roman"/>
-        </w:rPr>
-        <w:t>selectattr</w:t>
-      </w:r>
-      <w:proofErr w:type="spellEnd"/>
-      <w:r>
-        <w:rPr>
-          <w:rFonts w:ascii="Cambria" w:eastAsia="MS Mincho" w:hAnsi="Cambria" w:cs="Times New Roman"/>
-        </w:rPr>
-        <w:t>(</w:t>
-      </w:r>
-      <w:proofErr w:type="gramEnd"/>
-      <w:r>
-        <w:rPr>
-          <w:rFonts w:ascii="Cambria" w:eastAsia="MS Mincho" w:hAnsi="Cambria" w:cs="Times New Roman"/>
-        </w:rPr>
-        <w:t>'latency', '</w:t>
-      </w:r>
-      <w:proofErr w:type="spellStart"/>
-      <w:r>
-        <w:rPr>
-          <w:rFonts w:ascii="Cambria" w:eastAsia="MS Mincho" w:hAnsi="Cambria" w:cs="Times New Roman"/>
-        </w:rPr>
-        <w:t>gt</w:t>
-      </w:r>
-      <w:proofErr w:type="spellEnd"/>
-      <w:r>
-        <w:rPr>
-          <w:rFonts w:ascii="Cambria" w:eastAsia="MS Mincho" w:hAnsi="Cambria" w:cs="Times New Roman"/>
-        </w:rPr>
-        <w:t xml:space="preserve">', 50) | </w:t>
-      </w:r>
-      <w:proofErr w:type="spellStart"/>
-      <w:proofErr w:type="gramStart"/>
-      <w:r>
-        <w:rPr>
-          <w:rFonts w:ascii="Cambria" w:eastAsia="MS Mincho" w:hAnsi="Cambria" w:cs="Times New Roman"/>
-        </w:rPr>
-        <w:t>selectattr</w:t>
-      </w:r>
-      <w:proofErr w:type="spellEnd"/>
-      <w:r>
-        <w:rPr>
-          <w:rFonts w:ascii="Cambria" w:eastAsia="MS Mincho" w:hAnsi="Cambria" w:cs="Times New Roman"/>
-        </w:rPr>
-        <w:t>(</w:t>
-      </w:r>
-      <w:proofErr w:type="gramEnd"/>
-      <w:r>
-        <w:rPr>
-          <w:rFonts w:ascii="Cambria" w:eastAsia="MS Mincho" w:hAnsi="Cambria" w:cs="Times New Roman"/>
-        </w:rPr>
-        <w:t xml:space="preserve">'latency', 'le', 150) | map(attribute='host') | list </w:t>
-      </w:r>
-      <w:proofErr w:type="gramStart"/>
-      <w:r>
-        <w:rPr>
-          <w:rFonts w:ascii="Cambria" w:eastAsia="MS Mincho" w:hAnsi="Cambria" w:cs="Times New Roman"/>
-        </w:rPr>
-        <w:t>%}{</w:t>
-      </w:r>
-      <w:proofErr w:type="gramEnd"/>
-      <w:r>
-        <w:rPr>
-          <w:rFonts w:ascii="Cambria" w:eastAsia="MS Mincho" w:hAnsi="Cambria" w:cs="Times New Roman"/>
-        </w:rPr>
-        <w:t xml:space="preserve">% if </w:t>
-      </w:r>
-      <w:proofErr w:type="spellStart"/>
-      <w:r>
-        <w:rPr>
-          <w:rFonts w:ascii="Cambria" w:eastAsia="MS Mincho" w:hAnsi="Cambria" w:cs="Times New Roman"/>
-        </w:rPr>
-        <w:t>warns|length</w:t>
-      </w:r>
-      <w:proofErr w:type="spellEnd"/>
-      <w:r>
-        <w:rPr>
-          <w:rFonts w:ascii="Cambria" w:eastAsia="MS Mincho" w:hAnsi="Cambria" w:cs="Times New Roman"/>
-        </w:rPr>
-        <w:t xml:space="preserve"> &gt; 0 %} (</w:t>
-      </w:r>
-      <w:proofErr w:type="gramStart"/>
-      <w:r>
-        <w:rPr>
-          <w:rFonts w:ascii="Cambria" w:eastAsia="MS Mincho" w:hAnsi="Cambria" w:cs="Times New Roman"/>
-        </w:rPr>
-        <w:t>{{ warns</w:t>
-      </w:r>
-      <w:proofErr w:type="gramEnd"/>
-      <w:r>
-        <w:rPr>
-          <w:rFonts w:ascii="Cambria" w:eastAsia="MS Mincho" w:hAnsi="Cambria" w:cs="Times New Roman"/>
-        </w:rPr>
-        <w:t xml:space="preserve"> | </w:t>
-      </w:r>
-      <w:proofErr w:type="gramStart"/>
-      <w:r>
-        <w:rPr>
-          <w:rFonts w:ascii="Cambria" w:eastAsia="MS Mincho" w:hAnsi="Cambria" w:cs="Times New Roman"/>
-        </w:rPr>
-        <w:t>join(</w:t>
-      </w:r>
-      <w:proofErr w:type="gramEnd"/>
-      <w:r>
-        <w:rPr>
-          <w:rFonts w:ascii="Cambria" w:eastAsia="MS Mincho" w:hAnsi="Cambria" w:cs="Times New Roman"/>
-        </w:rPr>
-        <w:t>', '</w:t>
-      </w:r>
-      <w:proofErr w:type="gramStart"/>
-      <w:r>
-        <w:rPr>
-          <w:rFonts w:ascii="Cambria" w:eastAsia="MS Mincho" w:hAnsi="Cambria" w:cs="Times New Roman"/>
-        </w:rPr>
-        <w:t>) }}){</w:t>
-      </w:r>
-      <w:proofErr w:type="gramEnd"/>
-      <w:r>
-        <w:rPr>
-          <w:rFonts w:ascii="Cambria" w:eastAsia="MS Mincho" w:hAnsi="Cambria" w:cs="Times New Roman"/>
-        </w:rPr>
-        <w:t>% endif %}</w:t>
+        <w:t xml:space="preserve"> Warning (Ping 50ms ≤ 150ms): {{ results | rejectattr('latency', 'equalto', '') | selectattr('latency', 'gt', 50) | selectattr('latency', 'le', 150) | list | length }}{% set warns = results | rejectattr('latency', 'equalto', '') | selectattr('latency', 'gt', 50) | selectattr('latency', 'le', 150) | map(attribute='host') | list %}{% if warns|length &gt; 0 %} ({{ warns | join(', ') }}){% endif %}</w:t>
       </w:r>
     </w:p>
     <w:p>
@@ -474,249 +102,7 @@
         <w:rPr>
           <w:rFonts w:ascii="Cambria" w:eastAsia="MS Mincho" w:hAnsi="Cambria" w:cs="Times New Roman"/>
         </w:rPr>
-        <w:t xml:space="preserve"> Critical (Ping ≥ 150ms): </w:t>
-      </w:r>
-      <w:proofErr w:type="gramStart"/>
-      <w:r>
-        <w:rPr>
-          <w:rFonts w:ascii="Cambria" w:eastAsia="MS Mincho" w:hAnsi="Cambria" w:cs="Times New Roman"/>
-        </w:rPr>
-        <w:t>{{ results</w:t>
-      </w:r>
-      <w:proofErr w:type="gramEnd"/>
-      <w:r>
-        <w:rPr>
-          <w:rFonts w:ascii="Cambria" w:eastAsia="MS Mincho" w:hAnsi="Cambria" w:cs="Times New Roman"/>
-        </w:rPr>
-        <w:t xml:space="preserve"> | </w:t>
-      </w:r>
-      <w:proofErr w:type="spellStart"/>
-      <w:proofErr w:type="gramStart"/>
-      <w:r>
-        <w:rPr>
-          <w:rFonts w:ascii="Cambria" w:eastAsia="MS Mincho" w:hAnsi="Cambria" w:cs="Times New Roman"/>
-        </w:rPr>
-        <w:t>rejectattr</w:t>
-      </w:r>
-      <w:proofErr w:type="spellEnd"/>
-      <w:r>
-        <w:rPr>
-          <w:rFonts w:ascii="Cambria" w:eastAsia="MS Mincho" w:hAnsi="Cambria" w:cs="Times New Roman"/>
-        </w:rPr>
-        <w:t>(</w:t>
-      </w:r>
-      <w:proofErr w:type="gramEnd"/>
-      <w:r>
-        <w:rPr>
-          <w:rFonts w:ascii="Cambria" w:eastAsia="MS Mincho" w:hAnsi="Cambria" w:cs="Times New Roman"/>
-        </w:rPr>
-        <w:t>'latency', '</w:t>
-      </w:r>
-      <w:proofErr w:type="spellStart"/>
-      <w:r>
-        <w:rPr>
-          <w:rFonts w:ascii="Cambria" w:eastAsia="MS Mincho" w:hAnsi="Cambria" w:cs="Times New Roman"/>
-        </w:rPr>
-        <w:t>equalto</w:t>
-      </w:r>
-      <w:proofErr w:type="spellEnd"/>
-      <w:r>
-        <w:rPr>
-          <w:rFonts w:ascii="Cambria" w:eastAsia="MS Mincho" w:hAnsi="Cambria" w:cs="Times New Roman"/>
-        </w:rPr>
-        <w:t xml:space="preserve">', '') | </w:t>
-      </w:r>
-      <w:proofErr w:type="spellStart"/>
-      <w:proofErr w:type="gramStart"/>
-      <w:r>
-        <w:rPr>
-          <w:rFonts w:ascii="Cambria" w:eastAsia="MS Mincho" w:hAnsi="Cambria" w:cs="Times New Roman"/>
-        </w:rPr>
-        <w:t>selectattr</w:t>
-      </w:r>
-      <w:proofErr w:type="spellEnd"/>
-      <w:r>
-        <w:rPr>
-          <w:rFonts w:ascii="Cambria" w:eastAsia="MS Mincho" w:hAnsi="Cambria" w:cs="Times New Roman"/>
-        </w:rPr>
-        <w:t>(</w:t>
-      </w:r>
-      <w:proofErr w:type="gramEnd"/>
-      <w:r>
-        <w:rPr>
-          <w:rFonts w:ascii="Cambria" w:eastAsia="MS Mincho" w:hAnsi="Cambria" w:cs="Times New Roman"/>
-        </w:rPr>
-        <w:t>'latency', '</w:t>
-      </w:r>
-      <w:proofErr w:type="spellStart"/>
-      <w:r>
-        <w:rPr>
-          <w:rFonts w:ascii="Cambria" w:eastAsia="MS Mincho" w:hAnsi="Cambria" w:cs="Times New Roman"/>
-        </w:rPr>
-        <w:t>gt</w:t>
-      </w:r>
-      <w:proofErr w:type="spellEnd"/>
-      <w:r>
-        <w:rPr>
-          <w:rFonts w:ascii="Cambria" w:eastAsia="MS Mincho" w:hAnsi="Cambria" w:cs="Times New Roman"/>
-        </w:rPr>
-        <w:t xml:space="preserve">', 150) | list | </w:t>
-      </w:r>
-      <w:proofErr w:type="gramStart"/>
-      <w:r>
-        <w:rPr>
-          <w:rFonts w:ascii="Cambria" w:eastAsia="MS Mincho" w:hAnsi="Cambria" w:cs="Times New Roman"/>
-        </w:rPr>
-        <w:t>length }}{</w:t>
-      </w:r>
-      <w:proofErr w:type="gramEnd"/>
-      <w:r>
-        <w:rPr>
-          <w:rFonts w:ascii="Cambria" w:eastAsia="MS Mincho" w:hAnsi="Cambria" w:cs="Times New Roman"/>
-        </w:rPr>
-        <w:t xml:space="preserve">% set crits = results | </w:t>
-      </w:r>
-      <w:proofErr w:type="spellStart"/>
-      <w:proofErr w:type="gramStart"/>
-      <w:r>
-        <w:rPr>
-          <w:rFonts w:ascii="Cambria" w:eastAsia="MS Mincho" w:hAnsi="Cambria" w:cs="Times New Roman"/>
-        </w:rPr>
-        <w:t>rejectattr</w:t>
-      </w:r>
-      <w:proofErr w:type="spellEnd"/>
-      <w:r>
-        <w:rPr>
-          <w:rFonts w:ascii="Cambria" w:eastAsia="MS Mincho" w:hAnsi="Cambria" w:cs="Times New Roman"/>
-        </w:rPr>
-        <w:t>(</w:t>
-      </w:r>
-      <w:proofErr w:type="gramEnd"/>
-      <w:r>
-        <w:rPr>
-          <w:rFonts w:ascii="Cambria" w:eastAsia="MS Mincho" w:hAnsi="Cambria" w:cs="Times New Roman"/>
-        </w:rPr>
-        <w:t>'latency', '</w:t>
-      </w:r>
-      <w:proofErr w:type="spellStart"/>
-      <w:r>
-        <w:rPr>
-          <w:rFonts w:ascii="Cambria" w:eastAsia="MS Mincho" w:hAnsi="Cambria" w:cs="Times New Roman"/>
-        </w:rPr>
-        <w:t>equalto</w:t>
-      </w:r>
-      <w:proofErr w:type="spellEnd"/>
-      <w:r>
-        <w:rPr>
-          <w:rFonts w:ascii="Cambria" w:eastAsia="MS Mincho" w:hAnsi="Cambria" w:cs="Times New Roman"/>
-        </w:rPr>
-        <w:t xml:space="preserve">', '') | </w:t>
-      </w:r>
-      <w:proofErr w:type="spellStart"/>
-      <w:proofErr w:type="gramStart"/>
-      <w:r>
-        <w:rPr>
-          <w:rFonts w:ascii="Cambria" w:eastAsia="MS Mincho" w:hAnsi="Cambria" w:cs="Times New Roman"/>
-        </w:rPr>
-        <w:t>selectattr</w:t>
-      </w:r>
-      <w:proofErr w:type="spellEnd"/>
-      <w:r>
-        <w:rPr>
-          <w:rFonts w:ascii="Cambria" w:eastAsia="MS Mincho" w:hAnsi="Cambria" w:cs="Times New Roman"/>
-        </w:rPr>
-        <w:t>(</w:t>
-      </w:r>
-      <w:proofErr w:type="gramEnd"/>
-      <w:r>
-        <w:rPr>
-          <w:rFonts w:ascii="Cambria" w:eastAsia="MS Mincho" w:hAnsi="Cambria" w:cs="Times New Roman"/>
-        </w:rPr>
-        <w:t>'latency', '</w:t>
-      </w:r>
-      <w:proofErr w:type="spellStart"/>
-      <w:r>
-        <w:rPr>
-          <w:rFonts w:ascii="Cambria" w:eastAsia="MS Mincho" w:hAnsi="Cambria" w:cs="Times New Roman"/>
-        </w:rPr>
-        <w:t>gt</w:t>
-      </w:r>
-      <w:proofErr w:type="spellEnd"/>
-      <w:r>
-        <w:rPr>
-          <w:rFonts w:ascii="Cambria" w:eastAsia="MS Mincho" w:hAnsi="Cambria" w:cs="Times New Roman"/>
-        </w:rPr>
-        <w:t xml:space="preserve">', 150) | map(attribute='host') | list </w:t>
-      </w:r>
-      <w:proofErr w:type="gramStart"/>
-      <w:r>
-        <w:rPr>
-          <w:rFonts w:ascii="Cambria" w:eastAsia="MS Mincho" w:hAnsi="Cambria" w:cs="Times New Roman"/>
-        </w:rPr>
-        <w:t>%}{</w:t>
-      </w:r>
-      <w:proofErr w:type="gramEnd"/>
-      <w:r>
-        <w:rPr>
-          <w:rFonts w:ascii="Cambria" w:eastAsia="MS Mincho" w:hAnsi="Cambria" w:cs="Times New Roman"/>
-        </w:rPr>
-        <w:t xml:space="preserve">% if </w:t>
-      </w:r>
-      <w:proofErr w:type="spellStart"/>
-      <w:r>
-        <w:rPr>
-          <w:rFonts w:ascii="Cambria" w:eastAsia="MS Mincho" w:hAnsi="Cambria" w:cs="Times New Roman"/>
-        </w:rPr>
-        <w:t>crits|length</w:t>
-      </w:r>
-      <w:proofErr w:type="spellEnd"/>
-      <w:r>
-        <w:rPr>
-          <w:rFonts w:ascii="Cambria" w:eastAsia="MS Mincho" w:hAnsi="Cambria" w:cs="Times New Roman"/>
-        </w:rPr>
-        <w:t xml:space="preserve"> &gt; 0 %} (</w:t>
-      </w:r>
-      <w:proofErr w:type="gramStart"/>
-      <w:r>
-        <w:rPr>
-          <w:rFonts w:ascii="Cambria" w:eastAsia="MS Mincho" w:hAnsi="Cambria" w:cs="Times New Roman"/>
-        </w:rPr>
-        <w:t>{{ crits</w:t>
-      </w:r>
-      <w:proofErr w:type="gramEnd"/>
-      <w:r>
-        <w:rPr>
-          <w:rFonts w:ascii="Cambria" w:eastAsia="MS Mincho" w:hAnsi="Cambria" w:cs="Times New Roman"/>
-        </w:rPr>
-        <w:t xml:space="preserve"> | </w:t>
-      </w:r>
-      <w:proofErr w:type="gramStart"/>
-      <w:r>
-        <w:rPr>
-          <w:rFonts w:ascii="Cambria" w:eastAsia="MS Mincho" w:hAnsi="Cambria" w:cs="Times New Roman"/>
-        </w:rPr>
-        <w:t>join(</w:t>
-      </w:r>
-      <w:proofErr w:type="gramEnd"/>
-      <w:r>
-        <w:rPr>
-          <w:rFonts w:ascii="Cambria" w:eastAsia="MS Mincho" w:hAnsi="Cambria" w:cs="Times New Roman"/>
-        </w:rPr>
-        <w:t>', '</w:t>
-      </w:r>
-      <w:proofErr w:type="gramStart"/>
-      <w:r>
-        <w:rPr>
-          <w:rFonts w:ascii="Cambria" w:eastAsia="MS Mincho" w:hAnsi="Cambria" w:cs="Times New Roman"/>
-        </w:rPr>
-        <w:t>) }}){</w:t>
-      </w:r>
-      <w:proofErr w:type="gramEnd"/>
-      <w:r>
-        <w:rPr>
-          <w:rFonts w:ascii="Cambria" w:eastAsia="MS Mincho" w:hAnsi="Cambria" w:cs="Times New Roman"/>
-        </w:rPr>
-        <w:t>% endif %}</w:t>
+        <w:t xml:space="preserve"> Critical (Ping ≥ 150ms): {{ results | rejectattr('latency', 'equalto', '') | selectattr('latency', 'gt', 150) | list | length }}{% set crits = results | rejectattr('latency', 'equalto', '') | selectattr('latency', 'gt', 150) | map(attribute='host') | list %}{% if crits|length &gt; 0 %} ({{ crits | join(', ') }}){% endif %}</w:t>
       </w:r>
     </w:p>
     <w:p>
@@ -735,177 +121,7 @@
         <w:rPr>
           <w:rFonts w:ascii="Cambria" w:eastAsia="MS Mincho" w:hAnsi="Cambria" w:cs="Times New Roman"/>
         </w:rPr>
-        <w:t xml:space="preserve"> Ping Timeout: </w:t>
-      </w:r>
-      <w:proofErr w:type="gramStart"/>
-      <w:r>
-        <w:rPr>
-          <w:rFonts w:ascii="Cambria" w:eastAsia="MS Mincho" w:hAnsi="Cambria" w:cs="Times New Roman"/>
-        </w:rPr>
-        <w:t>{{ results</w:t>
-      </w:r>
-      <w:proofErr w:type="gramEnd"/>
-      <w:r>
-        <w:rPr>
-          <w:rFonts w:ascii="Cambria" w:eastAsia="MS Mincho" w:hAnsi="Cambria" w:cs="Times New Roman"/>
-        </w:rPr>
-        <w:t xml:space="preserve"> | </w:t>
-      </w:r>
-      <w:proofErr w:type="spellStart"/>
-      <w:proofErr w:type="gramStart"/>
-      <w:r>
-        <w:rPr>
-          <w:rFonts w:ascii="Cambria" w:eastAsia="MS Mincho" w:hAnsi="Cambria" w:cs="Times New Roman"/>
-        </w:rPr>
-        <w:t>selectattr</w:t>
-      </w:r>
-      <w:proofErr w:type="spellEnd"/>
-      <w:r>
-        <w:rPr>
-          <w:rFonts w:ascii="Cambria" w:eastAsia="MS Mincho" w:hAnsi="Cambria" w:cs="Times New Roman"/>
-        </w:rPr>
-        <w:t>(</w:t>
-      </w:r>
-      <w:proofErr w:type="gramEnd"/>
-      <w:r>
-        <w:rPr>
-          <w:rFonts w:ascii="Cambria" w:eastAsia="MS Mincho" w:hAnsi="Cambria" w:cs="Times New Roman"/>
-        </w:rPr>
-        <w:t>'latency', '</w:t>
-      </w:r>
-      <w:proofErr w:type="spellStart"/>
-      <w:r>
-        <w:rPr>
-          <w:rFonts w:ascii="Cambria" w:eastAsia="MS Mincho" w:hAnsi="Cambria" w:cs="Times New Roman"/>
-        </w:rPr>
-        <w:t>equalto</w:t>
-      </w:r>
-      <w:proofErr w:type="spellEnd"/>
-      <w:r>
-        <w:rPr>
-          <w:rFonts w:ascii="Cambria" w:eastAsia="MS Mincho" w:hAnsi="Cambria" w:cs="Times New Roman"/>
-        </w:rPr>
-        <w:t xml:space="preserve">', '') | list | </w:t>
-      </w:r>
-      <w:proofErr w:type="gramStart"/>
-      <w:r>
-        <w:rPr>
-          <w:rFonts w:ascii="Cambria" w:eastAsia="MS Mincho" w:hAnsi="Cambria" w:cs="Times New Roman"/>
-        </w:rPr>
-        <w:t>length }}{</w:t>
-      </w:r>
-      <w:proofErr w:type="gramEnd"/>
-      <w:r>
-        <w:rPr>
-          <w:rFonts w:ascii="Cambria" w:eastAsia="MS Mincho" w:hAnsi="Cambria" w:cs="Times New Roman"/>
-        </w:rPr>
-        <w:t xml:space="preserve">% set timeouts = results | </w:t>
-      </w:r>
-      <w:proofErr w:type="spellStart"/>
-      <w:proofErr w:type="gramStart"/>
-      <w:r>
-        <w:rPr>
-          <w:rFonts w:ascii="Cambria" w:eastAsia="MS Mincho" w:hAnsi="Cambria" w:cs="Times New Roman"/>
-        </w:rPr>
-        <w:t>selectattr</w:t>
-      </w:r>
-      <w:proofErr w:type="spellEnd"/>
-      <w:r>
-        <w:rPr>
-          <w:rFonts w:ascii="Cambria" w:eastAsia="MS Mincho" w:hAnsi="Cambria" w:cs="Times New Roman"/>
-        </w:rPr>
-        <w:t>(</w:t>
-      </w:r>
-      <w:proofErr w:type="gramEnd"/>
-      <w:r>
-        <w:rPr>
-          <w:rFonts w:ascii="Cambria" w:eastAsia="MS Mincho" w:hAnsi="Cambria" w:cs="Times New Roman"/>
-        </w:rPr>
-        <w:t>'latency', '</w:t>
-      </w:r>
-      <w:proofErr w:type="spellStart"/>
-      <w:r>
-        <w:rPr>
-          <w:rFonts w:ascii="Cambria" w:eastAsia="MS Mincho" w:hAnsi="Cambria" w:cs="Times New Roman"/>
-        </w:rPr>
-        <w:t>equalto</w:t>
-      </w:r>
-      <w:proofErr w:type="spellEnd"/>
-      <w:r>
-        <w:rPr>
-          <w:rFonts w:ascii="Cambria" w:eastAsia="MS Mincho" w:hAnsi="Cambria" w:cs="Times New Roman"/>
-        </w:rPr>
-        <w:t xml:space="preserve">', '') | map(attribute='host') | list </w:t>
-      </w:r>
-      <w:proofErr w:type="gramStart"/>
-      <w:r>
-        <w:rPr>
-          <w:rFonts w:ascii="Cambria" w:eastAsia="MS Mincho" w:hAnsi="Cambria" w:cs="Times New Roman"/>
-        </w:rPr>
-        <w:t>%}{</w:t>
-      </w:r>
-      <w:proofErr w:type="gramEnd"/>
-      <w:r>
-        <w:rPr>
-          <w:rFonts w:ascii="Cambria" w:eastAsia="MS Mincho" w:hAnsi="Cambria" w:cs="Times New Roman"/>
-        </w:rPr>
-        <w:t xml:space="preserve">% if </w:t>
-      </w:r>
-      <w:proofErr w:type="spellStart"/>
-      <w:r>
-        <w:rPr>
-          <w:rFonts w:ascii="Cambria" w:eastAsia="MS Mincho" w:hAnsi="Cambria" w:cs="Times New Roman"/>
-        </w:rPr>
-        <w:t>timeouts|length</w:t>
-      </w:r>
-      <w:proofErr w:type="spellEnd"/>
-      <w:r>
-        <w:rPr>
-          <w:rFonts w:ascii="Cambria" w:eastAsia="MS Mincho" w:hAnsi="Cambria" w:cs="Times New Roman"/>
-        </w:rPr>
-        <w:t xml:space="preserve"> &gt; 0 %} (</w:t>
-      </w:r>
-      <w:proofErr w:type="gramStart"/>
-      <w:r>
-        <w:rPr>
-          <w:rFonts w:ascii="Cambria" w:eastAsia="MS Mincho" w:hAnsi="Cambria" w:cs="Times New Roman"/>
-        </w:rPr>
-        <w:t>{{ timeouts</w:t>
-      </w:r>
-      <w:proofErr w:type="gramEnd"/>
-      <w:r>
-        <w:rPr>
-          <w:rFonts w:ascii="Cambria" w:eastAsia="MS Mincho" w:hAnsi="Cambria" w:cs="Times New Roman"/>
-        </w:rPr>
-        <w:t xml:space="preserve"> | </w:t>
-      </w:r>
-      <w:proofErr w:type="gramStart"/>
-      <w:r>
-        <w:rPr>
-          <w:rFonts w:ascii="Cambria" w:eastAsia="MS Mincho" w:hAnsi="Cambria" w:cs="Times New Roman"/>
-        </w:rPr>
-        <w:t>join(</w:t>
-      </w:r>
-      <w:proofErr w:type="gramEnd"/>
-      <w:r>
-        <w:rPr>
-          <w:rFonts w:ascii="Cambria" w:eastAsia="MS Mincho" w:hAnsi="Cambria" w:cs="Times New Roman"/>
-        </w:rPr>
-        <w:t>', '</w:t>
-      </w:r>
-      <w:proofErr w:type="gramStart"/>
-      <w:r>
-        <w:rPr>
-          <w:rFonts w:ascii="Cambria" w:eastAsia="MS Mincho" w:hAnsi="Cambria" w:cs="Times New Roman"/>
-        </w:rPr>
-        <w:t>) }}){</w:t>
-      </w:r>
-      <w:proofErr w:type="gramEnd"/>
-      <w:r>
-        <w:rPr>
-          <w:rFonts w:ascii="Cambria" w:eastAsia="MS Mincho" w:hAnsi="Cambria" w:cs="Times New Roman"/>
-        </w:rPr>
-        <w:t>% endif %}</w:t>
+        <w:t xml:space="preserve"> Ping Timeout: {{ results | selectattr('latency', 'equalto', '') | list | length }}{% set timeouts = results | selectattr('latency', 'equalto', '') | map(attribute='host') | list %}{% if timeouts|length &gt; 0 %} ({{ timeouts | join(', ') }}){% endif %}</w:t>
       </w:r>
     </w:p>
     <w:p>
@@ -916,97 +132,21 @@
         <w:t>p</w:t>
       </w:r>
       <w:r>
-        <w:t xml:space="preserve"> for </w:t>
+        <w:t xml:space="preserve"> for res in results %}</w:t>
       </w:r>
-      <w:proofErr w:type="gramStart"/>
-      <w:r>
-        <w:t>res</w:t>
-      </w:r>
-      <w:proofErr w:type="gramEnd"/>
-      <w:r>
-        <w:t xml:space="preserve"> in </w:t>
-      </w:r>
-      <w:proofErr w:type="gramStart"/>
-      <w:r>
-        <w:t>results %}</w:t>
-      </w:r>
-      <w:proofErr w:type="gramEnd"/>
     </w:p>
     <w:p>
       <w:pPr>
         <w:pStyle w:val="Ttulo1"/>
       </w:pPr>
-      <w:proofErr w:type="gramStart"/>
       <w:r>
-        <w:t xml:space="preserve">{{ </w:t>
-      </w:r>
-      <w:proofErr w:type="spellStart"/>
-      <w:r>
-        <w:t>res</w:t>
-      </w:r>
-      <w:proofErr w:type="gramEnd"/>
-      <w:r>
-        <w:t>.rule_</w:t>
-      </w:r>
-      <w:proofErr w:type="gramStart"/>
-      <w:r>
-        <w:t>name</w:t>
-      </w:r>
-      <w:proofErr w:type="spellEnd"/>
-      <w:r>
-        <w:t xml:space="preserve"> }</w:t>
-      </w:r>
-      <w:proofErr w:type="gramEnd"/>
-      <w:r>
-        <w:t xml:space="preserve">}: </w:t>
-      </w:r>
-      <w:proofErr w:type="gramStart"/>
-      <w:r>
-        <w:t xml:space="preserve">{{ </w:t>
-      </w:r>
-      <w:proofErr w:type="spellStart"/>
-      <w:r>
-        <w:t>res</w:t>
-      </w:r>
-      <w:proofErr w:type="gramEnd"/>
-      <w:r>
-        <w:t>.</w:t>
-      </w:r>
-      <w:proofErr w:type="gramStart"/>
-      <w:r>
-        <w:t>host</w:t>
-      </w:r>
-      <w:proofErr w:type="spellEnd"/>
-      <w:r>
-        <w:t xml:space="preserve"> }</w:t>
-      </w:r>
-      <w:proofErr w:type="gramEnd"/>
-      <w:r>
-        <w:t>}</w:t>
+        <w:t>{{ res.rule_name }}: {{ res.host }}</w:t>
       </w:r>
     </w:p>
     <w:p>
       <w:r>
-        <w:t xml:space="preserve">{%p if </w:t>
+        <w:t>{%p if res.rule_name in ['Switch', 'Access Point'] %}</w:t>
       </w:r>
-      <w:proofErr w:type="spellStart"/>
-      <w:proofErr w:type="gramStart"/>
-      <w:r>
-        <w:t>res.rule</w:t>
-      </w:r>
-      <w:proofErr w:type="gramEnd"/>
-      <w:r>
-        <w:t>_name</w:t>
-      </w:r>
-      <w:proofErr w:type="spellEnd"/>
-      <w:r>
-        <w:t xml:space="preserve"> in ['Switch', 'Access Point'</w:t>
-      </w:r>
-      <w:proofErr w:type="gramStart"/>
-      <w:r>
-        <w:t>] %}</w:t>
-      </w:r>
-      <w:proofErr w:type="gramEnd"/>
     </w:p>
     <w:p>
       <w:r>
@@ -1018,13 +158,9 @@
       <w:r>
         <w:t xml:space="preserve"> if </w:t>
       </w:r>
-      <w:proofErr w:type="spellStart"/>
-      <w:proofErr w:type="gramStart"/>
       <w:r>
         <w:t>res.latency</w:t>
       </w:r>
-      <w:proofErr w:type="spellEnd"/>
-      <w:proofErr w:type="gramEnd"/>
       <w:r>
         <w:t xml:space="preserve"> %}</w:t>
       </w:r>
@@ -1033,55 +169,18 @@
       <w:r>
         <w:t xml:space="preserve">{% set ping = </w:t>
       </w:r>
-      <w:proofErr w:type="spellStart"/>
-      <w:proofErr w:type="gramStart"/>
       <w:r>
         <w:t>res.latency</w:t>
       </w:r>
-      <w:proofErr w:type="gramEnd"/>
       <w:r>
-        <w:t>|int</w:t>
-      </w:r>
-      <w:proofErr w:type="spellEnd"/>
-      <w:r>
-        <w:t xml:space="preserve"> </w:t>
-      </w:r>
-      <w:proofErr w:type="gramStart"/>
-      <w:r>
-        <w:t>%}Lat</w:t>
+        <w:t>|int %}Lat</w:t>
       </w:r>
       <w:r>
         <w:t>ency</w:t>
       </w:r>
-      <w:proofErr w:type="gramEnd"/>
       <w:r>
-        <w:t xml:space="preserve">: </w:t>
+        <w:t xml:space="preserve">: {{ ping }}ms ({% if ping &lt;= 50 %}Ok </w:t>
       </w:r>
-      <w:proofErr w:type="gramStart"/>
-      <w:r>
-        <w:t>{{ ping</w:t>
-      </w:r>
-      <w:proofErr w:type="gramEnd"/>
-      <w:r>
-        <w:t xml:space="preserve"> }}</w:t>
-      </w:r>
-      <w:proofErr w:type="spellStart"/>
-      <w:r>
-        <w:t>ms</w:t>
-      </w:r>
-      <w:proofErr w:type="spellEnd"/>
-      <w:r>
-        <w:t xml:space="preserve"> ({% if ping &lt;= 50 </w:t>
-      </w:r>
-      <w:proofErr w:type="gramStart"/>
-      <w:r>
-        <w:t>%}Ok</w:t>
-      </w:r>
-      <w:proofErr w:type="gramEnd"/>
-      <w:r>
-        <w:t xml:space="preserve"> </w:t>
-      </w:r>
-      <w:proofErr w:type="gramStart"/>
       <w:r>
         <w:rPr>
           <w:rFonts w:ascii="Segoe UI Emoji" w:hAnsi="Segoe UI Emoji" w:cs="Segoe UI Emoji"/>
@@ -1089,29 +188,8 @@
         <w:t>🟢</w:t>
       </w:r>
       <w:r>
-        <w:t>{</w:t>
+        <w:t xml:space="preserve">{% elif ping &lt;= 150 %}Warning </w:t>
       </w:r>
-      <w:proofErr w:type="gramEnd"/>
-      <w:r>
-        <w:t xml:space="preserve">% </w:t>
-      </w:r>
-      <w:proofErr w:type="spellStart"/>
-      <w:r>
-        <w:t>elif</w:t>
-      </w:r>
-      <w:proofErr w:type="spellEnd"/>
-      <w:r>
-        <w:t xml:space="preserve"> ping &lt;= 150 </w:t>
-      </w:r>
-      <w:proofErr w:type="gramStart"/>
-      <w:r>
-        <w:t>%}Warning</w:t>
-      </w:r>
-      <w:proofErr w:type="gramEnd"/>
-      <w:r>
-        <w:t xml:space="preserve"> </w:t>
-      </w:r>
-      <w:proofErr w:type="gramStart"/>
       <w:r>
         <w:rPr>
           <w:rFonts w:ascii="Segoe UI Emoji" w:hAnsi="Segoe UI Emoji" w:cs="Segoe UI Emoji"/>
@@ -1119,21 +197,8 @@
         <w:t>🟡</w:t>
       </w:r>
       <w:r>
-        <w:t>{</w:t>
+        <w:t xml:space="preserve">{% else %}Critical </w:t>
       </w:r>
-      <w:proofErr w:type="gramEnd"/>
-      <w:r>
-        <w:t xml:space="preserve">% else </w:t>
-      </w:r>
-      <w:proofErr w:type="gramStart"/>
-      <w:r>
-        <w:t>%}Critical</w:t>
-      </w:r>
-      <w:proofErr w:type="gramEnd"/>
-      <w:r>
-        <w:t xml:space="preserve"> </w:t>
-      </w:r>
-      <w:proofErr w:type="gramStart"/>
       <w:r>
         <w:rPr>
           <w:rFonts w:ascii="Segoe UI Emoji" w:hAnsi="Segoe UI Emoji" w:cs="Segoe UI Emoji"/>
@@ -1141,11 +206,7 @@
         <w:t>🔴</w:t>
       </w:r>
       <w:r>
-        <w:t>{</w:t>
-      </w:r>
-      <w:proofErr w:type="gramEnd"/>
-      <w:r>
-        <w:t>% endif %})</w:t>
+        <w:t>{% endif %})</w:t>
       </w:r>
     </w:p>
     <w:p>
@@ -1156,13 +217,8 @@
         <w:t>p</w:t>
       </w:r>
       <w:r>
-        <w:t xml:space="preserve"> </w:t>
+        <w:t xml:space="preserve"> else %}</w:t>
       </w:r>
-      <w:proofErr w:type="gramStart"/>
-      <w:r>
-        <w:t>else %}</w:t>
-      </w:r>
-      <w:proofErr w:type="gramEnd"/>
     </w:p>
     <w:p>
       <w:r>
@@ -1186,591 +242,7 @@
         <w:t>p</w:t>
       </w:r>
       <w:r>
-        <w:t xml:space="preserve"> </w:t>
-      </w:r>
-      <w:proofErr w:type="gramStart"/>
-      <w:r>
-        <w:t>endif %}</w:t>
-      </w:r>
-      <w:proofErr w:type="gramEnd"/>
-    </w:p>
-    <w:p>
-      <w:r>
-        <w:t>{%</w:t>
-      </w:r>
-      <w:r>
-        <w:t>p</w:t>
-      </w:r>
-      <w:r>
-        <w:t xml:space="preserve"> </w:t>
-      </w:r>
-      <w:proofErr w:type="spellStart"/>
-      <w:r>
-        <w:t>elif</w:t>
-      </w:r>
-      <w:proofErr w:type="spellEnd"/>
-      <w:r>
-        <w:t xml:space="preserve"> </w:t>
-      </w:r>
-      <w:proofErr w:type="spellStart"/>
-      <w:proofErr w:type="gramStart"/>
-      <w:r>
-        <w:t>res.rule</w:t>
-      </w:r>
-      <w:proofErr w:type="gramEnd"/>
-      <w:r>
-        <w:t>_name</w:t>
-      </w:r>
-      <w:proofErr w:type="spellEnd"/>
-      <w:r>
-        <w:t xml:space="preserve"> == "FortiGate</w:t>
-      </w:r>
-      <w:proofErr w:type="gramStart"/>
-      <w:r>
-        <w:t>" %}</w:t>
-      </w:r>
-      <w:proofErr w:type="gramEnd"/>
-    </w:p>
-    <w:p>
-      <w:r>
-        <w:t>{%</w:t>
-      </w:r>
-      <w:r>
-        <w:t>p</w:t>
-      </w:r>
-      <w:r>
-        <w:t xml:space="preserve"> if </w:t>
-      </w:r>
-      <w:proofErr w:type="spellStart"/>
-      <w:proofErr w:type="gramStart"/>
-      <w:r>
-        <w:t>res.error</w:t>
-      </w:r>
-      <w:proofErr w:type="spellEnd"/>
-      <w:proofErr w:type="gramEnd"/>
-      <w:r>
-        <w:t xml:space="preserve"> %}</w:t>
-      </w:r>
-    </w:p>
-    <w:p>
-      <w:r>
-        <w:t xml:space="preserve">Error: </w:t>
-      </w:r>
-      <w:proofErr w:type="gramStart"/>
-      <w:r>
-        <w:t xml:space="preserve">{{ </w:t>
-      </w:r>
-      <w:proofErr w:type="spellStart"/>
-      <w:r>
-        <w:t>res</w:t>
-      </w:r>
-      <w:proofErr w:type="gramEnd"/>
-      <w:r>
-        <w:t>.</w:t>
-      </w:r>
-      <w:proofErr w:type="gramStart"/>
-      <w:r>
-        <w:t>error</w:t>
-      </w:r>
-      <w:proofErr w:type="spellEnd"/>
-      <w:r>
-        <w:t xml:space="preserve"> }</w:t>
-      </w:r>
-      <w:proofErr w:type="gramEnd"/>
-      <w:r>
-        <w:t>}</w:t>
-      </w:r>
-    </w:p>
-    <w:p>
-      <w:r>
-        <w:lastRenderedPageBreak/>
-        <w:t>{%</w:t>
-      </w:r>
-      <w:r>
-        <w:t>p</w:t>
-      </w:r>
-      <w:r>
-        <w:t xml:space="preserve"> </w:t>
-      </w:r>
-      <w:proofErr w:type="gramStart"/>
-      <w:r>
-        <w:t>else %}</w:t>
-      </w:r>
-      <w:proofErr w:type="gramEnd"/>
-    </w:p>
-    <w:p>
-      <w:r>
-        <w:t xml:space="preserve">{%p for </w:t>
-      </w:r>
-      <w:proofErr w:type="spellStart"/>
-      <w:r>
-        <w:t>intf_</w:t>
-      </w:r>
-      <w:r>
-        <w:t>key</w:t>
-      </w:r>
-      <w:proofErr w:type="spellEnd"/>
-      <w:r>
-        <w:t xml:space="preserve">, </w:t>
-      </w:r>
-      <w:proofErr w:type="spellStart"/>
-      <w:r>
-        <w:t>intf_data</w:t>
-      </w:r>
-      <w:proofErr w:type="spellEnd"/>
-      <w:r>
-        <w:t xml:space="preserve"> in </w:t>
-      </w:r>
-      <w:proofErr w:type="spellStart"/>
-      <w:r>
-        <w:t>res.wan_</w:t>
-      </w:r>
-      <w:proofErr w:type="gramStart"/>
-      <w:r>
-        <w:t>status.items</w:t>
-      </w:r>
-      <w:proofErr w:type="spellEnd"/>
-      <w:proofErr w:type="gramEnd"/>
-      <w:r>
-        <w:t>(</w:t>
-      </w:r>
-      <w:proofErr w:type="gramStart"/>
-      <w:r>
-        <w:t>) %}</w:t>
-      </w:r>
-      <w:proofErr w:type="gramEnd"/>
-    </w:p>
-    <w:p>
-      <w:r>
-        <w:t xml:space="preserve">{% set </w:t>
-      </w:r>
-      <w:proofErr w:type="spellStart"/>
-      <w:r>
-        <w:t>isp_map</w:t>
-      </w:r>
-      <w:proofErr w:type="spellEnd"/>
-      <w:r>
-        <w:t xml:space="preserve"> </w:t>
-      </w:r>
-      <w:proofErr w:type="gramStart"/>
-      <w:r>
-        <w:t>= {'</w:t>
-      </w:r>
-      <w:proofErr w:type="gramEnd"/>
-      <w:r>
-        <w:t>WAN1': '</w:t>
-      </w:r>
-      <w:r>
-        <w:t>ISP1</w:t>
-      </w:r>
-      <w:r>
-        <w:t>', 'WAN2': '</w:t>
-      </w:r>
-      <w:proofErr w:type="gramStart"/>
-      <w:r>
-        <w:t>ISP2</w:t>
-      </w:r>
-      <w:r>
-        <w:t>'}</w:t>
-      </w:r>
-      <w:proofErr w:type="gramEnd"/>
-      <w:r>
-        <w:t xml:space="preserve"> %}</w:t>
-      </w:r>
-    </w:p>
-    <w:p>
-      <w:r>
-        <w:t xml:space="preserve">{% set </w:t>
-      </w:r>
-      <w:proofErr w:type="spellStart"/>
-      <w:r>
-        <w:t>isp_name</w:t>
-      </w:r>
-      <w:proofErr w:type="spellEnd"/>
-      <w:r>
-        <w:t xml:space="preserve"> = </w:t>
-      </w:r>
-      <w:proofErr w:type="spellStart"/>
-      <w:proofErr w:type="gramStart"/>
-      <w:r>
-        <w:t>isp_map.get</w:t>
-      </w:r>
-      <w:proofErr w:type="spellEnd"/>
-      <w:r>
-        <w:t>(</w:t>
-      </w:r>
-      <w:proofErr w:type="spellStart"/>
-      <w:proofErr w:type="gramEnd"/>
-      <w:r>
-        <w:t>intf_key</w:t>
-      </w:r>
-      <w:proofErr w:type="spellEnd"/>
-      <w:r>
-        <w:t xml:space="preserve">, </w:t>
-      </w:r>
-      <w:proofErr w:type="spellStart"/>
-      <w:r>
-        <w:t>intf_key</w:t>
-      </w:r>
-      <w:proofErr w:type="spellEnd"/>
-      <w:proofErr w:type="gramStart"/>
-      <w:r>
-        <w:t>) %}</w:t>
-      </w:r>
-      <w:proofErr w:type="gramEnd"/>
-    </w:p>
-    <w:p>
-      <w:proofErr w:type="gramStart"/>
-      <w:r>
-        <w:t xml:space="preserve">{{ </w:t>
-      </w:r>
-      <w:proofErr w:type="spellStart"/>
-      <w:r>
-        <w:t>isp</w:t>
-      </w:r>
-      <w:proofErr w:type="gramEnd"/>
-      <w:r>
-        <w:t>_</w:t>
-      </w:r>
-      <w:proofErr w:type="gramStart"/>
-      <w:r>
-        <w:t>name</w:t>
-      </w:r>
-      <w:proofErr w:type="spellEnd"/>
-      <w:r>
-        <w:t xml:space="preserve"> }</w:t>
-      </w:r>
-      <w:proofErr w:type="gramEnd"/>
-      <w:r>
-        <w:t xml:space="preserve">} </w:t>
-      </w:r>
-      <w:r>
-        <w:t>(</w:t>
-      </w:r>
-      <w:proofErr w:type="gramStart"/>
-      <w:r>
-        <w:t xml:space="preserve">{{ </w:t>
-      </w:r>
-      <w:proofErr w:type="spellStart"/>
-      <w:r>
-        <w:t>intf</w:t>
-      </w:r>
-      <w:proofErr w:type="gramEnd"/>
-      <w:r>
-        <w:t>_</w:t>
-      </w:r>
-      <w:proofErr w:type="gramStart"/>
-      <w:r>
-        <w:t>key</w:t>
-      </w:r>
-      <w:proofErr w:type="spellEnd"/>
-      <w:r>
-        <w:t xml:space="preserve"> }</w:t>
-      </w:r>
-      <w:proofErr w:type="gramEnd"/>
-      <w:r>
-        <w:t>}</w:t>
-      </w:r>
-      <w:r>
-        <w:t>)</w:t>
-      </w:r>
-      <w:r>
-        <w:t xml:space="preserve"> Link </w:t>
-      </w:r>
-      <w:proofErr w:type="gramStart"/>
-      <w:r>
-        <w:t>Status: {</w:t>
-      </w:r>
-      <w:proofErr w:type="gramEnd"/>
-      <w:r>
-        <w:t xml:space="preserve">% if </w:t>
-      </w:r>
-      <w:proofErr w:type="spellStart"/>
-      <w:r>
-        <w:t>intf_</w:t>
-      </w:r>
-      <w:proofErr w:type="gramStart"/>
-      <w:r>
-        <w:t>data.ip</w:t>
-      </w:r>
-      <w:proofErr w:type="spellEnd"/>
-      <w:proofErr w:type="gramEnd"/>
-      <w:r>
-        <w:t xml:space="preserve"> </w:t>
-      </w:r>
-      <w:proofErr w:type="gramStart"/>
-      <w:r>
-        <w:t xml:space="preserve">%}{{ </w:t>
-      </w:r>
-      <w:proofErr w:type="spellStart"/>
-      <w:r>
-        <w:t>intf</w:t>
-      </w:r>
-      <w:proofErr w:type="gramEnd"/>
-      <w:r>
-        <w:t>_</w:t>
-      </w:r>
-      <w:proofErr w:type="gramStart"/>
-      <w:r>
-        <w:t>data.ip</w:t>
-      </w:r>
-      <w:proofErr w:type="spellEnd"/>
-      <w:proofErr w:type="gramEnd"/>
-      <w:r>
-        <w:t xml:space="preserve"> </w:t>
-      </w:r>
-      <w:proofErr w:type="gramStart"/>
-      <w:r>
-        <w:t>}}{</w:t>
-      </w:r>
-      <w:proofErr w:type="gramEnd"/>
-      <w:r>
-        <w:t xml:space="preserve">% </w:t>
-      </w:r>
-      <w:proofErr w:type="gramStart"/>
-      <w:r>
-        <w:t>endif %}</w:t>
-      </w:r>
-      <w:proofErr w:type="gramEnd"/>
-      <w:r>
-        <w:t xml:space="preserve"> (</w:t>
-      </w:r>
-      <w:proofErr w:type="gramStart"/>
-      <w:r>
-        <w:t xml:space="preserve">{{ </w:t>
-      </w:r>
-      <w:proofErr w:type="spellStart"/>
-      <w:r>
-        <w:t>intf</w:t>
-      </w:r>
-      <w:proofErr w:type="gramEnd"/>
-      <w:r>
-        <w:t>_</w:t>
-      </w:r>
-      <w:proofErr w:type="gramStart"/>
-      <w:r>
-        <w:t>data.status</w:t>
-      </w:r>
-      <w:proofErr w:type="spellEnd"/>
-      <w:proofErr w:type="gramEnd"/>
-      <w:r>
-        <w:t xml:space="preserve"> }})</w:t>
-      </w:r>
-    </w:p>
-    <w:p>
-      <w:r>
-        <w:t>{%</w:t>
-      </w:r>
-      <w:r>
-        <w:t>p</w:t>
-      </w:r>
-      <w:r>
-        <w:t xml:space="preserve"> if </w:t>
-      </w:r>
-      <w:proofErr w:type="spellStart"/>
-      <w:r>
-        <w:t>intf_</w:t>
-      </w:r>
-      <w:proofErr w:type="gramStart"/>
-      <w:r>
-        <w:t>data.</w:t>
-      </w:r>
-      <w:r>
-        <w:t>ping</w:t>
-      </w:r>
-      <w:proofErr w:type="gramEnd"/>
-      <w:r>
-        <w:t>_</w:t>
-      </w:r>
-      <w:proofErr w:type="gramStart"/>
-      <w:r>
-        <w:t>interface</w:t>
-      </w:r>
-      <w:proofErr w:type="spellEnd"/>
-      <w:r>
-        <w:t xml:space="preserve"> %}</w:t>
-      </w:r>
-      <w:proofErr w:type="gramEnd"/>
-    </w:p>
-    <w:p>
-      <w:r>
-        <w:t xml:space="preserve">{% if </w:t>
-      </w:r>
-      <w:proofErr w:type="spellStart"/>
-      <w:r>
-        <w:t>intf_</w:t>
-      </w:r>
-      <w:proofErr w:type="gramStart"/>
-      <w:r>
-        <w:t>data.latency</w:t>
-      </w:r>
-      <w:proofErr w:type="spellEnd"/>
-      <w:proofErr w:type="gramEnd"/>
-      <w:r>
-        <w:t xml:space="preserve"> </w:t>
-      </w:r>
-      <w:proofErr w:type="gramStart"/>
-      <w:r>
-        <w:t>%}{</w:t>
-      </w:r>
-      <w:proofErr w:type="gramEnd"/>
-      <w:r>
-        <w:t xml:space="preserve">% set ping = </w:t>
-      </w:r>
-      <w:proofErr w:type="spellStart"/>
-      <w:r>
-        <w:t>intf_</w:t>
-      </w:r>
-      <w:proofErr w:type="gramStart"/>
-      <w:r>
-        <w:t>data.latency</w:t>
-      </w:r>
-      <w:proofErr w:type="gramEnd"/>
-      <w:r>
-        <w:t>|int</w:t>
-      </w:r>
-      <w:proofErr w:type="spellEnd"/>
-      <w:r>
-        <w:t xml:space="preserve"> </w:t>
-      </w:r>
-      <w:proofErr w:type="gramStart"/>
-      <w:r>
-        <w:t>%}Gateway</w:t>
-      </w:r>
-      <w:proofErr w:type="gramEnd"/>
-      <w:r>
-        <w:t xml:space="preserve"> Latency (</w:t>
-      </w:r>
-      <w:proofErr w:type="gramStart"/>
-      <w:r>
-        <w:t>{{ intf_data.gw</w:t>
-      </w:r>
-      <w:proofErr w:type="gramEnd"/>
-      <w:r>
-        <w:t xml:space="preserve"> }}): </w:t>
-      </w:r>
-      <w:proofErr w:type="gramStart"/>
-      <w:r>
-        <w:t>{{ ping</w:t>
-      </w:r>
-      <w:proofErr w:type="gramEnd"/>
-      <w:r>
-        <w:t xml:space="preserve"> }}</w:t>
-      </w:r>
-      <w:proofErr w:type="spellStart"/>
-      <w:r>
-        <w:t>ms</w:t>
-      </w:r>
-      <w:proofErr w:type="spellEnd"/>
-      <w:r>
-        <w:t xml:space="preserve"> ({% if ping &lt;= 50 </w:t>
-      </w:r>
-      <w:proofErr w:type="gramStart"/>
-      <w:r>
-        <w:t>%}Ok</w:t>
-      </w:r>
-      <w:proofErr w:type="gramEnd"/>
-      <w:r>
-        <w:t xml:space="preserve"> </w:t>
-      </w:r>
-      <w:proofErr w:type="gramStart"/>
-      <w:r>
-        <w:rPr>
-          <w:rFonts w:ascii="Segoe UI Emoji" w:hAnsi="Segoe UI Emoji" w:cs="Segoe UI Emoji"/>
-          <w:lang w:val="pt-BR"/>
-        </w:rPr>
-        <w:t>🟢</w:t>
-      </w:r>
-      <w:r>
-        <w:t>{</w:t>
-      </w:r>
-      <w:proofErr w:type="gramEnd"/>
-      <w:r>
-        <w:t xml:space="preserve">% </w:t>
-      </w:r>
-      <w:proofErr w:type="spellStart"/>
-      <w:r>
-        <w:t>elif</w:t>
-      </w:r>
-      <w:proofErr w:type="spellEnd"/>
-      <w:r>
-        <w:t xml:space="preserve"> ping &lt;= 150 </w:t>
-      </w:r>
-      <w:proofErr w:type="gramStart"/>
-      <w:r>
-        <w:t>%}Warning</w:t>
-      </w:r>
-      <w:proofErr w:type="gramEnd"/>
-      <w:r>
-        <w:t xml:space="preserve"> </w:t>
-      </w:r>
-      <w:proofErr w:type="gramStart"/>
-      <w:r>
-        <w:rPr>
-          <w:rFonts w:ascii="Segoe UI Emoji" w:hAnsi="Segoe UI Emoji" w:cs="Segoe UI Emoji"/>
-          <w:lang w:val="pt-BR"/>
-        </w:rPr>
-        <w:t>🟡</w:t>
-      </w:r>
-      <w:r>
-        <w:t>{</w:t>
-      </w:r>
-      <w:proofErr w:type="gramEnd"/>
-      <w:r>
-        <w:t xml:space="preserve">% else </w:t>
-      </w:r>
-      <w:proofErr w:type="gramStart"/>
-      <w:r>
-        <w:t>%}Critical</w:t>
-      </w:r>
-      <w:proofErr w:type="gramEnd"/>
-      <w:r>
-        <w:t xml:space="preserve"> </w:t>
-      </w:r>
-      <w:proofErr w:type="gramStart"/>
-      <w:r>
-        <w:rPr>
-          <w:rFonts w:ascii="Segoe UI Emoji" w:hAnsi="Segoe UI Emoji" w:cs="Segoe UI Emoji"/>
-          <w:lang w:val="pt-BR"/>
-        </w:rPr>
-        <w:t>🔴</w:t>
-      </w:r>
-      <w:r>
-        <w:t>{</w:t>
-      </w:r>
-      <w:proofErr w:type="gramEnd"/>
-      <w:r>
-        <w:t>% endif %</w:t>
-      </w:r>
-      <w:proofErr w:type="gramStart"/>
-      <w:r>
-        <w:t>}){</w:t>
-      </w:r>
-      <w:proofErr w:type="gramEnd"/>
-      <w:r>
-        <w:t xml:space="preserve">% else </w:t>
-      </w:r>
-      <w:proofErr w:type="gramStart"/>
-      <w:r>
-        <w:t>%}(</w:t>
-      </w:r>
-      <w:proofErr w:type="gramEnd"/>
-      <w:r>
-        <w:t xml:space="preserve">Ping Timeout </w:t>
-      </w:r>
-      <w:proofErr w:type="gramStart"/>
-      <w:r>
-        <w:rPr>
-          <w:rFonts w:ascii="Segoe UI Emoji" w:hAnsi="Segoe UI Emoji" w:cs="Segoe UI Emoji"/>
-        </w:rPr>
-        <w:t>❌</w:t>
-      </w:r>
-      <w:r>
-        <w:t>){</w:t>
-      </w:r>
-      <w:proofErr w:type="gramEnd"/>
-      <w:r>
-        <w:t>% endif %}</w:t>
+        <w:t xml:space="preserve"> endif %}</w:t>
       </w:r>
     </w:p>
     <w:p>
@@ -1783,48 +255,11 @@
       <w:r>
         <w:t xml:space="preserve"> </w:t>
       </w:r>
-      <w:proofErr w:type="gramStart"/>
       <w:r>
-        <w:t>endif %}</w:t>
-      </w:r>
-      <w:proofErr w:type="gramEnd"/>
-    </w:p>
-    <w:p>
-      <w:r>
-        <w:t xml:space="preserve">{%p </w:t>
-      </w:r>
-      <w:proofErr w:type="spellStart"/>
-      <w:r>
-        <w:t>endfor</w:t>
-      </w:r>
-      <w:proofErr w:type="spellEnd"/>
-      <w:r>
-        <w:t xml:space="preserve"> %}</w:t>
+        <w:t>elif</w:t>
       </w:r>
       <w:r>
-        <w:t xml:space="preserve"> </w:t>
-      </w:r>
-      <w:r>
-        <w:t xml:space="preserve">{# CLOSES: for </w:t>
-      </w:r>
-      <w:proofErr w:type="spellStart"/>
-      <w:r>
-        <w:t>intf_key</w:t>
-      </w:r>
-      <w:proofErr w:type="spellEnd"/>
-      <w:r>
-        <w:t xml:space="preserve">, </w:t>
-      </w:r>
-      <w:proofErr w:type="spellStart"/>
-      <w:r>
-        <w:t>intf_data</w:t>
-      </w:r>
-      <w:proofErr w:type="spellEnd"/>
-      <w:r>
-        <w:t xml:space="preserve"> #}</w:t>
-      </w:r>
-      <w:r>
-        <w:t xml:space="preserve"> </w:t>
+        <w:t xml:space="preserve"> res.rule_name == "FortiGate" %}</w:t>
       </w:r>
     </w:p>
     <w:p>
@@ -1835,34 +270,124 @@
         <w:t>p</w:t>
       </w:r>
       <w:r>
-        <w:t xml:space="preserve"> </w:t>
+        <w:t xml:space="preserve"> if res.error %}</w:t>
       </w:r>
-      <w:proofErr w:type="gramStart"/>
+    </w:p>
+    <w:p>
       <w:r>
-        <w:t>endif %</w:t>
+        <w:t>Error: {{ res.error }}</w:t>
+      </w:r>
+    </w:p>
+    <w:p>
+      <w:r>
+        <w:lastRenderedPageBreak/>
+        <w:t>{%</w:t>
       </w:r>
       <w:r>
-        <w:t>}</w:t>
+        <w:t>p</w:t>
       </w:r>
       <w:r>
-        <w:t xml:space="preserve"> </w:t>
+        <w:t xml:space="preserve"> else %}</w:t>
+      </w:r>
+    </w:p>
+    <w:p>
+      <w:r>
+        <w:t>{%p for intf_key, intf_data in res.wan_status.items() %}</w:t>
+      </w:r>
+    </w:p>
+    <w:p>
+      <w:r>
+        <w:t>{%p if intf_data.ip or 'DOWN' not in intf_data.status %}</w:t>
+      </w:r>
+    </w:p>
+    <w:p>
+      <w:r>
+        <w:t>{% set isp_map = {'WAN1': 'ISP1', 'WAN2': 'ISP2'} %}{% set isp_name = isp_map.get(intf_key, intf_key) %}{{ isp_name }} ({{ intf_key }})</w:t>
       </w:r>
       <w:r>
-        <w:t>{#</w:t>
+        <w:t xml:space="preserve"> Link Status</w:t>
       </w:r>
-      <w:proofErr w:type="gramEnd"/>
       <w:r>
-        <w:t xml:space="preserve"> CLOSES: if </w:t>
+        <w:t xml:space="preserve">: {% if intf_data.ip %}{{ intf_data.ip }}{% endif %} ({{ intf_data.status }}{% if 'DOWN' in intf_data.status %} </w:t>
       </w:r>
-      <w:proofErr w:type="spellStart"/>
-      <w:proofErr w:type="gramStart"/>
       <w:r>
-        <w:t>res.error</w:t>
+        <w:rPr>
+          <w:rFonts w:ascii="Segoe UI Emoji" w:hAnsi="Segoe UI Emoji" w:cs="Segoe UI Emoji"/>
+        </w:rPr>
+        <w:t>❌</w:t>
       </w:r>
-      <w:proofErr w:type="spellEnd"/>
-      <w:proofErr w:type="gramEnd"/>
       <w:r>
-        <w:t xml:space="preserve"> #}</w:t>
+        <w:t>{% endif %})</w:t>
+      </w:r>
+    </w:p>
+    <w:p>
+      <w:r>
+        <w:t>{%p if intf_data.ping_interface %}</w:t>
+      </w:r>
+    </w:p>
+    <w:p>
+      <w:r>
+        <w:t>{% if intf_data.latency %}{% set ping = intf_data.latency|int %}Gateway</w:t>
+      </w:r>
+      <w:r>
+        <w:t xml:space="preserve"> Latency</w:t>
+      </w:r>
+      <w:r>
+        <w:t xml:space="preserve"> ({{ intf_data.gw }}): {{ ping }}ms ({% if ping &lt;= 50 %}Ok </w:t>
+      </w:r>
+      <w:r>
+        <w:rPr>
+          <w:rFonts w:ascii="Segoe UI Emoji" w:hAnsi="Segoe UI Emoji" w:cs="Segoe UI Emoji"/>
+          <w:lang w:val="pt-BR"/>
+        </w:rPr>
+        <w:t>🟢</w:t>
+      </w:r>
+      <w:r>
+        <w:t xml:space="preserve">{% elif ping &lt;= 150 %}Warning </w:t>
+      </w:r>
+      <w:r>
+        <w:rPr>
+          <w:rFonts w:ascii="Segoe UI Emoji" w:hAnsi="Segoe UI Emoji" w:cs="Segoe UI Emoji"/>
+          <w:lang w:val="pt-BR"/>
+        </w:rPr>
+        <w:t>🟡</w:t>
+      </w:r>
+      <w:r>
+        <w:t xml:space="preserve">{% else %}Critical </w:t>
+      </w:r>
+      <w:r>
+        <w:rPr>
+          <w:rFonts w:ascii="Segoe UI Emoji" w:hAnsi="Segoe UI Emoji" w:cs="Segoe UI Emoji"/>
+          <w:lang w:val="pt-BR"/>
+        </w:rPr>
+        <w:t>🔴</w:t>
+      </w:r>
+      <w:r>
+        <w:t xml:space="preserve">{% endif %}){% else %}(Ping Timeout </w:t>
+      </w:r>
+      <w:r>
+        <w:rPr>
+          <w:rFonts w:ascii="Segoe UI Emoji" w:hAnsi="Segoe UI Emoji" w:cs="Segoe UI Emoji"/>
+        </w:rPr>
+        <w:t>❌</w:t>
+      </w:r>
+      <w:r>
+        <w:t>){% endif %}</w:t>
+      </w:r>
+    </w:p>
+    <w:p>
+      <w:r>
+        <w:t>{%p endif %}</w:t>
+      </w:r>
+    </w:p>
+    <w:p>
+      <w:r>
+        <w:t>{%p endif %}</w:t>
+      </w:r>
+    </w:p>
+    <w:p>
+      <w:r>
+        <w:t xml:space="preserve">{%p endfor %} {# CLOSES: for intf_key, intf_data #} </w:t>
       </w:r>
     </w:p>
     <w:p>
@@ -1873,111 +398,17 @@
         <w:t>p</w:t>
       </w:r>
       <w:r>
-        <w:t xml:space="preserve"> </w:t>
+        <w:t xml:space="preserve"> endif %</w:t>
       </w:r>
-      <w:proofErr w:type="gramStart"/>
       <w:r>
-        <w:t>endif %}</w:t>
+        <w:t>}</w:t>
       </w:r>
       <w:r>
         <w:t xml:space="preserve"> </w:t>
       </w:r>
       <w:r>
-        <w:t>{#</w:t>
+        <w:t>{# CLOSES: if res.error #}</w:t>
       </w:r>
-      <w:proofErr w:type="gramEnd"/>
-      <w:r>
-        <w:t xml:space="preserve"> CLOSES: if </w:t>
-      </w:r>
-      <w:proofErr w:type="spellStart"/>
-      <w:proofErr w:type="gramStart"/>
-      <w:r>
-        <w:t>res.rule</w:t>
-      </w:r>
-      <w:proofErr w:type="gramEnd"/>
-      <w:r>
-        <w:t>_name</w:t>
-      </w:r>
-      <w:proofErr w:type="spellEnd"/>
-      <w:r>
-        <w:t xml:space="preserve"> in ['Switch', 'Access Point</w:t>
-      </w:r>
-      <w:proofErr w:type="gramStart"/>
-      <w:r>
-        <w:t>'] #}</w:t>
-      </w:r>
-      <w:proofErr w:type="gramEnd"/>
-    </w:p>
-    <w:p>
-      <w:r>
-        <w:t xml:space="preserve">{%p if </w:t>
-      </w:r>
-      <w:proofErr w:type="spellStart"/>
-      <w:proofErr w:type="gramStart"/>
-      <w:r>
-        <w:t>res.screenshot</w:t>
-      </w:r>
-      <w:proofErr w:type="spellEnd"/>
-      <w:proofErr w:type="gramEnd"/>
-      <w:r>
-        <w:t xml:space="preserve"> %}</w:t>
-      </w:r>
-    </w:p>
-    <w:p>
-      <w:r>
-        <w:t>Evidence (Screenshot):</w:t>
-      </w:r>
-    </w:p>
-    <w:p>
-      <w:proofErr w:type="gramStart"/>
-      <w:r>
-        <w:t xml:space="preserve">{{ </w:t>
-      </w:r>
-      <w:proofErr w:type="spellStart"/>
-      <w:r>
-        <w:t>res</w:t>
-      </w:r>
-      <w:proofErr w:type="gramEnd"/>
-      <w:r>
-        <w:t>.</w:t>
-      </w:r>
-      <w:proofErr w:type="gramStart"/>
-      <w:r>
-        <w:t>screenshot</w:t>
-      </w:r>
-      <w:proofErr w:type="spellEnd"/>
-      <w:r>
-        <w:t xml:space="preserve"> }</w:t>
-      </w:r>
-      <w:proofErr w:type="gramEnd"/>
-      <w:r>
-        <w:t>}</w:t>
-      </w:r>
-    </w:p>
-    <w:p>
-      <w:r>
-        <w:t xml:space="preserve">{%p </w:t>
-      </w:r>
-      <w:proofErr w:type="gramStart"/>
-      <w:r>
-        <w:t>else %}</w:t>
-      </w:r>
-      <w:proofErr w:type="gramEnd"/>
-    </w:p>
-    <w:p>
-      <w:r>
-        <w:t>No evidence image available.</w:t>
-      </w:r>
-    </w:p>
-    <w:p>
-      <w:r>
-        <w:t xml:space="preserve">{%p </w:t>
-      </w:r>
-      <w:proofErr w:type="gramStart"/>
-      <w:r>
-        <w:t>endif %}</w:t>
-      </w:r>
-      <w:proofErr w:type="gramEnd"/>
     </w:p>
     <w:p>
       <w:r>
@@ -1987,18 +418,55 @@
         <w:t>p</w:t>
       </w:r>
       <w:r>
+        <w:t xml:space="preserve"> endif %}</w:t>
+      </w:r>
+      <w:r>
         <w:t xml:space="preserve"> </w:t>
       </w:r>
-      <w:proofErr w:type="spellStart"/>
-      <w:proofErr w:type="gramStart"/>
       <w:r>
-        <w:t>endfor</w:t>
+        <w:t>{# CLOSES: if res.rule_name in ['Switch', 'Access Point'] #}</w:t>
       </w:r>
-      <w:proofErr w:type="spellEnd"/>
+    </w:p>
+    <w:p>
       <w:r>
-        <w:t xml:space="preserve"> %}</w:t>
+        <w:t>{%p if res.screenshot %}</w:t>
       </w:r>
-      <w:proofErr w:type="gramEnd"/>
+    </w:p>
+    <w:p>
+      <w:r>
+        <w:t>Evidence (Screenshot):</w:t>
+      </w:r>
+    </w:p>
+    <w:p>
+      <w:r>
+        <w:t>{{ res.screenshot }}</w:t>
+      </w:r>
+    </w:p>
+    <w:p>
+      <w:r>
+        <w:t>{%p else %}</w:t>
+      </w:r>
+    </w:p>
+    <w:p>
+      <w:r>
+        <w:t>No evidence image available.</w:t>
+      </w:r>
+    </w:p>
+    <w:p>
+      <w:r>
+        <w:t>{%p endif %}</w:t>
+      </w:r>
+    </w:p>
+    <w:p>
+      <w:r>
+        <w:t>{%</w:t>
+      </w:r>
+      <w:r>
+        <w:t>p</w:t>
+      </w:r>
+      <w:r>
+        <w:t xml:space="preserve"> endfor %}</w:t>
+      </w:r>
     </w:p>
     <w:sectPr>
       <w:pgSz w:w="12240" w:h="15840"/>
@@ -2816,7 +1284,6 @@
   <w:style w:type="character" w:default="1" w:styleId="Fontepargpadro">
     <w:name w:val="Default Paragraph Font"/>
     <w:uiPriority w:val="1"/>
-    <w:semiHidden/>
     <w:unhideWhenUsed/>
   </w:style>
   <w:style w:type="table" w:default="1" w:styleId="Tabelanormal">

</xml_diff>

<commit_message>
Update default Word templates and config examples
</commit_message>
<xml_diff>
--- a/template_en.example.docx
+++ b/template_en.example.docx
@@ -12,126 +12,191 @@
     </w:p>
     <w:p>
       <w:pPr>
-        <w:keepNext/>
-        <w:keepLines/>
-        <w:spacing w:before="480" w:after="0"/>
-        <w:outlineLvl w:val="0"/>
-        <w:rPr>
-          <w:rFonts w:ascii="Calibri" w:eastAsia="MS Gothic" w:hAnsi="Calibri" w:cs="Times New Roman"/>
-          <w:b/>
-          <w:bCs/>
-          <w:color w:val="365F91" w:themeColor="accent1" w:themeShade="BF"/>
-          <w:sz w:val="28"/>
-          <w:szCs w:val="28"/>
-        </w:rPr>
+        <w:pStyle w:val="Ttulo1"/>
       </w:pPr>
       <w:r>
-        <w:rPr>
-          <w:rFonts w:ascii="Calibri" w:eastAsia="MS Gothic" w:hAnsi="Calibri" w:cs="Times New Roman"/>
-          <w:b/>
-          <w:bCs/>
-          <w:color w:val="365F91" w:themeColor="accent1" w:themeShade="BF"/>
-          <w:sz w:val="28"/>
-          <w:szCs w:val="28"/>
-        </w:rPr>
         <w:t>Sum</w:t>
       </w:r>
       <w:r>
-        <w:rPr>
-          <w:rFonts w:ascii="Calibri" w:eastAsia="MS Gothic" w:hAnsi="Calibri" w:cs="Times New Roman"/>
-          <w:b/>
-          <w:bCs/>
-          <w:color w:val="365F91" w:themeColor="accent1" w:themeShade="BF"/>
-          <w:sz w:val="28"/>
-          <w:szCs w:val="28"/>
-        </w:rPr>
         <w:t>mary</w:t>
       </w:r>
     </w:p>
     <w:p>
       <w:pPr>
-        <w:rPr>
-          <w:rFonts w:ascii="Cambria" w:eastAsia="MS Mincho" w:hAnsi="Cambria" w:cs="Times New Roman"/>
+        <w:spacing w:after="0"/>
+      </w:pPr>
+    </w:p>
+    <w:p>
+      <w:pPr>
+        <w:rPr>
+          <w:rFonts w:asciiTheme="majorHAnsi" w:hAnsiTheme="majorHAnsi" w:cstheme="majorHAnsi"/>
         </w:rPr>
       </w:pPr>
       <w:r>
         <w:rPr>
-          <w:rFonts w:ascii="Segoe UI Emoji" w:eastAsia="MS Mincho" w:hAnsi="Segoe UI Emoji" w:cs="Segoe UI Emoji"/>
+          <w:rFonts w:ascii="Segoe UI Emoji" w:hAnsi="Segoe UI Emoji" w:cs="Segoe UI Emoji"/>
         </w:rPr>
         <w:t>🟢</w:t>
       </w:r>
       <w:r>
         <w:rPr>
-          <w:rFonts w:ascii="Cambria" w:eastAsia="MS Mincho" w:hAnsi="Cambria" w:cs="Times New Roman"/>
-        </w:rPr>
-        <w:t xml:space="preserve"> Ok (Ping ≤ 50ms): {{ results | rejectattr('latency', 'equalto', '') | selectattr('latency', 'le', 50) | list | length }}</w:t>
+          <w:rFonts w:asciiTheme="majorHAnsi" w:hAnsiTheme="majorHAnsi" w:cstheme="majorHAnsi"/>
+        </w:rPr>
+        <w:t xml:space="preserve"> </w:t>
+      </w:r>
+      <w:r>
+        <w:rPr>
+          <w:rFonts w:asciiTheme="majorHAnsi" w:hAnsiTheme="majorHAnsi" w:cstheme="majorHAnsi"/>
+          <w:b/>
+          <w:bCs/>
+          <w:color w:val="00B050"/>
+        </w:rPr>
+        <w:t>Ok</w:t>
+      </w:r>
+      <w:r>
+        <w:rPr>
+          <w:rFonts w:asciiTheme="majorHAnsi" w:hAnsiTheme="majorHAnsi" w:cstheme="majorHAnsi"/>
+        </w:rPr>
+        <w:t xml:space="preserve"> (Ping ≤ 50ms): {{ results | rejectattr('latency', 'equalto', '') | selectattr('latency', 'le', 50) | list | length }}</w:t>
       </w:r>
     </w:p>
     <w:p>
       <w:pPr>
         <w:rPr>
-          <w:rFonts w:ascii="Cambria" w:eastAsia="MS Mincho" w:hAnsi="Cambria" w:cs="Times New Roman"/>
+          <w:rFonts w:asciiTheme="majorHAnsi" w:hAnsiTheme="majorHAnsi" w:cstheme="majorHAnsi"/>
         </w:rPr>
       </w:pPr>
       <w:r>
         <w:rPr>
-          <w:rFonts w:ascii="Segoe UI Emoji" w:eastAsia="MS Mincho" w:hAnsi="Segoe UI Emoji" w:cs="Segoe UI Emoji"/>
+          <w:rFonts w:ascii="Segoe UI Emoji" w:hAnsi="Segoe UI Emoji" w:cs="Segoe UI Emoji"/>
         </w:rPr>
         <w:t>🟡</w:t>
       </w:r>
       <w:r>
         <w:rPr>
-          <w:rFonts w:ascii="Cambria" w:eastAsia="MS Mincho" w:hAnsi="Cambria" w:cs="Times New Roman"/>
-        </w:rPr>
-        <w:t xml:space="preserve"> Warning (Ping 50ms ≤ 150ms): {{ results | rejectattr('latency', 'equalto', '') | selectattr('latency', 'gt', 50) | selectattr('latency', 'le', 150) | list | length }}{% set warns = results | rejectattr('latency', 'equalto', '') | selectattr('latency', 'gt', 50) | selectattr('latency', 'le', 150) | map(attribute='host') | list %}{% if warns|length &gt; 0 %} ({{ warns | join(', ') }}){% endif %}</w:t>
+          <w:rFonts w:asciiTheme="majorHAnsi" w:hAnsiTheme="majorHAnsi" w:cstheme="majorHAnsi"/>
+        </w:rPr>
+        <w:t xml:space="preserve"> </w:t>
+      </w:r>
+      <w:r>
+        <w:rPr>
+          <w:rFonts w:asciiTheme="majorHAnsi" w:hAnsiTheme="majorHAnsi" w:cstheme="majorHAnsi"/>
+          <w:b/>
+          <w:bCs/>
+          <w:color w:val="FFC000"/>
+        </w:rPr>
+        <w:t>Warning</w:t>
+      </w:r>
+      <w:r>
+        <w:rPr>
+          <w:rFonts w:asciiTheme="majorHAnsi" w:hAnsiTheme="majorHAnsi" w:cstheme="majorHAnsi"/>
+          <w:color w:val="FFC000"/>
+        </w:rPr>
+        <w:t xml:space="preserve"> </w:t>
+      </w:r>
+      <w:r>
+        <w:rPr>
+          <w:rFonts w:asciiTheme="majorHAnsi" w:hAnsiTheme="majorHAnsi" w:cstheme="majorHAnsi"/>
+        </w:rPr>
+        <w:t>(Ping 50ms ≤ 150ms): {{ results | rejectattr('latency', 'equalto', '') | selectattr('latency', 'gt', 50) | selectattr('latency', 'le', 150) | list | length }}{% set warns = results | rejectattr('latency', 'equalto', '') | selectattr('latency', 'gt', 50) | selectattr('latency', 'le', 150) | map(attribute='host') | list %}{% if warns|length &gt; 0 %} ({{ warns | join(', ') }}){% endif %}</w:t>
       </w:r>
     </w:p>
     <w:p>
       <w:pPr>
         <w:rPr>
-          <w:rFonts w:ascii="Cambria" w:eastAsia="MS Mincho" w:hAnsi="Cambria" w:cs="Times New Roman"/>
+          <w:rFonts w:asciiTheme="majorHAnsi" w:hAnsiTheme="majorHAnsi" w:cstheme="majorHAnsi"/>
         </w:rPr>
       </w:pPr>
       <w:r>
         <w:rPr>
-          <w:rFonts w:ascii="Segoe UI Emoji" w:eastAsia="MS Mincho" w:hAnsi="Segoe UI Emoji" w:cs="Segoe UI Emoji"/>
+          <w:rFonts w:ascii="Segoe UI Emoji" w:hAnsi="Segoe UI Emoji" w:cs="Segoe UI Emoji"/>
         </w:rPr>
         <w:t>🔴</w:t>
       </w:r>
       <w:r>
         <w:rPr>
-          <w:rFonts w:ascii="Cambria" w:eastAsia="MS Mincho" w:hAnsi="Cambria" w:cs="Times New Roman"/>
-        </w:rPr>
-        <w:t xml:space="preserve"> Critical (Ping ≥ 150ms): {{ results | rejectattr('latency', 'equalto', '') | selectattr('latency', 'gt', 150) | list | length }}{% set crits = results | rejectattr('latency', 'equalto', '') | selectattr('latency', 'gt', 150) | map(attribute='host') | list %}{% if crits|length &gt; 0 %} ({{ crits | join(', ') }}){% endif %}</w:t>
+          <w:rFonts w:asciiTheme="majorHAnsi" w:hAnsiTheme="majorHAnsi" w:cstheme="majorHAnsi"/>
+        </w:rPr>
+        <w:t xml:space="preserve"> </w:t>
+      </w:r>
+      <w:r>
+        <w:rPr>
+          <w:rFonts w:asciiTheme="majorHAnsi" w:hAnsiTheme="majorHAnsi" w:cstheme="majorHAnsi"/>
+          <w:b/>
+          <w:bCs/>
+          <w:color w:val="FF0000"/>
+        </w:rPr>
+        <w:t>Critical</w:t>
+      </w:r>
+      <w:r>
+        <w:rPr>
+          <w:rFonts w:asciiTheme="majorHAnsi" w:hAnsiTheme="majorHAnsi" w:cstheme="majorHAnsi"/>
+          <w:color w:val="FF0000"/>
+        </w:rPr>
+        <w:t xml:space="preserve"> </w:t>
+      </w:r>
+      <w:r>
+        <w:rPr>
+          <w:rFonts w:asciiTheme="majorHAnsi" w:hAnsiTheme="majorHAnsi" w:cstheme="majorHAnsi"/>
+        </w:rPr>
+        <w:t>(Ping ≥ 150ms): {{ results | rejectattr('latency', 'equalto', '') | selectattr('latency', 'gt', 150) | list | length }}{% set crits = results | rejectattr('latency', 'equalto', '') | selectattr('latency', 'gt', 150) | map(attribute='host') | list %}{% if crits|length &gt; 0 %} ({{ crits | join(', ') }}){% endif %}</w:t>
       </w:r>
     </w:p>
     <w:p>
       <w:pPr>
         <w:rPr>
-          <w:rFonts w:ascii="Cambria" w:eastAsia="MS Mincho" w:hAnsi="Cambria" w:cs="Times New Roman"/>
+          <w:rFonts w:asciiTheme="majorHAnsi" w:hAnsiTheme="majorHAnsi" w:cstheme="majorHAnsi"/>
         </w:rPr>
       </w:pPr>
       <w:r>
         <w:rPr>
-          <w:rFonts w:ascii="Segoe UI Emoji" w:eastAsia="MS Mincho" w:hAnsi="Segoe UI Emoji" w:cs="Segoe UI Emoji"/>
+          <w:rFonts w:ascii="Segoe UI Emoji" w:hAnsi="Segoe UI Emoji" w:cs="Segoe UI Emoji"/>
         </w:rPr>
         <w:t>❌</w:t>
       </w:r>
       <w:r>
         <w:rPr>
-          <w:rFonts w:ascii="Cambria" w:eastAsia="MS Mincho" w:hAnsi="Cambria" w:cs="Times New Roman"/>
-        </w:rPr>
-        <w:t xml:space="preserve"> Ping Timeout: {{ results | selectattr('latency', 'equalto', '') | list | length }}{% set timeouts = results | selectattr('latency', 'equalto', '') | map(attribute='host') | list %}{% if timeouts|length &gt; 0 %} ({{ timeouts | join(', ') }}){% endif %}</w:t>
+          <w:rFonts w:asciiTheme="majorHAnsi" w:hAnsiTheme="majorHAnsi" w:cstheme="majorHAnsi"/>
+        </w:rPr>
+        <w:t xml:space="preserve"> </w:t>
+      </w:r>
+      <w:r>
+        <w:rPr>
+          <w:rFonts w:asciiTheme="majorHAnsi" w:hAnsiTheme="majorHAnsi" w:cstheme="majorHAnsi"/>
+          <w:b/>
+          <w:bCs/>
+        </w:rPr>
+        <w:t>Ping Timeout</w:t>
+      </w:r>
+      <w:r>
+        <w:rPr>
+          <w:rFonts w:asciiTheme="majorHAnsi" w:hAnsiTheme="majorHAnsi" w:cstheme="majorHAnsi"/>
+        </w:rPr>
+        <w:t>: {{ results | selectattr('latency', 'equalto', '') | list | length }}{% set timeouts = results | selectattr('latency', 'equalto', '') | map(attribute='host') | list %}{% if timeouts|length &gt; 0 %} ({{ timeouts | join(', ') }}){% endif %}</w:t>
       </w:r>
     </w:p>
     <w:p>
+      <w:pPr>
+        <w:rPr>
+          <w:rFonts w:asciiTheme="majorHAnsi" w:hAnsiTheme="majorHAnsi" w:cstheme="majorHAnsi"/>
+        </w:rPr>
+      </w:pPr>
       <w:r>
+        <w:rPr>
+          <w:rFonts w:asciiTheme="majorHAnsi" w:hAnsiTheme="majorHAnsi" w:cstheme="majorHAnsi"/>
+        </w:rPr>
         <w:t>{%</w:t>
       </w:r>
       <w:r>
+        <w:rPr>
+          <w:rFonts w:asciiTheme="majorHAnsi" w:hAnsiTheme="majorHAnsi" w:cstheme="majorHAnsi"/>
+        </w:rPr>
         <w:t>p</w:t>
       </w:r>
       <w:r>
+        <w:rPr>
+          <w:rFonts w:asciiTheme="majorHAnsi" w:hAnsiTheme="majorHAnsi" w:cstheme="majorHAnsi"/>
+        </w:rPr>
         <w:t xml:space="preserve"> for res in results %}</w:t>
       </w:r>
     </w:p>
@@ -143,43 +208,70 @@
         <w:t>{{ res.rule_name }}: {{ res.host }}</w:t>
       </w:r>
     </w:p>
+    <w:p/>
     <w:p>
+      <w:pPr>
+        <w:spacing w:after="0"/>
+        <w:rPr>
+          <w:rFonts w:asciiTheme="majorHAnsi" w:hAnsiTheme="majorHAnsi" w:cstheme="majorHAnsi"/>
+        </w:rPr>
+      </w:pPr>
       <w:r>
+        <w:rPr>
+          <w:rFonts w:asciiTheme="majorHAnsi" w:hAnsiTheme="majorHAnsi" w:cstheme="majorHAnsi"/>
+        </w:rPr>
         <w:t>{%p if res.rule_name in ['Switch', 'Access Point'] %}</w:t>
       </w:r>
     </w:p>
     <w:p>
+      <w:pPr>
+        <w:spacing w:after="0"/>
+        <w:rPr>
+          <w:rFonts w:asciiTheme="majorHAnsi" w:hAnsiTheme="majorHAnsi" w:cstheme="majorHAnsi"/>
+        </w:rPr>
+      </w:pPr>
       <w:r>
+        <w:rPr>
+          <w:rFonts w:asciiTheme="majorHAnsi" w:hAnsiTheme="majorHAnsi" w:cstheme="majorHAnsi"/>
+        </w:rPr>
         <w:t>{%</w:t>
       </w:r>
       <w:r>
+        <w:rPr>
+          <w:rFonts w:asciiTheme="majorHAnsi" w:hAnsiTheme="majorHAnsi" w:cstheme="majorHAnsi"/>
+        </w:rPr>
         <w:t>p</w:t>
       </w:r>
       <w:r>
-        <w:t xml:space="preserve"> if </w:t>
-      </w:r>
-      <w:r>
-        <w:t>res.latency</w:t>
-      </w:r>
-      <w:r>
-        <w:t xml:space="preserve"> %}</w:t>
+        <w:rPr>
+          <w:rFonts w:asciiTheme="majorHAnsi" w:hAnsiTheme="majorHAnsi" w:cstheme="majorHAnsi"/>
+        </w:rPr>
+        <w:t xml:space="preserve"> if res.latency %}</w:t>
       </w:r>
     </w:p>
     <w:p>
+      <w:pPr>
+        <w:rPr>
+          <w:rFonts w:asciiTheme="majorHAnsi" w:hAnsiTheme="majorHAnsi" w:cstheme="majorHAnsi"/>
+        </w:rPr>
+      </w:pPr>
       <w:r>
-        <w:t xml:space="preserve">{% set ping = </w:t>
+        <w:rPr>
+          <w:rFonts w:asciiTheme="majorHAnsi" w:hAnsiTheme="majorHAnsi" w:cstheme="majorHAnsi"/>
+        </w:rPr>
+        <w:t>{% set ping = res.latency|int %}Lat</w:t>
       </w:r>
       <w:r>
-        <w:t>res.latency</w:t>
-      </w:r>
-      <w:r>
-        <w:t>|int %}Lat</w:t>
-      </w:r>
-      <w:r>
+        <w:rPr>
+          <w:rFonts w:asciiTheme="majorHAnsi" w:hAnsiTheme="majorHAnsi" w:cstheme="majorHAnsi"/>
+        </w:rPr>
         <w:t>ency</w:t>
       </w:r>
       <w:r>
-        <w:t xml:space="preserve">: {{ ping }}ms ({% if ping &lt;= 50 %}Ok </w:t>
+        <w:rPr>
+          <w:rFonts w:asciiTheme="majorHAnsi" w:hAnsiTheme="majorHAnsi" w:cstheme="majorHAnsi"/>
+        </w:rPr>
+        <w:t xml:space="preserve">: {{ ping }}ms {% if ping &lt;= 50 %}Ok </w:t>
       </w:r>
       <w:r>
         <w:rPr>
@@ -188,6 +280,9 @@
         <w:t>🟢</w:t>
       </w:r>
       <w:r>
+        <w:rPr>
+          <w:rFonts w:asciiTheme="majorHAnsi" w:hAnsiTheme="majorHAnsi" w:cstheme="majorHAnsi"/>
+        </w:rPr>
         <w:t xml:space="preserve">{% elif ping &lt;= 150 %}Warning </w:t>
       </w:r>
       <w:r>
@@ -197,6 +292,9 @@
         <w:t>🟡</w:t>
       </w:r>
       <w:r>
+        <w:rPr>
+          <w:rFonts w:asciiTheme="majorHAnsi" w:hAnsiTheme="majorHAnsi" w:cstheme="majorHAnsi"/>
+        </w:rPr>
         <w:t xml:space="preserve">{% else %}Critical </w:t>
       </w:r>
       <w:r>
@@ -206,22 +304,48 @@
         <w:t>🔴</w:t>
       </w:r>
       <w:r>
+        <w:rPr>
+          <w:rFonts w:asciiTheme="majorHAnsi" w:hAnsiTheme="majorHAnsi" w:cstheme="majorHAnsi"/>
+        </w:rPr>
         <w:t>{% endif %})</w:t>
       </w:r>
     </w:p>
     <w:p>
+      <w:pPr>
+        <w:spacing w:after="0"/>
+        <w:rPr>
+          <w:rFonts w:asciiTheme="majorHAnsi" w:hAnsiTheme="majorHAnsi" w:cstheme="majorHAnsi"/>
+        </w:rPr>
+      </w:pPr>
       <w:r>
+        <w:rPr>
+          <w:rFonts w:asciiTheme="majorHAnsi" w:hAnsiTheme="majorHAnsi" w:cstheme="majorHAnsi"/>
+        </w:rPr>
         <w:t>{%</w:t>
       </w:r>
       <w:r>
+        <w:rPr>
+          <w:rFonts w:asciiTheme="majorHAnsi" w:hAnsiTheme="majorHAnsi" w:cstheme="majorHAnsi"/>
+        </w:rPr>
         <w:t>p</w:t>
       </w:r>
       <w:r>
+        <w:rPr>
+          <w:rFonts w:asciiTheme="majorHAnsi" w:hAnsiTheme="majorHAnsi" w:cstheme="majorHAnsi"/>
+        </w:rPr>
         <w:t xml:space="preserve"> else %}</w:t>
       </w:r>
     </w:p>
     <w:p>
+      <w:pPr>
+        <w:rPr>
+          <w:rFonts w:asciiTheme="majorHAnsi" w:hAnsiTheme="majorHAnsi" w:cstheme="majorHAnsi"/>
+        </w:rPr>
+      </w:pPr>
       <w:r>
+        <w:rPr>
+          <w:rFonts w:asciiTheme="majorHAnsi" w:hAnsiTheme="majorHAnsi" w:cstheme="majorHAnsi"/>
+        </w:rPr>
         <w:t xml:space="preserve">(Ping Timeout </w:t>
       </w:r>
       <w:r>
@@ -231,139 +355,440 @@
         <w:t>❌</w:t>
       </w:r>
       <w:r>
+        <w:rPr>
+          <w:rFonts w:asciiTheme="majorHAnsi" w:hAnsiTheme="majorHAnsi" w:cstheme="majorHAnsi"/>
+        </w:rPr>
         <w:t>)</w:t>
       </w:r>
     </w:p>
     <w:p>
+      <w:pPr>
+        <w:spacing w:after="0"/>
+        <w:rPr>
+          <w:rFonts w:asciiTheme="majorHAnsi" w:hAnsiTheme="majorHAnsi" w:cstheme="majorHAnsi"/>
+        </w:rPr>
+      </w:pPr>
       <w:r>
+        <w:rPr>
+          <w:rFonts w:asciiTheme="majorHAnsi" w:hAnsiTheme="majorHAnsi" w:cstheme="majorHAnsi"/>
+        </w:rPr>
         <w:t>{%</w:t>
       </w:r>
       <w:r>
+        <w:rPr>
+          <w:rFonts w:asciiTheme="majorHAnsi" w:hAnsiTheme="majorHAnsi" w:cstheme="majorHAnsi"/>
+        </w:rPr>
         <w:t>p</w:t>
       </w:r>
       <w:r>
+        <w:rPr>
+          <w:rFonts w:asciiTheme="majorHAnsi" w:hAnsiTheme="majorHAnsi" w:cstheme="majorHAnsi"/>
+        </w:rPr>
         <w:t xml:space="preserve"> endif %}</w:t>
       </w:r>
     </w:p>
     <w:p>
+      <w:pPr>
+        <w:spacing w:after="0"/>
+        <w:rPr>
+          <w:rFonts w:asciiTheme="majorHAnsi" w:hAnsiTheme="majorHAnsi" w:cstheme="majorHAnsi"/>
+        </w:rPr>
+      </w:pPr>
       <w:r>
+        <w:rPr>
+          <w:rFonts w:asciiTheme="majorHAnsi" w:hAnsiTheme="majorHAnsi" w:cstheme="majorHAnsi"/>
+        </w:rPr>
+        <w:t>{%p elif res.rule_name == "FortiGate" %}</w:t>
+      </w:r>
+    </w:p>
+    <w:p>
+      <w:pPr>
+        <w:spacing w:after="0"/>
+        <w:rPr>
+          <w:rFonts w:asciiTheme="majorHAnsi" w:hAnsiTheme="majorHAnsi" w:cstheme="majorHAnsi"/>
+        </w:rPr>
+      </w:pPr>
+      <w:r>
+        <w:rPr>
+          <w:rFonts w:asciiTheme="majorHAnsi" w:hAnsiTheme="majorHAnsi" w:cstheme="majorHAnsi"/>
+        </w:rPr>
         <w:t>{%</w:t>
       </w:r>
       <w:r>
+        <w:rPr>
+          <w:rFonts w:asciiTheme="majorHAnsi" w:hAnsiTheme="majorHAnsi" w:cstheme="majorHAnsi"/>
+        </w:rPr>
         <w:t>p</w:t>
       </w:r>
       <w:r>
-        <w:t xml:space="preserve"> </w:t>
-      </w:r>
-      <w:r>
-        <w:t>elif</w:t>
-      </w:r>
-      <w:r>
-        <w:t xml:space="preserve"> res.rule_name == "FortiGate" %}</w:t>
-      </w:r>
-    </w:p>
-    <w:p>
-      <w:r>
-        <w:t>{%</w:t>
-      </w:r>
-      <w:r>
-        <w:t>p</w:t>
-      </w:r>
-      <w:r>
+        <w:rPr>
+          <w:rFonts w:asciiTheme="majorHAnsi" w:hAnsiTheme="majorHAnsi" w:cstheme="majorHAnsi"/>
+        </w:rPr>
         <w:t xml:space="preserve"> if res.error %}</w:t>
       </w:r>
     </w:p>
     <w:p>
+      <w:pPr>
+        <w:rPr>
+          <w:rFonts w:asciiTheme="majorHAnsi" w:hAnsiTheme="majorHAnsi" w:cstheme="majorHAnsi"/>
+        </w:rPr>
+      </w:pPr>
       <w:r>
-        <w:t>Error: {{ res.error }}</w:t>
+        <w:rPr>
+          <w:rFonts w:asciiTheme="majorHAnsi" w:hAnsiTheme="majorHAnsi" w:cstheme="majorHAnsi"/>
+        </w:rPr>
+        <w:t>Erro: {{ res.error }}</w:t>
       </w:r>
     </w:p>
     <w:p>
+      <w:pPr>
+        <w:spacing w:after="0"/>
+        <w:rPr>
+          <w:rFonts w:asciiTheme="majorHAnsi" w:hAnsiTheme="majorHAnsi" w:cstheme="majorHAnsi"/>
+        </w:rPr>
+      </w:pPr>
       <w:r>
-        <w:lastRenderedPageBreak/>
+        <w:rPr>
+          <w:rFonts w:asciiTheme="majorHAnsi" w:hAnsiTheme="majorHAnsi" w:cstheme="majorHAnsi"/>
+        </w:rPr>
         <w:t>{%</w:t>
       </w:r>
       <w:r>
+        <w:rPr>
+          <w:rFonts w:asciiTheme="majorHAnsi" w:hAnsiTheme="majorHAnsi" w:cstheme="majorHAnsi"/>
+        </w:rPr>
         <w:t>p</w:t>
       </w:r>
       <w:r>
+        <w:rPr>
+          <w:rFonts w:asciiTheme="majorHAnsi" w:hAnsiTheme="majorHAnsi" w:cstheme="majorHAnsi"/>
+        </w:rPr>
         <w:t xml:space="preserve"> else %}</w:t>
       </w:r>
     </w:p>
     <w:p>
+      <w:pPr>
+        <w:spacing w:after="0"/>
+        <w:rPr>
+          <w:rFonts w:asciiTheme="majorHAnsi" w:hAnsiTheme="majorHAnsi" w:cstheme="majorHAnsi"/>
+        </w:rPr>
+      </w:pPr>
       <w:r>
+        <w:rPr>
+          <w:rFonts w:asciiTheme="majorHAnsi" w:hAnsiTheme="majorHAnsi" w:cstheme="majorHAnsi"/>
+        </w:rPr>
         <w:t>{%p for intf_key, intf_data in res.wan_status.items() %}</w:t>
       </w:r>
     </w:p>
     <w:p>
+      <w:pPr>
+        <w:spacing w:after="0"/>
+        <w:rPr>
+          <w:rFonts w:asciiTheme="majorHAnsi" w:hAnsiTheme="majorHAnsi" w:cstheme="majorHAnsi"/>
+        </w:rPr>
+      </w:pPr>
       <w:r>
+        <w:rPr>
+          <w:rFonts w:asciiTheme="majorHAnsi" w:hAnsiTheme="majorHAnsi" w:cstheme="majorHAnsi"/>
+        </w:rPr>
         <w:t>{%p if intf_data.ip or 'DOWN' not in intf_data.status %}</w:t>
       </w:r>
     </w:p>
     <w:p>
+      <w:pPr>
+        <w:spacing w:after="0"/>
+        <w:rPr>
+          <w:rFonts w:asciiTheme="majorHAnsi" w:hAnsiTheme="majorHAnsi" w:cstheme="majorHAnsi"/>
+        </w:rPr>
+      </w:pPr>
       <w:r>
-        <w:t>{% set isp_map = {'WAN1': 'ISP1', 'WAN2': 'ISP2'} %}{% set isp_name = isp_map.get(intf_key, intf_key) %}{{ isp_name }} ({{ intf_key }})</w:t>
+        <w:rPr>
+          <w:rFonts w:asciiTheme="majorHAnsi" w:hAnsiTheme="majorHAnsi" w:cstheme="majorHAnsi"/>
+        </w:rPr>
+        <w:lastRenderedPageBreak/>
+        <w:t>{% set isp_map = {'WAN1': 'ISP1', 'WAN2': 'ISP2'} %}{% set isp_name = isp_map.get(intf_key, intf_key) %}</w:t>
       </w:r>
       <w:r>
-        <w:t xml:space="preserve"> Link Status</w:t>
+        <w:rPr>
+          <w:rStyle w:val="Ttulo3Char"/>
+        </w:rPr>
+        <w:t>{{ isp_name }}</w:t>
       </w:r>
       <w:r>
-        <w:t xml:space="preserve">: {% if intf_data.ip %}{{ intf_data.ip }}{% endif %} ({{ intf_data.status }}{% if 'DOWN' in intf_data.status %} </w:t>
+        <w:rPr>
+          <w:rStyle w:val="Ttulo3Char"/>
+        </w:rPr>
+        <w:t xml:space="preserve"> Interface</w:t>
       </w:r>
       <w:r>
         <w:rPr>
-          <w:rFonts w:ascii="Segoe UI Emoji" w:hAnsi="Segoe UI Emoji" w:cs="Segoe UI Emoji"/>
-        </w:rPr>
-        <w:t>❌</w:t>
-      </w:r>
-      <w:r>
-        <w:t>{% endif %})</w:t>
+          <w:rStyle w:val="Ttulo3Char"/>
+        </w:rPr>
+        <w:t xml:space="preserve"> ({{ intf_key }})</w:t>
       </w:r>
     </w:p>
     <w:p>
+      <w:pPr>
+        <w:spacing w:after="0"/>
+        <w:rPr>
+          <w:rFonts w:asciiTheme="majorHAnsi" w:hAnsiTheme="majorHAnsi" w:cstheme="majorHAnsi"/>
+        </w:rPr>
+      </w:pPr>
       <w:r>
+        <w:rPr>
+          <w:rFonts w:asciiTheme="majorHAnsi" w:hAnsiTheme="majorHAnsi" w:cstheme="majorHAnsi"/>
+        </w:rPr>
+        <w:t>{% if intf_data.ip %}</w:t>
+      </w:r>
+      <w:r>
+        <w:rPr>
+          <w:rFonts w:asciiTheme="majorHAnsi" w:hAnsiTheme="majorHAnsi" w:cstheme="majorHAnsi"/>
+        </w:rPr>
+        <w:t>IP</w:t>
+      </w:r>
+      <w:r>
+        <w:rPr>
+          <w:rFonts w:asciiTheme="majorHAnsi" w:hAnsiTheme="majorHAnsi" w:cstheme="majorHAnsi"/>
+        </w:rPr>
+        <w:t xml:space="preserve"> Address</w:t>
+      </w:r>
+      <w:r>
+        <w:rPr>
+          <w:rFonts w:asciiTheme="majorHAnsi" w:hAnsiTheme="majorHAnsi" w:cstheme="majorHAnsi"/>
+        </w:rPr>
+        <w:t xml:space="preserve">: </w:t>
+      </w:r>
+      <w:r>
+        <w:rPr>
+          <w:rFonts w:asciiTheme="majorHAnsi" w:hAnsiTheme="majorHAnsi" w:cstheme="majorHAnsi"/>
+        </w:rPr>
+        <w:t xml:space="preserve">{{ intf_data.ip }}{% endif %} </w:t>
+      </w:r>
+      <w:r>
+        <w:rPr>
+          <w:rFonts w:asciiTheme="majorHAnsi" w:hAnsiTheme="majorHAnsi" w:cstheme="majorHAnsi"/>
+        </w:rPr>
+        <w:t>{% if 'UP' in intf_data.status %}</w:t>
+      </w:r>
+      <w:r>
+        <w:rPr>
+          <w:rFonts w:asciiTheme="majorHAnsi" w:hAnsiTheme="majorHAnsi" w:cstheme="majorHAnsi"/>
+          <w:noProof/>
+        </w:rPr>
+        <w:drawing>
+          <wp:inline distT="0" distB="0" distL="0" distR="0" wp14:anchorId="059B7014" wp14:editId="54EB24EE">
+            <wp:extent cx="152400" cy="152400"/>
+            <wp:effectExtent l="0" t="0" r="0" b="0"/>
+            <wp:docPr id="723476421" name="Imagem 1"/>
+            <wp:cNvGraphicFramePr>
+              <a:graphicFrameLocks xmlns:a="http://schemas.openxmlformats.org/drawingml/2006/main" noChangeAspect="1"/>
+            </wp:cNvGraphicFramePr>
+            <a:graphic xmlns:a="http://schemas.openxmlformats.org/drawingml/2006/main">
+              <a:graphicData uri="http://schemas.openxmlformats.org/drawingml/2006/picture">
+                <pic:pic xmlns:pic="http://schemas.openxmlformats.org/drawingml/2006/picture">
+                  <pic:nvPicPr>
+                    <pic:cNvPr id="0" name="Picture 1"/>
+                    <pic:cNvPicPr>
+                      <a:picLocks noChangeAspect="1" noChangeArrowheads="1"/>
+                    </pic:cNvPicPr>
+                  </pic:nvPicPr>
+                  <pic:blipFill>
+                    <a:blip r:embed="rId6">
+                      <a:extLst>
+                        <a:ext uri="{28A0092B-C50C-407E-A947-70E740481C1C}">
+                          <a14:useLocalDpi xmlns:a14="http://schemas.microsoft.com/office/drawing/2010/main" val="0"/>
+                        </a:ext>
+                      </a:extLst>
+                    </a:blip>
+                    <a:srcRect/>
+                    <a:stretch>
+                      <a:fillRect/>
+                    </a:stretch>
+                  </pic:blipFill>
+                  <pic:spPr bwMode="auto">
+                    <a:xfrm>
+                      <a:off x="0" y="0"/>
+                      <a:ext cx="152400" cy="152400"/>
+                    </a:xfrm>
+                    <a:prstGeom prst="rect">
+                      <a:avLst/>
+                    </a:prstGeom>
+                    <a:noFill/>
+                    <a:ln>
+                      <a:noFill/>
+                    </a:ln>
+                  </pic:spPr>
+                </pic:pic>
+              </a:graphicData>
+            </a:graphic>
+          </wp:inline>
+        </w:drawing>
+      </w:r>
+      <w:r>
+        <w:rPr>
+          <w:rFonts w:asciiTheme="majorHAnsi" w:hAnsiTheme="majorHAnsi" w:cstheme="majorHAnsi"/>
+        </w:rPr>
+        <w:t>{% endif %}</w:t>
+      </w:r>
+      <w:r>
+        <w:rPr>
+          <w:rFonts w:asciiTheme="majorHAnsi" w:hAnsiTheme="majorHAnsi" w:cstheme="majorHAnsi"/>
+        </w:rPr>
+        <w:t>{% if 'DOWN' in intf_data.status %}</w:t>
+      </w:r>
+      <w:r>
+        <w:rPr>
+          <w:rFonts w:asciiTheme="majorHAnsi" w:hAnsiTheme="majorHAnsi" w:cstheme="majorHAnsi"/>
+          <w:noProof/>
+        </w:rPr>
+        <w:drawing>
+          <wp:inline distT="0" distB="0" distL="0" distR="0" wp14:anchorId="3C3F1FF2" wp14:editId="1DE60D42">
+            <wp:extent cx="152400" cy="152400"/>
+            <wp:effectExtent l="0" t="0" r="0" b="0"/>
+            <wp:docPr id="182736317" name="Imagem 2"/>
+            <wp:cNvGraphicFramePr>
+              <a:graphicFrameLocks xmlns:a="http://schemas.openxmlformats.org/drawingml/2006/main" noChangeAspect="1"/>
+            </wp:cNvGraphicFramePr>
+            <a:graphic xmlns:a="http://schemas.openxmlformats.org/drawingml/2006/main">
+              <a:graphicData uri="http://schemas.openxmlformats.org/drawingml/2006/picture">
+                <pic:pic xmlns:pic="http://schemas.openxmlformats.org/drawingml/2006/picture">
+                  <pic:nvPicPr>
+                    <pic:cNvPr id="0" name="Picture 3"/>
+                    <pic:cNvPicPr>
+                      <a:picLocks noChangeAspect="1" noChangeArrowheads="1"/>
+                    </pic:cNvPicPr>
+                  </pic:nvPicPr>
+                  <pic:blipFill>
+                    <a:blip r:embed="rId7">
+                      <a:extLst>
+                        <a:ext uri="{28A0092B-C50C-407E-A947-70E740481C1C}">
+                          <a14:useLocalDpi xmlns:a14="http://schemas.microsoft.com/office/drawing/2010/main" val="0"/>
+                        </a:ext>
+                      </a:extLst>
+                    </a:blip>
+                    <a:srcRect/>
+                    <a:stretch>
+                      <a:fillRect/>
+                    </a:stretch>
+                  </pic:blipFill>
+                  <pic:spPr bwMode="auto">
+                    <a:xfrm>
+                      <a:off x="0" y="0"/>
+                      <a:ext cx="152400" cy="152400"/>
+                    </a:xfrm>
+                    <a:prstGeom prst="rect">
+                      <a:avLst/>
+                    </a:prstGeom>
+                    <a:noFill/>
+                    <a:ln>
+                      <a:noFill/>
+                    </a:ln>
+                  </pic:spPr>
+                </pic:pic>
+              </a:graphicData>
+            </a:graphic>
+          </wp:inline>
+        </w:drawing>
+      </w:r>
+      <w:r>
+        <w:rPr>
+          <w:rFonts w:asciiTheme="majorHAnsi" w:hAnsiTheme="majorHAnsi" w:cstheme="majorHAnsi"/>
+        </w:rPr>
+        <w:t>{% endif %}</w:t>
+      </w:r>
+    </w:p>
+    <w:p>
+      <w:pPr>
+        <w:spacing w:after="0"/>
+        <w:rPr>
+          <w:rFonts w:asciiTheme="majorHAnsi" w:hAnsiTheme="majorHAnsi" w:cstheme="majorHAnsi"/>
+        </w:rPr>
+      </w:pPr>
+      <w:r>
+        <w:rPr>
+          <w:rFonts w:asciiTheme="majorHAnsi" w:hAnsiTheme="majorHAnsi" w:cstheme="majorHAnsi"/>
+        </w:rPr>
         <w:t>{%p if intf_data.ping_interface %}</w:t>
       </w:r>
     </w:p>
     <w:p>
+      <w:pPr>
+        <w:spacing w:after="0"/>
+        <w:rPr>
+          <w:rFonts w:asciiTheme="majorHAnsi" w:hAnsiTheme="majorHAnsi" w:cstheme="majorHAnsi"/>
+        </w:rPr>
+      </w:pPr>
       <w:r>
-        <w:t>{% if intf_data.latency %}{% set ping = intf_data.latency|int %}Gateway</w:t>
+        <w:rPr>
+          <w:rFonts w:asciiTheme="majorHAnsi" w:hAnsiTheme="majorHAnsi" w:cstheme="majorHAnsi"/>
+        </w:rPr>
+        <w:t>{% if intf_data.latency %}</w:t>
       </w:r>
       <w:r>
+        <w:rPr>
+          <w:rFonts w:asciiTheme="majorHAnsi" w:hAnsiTheme="majorHAnsi" w:cstheme="majorHAnsi"/>
+        </w:rPr>
+        <w:t>Gateway</w:t>
+      </w:r>
+      <w:r>
+        <w:rPr>
+          <w:rFonts w:asciiTheme="majorHAnsi" w:hAnsiTheme="majorHAnsi" w:cstheme="majorHAnsi"/>
+        </w:rPr>
         <w:t xml:space="preserve"> Latency</w:t>
       </w:r>
       <w:r>
-        <w:t xml:space="preserve"> ({{ intf_data.gw }}): {{ ping }}ms ({% if ping &lt;= 50 %}Ok </w:t>
+        <w:rPr>
+          <w:rFonts w:asciiTheme="majorHAnsi" w:hAnsiTheme="majorHAnsi" w:cstheme="majorHAnsi"/>
+        </w:rPr>
+        <w:t xml:space="preserve"> ({{ intf_data.gw }})</w:t>
       </w:r>
       <w:r>
         <w:rPr>
+          <w:rFonts w:asciiTheme="majorHAnsi" w:hAnsiTheme="majorHAnsi" w:cstheme="majorHAnsi"/>
+        </w:rPr>
+        <w:t xml:space="preserve">: </w:t>
+      </w:r>
+      <w:r>
+        <w:rPr>
+          <w:rFonts w:asciiTheme="majorHAnsi" w:hAnsiTheme="majorHAnsi" w:cstheme="majorHAnsi"/>
+        </w:rPr>
+        <w:t>{% set ping = intf_data.latency|int %}{{ ping }}ms {% if ping &lt;= 50 %}</w:t>
+      </w:r>
+      <w:r>
+        <w:rPr>
           <w:rFonts w:ascii="Segoe UI Emoji" w:hAnsi="Segoe UI Emoji" w:cs="Segoe UI Emoji"/>
-          <w:lang w:val="pt-BR"/>
         </w:rPr>
         <w:t>🟢</w:t>
       </w:r>
       <w:r>
-        <w:t xml:space="preserve">{% elif ping &lt;= 150 %}Warning </w:t>
+        <w:rPr>
+          <w:rFonts w:asciiTheme="majorHAnsi" w:hAnsiTheme="majorHAnsi" w:cstheme="majorHAnsi"/>
+        </w:rPr>
+        <w:t>{% elif ping &lt;= 150 %}</w:t>
       </w:r>
       <w:r>
         <w:rPr>
           <w:rFonts w:ascii="Segoe UI Emoji" w:hAnsi="Segoe UI Emoji" w:cs="Segoe UI Emoji"/>
-          <w:lang w:val="pt-BR"/>
         </w:rPr>
         <w:t>🟡</w:t>
       </w:r>
       <w:r>
-        <w:t xml:space="preserve">{% else %}Critical </w:t>
+        <w:rPr>
+          <w:rFonts w:asciiTheme="majorHAnsi" w:hAnsiTheme="majorHAnsi" w:cstheme="majorHAnsi"/>
+        </w:rPr>
+        <w:t>{% else %}</w:t>
       </w:r>
       <w:r>
         <w:rPr>
           <w:rFonts w:ascii="Segoe UI Emoji" w:hAnsi="Segoe UI Emoji" w:cs="Segoe UI Emoji"/>
-          <w:lang w:val="pt-BR"/>
         </w:rPr>
         <w:t>🔴</w:t>
       </w:r>
       <w:r>
-        <w:t xml:space="preserve">{% endif %}){% else %}(Ping Timeout </w:t>
+        <w:rPr>
+          <w:rFonts w:asciiTheme="majorHAnsi" w:hAnsiTheme="majorHAnsi" w:cstheme="majorHAnsi"/>
+        </w:rPr>
+        <w:t xml:space="preserve">{% endif %}{% else %}Ping Timeout </w:t>
       </w:r>
       <w:r>
         <w:rPr>
@@ -372,99 +797,218 @@
         <w:t>❌</w:t>
       </w:r>
       <w:r>
-        <w:t>){% endif %}</w:t>
+        <w:rPr>
+          <w:rFonts w:asciiTheme="majorHAnsi" w:hAnsiTheme="majorHAnsi" w:cstheme="majorHAnsi"/>
+        </w:rPr>
+        <w:t>{% endif %}</w:t>
       </w:r>
     </w:p>
     <w:p>
+      <w:pPr>
+        <w:spacing w:after="0"/>
+        <w:rPr>
+          <w:rFonts w:asciiTheme="majorHAnsi" w:hAnsiTheme="majorHAnsi" w:cstheme="majorHAnsi"/>
+        </w:rPr>
+      </w:pPr>
       <w:r>
+        <w:rPr>
+          <w:rFonts w:asciiTheme="majorHAnsi" w:hAnsiTheme="majorHAnsi" w:cstheme="majorHAnsi"/>
+        </w:rPr>
         <w:t>{%p endif %}</w:t>
       </w:r>
     </w:p>
     <w:p>
+      <w:pPr>
+        <w:spacing w:after="0"/>
+        <w:rPr>
+          <w:rFonts w:asciiTheme="majorHAnsi" w:hAnsiTheme="majorHAnsi" w:cstheme="majorHAnsi"/>
+        </w:rPr>
+      </w:pPr>
+    </w:p>
+    <w:p>
+      <w:pPr>
+        <w:spacing w:after="0"/>
+        <w:rPr>
+          <w:rFonts w:asciiTheme="majorHAnsi" w:hAnsiTheme="majorHAnsi" w:cstheme="majorHAnsi"/>
+        </w:rPr>
+      </w:pPr>
       <w:r>
+        <w:rPr>
+          <w:rFonts w:asciiTheme="majorHAnsi" w:hAnsiTheme="majorHAnsi" w:cstheme="majorHAnsi"/>
+        </w:rPr>
+        <w:t>{%p endif %}</w:t>
+      </w:r>
+      <w:r>
+        <w:rPr>
+          <w:rFonts w:asciiTheme="majorHAnsi" w:hAnsiTheme="majorHAnsi" w:cstheme="majorHAnsi"/>
+        </w:rPr>
+        <w:t xml:space="preserve"> {# CLOSES: if intf_data.ip #}</w:t>
+      </w:r>
+    </w:p>
+    <w:p>
+      <w:pPr>
+        <w:spacing w:after="0"/>
+        <w:rPr>
+          <w:rFonts w:asciiTheme="majorHAnsi" w:hAnsiTheme="majorHAnsi" w:cstheme="majorHAnsi"/>
+        </w:rPr>
+      </w:pPr>
+      <w:r>
+        <w:rPr>
+          <w:rFonts w:asciiTheme="majorHAnsi" w:hAnsiTheme="majorHAnsi" w:cstheme="majorHAnsi"/>
+        </w:rPr>
+        <w:t xml:space="preserve">{%p endfor %} {# CLOSES: for intf_key, intf_data #} </w:t>
+      </w:r>
+    </w:p>
+    <w:p>
+      <w:pPr>
+        <w:spacing w:after="0"/>
+        <w:rPr>
+          <w:rFonts w:asciiTheme="majorHAnsi" w:hAnsiTheme="majorHAnsi" w:cstheme="majorHAnsi"/>
+        </w:rPr>
+      </w:pPr>
+      <w:r>
+        <w:rPr>
+          <w:rFonts w:asciiTheme="majorHAnsi" w:hAnsiTheme="majorHAnsi" w:cstheme="majorHAnsi"/>
+        </w:rPr>
+        <w:t>{%p endif %} {# CLOSES: if res.error #}</w:t>
+      </w:r>
+    </w:p>
+    <w:p>
+      <w:pPr>
+        <w:spacing w:after="0"/>
+        <w:rPr>
+          <w:rFonts w:asciiTheme="majorHAnsi" w:hAnsiTheme="majorHAnsi" w:cstheme="majorHAnsi"/>
+        </w:rPr>
+      </w:pPr>
+      <w:r>
+        <w:rPr>
+          <w:rFonts w:asciiTheme="majorHAnsi" w:hAnsiTheme="majorHAnsi" w:cstheme="majorHAnsi"/>
+        </w:rPr>
+        <w:t>{%p endif %} {# CLOSES: if res.rule_name in ['Switch', 'Access Point'] #}</w:t>
+      </w:r>
+    </w:p>
+    <w:p>
+      <w:pPr>
+        <w:spacing w:after="0"/>
+        <w:rPr>
+          <w:rFonts w:asciiTheme="majorHAnsi" w:hAnsiTheme="majorHAnsi" w:cstheme="majorHAnsi"/>
+        </w:rPr>
+      </w:pPr>
+      <w:r>
+        <w:rPr>
+          <w:rFonts w:asciiTheme="majorHAnsi" w:hAnsiTheme="majorHAnsi" w:cstheme="majorHAnsi"/>
+        </w:rPr>
+        <w:t>{%p if res.screenshot %}</w:t>
+      </w:r>
+    </w:p>
+    <w:p>
+      <w:pPr>
+        <w:rPr>
+          <w:rFonts w:asciiTheme="majorHAnsi" w:hAnsiTheme="majorHAnsi" w:cstheme="majorHAnsi"/>
+        </w:rPr>
+      </w:pPr>
+      <w:r>
+        <w:rPr>
+          <w:rFonts w:asciiTheme="majorHAnsi" w:hAnsiTheme="majorHAnsi" w:cstheme="majorHAnsi"/>
+        </w:rPr>
+        <w:t>Evi</w:t>
+      </w:r>
+      <w:r>
+        <w:rPr>
+          <w:rFonts w:asciiTheme="majorHAnsi" w:hAnsiTheme="majorHAnsi" w:cstheme="majorHAnsi"/>
+        </w:rPr>
+        <w:t>dence</w:t>
+      </w:r>
+      <w:r>
+        <w:rPr>
+          <w:rFonts w:asciiTheme="majorHAnsi" w:hAnsiTheme="majorHAnsi" w:cstheme="majorHAnsi"/>
+        </w:rPr>
+        <w:t xml:space="preserve"> (Screenshot):</w:t>
+      </w:r>
+    </w:p>
+    <w:p>
+      <w:pPr>
+        <w:rPr>
+          <w:rFonts w:asciiTheme="majorHAnsi" w:hAnsiTheme="majorHAnsi" w:cstheme="majorHAnsi"/>
+        </w:rPr>
+      </w:pPr>
+      <w:r>
+        <w:rPr>
+          <w:rFonts w:asciiTheme="majorHAnsi" w:hAnsiTheme="majorHAnsi" w:cstheme="majorHAnsi"/>
+        </w:rPr>
+        <w:t>{{ res.screenshot }}</w:t>
+      </w:r>
+    </w:p>
+    <w:p>
+      <w:pPr>
+        <w:spacing w:after="0"/>
+        <w:rPr>
+          <w:rFonts w:asciiTheme="majorHAnsi" w:hAnsiTheme="majorHAnsi" w:cstheme="majorHAnsi"/>
+        </w:rPr>
+      </w:pPr>
+      <w:r>
+        <w:rPr>
+          <w:rFonts w:asciiTheme="majorHAnsi" w:hAnsiTheme="majorHAnsi" w:cstheme="majorHAnsi"/>
+        </w:rPr>
+        <w:t>{%p else %}</w:t>
+      </w:r>
+    </w:p>
+    <w:p>
+      <w:pPr>
+        <w:rPr>
+          <w:rFonts w:asciiTheme="majorHAnsi" w:hAnsiTheme="majorHAnsi" w:cstheme="majorHAnsi"/>
+        </w:rPr>
+      </w:pPr>
+      <w:r>
+        <w:rPr>
+          <w:rFonts w:asciiTheme="majorHAnsi" w:hAnsiTheme="majorHAnsi" w:cstheme="majorHAnsi"/>
+        </w:rPr>
+        <w:t>No evidence image available</w:t>
+      </w:r>
+      <w:r>
+        <w:rPr>
+          <w:rFonts w:asciiTheme="majorHAnsi" w:hAnsiTheme="majorHAnsi" w:cstheme="majorHAnsi"/>
+        </w:rPr>
+        <w:t>.</w:t>
+      </w:r>
+    </w:p>
+    <w:p>
+      <w:pPr>
+        <w:spacing w:after="0"/>
+        <w:rPr>
+          <w:rFonts w:asciiTheme="majorHAnsi" w:hAnsiTheme="majorHAnsi" w:cstheme="majorHAnsi"/>
+        </w:rPr>
+      </w:pPr>
+      <w:r>
+        <w:rPr>
+          <w:rFonts w:asciiTheme="majorHAnsi" w:hAnsiTheme="majorHAnsi" w:cstheme="majorHAnsi"/>
+        </w:rPr>
         <w:t>{%p endif %}</w:t>
       </w:r>
     </w:p>
     <w:p>
+      <w:pPr>
+        <w:spacing w:after="0"/>
+        <w:rPr>
+          <w:rFonts w:asciiTheme="majorHAnsi" w:hAnsiTheme="majorHAnsi" w:cstheme="majorHAnsi"/>
+        </w:rPr>
+      </w:pPr>
       <w:r>
-        <w:t xml:space="preserve">{%p endfor %} {# CLOSES: for intf_key, intf_data #} </w:t>
-      </w:r>
-    </w:p>
-    <w:p>
-      <w:r>
+        <w:rPr>
+          <w:rFonts w:asciiTheme="majorHAnsi" w:hAnsiTheme="majorHAnsi" w:cstheme="majorHAnsi"/>
+        </w:rPr>
         <w:t>{%</w:t>
       </w:r>
       <w:r>
+        <w:rPr>
+          <w:rFonts w:asciiTheme="majorHAnsi" w:hAnsiTheme="majorHAnsi" w:cstheme="majorHAnsi"/>
+        </w:rPr>
         <w:t>p</w:t>
       </w:r>
       <w:r>
-        <w:t xml:space="preserve"> endif %</w:t>
-      </w:r>
-      <w:r>
-        <w:t>}</w:t>
-      </w:r>
-      <w:r>
-        <w:t xml:space="preserve"> </w:t>
-      </w:r>
-      <w:r>
-        <w:t>{# CLOSES: if res.error #}</w:t>
-      </w:r>
-    </w:p>
-    <w:p>
-      <w:r>
-        <w:t>{%</w:t>
-      </w:r>
-      <w:r>
-        <w:t>p</w:t>
-      </w:r>
-      <w:r>
-        <w:t xml:space="preserve"> endif %}</w:t>
-      </w:r>
-      <w:r>
-        <w:t xml:space="preserve"> </w:t>
-      </w:r>
-      <w:r>
-        <w:t>{# CLOSES: if res.rule_name in ['Switch', 'Access Point'] #}</w:t>
-      </w:r>
-    </w:p>
-    <w:p>
-      <w:r>
-        <w:t>{%p if res.screenshot %}</w:t>
-      </w:r>
-    </w:p>
-    <w:p>
-      <w:r>
-        <w:t>Evidence (Screenshot):</w:t>
-      </w:r>
-    </w:p>
-    <w:p>
-      <w:r>
-        <w:t>{{ res.screenshot }}</w:t>
-      </w:r>
-    </w:p>
-    <w:p>
-      <w:r>
-        <w:t>{%p else %}</w:t>
-      </w:r>
-    </w:p>
-    <w:p>
-      <w:r>
-        <w:t>No evidence image available.</w:t>
-      </w:r>
-    </w:p>
-    <w:p>
-      <w:r>
-        <w:t>{%p endif %}</w:t>
-      </w:r>
-    </w:p>
-    <w:p>
-      <w:r>
-        <w:t>{%</w:t>
-      </w:r>
-      <w:r>
-        <w:t>p</w:t>
-      </w:r>
-      <w:r>
+        <w:rPr>
+          <w:rFonts w:asciiTheme="majorHAnsi" w:hAnsiTheme="majorHAnsi" w:cstheme="majorHAnsi"/>
+        </w:rPr>
         <w:t xml:space="preserve"> endfor %}</w:t>
       </w:r>
     </w:p>
@@ -651,31 +1195,31 @@
       </w:rPr>
     </w:lvl>
   </w:abstractNum>
-  <w:num w:numId="1" w16cid:durableId="842666212">
+  <w:num w:numId="1" w16cid:durableId="988753196">
     <w:abstractNumId w:val="8"/>
   </w:num>
-  <w:num w:numId="2" w16cid:durableId="314380649">
+  <w:num w:numId="2" w16cid:durableId="1377584724">
     <w:abstractNumId w:val="6"/>
   </w:num>
-  <w:num w:numId="3" w16cid:durableId="1845319368">
+  <w:num w:numId="3" w16cid:durableId="1603143422">
     <w:abstractNumId w:val="5"/>
   </w:num>
-  <w:num w:numId="4" w16cid:durableId="1282109510">
+  <w:num w:numId="4" w16cid:durableId="1351223553">
     <w:abstractNumId w:val="4"/>
   </w:num>
-  <w:num w:numId="5" w16cid:durableId="315496221">
+  <w:num w:numId="5" w16cid:durableId="1838301687">
     <w:abstractNumId w:val="7"/>
   </w:num>
-  <w:num w:numId="6" w16cid:durableId="594870440">
+  <w:num w:numId="6" w16cid:durableId="1125122433">
     <w:abstractNumId w:val="3"/>
   </w:num>
-  <w:num w:numId="7" w16cid:durableId="966853318">
+  <w:num w:numId="7" w16cid:durableId="1879659164">
     <w:abstractNumId w:val="2"/>
   </w:num>
-  <w:num w:numId="8" w16cid:durableId="693581456">
+  <w:num w:numId="8" w16cid:durableId="1175459162">
     <w:abstractNumId w:val="1"/>
   </w:num>
-  <w:num w:numId="9" w16cid:durableId="808321967">
+  <w:num w:numId="9" w16cid:durableId="1202474076">
     <w:abstractNumId w:val="0"/>
   </w:num>
 </w:numbering>
@@ -1284,6 +1828,7 @@
   <w:style w:type="character" w:default="1" w:styleId="Fontepargpadro">
     <w:name w:val="Default Paragraph Font"/>
     <w:uiPriority w:val="1"/>
+    <w:semiHidden/>
     <w:unhideWhenUsed/>
   </w:style>
   <w:style w:type="table" w:default="1" w:styleId="Tabelanormal">

</xml_diff>

<commit_message>
Update default Word templates to include ping_target_ip
</commit_message>
<xml_diff>
--- a/template_en.example.docx
+++ b/template_en.example.docx
@@ -728,19 +728,25 @@
         <w:rPr>
           <w:rFonts w:asciiTheme="majorHAnsi" w:hAnsiTheme="majorHAnsi" w:cstheme="majorHAnsi"/>
         </w:rPr>
-        <w:t>Gateway</w:t>
+        <w:t>Latency</w:t>
       </w:r>
       <w:r>
         <w:rPr>
           <w:rFonts w:asciiTheme="majorHAnsi" w:hAnsiTheme="majorHAnsi" w:cstheme="majorHAnsi"/>
         </w:rPr>
-        <w:t xml:space="preserve"> Latency</w:t>
+        <w:t xml:space="preserve"> (</w:t>
       </w:r>
       <w:r>
         <w:rPr>
           <w:rFonts w:asciiTheme="majorHAnsi" w:hAnsiTheme="majorHAnsi" w:cstheme="majorHAnsi"/>
         </w:rPr>
-        <w:t xml:space="preserve"> ({{ intf_data.gw }})</w:t>
+        <w:t>{{ intf_data.ping_target_ip }}</w:t>
+      </w:r>
+      <w:r>
+        <w:rPr>
+          <w:rFonts w:asciiTheme="majorHAnsi" w:hAnsiTheme="majorHAnsi" w:cstheme="majorHAnsi"/>
+        </w:rPr>
+        <w:t>)</w:t>
       </w:r>
       <w:r>
         <w:rPr>
@@ -1828,7 +1834,6 @@
   <w:style w:type="character" w:default="1" w:styleId="Fontepargpadro">
     <w:name w:val="Default Paragraph Font"/>
     <w:uiPriority w:val="1"/>
-    <w:semiHidden/>
     <w:unhideWhenUsed/>
   </w:style>
   <w:style w:type="table" w:default="1" w:styleId="Tabelanormal">

</xml_diff>

<commit_message>
docs: update template_en and template_pt-BR example docx files
</commit_message>
<xml_diff>
--- a/template_en.example.docx
+++ b/template_en.example.docx
@@ -1,6 +1,6 @@
 
 <file path=word/document.xml><?xml version="1.0" encoding="utf-8"?>
-<w:document xmlns:wpc="http://schemas.microsoft.com/office/word/2010/wordprocessingCanvas" xmlns:cx="http://schemas.microsoft.com/office/drawing/2014/chartex" xmlns:cx1="http://schemas.microsoft.com/office/drawing/2015/9/8/chartex" xmlns:cx2="http://schemas.microsoft.com/office/drawing/2015/10/21/chartex" xmlns:cx3="http://schemas.microsoft.com/office/drawing/2016/5/9/chartex" xmlns:cx4="http://schemas.microsoft.com/office/drawing/2016/5/10/chartex" xmlns:cx5="http://schemas.microsoft.com/office/drawing/2016/5/11/chartex" xmlns:cx6="http://schemas.microsoft.com/office/drawing/2016/5/12/chartex" xmlns:cx7="http://schemas.microsoft.com/office/drawing/2016/5/13/chartex" xmlns:cx8="http://schemas.microsoft.com/office/drawing/2016/5/14/chartex" xmlns:mc="http://schemas.openxmlformats.org/markup-compatibility/2006" xmlns:aink="http://schemas.microsoft.com/office/drawing/2016/ink" xmlns:am3d="http://schemas.microsoft.com/office/drawing/2017/model3d" xmlns:o="urn:schemas-microsoft-com:office:office" xmlns:oel="http://schemas.microsoft.com/office/2019/extlst" xmlns:r="http://schemas.openxmlformats.org/officeDocument/2006/relationships" xmlns:m="http://schemas.openxmlformats.org/officeDocument/2006/math" xmlns:v="urn:schemas-microsoft-com:vml" xmlns:wp14="http://schemas.microsoft.com/office/word/2010/wordprocessingDrawing" xmlns:wp="http://schemas.openxmlformats.org/drawingml/2006/wordprocessingDrawing" xmlns:w10="urn:schemas-microsoft-com:office:word" xmlns:w="http://schemas.openxmlformats.org/wordprocessingml/2006/main" xmlns:w14="http://schemas.microsoft.com/office/word/2010/wordml" xmlns:w15="http://schemas.microsoft.com/office/word/2012/wordml" xmlns:w16cex="http://schemas.microsoft.com/office/word/2018/wordml/cex" xmlns:w16cid="http://schemas.microsoft.com/office/word/2016/wordml/cid" xmlns:w16="http://schemas.microsoft.com/office/word/2018/wordml" xmlns:w16du="http://schemas.microsoft.com/office/word/2023/wordml/word16du" xmlns:w16sdtdh="http://schemas.microsoft.com/office/word/2020/wordml/sdtdatahash" xmlns:w16sdtfl="http://schemas.microsoft.com/office/word/2024/wordml/sdtformatlock" xmlns:w16se="http://schemas.microsoft.com/office/word/2015/wordml/symex" xmlns:wpg="http://schemas.microsoft.com/office/word/2010/wordprocessingGroup" xmlns:wpi="http://schemas.microsoft.com/office/word/2010/wordprocessingInk" xmlns:wne="http://schemas.microsoft.com/office/word/2006/wordml" xmlns:wps="http://schemas.microsoft.com/office/word/2010/wordprocessingShape" mc:Ignorable="w14 w15 w16se w16cid w16 w16cex w16sdtdh w16sdtfl w16du wp14">
+<w:document xmlns:wpc="http://schemas.microsoft.com/office/word/2010/wordprocessingCanvas" xmlns:cx="http://schemas.microsoft.com/office/drawing/2014/chartex" xmlns:cx1="http://schemas.microsoft.com/office/drawing/2015/9/8/chartex" xmlns:cx2="http://schemas.microsoft.com/office/drawing/2015/10/21/chartex" xmlns:cx3="http://schemas.microsoft.com/office/drawing/2016/5/9/chartex" xmlns:cx4="http://schemas.microsoft.com/office/drawing/2016/5/10/chartex" xmlns:cx5="http://schemas.microsoft.com/office/drawing/2016/5/11/chartex" xmlns:cx6="http://schemas.microsoft.com/office/drawing/2016/5/12/chartex" xmlns:cx7="http://schemas.microsoft.com/office/drawing/2016/5/13/chartex" xmlns:cx8="http://schemas.microsoft.com/office/drawing/2016/5/14/chartex" xmlns:mc="http://schemas.openxmlformats.org/markup-compatibility/2006" xmlns:m="http://schemas.openxmlformats.org/officeDocument/2006/math" xmlns:aink="http://schemas.microsoft.com/office/drawing/2016/ink" xmlns:am3d="http://schemas.microsoft.com/office/drawing/2017/model3d" xmlns:oel="http://schemas.microsoft.com/office/2019/extlst" xmlns:r="http://schemas.openxmlformats.org/officeDocument/2006/relationships" xmlns:wp14="http://schemas.microsoft.com/office/word/2010/wordprocessingDrawing" xmlns:wp="http://schemas.openxmlformats.org/drawingml/2006/wordprocessingDrawing" xmlns:wpg="http://schemas.microsoft.com/office/word/2010/wordprocessingGroup" xmlns:wpi="http://schemas.microsoft.com/office/word/2010/wordprocessingInk" xmlns:wps="http://schemas.microsoft.com/office/word/2010/wordprocessingShape" xmlns:o="urn:schemas-microsoft-com:office:office" xmlns:v="urn:schemas-microsoft-com:vml" xmlns:w10="urn:schemas-microsoft-com:office:word" xmlns:w="http://schemas.openxmlformats.org/wordprocessingml/2006/main" xmlns:w14="http://schemas.microsoft.com/office/word/2010/wordml" xmlns:w15="http://schemas.microsoft.com/office/word/2012/wordml" xmlns:w16cex="http://schemas.microsoft.com/office/word/2018/wordml/cex" xmlns:w16cid="http://schemas.microsoft.com/office/word/2016/wordml/cid" xmlns:w16="http://schemas.microsoft.com/office/word/2018/wordml" xmlns:w16sdtdh="http://schemas.microsoft.com/office/word/2020/wordml/sdtdatahash" xmlns:w16sdtfl="http://schemas.microsoft.com/office/word/2024/wordml/sdtformatlock" xmlns:w16se="http://schemas.microsoft.com/office/word/2015/wordml/symex" xmlns:w16du="http://schemas.microsoft.com/office/word/2023/wordml/word16du" xmlns:wne="http://schemas.microsoft.com/office/word/2006/wordml" mc:Ignorable="w14 w15 w16se w16cid w16 w16cex w16sdtdh w16sdtfl w16du wp14">
   <w:body>
     <w:p>
       <w:pPr>
@@ -208,6 +208,48 @@
         <w:t>{{ res.rule_name }}: {{ res.host }}</w:t>
       </w:r>
     </w:p>
+    <w:p>
+      <w:pPr>
+        <w:spacing w:after="0"/>
+        <w:rPr>
+          <w:rFonts w:asciiTheme="majorHAnsi" w:hAnsiTheme="majorHAnsi" w:cstheme="majorHAnsi"/>
+        </w:rPr>
+      </w:pPr>
+      <w:r>
+        <w:rPr>
+          <w:rFonts w:asciiTheme="majorHAnsi" w:hAnsiTheme="majorHAnsi" w:cstheme="majorHAnsi"/>
+        </w:rPr>
+        <w:t>{%p if res.system_info %}</w:t>
+      </w:r>
+    </w:p>
+    <w:p>
+      <w:pPr>
+        <w:spacing w:after="0"/>
+        <w:rPr>
+          <w:rFonts w:asciiTheme="majorHAnsi" w:hAnsiTheme="majorHAnsi" w:cstheme="majorHAnsi"/>
+        </w:rPr>
+      </w:pPr>
+      <w:r>
+        <w:rPr>
+          <w:rFonts w:asciiTheme="majorHAnsi" w:hAnsiTheme="majorHAnsi" w:cstheme="majorHAnsi"/>
+        </w:rPr>
+        <w:t>{% if res.system_info.model %}Model: {{ res.system_info.model }} | {% endif %}{% if res.system_info.serial_number %}S/N: {{ res.system_info.serial_number }} | {% endif %}{% if res.system_info.version %}Version: {{ res.system_info.version }} | {% endif %}{% if res.system_info.uptime %}Uptime: {{ res.system_info.uptime }}{% endif %}{% if res.system_info.cpu_util %} | CPU: {{ res.system_info.cpu_util }}%{% endif %}{% if res.system_info.memory_usage %} | Mem: {{ res.system_info.memory_usage }}%{% endif %}</w:t>
+      </w:r>
+    </w:p>
+    <w:p>
+      <w:pPr>
+        <w:spacing w:after="0"/>
+        <w:rPr>
+          <w:rFonts w:asciiTheme="majorHAnsi" w:hAnsiTheme="majorHAnsi" w:cstheme="majorHAnsi"/>
+        </w:rPr>
+      </w:pPr>
+      <w:r>
+        <w:rPr>
+          <w:rFonts w:asciiTheme="majorHAnsi" w:hAnsiTheme="majorHAnsi" w:cstheme="majorHAnsi"/>
+        </w:rPr>
+        <w:t>{%p endif %}</w:t>
+      </w:r>
+    </w:p>
     <w:p/>
     <w:p>
       <w:pPr>
@@ -372,6 +414,7 @@
         <w:rPr>
           <w:rFonts w:asciiTheme="majorHAnsi" w:hAnsiTheme="majorHAnsi" w:cstheme="majorHAnsi"/>
         </w:rPr>
+        <w:lastRenderedPageBreak/>
         <w:t>{%</w:t>
       </w:r>
       <w:r>
@@ -505,7 +548,6 @@
         <w:rPr>
           <w:rFonts w:asciiTheme="majorHAnsi" w:hAnsiTheme="majorHAnsi" w:cstheme="majorHAnsi"/>
         </w:rPr>
-        <w:lastRenderedPageBreak/>
         <w:t>{% set isp_map = {'WAN1': 'ISP1', 'WAN2': 'ISP2'} %}{% set isp_name = isp_map.get(intf_key, intf_key) %}</w:t>
       </w:r>
       <w:r>
@@ -1029,7 +1071,7 @@
 </file>
 
 <file path=word/numbering.xml><?xml version="1.0" encoding="utf-8"?>
-<w:numbering xmlns:wpc="http://schemas.microsoft.com/office/word/2010/wordprocessingCanvas" xmlns:cx="http://schemas.microsoft.com/office/drawing/2014/chartex" xmlns:cx1="http://schemas.microsoft.com/office/drawing/2015/9/8/chartex" xmlns:cx2="http://schemas.microsoft.com/office/drawing/2015/10/21/chartex" xmlns:cx3="http://schemas.microsoft.com/office/drawing/2016/5/9/chartex" xmlns:cx4="http://schemas.microsoft.com/office/drawing/2016/5/10/chartex" xmlns:cx5="http://schemas.microsoft.com/office/drawing/2016/5/11/chartex" xmlns:cx6="http://schemas.microsoft.com/office/drawing/2016/5/12/chartex" xmlns:cx7="http://schemas.microsoft.com/office/drawing/2016/5/13/chartex" xmlns:cx8="http://schemas.microsoft.com/office/drawing/2016/5/14/chartex" xmlns:mc="http://schemas.openxmlformats.org/markup-compatibility/2006" xmlns:aink="http://schemas.microsoft.com/office/drawing/2016/ink" xmlns:am3d="http://schemas.microsoft.com/office/drawing/2017/model3d" xmlns:o="urn:schemas-microsoft-com:office:office" xmlns:oel="http://schemas.microsoft.com/office/2019/extlst" xmlns:r="http://schemas.openxmlformats.org/officeDocument/2006/relationships" xmlns:m="http://schemas.openxmlformats.org/officeDocument/2006/math" xmlns:v="urn:schemas-microsoft-com:vml" xmlns:wp14="http://schemas.microsoft.com/office/word/2010/wordprocessingDrawing" xmlns:wp="http://schemas.openxmlformats.org/drawingml/2006/wordprocessingDrawing" xmlns:w10="urn:schemas-microsoft-com:office:word" xmlns:w="http://schemas.openxmlformats.org/wordprocessingml/2006/main" xmlns:w14="http://schemas.microsoft.com/office/word/2010/wordml" xmlns:w15="http://schemas.microsoft.com/office/word/2012/wordml" xmlns:w16cex="http://schemas.microsoft.com/office/word/2018/wordml/cex" xmlns:w16cid="http://schemas.microsoft.com/office/word/2016/wordml/cid" xmlns:w16="http://schemas.microsoft.com/office/word/2018/wordml" xmlns:w16du="http://schemas.microsoft.com/office/word/2023/wordml/word16du" xmlns:w16sdtdh="http://schemas.microsoft.com/office/word/2020/wordml/sdtdatahash" xmlns:w16sdtfl="http://schemas.microsoft.com/office/word/2024/wordml/sdtformatlock" xmlns:w16se="http://schemas.microsoft.com/office/word/2015/wordml/symex" xmlns:wpg="http://schemas.microsoft.com/office/word/2010/wordprocessingGroup" xmlns:wpi="http://schemas.microsoft.com/office/word/2010/wordprocessingInk" xmlns:wne="http://schemas.microsoft.com/office/word/2006/wordml" xmlns:wps="http://schemas.microsoft.com/office/word/2010/wordprocessingShape" mc:Ignorable="w14 w15 w16se w16cid w16 w16cex w16sdtdh w16sdtfl w16du wp14">
+<w:numbering xmlns:wpc="http://schemas.microsoft.com/office/word/2010/wordprocessingCanvas" xmlns:cx="http://schemas.microsoft.com/office/drawing/2014/chartex" xmlns:cx1="http://schemas.microsoft.com/office/drawing/2015/9/8/chartex" xmlns:cx2="http://schemas.microsoft.com/office/drawing/2015/10/21/chartex" xmlns:cx3="http://schemas.microsoft.com/office/drawing/2016/5/9/chartex" xmlns:cx4="http://schemas.microsoft.com/office/drawing/2016/5/10/chartex" xmlns:cx5="http://schemas.microsoft.com/office/drawing/2016/5/11/chartex" xmlns:cx6="http://schemas.microsoft.com/office/drawing/2016/5/12/chartex" xmlns:cx7="http://schemas.microsoft.com/office/drawing/2016/5/13/chartex" xmlns:cx8="http://schemas.microsoft.com/office/drawing/2016/5/14/chartex" xmlns:mc="http://schemas.openxmlformats.org/markup-compatibility/2006" xmlns:m="http://schemas.openxmlformats.org/officeDocument/2006/math" xmlns:aink="http://schemas.microsoft.com/office/drawing/2016/ink" xmlns:am3d="http://schemas.microsoft.com/office/drawing/2017/model3d" xmlns:oel="http://schemas.microsoft.com/office/2019/extlst" xmlns:r="http://schemas.openxmlformats.org/officeDocument/2006/relationships" xmlns:wp14="http://schemas.microsoft.com/office/word/2010/wordprocessingDrawing" xmlns:wp="http://schemas.openxmlformats.org/drawingml/2006/wordprocessingDrawing" xmlns:wpg="http://schemas.microsoft.com/office/word/2010/wordprocessingGroup" xmlns:wpi="http://schemas.microsoft.com/office/word/2010/wordprocessingInk" xmlns:wps="http://schemas.microsoft.com/office/word/2010/wordprocessingShape" xmlns:o="urn:schemas-microsoft-com:office:office" xmlns:v="urn:schemas-microsoft-com:vml" xmlns:w10="urn:schemas-microsoft-com:office:word" xmlns:w="http://schemas.openxmlformats.org/wordprocessingml/2006/main" xmlns:w14="http://schemas.microsoft.com/office/word/2010/wordml" xmlns:w15="http://schemas.microsoft.com/office/word/2012/wordml" xmlns:w16cex="http://schemas.microsoft.com/office/word/2018/wordml/cex" xmlns:w16cid="http://schemas.microsoft.com/office/word/2016/wordml/cid" xmlns:w16="http://schemas.microsoft.com/office/word/2018/wordml" xmlns:w16sdtdh="http://schemas.microsoft.com/office/word/2020/wordml/sdtdatahash" xmlns:w16sdtfl="http://schemas.microsoft.com/office/word/2024/wordml/sdtformatlock" xmlns:w16se="http://schemas.microsoft.com/office/word/2015/wordml/symex" xmlns:w16du="http://schemas.microsoft.com/office/word/2023/wordml/word16du" xmlns:wne="http://schemas.microsoft.com/office/word/2006/wordml" mc:Ignorable="w14 w15 w16se w16cid w16 w16cex w16sdtdh w16sdtfl w16du wp14">
   <w:abstractNum w:abstractNumId="0" w15:restartNumberingAfterBreak="0">
     <w:nsid w:val="FFFFFF7C"/>
     <w:multiLevelType w:val="singleLevel"/>
@@ -1232,7 +1274,7 @@
 </file>
 
 <file path=word/styles.xml><?xml version="1.0" encoding="utf-8"?>
-<w:styles xmlns:mc="http://schemas.openxmlformats.org/markup-compatibility/2006" xmlns:r="http://schemas.openxmlformats.org/officeDocument/2006/relationships" xmlns:w="http://schemas.openxmlformats.org/wordprocessingml/2006/main" xmlns:w14="http://schemas.microsoft.com/office/word/2010/wordml" xmlns:w15="http://schemas.microsoft.com/office/word/2012/wordml" xmlns:w16cex="http://schemas.microsoft.com/office/word/2018/wordml/cex" xmlns:w16cid="http://schemas.microsoft.com/office/word/2016/wordml/cid" xmlns:w16="http://schemas.microsoft.com/office/word/2018/wordml" xmlns:w16du="http://schemas.microsoft.com/office/word/2023/wordml/word16du" xmlns:w16sdtdh="http://schemas.microsoft.com/office/word/2020/wordml/sdtdatahash" xmlns:w16sdtfl="http://schemas.microsoft.com/office/word/2024/wordml/sdtformatlock" xmlns:w16se="http://schemas.microsoft.com/office/word/2015/wordml/symex" mc:Ignorable="w14 w15 w16se w16cid w16 w16cex w16sdtdh w16sdtfl w16du">
+<w:styles xmlns:mc="http://schemas.openxmlformats.org/markup-compatibility/2006" xmlns:r="http://schemas.openxmlformats.org/officeDocument/2006/relationships" xmlns:w="http://schemas.openxmlformats.org/wordprocessingml/2006/main" xmlns:w14="http://schemas.microsoft.com/office/word/2010/wordml" xmlns:w15="http://schemas.microsoft.com/office/word/2012/wordml" xmlns:w16cex="http://schemas.microsoft.com/office/word/2018/wordml/cex" xmlns:w16cid="http://schemas.microsoft.com/office/word/2016/wordml/cid" xmlns:w16="http://schemas.microsoft.com/office/word/2018/wordml" xmlns:w16sdtdh="http://schemas.microsoft.com/office/word/2020/wordml/sdtdatahash" xmlns:w16sdtfl="http://schemas.microsoft.com/office/word/2024/wordml/sdtformatlock" xmlns:w16se="http://schemas.microsoft.com/office/word/2015/wordml/symex" xmlns:w16du="http://schemas.microsoft.com/office/word/2023/wordml/word16du" mc:Ignorable="w14 w15 w16se w16cid w16 w16cex w16sdtdh w16sdtfl w16du">
   <w:docDefaults>
     <w:rPrDefault>
       <w:rPr>
@@ -1834,6 +1876,7 @@
   <w:style w:type="character" w:default="1" w:styleId="Fontepargpadro">
     <w:name w:val="Default Paragraph Font"/>
     <w:uiPriority w:val="1"/>
+    <w:semiHidden/>
     <w:unhideWhenUsed/>
   </w:style>
   <w:style w:type="table" w:default="1" w:styleId="Tabelanormal">

</xml_diff>